<commit_message>
26-02-24, Tatum blog bijgewerkt
</commit_message>
<xml_diff>
--- a/BlogsWord/Wiewildiebaan?.docx
+++ b/BlogsWord/Wiewildiebaan?.docx
@@ -13,7 +13,7 @@
           <w:iCs/>
           <w:sz w:val="32"/>
           <w:szCs w:val="32"/>
-          <w:lang w:val="en-US"/>
+          <w:lang w:val="nl-NL"/>
         </w:rPr>
       </w:pPr>
       <w:r>
@@ -25,65 +25,9 @@
           <w:iCs/>
           <w:sz w:val="32"/>
           <w:szCs w:val="32"/>
-          <w:lang w:val="en-US"/>
-        </w:rPr>
-        <w:t xml:space="preserve">Wie </w:t>
-      </w:r>
-      <w:proofErr w:type="spellStart"/>
-      <w:r>
-        <w:rPr>
-          <w:rFonts w:ascii="Courier New" w:hAnsi="Courier New" w:cs="Courier New"/>
-          <w:b/>
-          <w:bCs/>
-          <w:i/>
-          <w:iCs/>
-          <w:sz w:val="32"/>
-          <w:szCs w:val="32"/>
-          <w:lang w:val="en-US"/>
-        </w:rPr>
-        <w:t>wil</w:t>
-      </w:r>
-      <w:proofErr w:type="spellEnd"/>
-      <w:r>
-        <w:rPr>
-          <w:rFonts w:ascii="Courier New" w:hAnsi="Courier New" w:cs="Courier New"/>
-          <w:b/>
-          <w:bCs/>
-          <w:i/>
-          <w:iCs/>
-          <w:sz w:val="32"/>
-          <w:szCs w:val="32"/>
-          <w:lang w:val="en-US"/>
-        </w:rPr>
-        <w:t xml:space="preserve"> die </w:t>
-      </w:r>
-      <w:proofErr w:type="spellStart"/>
-      <w:r>
-        <w:rPr>
-          <w:rFonts w:ascii="Courier New" w:hAnsi="Courier New" w:cs="Courier New"/>
-          <w:b/>
-          <w:bCs/>
-          <w:i/>
-          <w:iCs/>
-          <w:sz w:val="32"/>
-          <w:szCs w:val="32"/>
-          <w:lang w:val="en-US"/>
-        </w:rPr>
-        <w:t>baan</w:t>
-      </w:r>
-      <w:proofErr w:type="spellEnd"/>
-      <w:r>
-        <w:rPr>
-          <w:rFonts w:ascii="Courier New" w:hAnsi="Courier New" w:cs="Courier New"/>
-          <w:b/>
-          <w:bCs/>
-          <w:i/>
-          <w:iCs/>
-          <w:sz w:val="32"/>
-          <w:szCs w:val="32"/>
-          <w:lang w:val="en-US"/>
-        </w:rPr>
-        <w:t>?</w:t>
+          <w:lang w:val="nl-NL"/>
+        </w:rPr>
+        <w:t>Wie wil die baan?</w:t>
       </w:r>
     </w:p>
     <w:p>
@@ -93,7 +37,7 @@
           <w:rFonts w:ascii="Courier New" w:hAnsi="Courier New" w:cs="Courier New"/>
           <w:sz w:val="22"/>
           <w:szCs w:val="22"/>
-          <w:lang w:val="en-US"/>
+          <w:lang w:val="nl-NL"/>
         </w:rPr>
       </w:pPr>
     </w:p>
@@ -113,57 +57,249 @@
         <w:spacing w:line="360" w:lineRule="auto"/>
         <w:rPr>
           <w:rFonts w:ascii="Courier New" w:hAnsi="Courier New" w:cs="Courier New"/>
-          <w:sz w:val="22"/>
-          <w:szCs w:val="22"/>
-          <w:lang w:val="nl-NL"/>
-        </w:rPr>
-      </w:pPr>
-      <w:r>
-        <w:rPr>
-          <w:rFonts w:ascii="Courier New" w:hAnsi="Courier New" w:cs="Courier New"/>
-          <w:sz w:val="22"/>
-          <w:szCs w:val="22"/>
-          <w:lang w:val="nl-NL"/>
-        </w:rPr>
-        <w:t xml:space="preserve">Er speelt nogal wat op de universiteiten </w:t>
-      </w:r>
-      <w:r>
-        <w:rPr>
-          <w:rFonts w:ascii="Courier New" w:hAnsi="Courier New" w:cs="Courier New"/>
-          <w:sz w:val="22"/>
-          <w:szCs w:val="22"/>
-          <w:lang w:val="nl-NL"/>
-        </w:rPr>
-        <w:t>tegenwoordig. D</w:t>
-      </w:r>
-      <w:r>
-        <w:rPr>
-          <w:rFonts w:ascii="Courier New" w:hAnsi="Courier New" w:cs="Courier New"/>
-          <w:sz w:val="22"/>
-          <w:szCs w:val="22"/>
-          <w:lang w:val="nl-NL"/>
-        </w:rPr>
-        <w:t xml:space="preserve">e COVID-pandemie twee jaar lang, de oorlogen in Oekraïne en Gaza, de rechten van de </w:t>
-      </w:r>
-      <w:r>
-        <w:rPr>
-          <w:rFonts w:ascii="Courier New" w:hAnsi="Courier New" w:cs="Courier New"/>
-          <w:sz w:val="22"/>
-          <w:szCs w:val="22"/>
-        </w:rPr>
-        <w:t>LHBTQ+</w:t>
-      </w:r>
-      <w:r>
-        <w:rPr>
-          <w:rFonts w:ascii="Courier New" w:hAnsi="Courier New" w:cs="Courier New"/>
-          <w:sz w:val="22"/>
-          <w:szCs w:val="22"/>
-        </w:rPr>
-        <w:t>-gemeenschap en de mentale problemen van jongeren en in Amerika ook nog de dreiging van het wapenbezit op de instellingen en überhaupt de vraag wat het hoger onderwijs oplevert en wat er in de deze samenleving van het hoger onderwijs wordt verwacht. Personen die de universiteiten en colleges leiden (of dat nou de presidenten zijn, de decanen, de voorzitters en de afdelingshoofden) hebben het zwaar tegenwoordig en dat roept nogal eens de vraag op wie wil deze baan nog hebben.</w:t>
+          <w:i/>
+          <w:iCs/>
+          <w:sz w:val="22"/>
+          <w:szCs w:val="22"/>
+        </w:rPr>
+      </w:pPr>
+      <w:r>
+        <w:rPr>
+          <w:rFonts w:ascii="Courier New" w:hAnsi="Courier New" w:cs="Courier New"/>
+          <w:i/>
+          <w:iCs/>
+          <w:sz w:val="22"/>
+          <w:szCs w:val="22"/>
+          <w:lang w:val="nl-NL"/>
+        </w:rPr>
+        <w:t>“</w:t>
+      </w:r>
+      <w:r>
+        <w:rPr>
+          <w:rFonts w:ascii="Courier New" w:hAnsi="Courier New" w:cs="Courier New"/>
+          <w:i/>
+          <w:iCs/>
+          <w:sz w:val="22"/>
+          <w:szCs w:val="22"/>
+        </w:rPr>
+        <w:t>Het langetermijnsucces van het hoger onderwijs als publiek goed hangt niet alleen af van de institutionele leiders — en hun besturen, hun docenten, medewerkers, bestuurders en alumni — maar ook van de bredere gemeenschappen die hen steunen en geloven in de transformerende kracht van hun onderwijsopdracht.</w:t>
+      </w:r>
+      <w:r>
+        <w:rPr>
+          <w:rFonts w:ascii="Courier New" w:hAnsi="Courier New" w:cs="Courier New"/>
+          <w:i/>
+          <w:iCs/>
+          <w:sz w:val="22"/>
+          <w:szCs w:val="22"/>
+        </w:rPr>
+        <w:t>”</w:t>
       </w:r>
     </w:p>
     <w:p>
       <w:pPr>
+        <w:pStyle w:val="ListParagraph"/>
+        <w:numPr>
+          <w:ilvl w:val="0"/>
+          <w:numId w:val="2"/>
+        </w:numPr>
+        <w:spacing w:line="360" w:lineRule="auto"/>
+        <w:rPr>
+          <w:rFonts w:ascii="Courier New" w:hAnsi="Courier New" w:cs="Courier New"/>
+          <w:sz w:val="22"/>
+          <w:szCs w:val="22"/>
+          <w:lang w:val="nl-NL"/>
+        </w:rPr>
+      </w:pPr>
+      <w:r>
+        <w:rPr>
+          <w:rFonts w:ascii="Courier New" w:hAnsi="Courier New" w:cs="Courier New"/>
+          <w:sz w:val="22"/>
+          <w:szCs w:val="22"/>
+          <w:lang w:val="nl-NL"/>
+        </w:rPr>
+        <w:t xml:space="preserve">B.D. </w:t>
+      </w:r>
+      <w:r>
+        <w:rPr>
+          <w:rFonts w:ascii="Courier New" w:hAnsi="Courier New" w:cs="Courier New"/>
+          <w:sz w:val="22"/>
+          <w:szCs w:val="22"/>
+          <w:lang w:val="nl-NL"/>
+        </w:rPr>
+        <w:t>Tatum</w:t>
+      </w:r>
+    </w:p>
+    <w:p>
+      <w:pPr>
+        <w:pStyle w:val="ListParagraph"/>
+        <w:spacing w:line="360" w:lineRule="auto"/>
+        <w:rPr>
+          <w:rFonts w:ascii="Courier New" w:hAnsi="Courier New" w:cs="Courier New"/>
+          <w:sz w:val="22"/>
+          <w:szCs w:val="22"/>
+          <w:lang w:val="nl-NL"/>
+        </w:rPr>
+      </w:pPr>
+    </w:p>
+    <w:p>
+      <w:pPr>
+        <w:pStyle w:val="ListParagraph"/>
+        <w:spacing w:line="360" w:lineRule="auto"/>
+        <w:rPr>
+          <w:rFonts w:ascii="Courier New" w:hAnsi="Courier New" w:cs="Courier New"/>
+          <w:sz w:val="22"/>
+          <w:szCs w:val="22"/>
+          <w:lang w:val="nl-NL"/>
+        </w:rPr>
+      </w:pPr>
+    </w:p>
+    <w:p>
+      <w:pPr>
+        <w:spacing w:line="360" w:lineRule="auto"/>
+        <w:rPr>
+          <w:rFonts w:ascii="Courier New" w:hAnsi="Courier New" w:cs="Courier New"/>
+          <w:sz w:val="22"/>
+          <w:szCs w:val="22"/>
+          <w:lang w:val="nl-NL"/>
+        </w:rPr>
+      </w:pPr>
+      <w:r>
+        <w:rPr>
+          <w:rFonts w:ascii="Courier New" w:hAnsi="Courier New" w:cs="Courier New"/>
+          <w:sz w:val="22"/>
+          <w:szCs w:val="22"/>
+          <w:lang w:val="nl-NL"/>
+        </w:rPr>
+        <w:t xml:space="preserve">Er speelt nogal wat op de universiteiten </w:t>
+      </w:r>
+      <w:r>
+        <w:rPr>
+          <w:rFonts w:ascii="Courier New" w:hAnsi="Courier New" w:cs="Courier New"/>
+          <w:sz w:val="22"/>
+          <w:szCs w:val="22"/>
+          <w:lang w:val="nl-NL"/>
+        </w:rPr>
+        <w:t>tegenwoordig</w:t>
+      </w:r>
+      <w:r>
+        <w:rPr>
+          <w:rFonts w:ascii="Courier New" w:hAnsi="Courier New" w:cs="Courier New"/>
+          <w:sz w:val="22"/>
+          <w:szCs w:val="22"/>
+          <w:lang w:val="nl-NL"/>
+        </w:rPr>
+        <w:t>: d</w:t>
+      </w:r>
+      <w:r>
+        <w:rPr>
+          <w:rFonts w:ascii="Courier New" w:hAnsi="Courier New" w:cs="Courier New"/>
+          <w:sz w:val="22"/>
+          <w:szCs w:val="22"/>
+          <w:lang w:val="nl-NL"/>
+        </w:rPr>
+        <w:t>e COVID-pandemie twee jaar lang</w:t>
+      </w:r>
+      <w:r>
+        <w:rPr>
+          <w:rFonts w:ascii="Courier New" w:hAnsi="Courier New" w:cs="Courier New"/>
+          <w:sz w:val="22"/>
+          <w:szCs w:val="22"/>
+          <w:lang w:val="nl-NL"/>
+        </w:rPr>
+        <w:t xml:space="preserve"> en de naweeën ervan</w:t>
+      </w:r>
+      <w:r>
+        <w:rPr>
+          <w:rFonts w:ascii="Courier New" w:hAnsi="Courier New" w:cs="Courier New"/>
+          <w:sz w:val="22"/>
+          <w:szCs w:val="22"/>
+          <w:lang w:val="nl-NL"/>
+        </w:rPr>
+        <w:t xml:space="preserve">, de oorlogen in Oekraïne en Gaza, de rechten van de </w:t>
+      </w:r>
+      <w:r>
+        <w:rPr>
+          <w:rFonts w:ascii="Courier New" w:hAnsi="Courier New" w:cs="Courier New"/>
+          <w:sz w:val="22"/>
+          <w:szCs w:val="22"/>
+        </w:rPr>
+        <w:t>LHBTQ+</w:t>
+      </w:r>
+      <w:r>
+        <w:rPr>
+          <w:rFonts w:ascii="Courier New" w:hAnsi="Courier New" w:cs="Courier New"/>
+          <w:sz w:val="22"/>
+          <w:szCs w:val="22"/>
+        </w:rPr>
+        <w:t>-gemeenschap en de mentale problemen van jongeren</w:t>
+      </w:r>
+      <w:r>
+        <w:rPr>
+          <w:rFonts w:ascii="Courier New" w:hAnsi="Courier New" w:cs="Courier New"/>
+          <w:sz w:val="22"/>
+          <w:szCs w:val="22"/>
+        </w:rPr>
+        <w:t xml:space="preserve">, </w:t>
+      </w:r>
+      <w:r>
+        <w:rPr>
+          <w:rFonts w:ascii="Courier New" w:hAnsi="Courier New" w:cs="Courier New"/>
+          <w:sz w:val="22"/>
+          <w:szCs w:val="22"/>
+        </w:rPr>
+        <w:t xml:space="preserve">in Amerika ook nog de dreiging van het wapenbezit op de instellingen en </w:t>
+      </w:r>
+      <w:r>
+        <w:rPr>
+          <w:rFonts w:ascii="Courier New" w:hAnsi="Courier New" w:cs="Courier New"/>
+          <w:sz w:val="22"/>
+          <w:szCs w:val="22"/>
+        </w:rPr>
+        <w:t xml:space="preserve">dan </w:t>
+      </w:r>
+      <w:r>
+        <w:rPr>
+          <w:rFonts w:ascii="Courier New" w:hAnsi="Courier New" w:cs="Courier New"/>
+          <w:sz w:val="22"/>
+          <w:szCs w:val="22"/>
+        </w:rPr>
+        <w:t xml:space="preserve">überhaupt de vraag wat het hoger onderwijs oplevert en wat er in de deze samenleving van het hoger onderwijs </w:t>
+      </w:r>
+      <w:r>
+        <w:rPr>
+          <w:rFonts w:ascii="Courier New" w:hAnsi="Courier New" w:cs="Courier New"/>
+          <w:sz w:val="22"/>
+          <w:szCs w:val="22"/>
+        </w:rPr>
+        <w:t>mag worden</w:t>
+      </w:r>
+      <w:r>
+        <w:rPr>
+          <w:rFonts w:ascii="Courier New" w:hAnsi="Courier New" w:cs="Courier New"/>
+          <w:sz w:val="22"/>
+          <w:szCs w:val="22"/>
+        </w:rPr>
+        <w:t xml:space="preserve"> verwacht. Personen die de universiteiten en colleges leiden (of dat nou de presidenten zijn, de decanen, de voorzitters en de afdelingshoofden) hebben het zwaar tegenwoordig en dat roept nogal eens de vraag op wie deze baan nog </w:t>
+      </w:r>
+      <w:r>
+        <w:rPr>
+          <w:rFonts w:ascii="Courier New" w:hAnsi="Courier New" w:cs="Courier New"/>
+          <w:sz w:val="22"/>
+          <w:szCs w:val="22"/>
+        </w:rPr>
+        <w:t xml:space="preserve">wil </w:t>
+      </w:r>
+      <w:r>
+        <w:rPr>
+          <w:rFonts w:ascii="Courier New" w:hAnsi="Courier New" w:cs="Courier New"/>
+          <w:sz w:val="22"/>
+          <w:szCs w:val="22"/>
+        </w:rPr>
+        <w:t>hebben.</w:t>
+      </w:r>
+    </w:p>
+    <w:p>
+      <w:pPr>
         <w:spacing w:line="360" w:lineRule="auto"/>
         <w:ind w:firstLine="720"/>
         <w:rPr>
@@ -198,7 +334,25 @@
           <w:szCs w:val="22"/>
           <w:lang w:val="nl-NL"/>
         </w:rPr>
-        <w:t xml:space="preserve">en was gespecialiseerd in de thematiek van diversiteit, ras en identiteit. </w:t>
+        <w:t xml:space="preserve">en </w:t>
+      </w:r>
+      <w:r>
+        <w:rPr>
+          <w:rFonts w:ascii="Courier New" w:hAnsi="Courier New" w:cs="Courier New"/>
+          <w:sz w:val="22"/>
+          <w:szCs w:val="22"/>
+          <w:lang w:val="nl-NL"/>
+        </w:rPr>
+        <w:t xml:space="preserve">is </w:t>
+      </w:r>
+      <w:r>
+        <w:rPr>
+          <w:rFonts w:ascii="Courier New" w:hAnsi="Courier New" w:cs="Courier New"/>
+          <w:sz w:val="22"/>
+          <w:szCs w:val="22"/>
+          <w:lang w:val="nl-NL"/>
+        </w:rPr>
+        <w:t xml:space="preserve">gespecialiseerd in de thematiek van diversiteit, ras en identiteit. </w:t>
       </w:r>
       <w:r>
         <w:rPr>
@@ -302,14 +456,110 @@
           <w:szCs w:val="22"/>
           <w:lang w:val="en-US"/>
         </w:rPr>
-        <w:t>? And Other Conversations About Race</w:t>
-      </w:r>
-      <w:r>
-        <w:rPr>
-          <w:rFonts w:ascii="Courier New" w:hAnsi="Courier New" w:cs="Courier New"/>
-          <w:sz w:val="22"/>
-          <w:szCs w:val="22"/>
-          <w:lang w:val="en-US"/>
+        <w:t xml:space="preserve">? </w:t>
+      </w:r>
+      <w:proofErr w:type="spellStart"/>
+      <w:r>
+        <w:rPr>
+          <w:rFonts w:ascii="Courier New" w:hAnsi="Courier New" w:cs="Courier New"/>
+          <w:i/>
+          <w:iCs/>
+          <w:sz w:val="22"/>
+          <w:szCs w:val="22"/>
+          <w:lang w:val="nl-NL"/>
+        </w:rPr>
+        <w:t>And</w:t>
+      </w:r>
+      <w:proofErr w:type="spellEnd"/>
+      <w:r>
+        <w:rPr>
+          <w:rFonts w:ascii="Courier New" w:hAnsi="Courier New" w:cs="Courier New"/>
+          <w:i/>
+          <w:iCs/>
+          <w:sz w:val="22"/>
+          <w:szCs w:val="22"/>
+          <w:lang w:val="nl-NL"/>
+        </w:rPr>
+        <w:t xml:space="preserve"> </w:t>
+      </w:r>
+      <w:proofErr w:type="spellStart"/>
+      <w:r>
+        <w:rPr>
+          <w:rFonts w:ascii="Courier New" w:hAnsi="Courier New" w:cs="Courier New"/>
+          <w:i/>
+          <w:iCs/>
+          <w:sz w:val="22"/>
+          <w:szCs w:val="22"/>
+          <w:lang w:val="nl-NL"/>
+        </w:rPr>
+        <w:t>Other</w:t>
+      </w:r>
+      <w:proofErr w:type="spellEnd"/>
+      <w:r>
+        <w:rPr>
+          <w:rFonts w:ascii="Courier New" w:hAnsi="Courier New" w:cs="Courier New"/>
+          <w:i/>
+          <w:iCs/>
+          <w:sz w:val="22"/>
+          <w:szCs w:val="22"/>
+          <w:lang w:val="nl-NL"/>
+        </w:rPr>
+        <w:t xml:space="preserve"> </w:t>
+      </w:r>
+      <w:proofErr w:type="spellStart"/>
+      <w:r>
+        <w:rPr>
+          <w:rFonts w:ascii="Courier New" w:hAnsi="Courier New" w:cs="Courier New"/>
+          <w:i/>
+          <w:iCs/>
+          <w:sz w:val="22"/>
+          <w:szCs w:val="22"/>
+          <w:lang w:val="nl-NL"/>
+        </w:rPr>
+        <w:t>Conversations</w:t>
+      </w:r>
+      <w:proofErr w:type="spellEnd"/>
+      <w:r>
+        <w:rPr>
+          <w:rFonts w:ascii="Courier New" w:hAnsi="Courier New" w:cs="Courier New"/>
+          <w:i/>
+          <w:iCs/>
+          <w:sz w:val="22"/>
+          <w:szCs w:val="22"/>
+          <w:lang w:val="nl-NL"/>
+        </w:rPr>
+        <w:t xml:space="preserve"> </w:t>
+      </w:r>
+      <w:proofErr w:type="spellStart"/>
+      <w:r>
+        <w:rPr>
+          <w:rFonts w:ascii="Courier New" w:hAnsi="Courier New" w:cs="Courier New"/>
+          <w:i/>
+          <w:iCs/>
+          <w:sz w:val="22"/>
+          <w:szCs w:val="22"/>
+          <w:lang w:val="nl-NL"/>
+        </w:rPr>
+        <w:t>About</w:t>
+      </w:r>
+      <w:proofErr w:type="spellEnd"/>
+      <w:r>
+        <w:rPr>
+          <w:rFonts w:ascii="Courier New" w:hAnsi="Courier New" w:cs="Courier New"/>
+          <w:i/>
+          <w:iCs/>
+          <w:sz w:val="22"/>
+          <w:szCs w:val="22"/>
+          <w:lang w:val="nl-NL"/>
+        </w:rPr>
+        <w:t xml:space="preserve"> Race</w:t>
+      </w:r>
+      <w:r>
+        <w:rPr>
+          <w:rFonts w:ascii="Courier New" w:hAnsi="Courier New" w:cs="Courier New"/>
+          <w:sz w:val="22"/>
+          <w:szCs w:val="22"/>
+          <w:lang w:val="nl-NL"/>
         </w:rPr>
         <w:t xml:space="preserve">. </w:t>
       </w:r>
@@ -340,6 +590,188 @@
           <w:szCs w:val="22"/>
           <w:lang w:val="nl-NL"/>
         </w:rPr>
+        <w:t>-</w:t>
+      </w:r>
+      <w:r>
+        <w:rPr>
+          <w:rFonts w:ascii="Courier New" w:hAnsi="Courier New" w:cs="Courier New"/>
+          <w:sz w:val="22"/>
+          <w:szCs w:val="22"/>
+          <w:lang w:val="nl-NL"/>
+        </w:rPr>
+        <w:t>vrouwen</w:t>
+      </w:r>
+      <w:r>
+        <w:rPr>
+          <w:rFonts w:ascii="Courier New" w:hAnsi="Courier New" w:cs="Courier New"/>
+          <w:sz w:val="22"/>
+          <w:szCs w:val="22"/>
+          <w:lang w:val="nl-NL"/>
+        </w:rPr>
+        <w:t>college</w:t>
+      </w:r>
+      <w:r>
+        <w:rPr>
+          <w:rFonts w:ascii="Courier New" w:hAnsi="Courier New" w:cs="Courier New"/>
+          <w:sz w:val="22"/>
+          <w:szCs w:val="22"/>
+          <w:lang w:val="nl-NL"/>
+        </w:rPr>
+        <w:t xml:space="preserve"> in Massachusetts</w:t>
+      </w:r>
+      <w:r>
+        <w:rPr>
+          <w:rFonts w:ascii="Courier New" w:hAnsi="Courier New" w:cs="Courier New"/>
+          <w:sz w:val="22"/>
+          <w:szCs w:val="22"/>
+          <w:lang w:val="nl-NL"/>
+        </w:rPr>
+        <w:t xml:space="preserve">, eerst als </w:t>
+      </w:r>
+      <w:r>
+        <w:rPr>
+          <w:rFonts w:ascii="Courier New" w:hAnsi="Courier New" w:cs="Courier New"/>
+          <w:sz w:val="22"/>
+          <w:szCs w:val="22"/>
+          <w:lang w:val="nl-NL"/>
+        </w:rPr>
+        <w:t xml:space="preserve">hoogleraar psychologie, vervolgens als </w:t>
+      </w:r>
+      <w:r>
+        <w:rPr>
+          <w:rFonts w:ascii="Courier New" w:hAnsi="Courier New" w:cs="Courier New"/>
+          <w:sz w:val="22"/>
+          <w:szCs w:val="22"/>
+          <w:lang w:val="nl-NL"/>
+        </w:rPr>
+        <w:t>decaan</w:t>
+      </w:r>
+      <w:r>
+        <w:rPr>
+          <w:rFonts w:ascii="Courier New" w:hAnsi="Courier New" w:cs="Courier New"/>
+          <w:sz w:val="22"/>
+          <w:szCs w:val="22"/>
+          <w:lang w:val="nl-NL"/>
+        </w:rPr>
+        <w:t xml:space="preserve"> en president </w:t>
+      </w:r>
+      <w:r>
+        <w:rPr>
+          <w:rFonts w:ascii="Courier New" w:hAnsi="Courier New" w:cs="Courier New"/>
+          <w:sz w:val="22"/>
+          <w:szCs w:val="22"/>
+          <w:lang w:val="nl-NL"/>
+        </w:rPr>
+        <w:t xml:space="preserve">(en later nog een keer een jaar als interim-president) </w:t>
+      </w:r>
+      <w:r>
+        <w:rPr>
+          <w:rFonts w:ascii="Courier New" w:hAnsi="Courier New" w:cs="Courier New"/>
+          <w:sz w:val="22"/>
+          <w:szCs w:val="22"/>
+          <w:lang w:val="nl-NL"/>
+        </w:rPr>
+        <w:t xml:space="preserve">om daarna president van het </w:t>
+      </w:r>
+      <w:proofErr w:type="spellStart"/>
+      <w:r>
+        <w:rPr>
+          <w:rFonts w:ascii="Courier New" w:hAnsi="Courier New" w:cs="Courier New"/>
+          <w:sz w:val="22"/>
+          <w:szCs w:val="22"/>
+          <w:lang w:val="nl-NL"/>
+        </w:rPr>
+        <w:t>Spelman</w:t>
+      </w:r>
+      <w:proofErr w:type="spellEnd"/>
+      <w:r>
+        <w:rPr>
+          <w:rFonts w:ascii="Courier New" w:hAnsi="Courier New" w:cs="Courier New"/>
+          <w:sz w:val="22"/>
+          <w:szCs w:val="22"/>
+          <w:lang w:val="nl-NL"/>
+        </w:rPr>
+        <w:t xml:space="preserve"> College </w:t>
+      </w:r>
+      <w:r>
+        <w:rPr>
+          <w:rFonts w:ascii="Courier New" w:hAnsi="Courier New" w:cs="Courier New"/>
+          <w:sz w:val="22"/>
+          <w:szCs w:val="22"/>
+          <w:lang w:val="nl-NL"/>
+        </w:rPr>
+        <w:t xml:space="preserve">in Atlanta </w:t>
+      </w:r>
+      <w:r>
+        <w:rPr>
+          <w:rFonts w:ascii="Courier New" w:hAnsi="Courier New" w:cs="Courier New"/>
+          <w:sz w:val="22"/>
+          <w:szCs w:val="22"/>
+          <w:lang w:val="nl-NL"/>
+        </w:rPr>
+        <w:t>te worden</w:t>
+      </w:r>
+      <w:r>
+        <w:rPr>
+          <w:rFonts w:ascii="Courier New" w:hAnsi="Courier New" w:cs="Courier New"/>
+          <w:sz w:val="22"/>
+          <w:szCs w:val="22"/>
+          <w:lang w:val="nl-NL"/>
+        </w:rPr>
+        <w:t>, ook een vrouwencollege</w:t>
+      </w:r>
+      <w:r>
+        <w:rPr>
+          <w:rFonts w:ascii="Courier New" w:hAnsi="Courier New" w:cs="Courier New"/>
+          <w:sz w:val="22"/>
+          <w:szCs w:val="22"/>
+          <w:lang w:val="nl-NL"/>
+        </w:rPr>
+        <w:t>.</w:t>
+      </w:r>
+      <w:r>
+        <w:rPr>
+          <w:rFonts w:ascii="Courier New" w:hAnsi="Courier New" w:cs="Courier New"/>
+          <w:sz w:val="22"/>
+          <w:szCs w:val="22"/>
+          <w:lang w:val="nl-NL"/>
+        </w:rPr>
+        <w:t xml:space="preserve"> In 2015 </w:t>
+      </w:r>
+      <w:r>
+        <w:rPr>
+          <w:rFonts w:ascii="Courier New" w:hAnsi="Courier New" w:cs="Courier New"/>
+          <w:sz w:val="22"/>
+          <w:szCs w:val="22"/>
+          <w:lang w:val="nl-NL"/>
+        </w:rPr>
+        <w:t>ging</w:t>
+      </w:r>
+      <w:r>
+        <w:rPr>
+          <w:rFonts w:ascii="Courier New" w:hAnsi="Courier New" w:cs="Courier New"/>
+          <w:sz w:val="22"/>
+          <w:szCs w:val="22"/>
+          <w:lang w:val="nl-NL"/>
+        </w:rPr>
+        <w:t xml:space="preserve"> ze met pensioen en </w:t>
+      </w:r>
+      <w:r>
+        <w:rPr>
+          <w:rFonts w:ascii="Courier New" w:hAnsi="Courier New" w:cs="Courier New"/>
+          <w:sz w:val="22"/>
+          <w:szCs w:val="22"/>
+          <w:lang w:val="nl-NL"/>
+        </w:rPr>
+        <w:t>nam zich toen voor</w:t>
+      </w:r>
+      <w:r>
+        <w:rPr>
+          <w:rFonts w:ascii="Courier New" w:hAnsi="Courier New" w:cs="Courier New"/>
+          <w:sz w:val="22"/>
+          <w:szCs w:val="22"/>
+          <w:lang w:val="nl-NL"/>
+        </w:rPr>
         <w:t xml:space="preserve"> </w:t>
       </w:r>
       <w:r>
@@ -349,193 +781,239 @@
           <w:szCs w:val="22"/>
           <w:lang w:val="nl-NL"/>
         </w:rPr>
-        <w:t>vrouwen</w:t>
-      </w:r>
-      <w:r>
-        <w:rPr>
-          <w:rFonts w:ascii="Courier New" w:hAnsi="Courier New" w:cs="Courier New"/>
-          <w:sz w:val="22"/>
-          <w:szCs w:val="22"/>
-          <w:lang w:val="nl-NL"/>
-        </w:rPr>
-        <w:t>college</w:t>
-      </w:r>
-      <w:r>
-        <w:rPr>
-          <w:rFonts w:ascii="Courier New" w:hAnsi="Courier New" w:cs="Courier New"/>
-          <w:sz w:val="22"/>
-          <w:szCs w:val="22"/>
-          <w:lang w:val="nl-NL"/>
-        </w:rPr>
-        <w:t xml:space="preserve"> in Massachusetts</w:t>
-      </w:r>
-      <w:r>
-        <w:rPr>
-          <w:rFonts w:ascii="Courier New" w:hAnsi="Courier New" w:cs="Courier New"/>
-          <w:sz w:val="22"/>
-          <w:szCs w:val="22"/>
-          <w:lang w:val="nl-NL"/>
-        </w:rPr>
-        <w:t xml:space="preserve">, eerst als </w:t>
-      </w:r>
-      <w:r>
-        <w:rPr>
-          <w:rFonts w:ascii="Courier New" w:hAnsi="Courier New" w:cs="Courier New"/>
-          <w:sz w:val="22"/>
-          <w:szCs w:val="22"/>
-          <w:lang w:val="nl-NL"/>
-        </w:rPr>
-        <w:t xml:space="preserve">hoogleraar psychologie, vervolgens als </w:t>
+        <w:t xml:space="preserve">de komende jaren </w:t>
+      </w:r>
+      <w:r>
+        <w:rPr>
+          <w:rFonts w:ascii="Courier New" w:hAnsi="Courier New" w:cs="Courier New"/>
+          <w:sz w:val="22"/>
+          <w:szCs w:val="22"/>
+          <w:lang w:val="nl-NL"/>
+        </w:rPr>
+        <w:t>twee boeken te schrijven. Ze wilde na twintig jaar haar populaire ‘Cafetaria’-boek reviseren</w:t>
+      </w:r>
+      <w:r>
+        <w:rPr>
+          <w:rFonts w:ascii="Courier New" w:hAnsi="Courier New" w:cs="Courier New"/>
+          <w:sz w:val="22"/>
+          <w:szCs w:val="22"/>
+          <w:lang w:val="nl-NL"/>
+        </w:rPr>
+        <w:t xml:space="preserve">. Dat kwam in 2017 uit en </w:t>
+      </w:r>
+      <w:r>
+        <w:rPr>
+          <w:rFonts w:ascii="Courier New" w:hAnsi="Courier New" w:cs="Courier New"/>
+          <w:sz w:val="22"/>
+          <w:szCs w:val="22"/>
+          <w:lang w:val="nl-NL"/>
+        </w:rPr>
+        <w:t xml:space="preserve">de publicatie </w:t>
+      </w:r>
+      <w:r>
+        <w:rPr>
+          <w:rFonts w:ascii="Courier New" w:hAnsi="Courier New" w:cs="Courier New"/>
+          <w:sz w:val="22"/>
+          <w:szCs w:val="22"/>
+          <w:lang w:val="nl-NL"/>
+        </w:rPr>
+        <w:t xml:space="preserve">vroeg veel aandacht, zeker </w:t>
+      </w:r>
+      <w:r>
+        <w:rPr>
+          <w:rFonts w:ascii="Courier New" w:hAnsi="Courier New" w:cs="Courier New"/>
+          <w:sz w:val="22"/>
+          <w:szCs w:val="22"/>
+          <w:lang w:val="nl-NL"/>
+        </w:rPr>
+        <w:t xml:space="preserve">na de dood van </w:t>
+      </w:r>
+      <w:r>
+        <w:rPr>
+          <w:rFonts w:ascii="Courier New" w:hAnsi="Courier New" w:cs="Courier New"/>
+          <w:sz w:val="22"/>
+          <w:szCs w:val="22"/>
+          <w:lang w:val="nl-NL"/>
+        </w:rPr>
+        <w:t xml:space="preserve">George Floyd </w:t>
+      </w:r>
+      <w:r>
+        <w:rPr>
+          <w:rFonts w:ascii="Courier New" w:hAnsi="Courier New" w:cs="Courier New"/>
+          <w:sz w:val="22"/>
+          <w:szCs w:val="22"/>
+          <w:lang w:val="nl-NL"/>
+        </w:rPr>
+        <w:t>toen zij</w:t>
+      </w:r>
+      <w:r>
+        <w:rPr>
+          <w:rFonts w:ascii="Courier New" w:hAnsi="Courier New" w:cs="Courier New"/>
+          <w:sz w:val="22"/>
+          <w:szCs w:val="22"/>
+          <w:lang w:val="nl-NL"/>
+        </w:rPr>
+        <w:t xml:space="preserve"> voor haar boek overal moest opdraven. Het tweede boek dat ze in gedachten had was een soort memoires</w:t>
+      </w:r>
+      <w:r>
+        <w:rPr>
+          <w:rFonts w:ascii="Courier New" w:hAnsi="Courier New" w:cs="Courier New"/>
+          <w:sz w:val="22"/>
+          <w:szCs w:val="22"/>
+          <w:lang w:val="nl-NL"/>
+        </w:rPr>
+        <w:t xml:space="preserve"> </w:t>
+      </w:r>
+      <w:r>
+        <w:rPr>
+          <w:rFonts w:ascii="Courier New" w:hAnsi="Courier New" w:cs="Courier New"/>
+          <w:sz w:val="22"/>
+          <w:szCs w:val="22"/>
+          <w:lang w:val="nl-NL"/>
+        </w:rPr>
+        <w:t>en dat verscheen uiteindelijk in 2025</w:t>
+      </w:r>
+      <w:r>
+        <w:rPr>
+          <w:rFonts w:ascii="Courier New" w:hAnsi="Courier New" w:cs="Courier New"/>
+          <w:sz w:val="22"/>
+          <w:szCs w:val="22"/>
+          <w:lang w:val="nl-NL"/>
+        </w:rPr>
+        <w:t xml:space="preserve"> onder de titel </w:t>
       </w:r>
       <w:proofErr w:type="spellStart"/>
       <w:r>
         <w:rPr>
           <w:rFonts w:ascii="Courier New" w:hAnsi="Courier New" w:cs="Courier New"/>
-          <w:sz w:val="22"/>
-          <w:szCs w:val="22"/>
-          <w:lang w:val="nl-NL"/>
-        </w:rPr>
-        <w:t>dekaan</w:t>
+          <w:i/>
+          <w:iCs/>
+          <w:sz w:val="22"/>
+          <w:szCs w:val="22"/>
+          <w:lang w:val="nl-NL"/>
+        </w:rPr>
+        <w:t>Peril</w:t>
       </w:r>
       <w:proofErr w:type="spellEnd"/>
       <w:r>
         <w:rPr>
           <w:rFonts w:ascii="Courier New" w:hAnsi="Courier New" w:cs="Courier New"/>
-          <w:sz w:val="22"/>
-          <w:szCs w:val="22"/>
-          <w:lang w:val="nl-NL"/>
-        </w:rPr>
-        <w:t xml:space="preserve"> en president om daarna president van het </w:t>
+          <w:i/>
+          <w:iCs/>
+          <w:sz w:val="22"/>
+          <w:szCs w:val="22"/>
+          <w:lang w:val="nl-NL"/>
+        </w:rPr>
+        <w:t xml:space="preserve"> </w:t>
       </w:r>
       <w:proofErr w:type="spellStart"/>
       <w:r>
         <w:rPr>
           <w:rFonts w:ascii="Courier New" w:hAnsi="Courier New" w:cs="Courier New"/>
-          <w:sz w:val="22"/>
-          <w:szCs w:val="22"/>
-          <w:lang w:val="nl-NL"/>
-        </w:rPr>
-        <w:t>Spelman</w:t>
+          <w:i/>
+          <w:iCs/>
+          <w:sz w:val="22"/>
+          <w:szCs w:val="22"/>
+          <w:lang w:val="nl-NL"/>
+        </w:rPr>
+        <w:t>and</w:t>
       </w:r>
       <w:proofErr w:type="spellEnd"/>
       <w:r>
         <w:rPr>
           <w:rFonts w:ascii="Courier New" w:hAnsi="Courier New" w:cs="Courier New"/>
-          <w:sz w:val="22"/>
-          <w:szCs w:val="22"/>
-          <w:lang w:val="nl-NL"/>
-        </w:rPr>
-        <w:t xml:space="preserve"> College </w:t>
-      </w:r>
-      <w:r>
-        <w:rPr>
-          <w:rFonts w:ascii="Courier New" w:hAnsi="Courier New" w:cs="Courier New"/>
-          <w:sz w:val="22"/>
-          <w:szCs w:val="22"/>
-          <w:lang w:val="nl-NL"/>
-        </w:rPr>
-        <w:t xml:space="preserve">in Atlanta </w:t>
-      </w:r>
-      <w:r>
-        <w:rPr>
-          <w:rFonts w:ascii="Courier New" w:hAnsi="Courier New" w:cs="Courier New"/>
-          <w:sz w:val="22"/>
-          <w:szCs w:val="22"/>
-          <w:lang w:val="nl-NL"/>
-        </w:rPr>
-        <w:t>te worden</w:t>
-      </w:r>
-      <w:r>
-        <w:rPr>
-          <w:rFonts w:ascii="Courier New" w:hAnsi="Courier New" w:cs="Courier New"/>
-          <w:sz w:val="22"/>
-          <w:szCs w:val="22"/>
-          <w:lang w:val="nl-NL"/>
-        </w:rPr>
-        <w:t>, ook een vrouwencollege</w:t>
-      </w:r>
-      <w:r>
-        <w:rPr>
-          <w:rFonts w:ascii="Courier New" w:hAnsi="Courier New" w:cs="Courier New"/>
-          <w:sz w:val="22"/>
-          <w:szCs w:val="22"/>
-          <w:lang w:val="nl-NL"/>
-        </w:rPr>
-        <w:t>.</w:t>
-      </w:r>
-      <w:r>
-        <w:rPr>
-          <w:rFonts w:ascii="Courier New" w:hAnsi="Courier New" w:cs="Courier New"/>
-          <w:sz w:val="22"/>
-          <w:szCs w:val="22"/>
-          <w:lang w:val="nl-NL"/>
-        </w:rPr>
-        <w:t xml:space="preserve"> In het schooljaar 2022-2023 was ze nog een jaar interim</w:t>
-      </w:r>
-      <w:r>
-        <w:rPr>
-          <w:rFonts w:ascii="Courier New" w:hAnsi="Courier New" w:cs="Courier New"/>
-          <w:sz w:val="22"/>
-          <w:szCs w:val="22"/>
-          <w:lang w:val="nl-NL"/>
-        </w:rPr>
-        <w:t>-</w:t>
-      </w:r>
-      <w:r>
-        <w:rPr>
-          <w:rFonts w:ascii="Courier New" w:hAnsi="Courier New" w:cs="Courier New"/>
-          <w:sz w:val="22"/>
-          <w:szCs w:val="22"/>
-          <w:lang w:val="nl-NL"/>
-        </w:rPr>
-        <w:t xml:space="preserve">president op Mount </w:t>
+          <w:i/>
+          <w:iCs/>
+          <w:sz w:val="22"/>
+          <w:szCs w:val="22"/>
+          <w:lang w:val="nl-NL"/>
+        </w:rPr>
+        <w:t xml:space="preserve"> </w:t>
       </w:r>
       <w:proofErr w:type="spellStart"/>
       <w:r>
         <w:rPr>
           <w:rFonts w:ascii="Courier New" w:hAnsi="Courier New" w:cs="Courier New"/>
-          <w:sz w:val="22"/>
-          <w:szCs w:val="22"/>
-          <w:lang w:val="nl-NL"/>
-        </w:rPr>
-        <w:t>Holyoke</w:t>
+          <w:i/>
+          <w:iCs/>
+          <w:sz w:val="22"/>
+          <w:szCs w:val="22"/>
+          <w:lang w:val="nl-NL"/>
+        </w:rPr>
+        <w:t>Promise</w:t>
       </w:r>
       <w:proofErr w:type="spellEnd"/>
       <w:r>
         <w:rPr>
           <w:rFonts w:ascii="Courier New" w:hAnsi="Courier New" w:cs="Courier New"/>
-          <w:sz w:val="22"/>
-          <w:szCs w:val="22"/>
-          <w:lang w:val="nl-NL"/>
-        </w:rPr>
-        <w:t>. In 2015 was ze met pensioen gegaan en had zich voorgenomen twee boeken te schrijven. Ze wilde na twintig jaar haar populaire ‘Cafetaria’-boek reviseren</w:t>
-      </w:r>
-      <w:r>
-        <w:rPr>
-          <w:rFonts w:ascii="Courier New" w:hAnsi="Courier New" w:cs="Courier New"/>
-          <w:sz w:val="22"/>
-          <w:szCs w:val="22"/>
-          <w:lang w:val="nl-NL"/>
-        </w:rPr>
-        <w:t>. Dat kwam in 2017 uit en vroeg veel aandacht, zeker toen George Floyd en zij voor haar boek overal moest opdraven. Het tweede boek dat ze in gedachten had was een soort memoires</w:t>
-      </w:r>
-      <w:r>
-        <w:rPr>
-          <w:rFonts w:ascii="Courier New" w:hAnsi="Courier New" w:cs="Courier New"/>
-          <w:sz w:val="22"/>
-          <w:szCs w:val="22"/>
-          <w:lang w:val="nl-NL"/>
-        </w:rPr>
-        <w:t xml:space="preserve"> </w:t>
-      </w:r>
-      <w:r>
-        <w:rPr>
-          <w:rFonts w:ascii="Courier New" w:hAnsi="Courier New" w:cs="Courier New"/>
-          <w:sz w:val="22"/>
-          <w:szCs w:val="22"/>
-          <w:lang w:val="nl-NL"/>
-        </w:rPr>
-        <w:t xml:space="preserve">en dat verscheen uiteindelijk in 2025. Het is een boek geworden over </w:t>
+          <w:i/>
+          <w:iCs/>
+          <w:sz w:val="22"/>
+          <w:szCs w:val="22"/>
+          <w:lang w:val="nl-NL"/>
+        </w:rPr>
+        <w:t xml:space="preserve">. College </w:t>
+      </w:r>
+      <w:proofErr w:type="spellStart"/>
+      <w:r>
+        <w:rPr>
+          <w:rFonts w:ascii="Courier New" w:hAnsi="Courier New" w:cs="Courier New"/>
+          <w:i/>
+          <w:iCs/>
+          <w:sz w:val="22"/>
+          <w:szCs w:val="22"/>
+          <w:lang w:val="nl-NL"/>
+        </w:rPr>
+        <w:t>Leadership</w:t>
+      </w:r>
+      <w:proofErr w:type="spellEnd"/>
+      <w:r>
+        <w:rPr>
+          <w:rFonts w:ascii="Courier New" w:hAnsi="Courier New" w:cs="Courier New"/>
+          <w:i/>
+          <w:iCs/>
+          <w:sz w:val="22"/>
+          <w:szCs w:val="22"/>
+          <w:lang w:val="nl-NL"/>
+        </w:rPr>
+        <w:t xml:space="preserve"> in Turbulent Times</w:t>
+      </w:r>
+      <w:r>
+        <w:rPr>
+          <w:rFonts w:ascii="Courier New" w:hAnsi="Courier New" w:cs="Courier New"/>
+          <w:sz w:val="22"/>
+          <w:szCs w:val="22"/>
+          <w:lang w:val="nl-NL"/>
+        </w:rPr>
+        <w:t xml:space="preserve">. Het is een </w:t>
+      </w:r>
+      <w:r>
+        <w:rPr>
+          <w:rFonts w:ascii="Courier New" w:hAnsi="Courier New" w:cs="Courier New"/>
+          <w:sz w:val="22"/>
+          <w:szCs w:val="22"/>
+          <w:lang w:val="nl-NL"/>
+        </w:rPr>
+        <w:t xml:space="preserve">mooi en heel </w:t>
+      </w:r>
+      <w:r>
+        <w:rPr>
+          <w:rFonts w:ascii="Courier New" w:hAnsi="Courier New" w:cs="Courier New"/>
+          <w:sz w:val="22"/>
+          <w:szCs w:val="22"/>
+          <w:lang w:val="nl-NL"/>
+        </w:rPr>
+        <w:lastRenderedPageBreak/>
+        <w:t xml:space="preserve">leerzaam </w:t>
+      </w:r>
+      <w:r>
+        <w:rPr>
+          <w:rFonts w:ascii="Courier New" w:hAnsi="Courier New" w:cs="Courier New"/>
+          <w:sz w:val="22"/>
+          <w:szCs w:val="22"/>
+          <w:lang w:val="nl-NL"/>
+        </w:rPr>
+        <w:t xml:space="preserve">boek over </w:t>
       </w:r>
       <w:r>
         <w:rPr>
@@ -577,7 +1055,63 @@
           <w:sz w:val="22"/>
           <w:szCs w:val="22"/>
         </w:rPr>
-        <w:t xml:space="preserve">welke maatschappelijke problemen er spelen en waar je als leider van die instellingen mee te maken hebt. </w:t>
+        <w:t>de</w:t>
+      </w:r>
+      <w:r>
+        <w:rPr>
+          <w:rFonts w:ascii="Courier New" w:hAnsi="Courier New" w:cs="Courier New"/>
+          <w:sz w:val="22"/>
+          <w:szCs w:val="22"/>
+        </w:rPr>
+        <w:t xml:space="preserve"> maatschappelijke problemen </w:t>
+      </w:r>
+      <w:r>
+        <w:rPr>
+          <w:rFonts w:ascii="Courier New" w:hAnsi="Courier New" w:cs="Courier New"/>
+          <w:sz w:val="22"/>
+          <w:szCs w:val="22"/>
+        </w:rPr>
+        <w:t xml:space="preserve">die </w:t>
+      </w:r>
+      <w:r>
+        <w:rPr>
+          <w:rFonts w:ascii="Courier New" w:hAnsi="Courier New" w:cs="Courier New"/>
+          <w:sz w:val="22"/>
+          <w:szCs w:val="22"/>
+        </w:rPr>
+        <w:t>er spelen en wa</w:t>
+      </w:r>
+      <w:r>
+        <w:rPr>
+          <w:rFonts w:ascii="Courier New" w:hAnsi="Courier New" w:cs="Courier New"/>
+          <w:sz w:val="22"/>
+          <w:szCs w:val="22"/>
+        </w:rPr>
+        <w:t xml:space="preserve">t er van jou </w:t>
+      </w:r>
+      <w:r>
+        <w:rPr>
+          <w:rFonts w:ascii="Courier New" w:hAnsi="Courier New" w:cs="Courier New"/>
+          <w:sz w:val="22"/>
+          <w:szCs w:val="22"/>
+        </w:rPr>
+        <w:t>als leider van die instellingen m</w:t>
+      </w:r>
+      <w:r>
+        <w:rPr>
+          <w:rFonts w:ascii="Courier New" w:hAnsi="Courier New" w:cs="Courier New"/>
+          <w:sz w:val="22"/>
+          <w:szCs w:val="22"/>
+        </w:rPr>
+        <w:t>ag worden verwacht</w:t>
+      </w:r>
+      <w:r>
+        <w:rPr>
+          <w:rFonts w:ascii="Courier New" w:hAnsi="Courier New" w:cs="Courier New"/>
+          <w:sz w:val="22"/>
+          <w:szCs w:val="22"/>
+        </w:rPr>
+        <w:t xml:space="preserve">. </w:t>
       </w:r>
     </w:p>
     <w:p>
@@ -619,27 +1153,538 @@
           <w:szCs w:val="22"/>
           <w:lang w:val="nl-NL"/>
         </w:rPr>
-        <w:t>Universiteiten in Amerika</w:t>
+        <w:t xml:space="preserve">Als we aan het hoger onderwijs van Amerika denken wordt er al snel aan Harvard, Stanford, MIT, Princeton, Chicago of </w:t>
+      </w:r>
+      <w:proofErr w:type="spellStart"/>
+      <w:r>
+        <w:rPr>
+          <w:rFonts w:ascii="Courier New" w:hAnsi="Courier New" w:cs="Courier New"/>
+          <w:sz w:val="22"/>
+          <w:szCs w:val="22"/>
+          <w:lang w:val="nl-NL"/>
+        </w:rPr>
+        <w:t>Berkley</w:t>
+      </w:r>
+      <w:proofErr w:type="spellEnd"/>
+      <w:r>
+        <w:rPr>
+          <w:rFonts w:ascii="Courier New" w:hAnsi="Courier New" w:cs="Courier New"/>
+          <w:sz w:val="22"/>
+          <w:szCs w:val="22"/>
+          <w:lang w:val="nl-NL"/>
+        </w:rPr>
+        <w:t xml:space="preserve"> gedacht maar er zijn daar zo’n kleine 4000 instellingen van hoger onderwijs met meer dan 15 miljoen studenten. Het zijn vierjarige publieke instellingen (48%), </w:t>
+      </w:r>
+      <w:proofErr w:type="spellStart"/>
+      <w:r>
+        <w:rPr>
+          <w:rFonts w:ascii="Courier New" w:hAnsi="Courier New" w:cs="Courier New"/>
+          <w:sz w:val="22"/>
+          <w:szCs w:val="22"/>
+          <w:lang w:val="nl-NL"/>
+        </w:rPr>
+        <w:t>twee-jarige</w:t>
+      </w:r>
+      <w:proofErr w:type="spellEnd"/>
+      <w:r>
+        <w:rPr>
+          <w:rFonts w:ascii="Courier New" w:hAnsi="Courier New" w:cs="Courier New"/>
+          <w:sz w:val="22"/>
+          <w:szCs w:val="22"/>
+          <w:lang w:val="nl-NL"/>
+        </w:rPr>
+        <w:t xml:space="preserve"> publieke instellingen (29%), vierjarige private non-profit instellingen (17%) en nog een restant andersoortige instellingen. De raciale en etnische verdelingen over deze typen instellingen is heel groot. Het leiderschap van deze instellingen is veel minder </w:t>
+      </w:r>
+      <w:r>
+        <w:rPr>
+          <w:rFonts w:ascii="Courier New" w:hAnsi="Courier New" w:cs="Courier New"/>
+          <w:sz w:val="22"/>
+          <w:szCs w:val="22"/>
+          <w:lang w:val="nl-NL"/>
+        </w:rPr>
+        <w:t xml:space="preserve">divers. Het zijn vooral oudere witte mannen (gemiddeld 60 jaar) en 33% is vrouw. 25% is van kleur en 10% vrouw is van kleur. Tatum zelf groeide als enige zwarte student in haar klas op maar wel in een gezin met onderwijsambitie. </w:t>
       </w:r>
     </w:p>
     <w:p>
       <w:pPr>
         <w:spacing w:line="360" w:lineRule="auto"/>
-        <w:rPr>
-          <w:rFonts w:ascii="Courier New" w:hAnsi="Courier New" w:cs="Courier New"/>
-          <w:sz w:val="22"/>
-          <w:szCs w:val="22"/>
-          <w:lang w:val="nl-NL"/>
-        </w:rPr>
-      </w:pPr>
-      <w:r>
-        <w:rPr>
-          <w:rFonts w:ascii="Courier New" w:hAnsi="Courier New" w:cs="Courier New"/>
-          <w:sz w:val="22"/>
-          <w:szCs w:val="22"/>
-          <w:lang w:val="nl-NL"/>
-        </w:rPr>
-        <w:t>Problemen die er nu spelen?</w:t>
+        <w:ind w:firstLine="720"/>
+        <w:rPr>
+          <w:rFonts w:ascii="Courier New" w:hAnsi="Courier New" w:cs="Courier New"/>
+          <w:sz w:val="22"/>
+          <w:szCs w:val="22"/>
+          <w:lang w:val="nl-NL"/>
+        </w:rPr>
+      </w:pPr>
+      <w:r>
+        <w:rPr>
+          <w:rFonts w:ascii="Courier New" w:hAnsi="Courier New" w:cs="Courier New"/>
+          <w:sz w:val="22"/>
+          <w:szCs w:val="22"/>
+          <w:lang w:val="nl-NL"/>
+        </w:rPr>
+        <w:t xml:space="preserve">Als psychologe specialiseert zij zich in het thema ras en identiteit en werkt zich op tot hoogleraar. </w:t>
+      </w:r>
+      <w:r>
+        <w:rPr>
+          <w:rFonts w:ascii="Courier New" w:hAnsi="Courier New" w:cs="Courier New"/>
+          <w:sz w:val="22"/>
+          <w:szCs w:val="22"/>
+          <w:lang w:val="nl-NL"/>
+        </w:rPr>
+        <w:t xml:space="preserve">Wanneer Clinton het thema ras op de agenda zet en zij zelf net </w:t>
+      </w:r>
+      <w:proofErr w:type="spellStart"/>
+      <w:r>
+        <w:rPr>
+          <w:rFonts w:ascii="Courier New" w:hAnsi="Courier New" w:cs="Courier New"/>
+          <w:i/>
+          <w:iCs/>
+          <w:sz w:val="22"/>
+          <w:szCs w:val="22"/>
+          <w:lang w:val="nl-NL"/>
+        </w:rPr>
+        <w:t>Why</w:t>
+      </w:r>
+      <w:proofErr w:type="spellEnd"/>
+      <w:r>
+        <w:rPr>
+          <w:rFonts w:ascii="Courier New" w:hAnsi="Courier New" w:cs="Courier New"/>
+          <w:i/>
+          <w:iCs/>
+          <w:sz w:val="22"/>
+          <w:szCs w:val="22"/>
+          <w:lang w:val="nl-NL"/>
+        </w:rPr>
+        <w:t xml:space="preserve"> Are </w:t>
+      </w:r>
+      <w:proofErr w:type="spellStart"/>
+      <w:r>
+        <w:rPr>
+          <w:rFonts w:ascii="Courier New" w:hAnsi="Courier New" w:cs="Courier New"/>
+          <w:i/>
+          <w:iCs/>
+          <w:sz w:val="22"/>
+          <w:szCs w:val="22"/>
+          <w:lang w:val="nl-NL"/>
+        </w:rPr>
+        <w:t>All</w:t>
+      </w:r>
+      <w:proofErr w:type="spellEnd"/>
+      <w:r>
+        <w:rPr>
+          <w:rFonts w:ascii="Courier New" w:hAnsi="Courier New" w:cs="Courier New"/>
+          <w:i/>
+          <w:iCs/>
+          <w:sz w:val="22"/>
+          <w:szCs w:val="22"/>
+          <w:lang w:val="nl-NL"/>
+        </w:rPr>
+        <w:t xml:space="preserve"> </w:t>
+      </w:r>
+      <w:proofErr w:type="spellStart"/>
+      <w:r>
+        <w:rPr>
+          <w:rFonts w:ascii="Courier New" w:hAnsi="Courier New" w:cs="Courier New"/>
+          <w:i/>
+          <w:iCs/>
+          <w:sz w:val="22"/>
+          <w:szCs w:val="22"/>
+          <w:lang w:val="nl-NL"/>
+        </w:rPr>
+        <w:t>the</w:t>
+      </w:r>
+      <w:proofErr w:type="spellEnd"/>
+      <w:r>
+        <w:rPr>
+          <w:rFonts w:ascii="Courier New" w:hAnsi="Courier New" w:cs="Courier New"/>
+          <w:i/>
+          <w:iCs/>
+          <w:sz w:val="22"/>
+          <w:szCs w:val="22"/>
+          <w:lang w:val="nl-NL"/>
+        </w:rPr>
+        <w:t xml:space="preserve"> Black </w:t>
+      </w:r>
+      <w:proofErr w:type="spellStart"/>
+      <w:r>
+        <w:rPr>
+          <w:rFonts w:ascii="Courier New" w:hAnsi="Courier New" w:cs="Courier New"/>
+          <w:i/>
+          <w:iCs/>
+          <w:sz w:val="22"/>
+          <w:szCs w:val="22"/>
+          <w:lang w:val="nl-NL"/>
+        </w:rPr>
+        <w:t>Kids</w:t>
+      </w:r>
+      <w:proofErr w:type="spellEnd"/>
+      <w:r>
+        <w:rPr>
+          <w:rFonts w:ascii="Courier New" w:hAnsi="Courier New" w:cs="Courier New"/>
+          <w:i/>
+          <w:iCs/>
+          <w:sz w:val="22"/>
+          <w:szCs w:val="22"/>
+          <w:lang w:val="nl-NL"/>
+        </w:rPr>
+        <w:t xml:space="preserve"> </w:t>
+      </w:r>
+      <w:proofErr w:type="spellStart"/>
+      <w:r>
+        <w:rPr>
+          <w:rFonts w:ascii="Courier New" w:hAnsi="Courier New" w:cs="Courier New"/>
+          <w:i/>
+          <w:iCs/>
+          <w:sz w:val="22"/>
+          <w:szCs w:val="22"/>
+          <w:lang w:val="nl-NL"/>
+        </w:rPr>
+        <w:t>Sitting</w:t>
+      </w:r>
+      <w:proofErr w:type="spellEnd"/>
+      <w:r>
+        <w:rPr>
+          <w:rFonts w:ascii="Courier New" w:hAnsi="Courier New" w:cs="Courier New"/>
+          <w:i/>
+          <w:iCs/>
+          <w:sz w:val="22"/>
+          <w:szCs w:val="22"/>
+          <w:lang w:val="nl-NL"/>
+        </w:rPr>
+        <w:t xml:space="preserve"> </w:t>
+      </w:r>
+      <w:proofErr w:type="spellStart"/>
+      <w:r>
+        <w:rPr>
+          <w:rFonts w:ascii="Courier New" w:hAnsi="Courier New" w:cs="Courier New"/>
+          <w:i/>
+          <w:iCs/>
+          <w:sz w:val="22"/>
+          <w:szCs w:val="22"/>
+          <w:lang w:val="nl-NL"/>
+        </w:rPr>
+        <w:t>Together</w:t>
+      </w:r>
+      <w:proofErr w:type="spellEnd"/>
+      <w:r>
+        <w:rPr>
+          <w:rFonts w:ascii="Courier New" w:hAnsi="Courier New" w:cs="Courier New"/>
+          <w:i/>
+          <w:iCs/>
+          <w:sz w:val="22"/>
+          <w:szCs w:val="22"/>
+          <w:lang w:val="nl-NL"/>
+        </w:rPr>
+        <w:t xml:space="preserve"> in </w:t>
+      </w:r>
+      <w:proofErr w:type="spellStart"/>
+      <w:r>
+        <w:rPr>
+          <w:rFonts w:ascii="Courier New" w:hAnsi="Courier New" w:cs="Courier New"/>
+          <w:i/>
+          <w:iCs/>
+          <w:sz w:val="22"/>
+          <w:szCs w:val="22"/>
+          <w:lang w:val="nl-NL"/>
+        </w:rPr>
+        <w:t>the</w:t>
+      </w:r>
+      <w:proofErr w:type="spellEnd"/>
+      <w:r>
+        <w:rPr>
+          <w:rFonts w:ascii="Courier New" w:hAnsi="Courier New" w:cs="Courier New"/>
+          <w:i/>
+          <w:iCs/>
+          <w:sz w:val="22"/>
+          <w:szCs w:val="22"/>
+          <w:lang w:val="nl-NL"/>
+        </w:rPr>
+        <w:t xml:space="preserve"> Cafetaria? </w:t>
+      </w:r>
+      <w:proofErr w:type="spellStart"/>
+      <w:r>
+        <w:rPr>
+          <w:rFonts w:ascii="Courier New" w:hAnsi="Courier New" w:cs="Courier New"/>
+          <w:i/>
+          <w:iCs/>
+          <w:sz w:val="22"/>
+          <w:szCs w:val="22"/>
+          <w:lang w:val="nl-NL"/>
+        </w:rPr>
+        <w:t>And</w:t>
+      </w:r>
+      <w:proofErr w:type="spellEnd"/>
+      <w:r>
+        <w:rPr>
+          <w:rFonts w:ascii="Courier New" w:hAnsi="Courier New" w:cs="Courier New"/>
+          <w:i/>
+          <w:iCs/>
+          <w:sz w:val="22"/>
+          <w:szCs w:val="22"/>
+          <w:lang w:val="nl-NL"/>
+        </w:rPr>
+        <w:t xml:space="preserve"> </w:t>
+      </w:r>
+      <w:proofErr w:type="spellStart"/>
+      <w:r>
+        <w:rPr>
+          <w:rFonts w:ascii="Courier New" w:hAnsi="Courier New" w:cs="Courier New"/>
+          <w:i/>
+          <w:iCs/>
+          <w:sz w:val="22"/>
+          <w:szCs w:val="22"/>
+          <w:lang w:val="nl-NL"/>
+        </w:rPr>
+        <w:t>Other</w:t>
+      </w:r>
+      <w:proofErr w:type="spellEnd"/>
+      <w:r>
+        <w:rPr>
+          <w:rFonts w:ascii="Courier New" w:hAnsi="Courier New" w:cs="Courier New"/>
+          <w:i/>
+          <w:iCs/>
+          <w:sz w:val="22"/>
+          <w:szCs w:val="22"/>
+          <w:lang w:val="nl-NL"/>
+        </w:rPr>
+        <w:t xml:space="preserve"> </w:t>
+      </w:r>
+      <w:proofErr w:type="spellStart"/>
+      <w:r>
+        <w:rPr>
+          <w:rFonts w:ascii="Courier New" w:hAnsi="Courier New" w:cs="Courier New"/>
+          <w:i/>
+          <w:iCs/>
+          <w:sz w:val="22"/>
+          <w:szCs w:val="22"/>
+          <w:lang w:val="nl-NL"/>
+        </w:rPr>
+        <w:t>Conversations</w:t>
+      </w:r>
+      <w:proofErr w:type="spellEnd"/>
+      <w:r>
+        <w:rPr>
+          <w:rFonts w:ascii="Courier New" w:hAnsi="Courier New" w:cs="Courier New"/>
+          <w:i/>
+          <w:iCs/>
+          <w:sz w:val="22"/>
+          <w:szCs w:val="22"/>
+          <w:lang w:val="nl-NL"/>
+        </w:rPr>
+        <w:t xml:space="preserve"> </w:t>
+      </w:r>
+      <w:proofErr w:type="spellStart"/>
+      <w:r>
+        <w:rPr>
+          <w:rFonts w:ascii="Courier New" w:hAnsi="Courier New" w:cs="Courier New"/>
+          <w:i/>
+          <w:iCs/>
+          <w:sz w:val="22"/>
+          <w:szCs w:val="22"/>
+          <w:lang w:val="nl-NL"/>
+        </w:rPr>
+        <w:t>About</w:t>
+      </w:r>
+      <w:proofErr w:type="spellEnd"/>
+      <w:r>
+        <w:rPr>
+          <w:rFonts w:ascii="Courier New" w:hAnsi="Courier New" w:cs="Courier New"/>
+          <w:i/>
+          <w:iCs/>
+          <w:sz w:val="22"/>
+          <w:szCs w:val="22"/>
+          <w:lang w:val="nl-NL"/>
+        </w:rPr>
+        <w:t xml:space="preserve"> Race</w:t>
+      </w:r>
+      <w:r>
+        <w:rPr>
+          <w:rFonts w:ascii="Courier New" w:hAnsi="Courier New" w:cs="Courier New"/>
+          <w:sz w:val="22"/>
+          <w:szCs w:val="22"/>
+          <w:lang w:val="nl-NL"/>
+        </w:rPr>
+        <w:t xml:space="preserve"> had geschreven, komt zij zelf in de belangstelling te staan. Ze gaat zich afvragen of zij kan bijdragen aan het creëren van leeromgevingen die beter met segregatie en verschillen kunnen omgaan. Ze raakt </w:t>
+      </w:r>
+      <w:proofErr w:type="spellStart"/>
+      <w:r>
+        <w:rPr>
+          <w:rFonts w:ascii="Courier New" w:hAnsi="Courier New" w:cs="Courier New"/>
+          <w:sz w:val="22"/>
+          <w:szCs w:val="22"/>
+          <w:lang w:val="nl-NL"/>
+        </w:rPr>
+        <w:t>geïneresseerd</w:t>
+      </w:r>
+      <w:proofErr w:type="spellEnd"/>
+      <w:r>
+        <w:rPr>
+          <w:rFonts w:ascii="Courier New" w:hAnsi="Courier New" w:cs="Courier New"/>
+          <w:sz w:val="22"/>
+          <w:szCs w:val="22"/>
+          <w:lang w:val="nl-NL"/>
+        </w:rPr>
+        <w:t xml:space="preserve"> in dialogen tussen </w:t>
+      </w:r>
+      <w:proofErr w:type="spellStart"/>
+      <w:r>
+        <w:rPr>
+          <w:rFonts w:ascii="Courier New" w:hAnsi="Courier New" w:cs="Courier New"/>
+          <w:sz w:val="22"/>
+          <w:szCs w:val="22"/>
+          <w:lang w:val="nl-NL"/>
+        </w:rPr>
+        <w:t>verchillende</w:t>
+      </w:r>
+      <w:proofErr w:type="spellEnd"/>
+      <w:r>
+        <w:rPr>
+          <w:rFonts w:ascii="Courier New" w:hAnsi="Courier New" w:cs="Courier New"/>
+          <w:sz w:val="22"/>
+          <w:szCs w:val="22"/>
+          <w:lang w:val="nl-NL"/>
+        </w:rPr>
+        <w:t xml:space="preserve"> groepen en maakt daar werk van als decaan op haar eigen Mount </w:t>
+      </w:r>
+      <w:proofErr w:type="spellStart"/>
+      <w:r>
+        <w:rPr>
+          <w:rFonts w:ascii="Courier New" w:hAnsi="Courier New" w:cs="Courier New"/>
+          <w:sz w:val="22"/>
+          <w:szCs w:val="22"/>
+          <w:lang w:val="nl-NL"/>
+        </w:rPr>
+        <w:t>Holyoke</w:t>
+      </w:r>
+      <w:proofErr w:type="spellEnd"/>
+      <w:r>
+        <w:rPr>
+          <w:rFonts w:ascii="Courier New" w:hAnsi="Courier New" w:cs="Courier New"/>
+          <w:sz w:val="22"/>
+          <w:szCs w:val="22"/>
+          <w:lang w:val="nl-NL"/>
+        </w:rPr>
+        <w:t xml:space="preserve"> instituut. Zij stelt een gemeenschappelijke visie voor die ze als het ABC definieert: aanmoedigen van identiteitsvorming van alle studenten en dan met name van de gemarginaliseerde groepen, bouwen van een gemeenschap waar iedereen zich thuis voelt en </w:t>
+      </w:r>
+      <w:r>
+        <w:rPr>
+          <w:rFonts w:ascii="Courier New" w:hAnsi="Courier New" w:cs="Courier New"/>
+          <w:sz w:val="22"/>
+          <w:szCs w:val="22"/>
+          <w:lang w:val="nl-NL"/>
+        </w:rPr>
+        <w:t xml:space="preserve">het cultiveren van de leiderschapscapaciteiten van de studenten waarmee zij zich voorbereiden op wat er in hun tijd van verwacht wordt. En haar ABC lijkt natuurlijk erg op DEI (Diversiteit, </w:t>
+      </w:r>
+      <w:proofErr w:type="spellStart"/>
+      <w:r>
+        <w:rPr>
+          <w:rFonts w:ascii="Courier New" w:hAnsi="Courier New" w:cs="Courier New"/>
+          <w:sz w:val="22"/>
+          <w:szCs w:val="22"/>
+          <w:lang w:val="nl-NL"/>
+        </w:rPr>
+        <w:t>Egaliteit</w:t>
+      </w:r>
+      <w:proofErr w:type="spellEnd"/>
+      <w:r>
+        <w:rPr>
+          <w:rFonts w:ascii="Courier New" w:hAnsi="Courier New" w:cs="Courier New"/>
+          <w:sz w:val="22"/>
+          <w:szCs w:val="22"/>
+          <w:lang w:val="nl-NL"/>
+        </w:rPr>
+        <w:t xml:space="preserve"> en </w:t>
+      </w:r>
+      <w:proofErr w:type="spellStart"/>
+      <w:r>
+        <w:rPr>
+          <w:rFonts w:ascii="Courier New" w:hAnsi="Courier New" w:cs="Courier New"/>
+          <w:sz w:val="22"/>
+          <w:szCs w:val="22"/>
+          <w:lang w:val="nl-NL"/>
+        </w:rPr>
+        <w:t>Inclusiviteit</w:t>
+      </w:r>
+      <w:proofErr w:type="spellEnd"/>
+      <w:r>
+        <w:rPr>
+          <w:rFonts w:ascii="Courier New" w:hAnsi="Courier New" w:cs="Courier New"/>
+          <w:sz w:val="22"/>
+          <w:szCs w:val="22"/>
+          <w:lang w:val="nl-NL"/>
+        </w:rPr>
+        <w:t xml:space="preserve">) waar tegenwoordig van hogerhand zoveel weerstand. Waar </w:t>
+      </w:r>
+      <w:proofErr w:type="spellStart"/>
+      <w:r>
+        <w:rPr>
+          <w:rFonts w:ascii="Courier New" w:hAnsi="Courier New" w:cs="Courier New"/>
+          <w:sz w:val="22"/>
+          <w:szCs w:val="22"/>
+          <w:lang w:val="nl-NL"/>
+        </w:rPr>
+        <w:t>Trump</w:t>
+      </w:r>
+      <w:proofErr w:type="spellEnd"/>
+      <w:r>
+        <w:rPr>
+          <w:rFonts w:ascii="Courier New" w:hAnsi="Courier New" w:cs="Courier New"/>
+          <w:sz w:val="22"/>
+          <w:szCs w:val="22"/>
+          <w:lang w:val="nl-NL"/>
+        </w:rPr>
+        <w:t xml:space="preserve"> en de zijnen dit onder de noemer van </w:t>
+      </w:r>
+      <w:proofErr w:type="spellStart"/>
+      <w:r>
+        <w:rPr>
+          <w:rFonts w:ascii="Courier New" w:hAnsi="Courier New" w:cs="Courier New"/>
+          <w:sz w:val="22"/>
+          <w:szCs w:val="22"/>
+          <w:lang w:val="nl-NL"/>
+        </w:rPr>
+        <w:t>woke</w:t>
+      </w:r>
+      <w:proofErr w:type="spellEnd"/>
+      <w:r>
+        <w:rPr>
+          <w:rFonts w:ascii="Courier New" w:hAnsi="Courier New" w:cs="Courier New"/>
+          <w:sz w:val="22"/>
+          <w:szCs w:val="22"/>
+          <w:lang w:val="nl-NL"/>
+        </w:rPr>
+        <w:t xml:space="preserve"> plaatsen waar het hoger onderwijs van gevrijwaard moet worden, benadrukt Tatum juist de onderwijskundige en pedagogische waarde van een aanpak die </w:t>
+      </w:r>
+      <w:r>
+        <w:rPr>
+          <w:rFonts w:ascii="Courier New" w:hAnsi="Courier New" w:cs="Courier New"/>
+          <w:sz w:val="22"/>
+          <w:szCs w:val="22"/>
+          <w:lang w:val="nl-NL"/>
+        </w:rPr>
+        <w:lastRenderedPageBreak/>
+        <w:t xml:space="preserve">studenten het gevoel geven erbij te horen. Want het gaat er volgens Tatum om dat studenten in een omgeving komen waarin iedereen kan floreren en optimaal kan presteren. Want wat kun je erop tegen hebben als studenten een omgeving vinden waar ze het beste uit zichzelf kunnen halen? Zij laat zien wat die </w:t>
+      </w:r>
+      <w:proofErr w:type="spellStart"/>
+      <w:r>
+        <w:rPr>
+          <w:rFonts w:ascii="Courier New" w:hAnsi="Courier New" w:cs="Courier New"/>
+          <w:sz w:val="22"/>
+          <w:szCs w:val="22"/>
+          <w:lang w:val="nl-NL"/>
+        </w:rPr>
+        <w:t>woke</w:t>
+      </w:r>
+      <w:proofErr w:type="spellEnd"/>
+      <w:r>
+        <w:rPr>
+          <w:rFonts w:ascii="Courier New" w:hAnsi="Courier New" w:cs="Courier New"/>
+          <w:sz w:val="22"/>
+          <w:szCs w:val="22"/>
+          <w:lang w:val="nl-NL"/>
+        </w:rPr>
+        <w:t>-oorlog op het New College van Florida betekent.</w:t>
       </w:r>
     </w:p>
     <w:p>
@@ -652,35 +1697,6 @@
           <w:lang w:val="nl-NL"/>
         </w:rPr>
       </w:pPr>
-      <w:r>
-        <w:rPr>
-          <w:rFonts w:ascii="Courier New" w:hAnsi="Courier New" w:cs="Courier New"/>
-          <w:sz w:val="22"/>
-          <w:szCs w:val="22"/>
-          <w:lang w:val="nl-NL"/>
-        </w:rPr>
-        <w:t xml:space="preserve">Waar president, </w:t>
-      </w:r>
-      <w:proofErr w:type="spellStart"/>
-      <w:r>
-        <w:rPr>
-          <w:rFonts w:ascii="Courier New" w:hAnsi="Courier New" w:cs="Courier New"/>
-          <w:sz w:val="22"/>
-          <w:szCs w:val="22"/>
-          <w:lang w:val="nl-NL"/>
-        </w:rPr>
-        <w:t>dekaan</w:t>
-      </w:r>
-      <w:proofErr w:type="spellEnd"/>
-      <w:r>
-        <w:rPr>
-          <w:rFonts w:ascii="Courier New" w:hAnsi="Courier New" w:cs="Courier New"/>
-          <w:sz w:val="22"/>
-          <w:szCs w:val="22"/>
-          <w:lang w:val="nl-NL"/>
-        </w:rPr>
-        <w:t xml:space="preserve"> of bestuursvoorzitter van een universitaire instelling zoal mee te maken heeft.</w:t>
-      </w:r>
     </w:p>
     <w:p>
       <w:pPr>
@@ -692,6 +1708,69 @@
           <w:lang w:val="nl-NL"/>
         </w:rPr>
       </w:pPr>
+      <w:r>
+        <w:rPr>
+          <w:rFonts w:ascii="Courier New" w:hAnsi="Courier New" w:cs="Courier New"/>
+          <w:sz w:val="22"/>
+          <w:szCs w:val="22"/>
+          <w:lang w:val="nl-NL"/>
+        </w:rPr>
+        <w:t>W</w:t>
+      </w:r>
+      <w:r>
+        <w:rPr>
+          <w:rFonts w:ascii="Courier New" w:hAnsi="Courier New" w:cs="Courier New"/>
+          <w:sz w:val="22"/>
+          <w:szCs w:val="22"/>
+          <w:lang w:val="nl-NL"/>
+        </w:rPr>
+        <w:t xml:space="preserve">at mag er van jou als </w:t>
+      </w:r>
+      <w:r>
+        <w:rPr>
+          <w:rFonts w:ascii="Courier New" w:hAnsi="Courier New" w:cs="Courier New"/>
+          <w:sz w:val="22"/>
+          <w:szCs w:val="22"/>
+          <w:lang w:val="nl-NL"/>
+        </w:rPr>
+        <w:t xml:space="preserve">president, </w:t>
+      </w:r>
+      <w:r>
+        <w:rPr>
+          <w:rFonts w:ascii="Courier New" w:hAnsi="Courier New" w:cs="Courier New"/>
+          <w:sz w:val="22"/>
+          <w:szCs w:val="22"/>
+          <w:lang w:val="nl-NL"/>
+        </w:rPr>
+        <w:t>decaan</w:t>
+      </w:r>
+      <w:r>
+        <w:rPr>
+          <w:rFonts w:ascii="Courier New" w:hAnsi="Courier New" w:cs="Courier New"/>
+          <w:sz w:val="22"/>
+          <w:szCs w:val="22"/>
+          <w:lang w:val="nl-NL"/>
+        </w:rPr>
+        <w:t xml:space="preserve"> of bestuursvoorzitter </w:t>
+      </w:r>
+      <w:r>
+        <w:rPr>
+          <w:rFonts w:ascii="Courier New" w:hAnsi="Courier New" w:cs="Courier New"/>
+          <w:sz w:val="22"/>
+          <w:szCs w:val="22"/>
+          <w:lang w:val="nl-NL"/>
+        </w:rPr>
+        <w:t>zoal worden verwacht</w:t>
+      </w:r>
+      <w:r>
+        <w:rPr>
+          <w:rFonts w:ascii="Courier New" w:hAnsi="Courier New" w:cs="Courier New"/>
+          <w:sz w:val="22"/>
+          <w:szCs w:val="22"/>
+          <w:lang w:val="nl-NL"/>
+        </w:rPr>
+        <w:t>.</w:t>
+      </w:r>
     </w:p>
     <w:p>
       <w:pPr>
@@ -703,14 +1782,32 @@
           <w:lang w:val="nl-NL"/>
         </w:rPr>
       </w:pPr>
-      <w:r>
-        <w:rPr>
-          <w:rFonts w:ascii="Courier New" w:hAnsi="Courier New" w:cs="Courier New"/>
-          <w:sz w:val="22"/>
-          <w:szCs w:val="22"/>
-        </w:rPr>
-        <w:lastRenderedPageBreak/>
-        <w:t xml:space="preserve">instellingen die </w:t>
+    </w:p>
+    <w:p>
+      <w:pPr>
+        <w:spacing w:line="360" w:lineRule="auto"/>
+        <w:rPr>
+          <w:rFonts w:ascii="Courier New" w:hAnsi="Courier New" w:cs="Courier New"/>
+          <w:sz w:val="22"/>
+          <w:szCs w:val="22"/>
+          <w:lang w:val="nl-NL"/>
+        </w:rPr>
+      </w:pPr>
+      <w:r>
+        <w:rPr>
+          <w:rFonts w:ascii="Courier New" w:hAnsi="Courier New" w:cs="Courier New"/>
+          <w:sz w:val="22"/>
+          <w:szCs w:val="22"/>
+        </w:rPr>
+        <w:t>I</w:t>
+      </w:r>
+      <w:r>
+        <w:rPr>
+          <w:rFonts w:ascii="Courier New" w:hAnsi="Courier New" w:cs="Courier New"/>
+          <w:sz w:val="22"/>
+          <w:szCs w:val="22"/>
+        </w:rPr>
+        <w:t xml:space="preserve">nstellingen die </w:t>
       </w:r>
       <w:r>
         <w:rPr>
@@ -945,6 +2042,241 @@
     </w:sectPr>
   </w:body>
 </w:document>
+</file>
+
+<file path=word/numbering.xml><?xml version="1.0" encoding="utf-8"?>
+<w:numbering xmlns:wpc="http://schemas.microsoft.com/office/word/2010/wordprocessingCanvas" xmlns:cx="http://schemas.microsoft.com/office/drawing/2014/chartex" xmlns:cx1="http://schemas.microsoft.com/office/drawing/2015/9/8/chartex" xmlns:cx2="http://schemas.microsoft.com/office/drawing/2015/10/21/chartex" xmlns:cx3="http://schemas.microsoft.com/office/drawing/2016/5/9/chartex" xmlns:cx4="http://schemas.microsoft.com/office/drawing/2016/5/10/chartex" xmlns:cx5="http://schemas.microsoft.com/office/drawing/2016/5/11/chartex" xmlns:cx6="http://schemas.microsoft.com/office/drawing/2016/5/12/chartex" xmlns:cx7="http://schemas.microsoft.com/office/drawing/2016/5/13/chartex" xmlns:cx8="http://schemas.microsoft.com/office/drawing/2016/5/14/chartex" xmlns:mc="http://schemas.openxmlformats.org/markup-compatibility/2006" xmlns:aink="http://schemas.microsoft.com/office/drawing/2016/ink" xmlns:am3d="http://schemas.microsoft.com/office/drawing/2017/model3d" xmlns:o="urn:schemas-microsoft-com:office:office" xmlns:oel="http://schemas.microsoft.com/office/2019/extlst" xmlns:r="http://schemas.openxmlformats.org/officeDocument/2006/relationships" xmlns:m="http://schemas.openxmlformats.org/officeDocument/2006/math" xmlns:v="urn:schemas-microsoft-com:vml" xmlns:wp14="http://schemas.microsoft.com/office/word/2010/wordprocessingDrawing" xmlns:wp="http://schemas.openxmlformats.org/drawingml/2006/wordprocessingDrawing" xmlns:w10="urn:schemas-microsoft-com:office:word" xmlns:w="http://schemas.openxmlformats.org/wordprocessingml/2006/main" xmlns:w14="http://schemas.microsoft.com/office/word/2010/wordml" xmlns:w15="http://schemas.microsoft.com/office/word/2012/wordml" xmlns:w16cex="http://schemas.microsoft.com/office/word/2018/wordml/cex" xmlns:w16cid="http://schemas.microsoft.com/office/word/2016/wordml/cid" xmlns:w16="http://schemas.microsoft.com/office/word/2018/wordml" xmlns:w16du="http://schemas.microsoft.com/office/word/2023/wordml/word16du" xmlns:w16sdtdh="http://schemas.microsoft.com/office/word/2020/wordml/sdtdatahash" xmlns:w16se="http://schemas.microsoft.com/office/word/2015/wordml/symex" xmlns:wpg="http://schemas.microsoft.com/office/word/2010/wordprocessingGroup" xmlns:wpi="http://schemas.microsoft.com/office/word/2010/wordprocessingInk" xmlns:wne="http://schemas.microsoft.com/office/word/2006/wordml" xmlns:wps="http://schemas.microsoft.com/office/word/2010/wordprocessingShape" mc:Ignorable="w14 w15 w16se w16cid w16 w16cex w16sdtdh w16du wp14">
+  <w:abstractNum w:abstractNumId="0" w15:restartNumberingAfterBreak="0">
+    <w:nsid w:val="2AFE7C54"/>
+    <w:multiLevelType w:val="hybridMultilevel"/>
+    <w:tmpl w:val="B42A4186"/>
+    <w:lvl w:ilvl="0" w:tplc="BC4C51E8">
+      <w:numFmt w:val="bullet"/>
+      <w:lvlText w:val="-"/>
+      <w:lvlJc w:val="left"/>
+      <w:pPr>
+        <w:ind w:left="720" w:hanging="360"/>
+      </w:pPr>
+      <w:rPr>
+        <w:rFonts w:ascii="Courier New" w:eastAsiaTheme="minorHAnsi" w:hAnsi="Courier New" w:cs="Courier New" w:hint="default"/>
+      </w:rPr>
+    </w:lvl>
+    <w:lvl w:ilvl="1" w:tplc="08090003" w:tentative="1">
+      <w:start w:val="1"/>
+      <w:numFmt w:val="bullet"/>
+      <w:lvlText w:val="o"/>
+      <w:lvlJc w:val="left"/>
+      <w:pPr>
+        <w:ind w:left="1440" w:hanging="360"/>
+      </w:pPr>
+      <w:rPr>
+        <w:rFonts w:ascii="Courier New" w:hAnsi="Courier New" w:cs="Courier New" w:hint="default"/>
+      </w:rPr>
+    </w:lvl>
+    <w:lvl w:ilvl="2" w:tplc="08090005" w:tentative="1">
+      <w:start w:val="1"/>
+      <w:numFmt w:val="bullet"/>
+      <w:lvlText w:val=""/>
+      <w:lvlJc w:val="left"/>
+      <w:pPr>
+        <w:ind w:left="2160" w:hanging="360"/>
+      </w:pPr>
+      <w:rPr>
+        <w:rFonts w:ascii="Wingdings" w:hAnsi="Wingdings" w:hint="default"/>
+      </w:rPr>
+    </w:lvl>
+    <w:lvl w:ilvl="3" w:tplc="08090001" w:tentative="1">
+      <w:start w:val="1"/>
+      <w:numFmt w:val="bullet"/>
+      <w:lvlText w:val=""/>
+      <w:lvlJc w:val="left"/>
+      <w:pPr>
+        <w:ind w:left="2880" w:hanging="360"/>
+      </w:pPr>
+      <w:rPr>
+        <w:rFonts w:ascii="Symbol" w:hAnsi="Symbol" w:hint="default"/>
+      </w:rPr>
+    </w:lvl>
+    <w:lvl w:ilvl="4" w:tplc="08090003" w:tentative="1">
+      <w:start w:val="1"/>
+      <w:numFmt w:val="bullet"/>
+      <w:lvlText w:val="o"/>
+      <w:lvlJc w:val="left"/>
+      <w:pPr>
+        <w:ind w:left="3600" w:hanging="360"/>
+      </w:pPr>
+      <w:rPr>
+        <w:rFonts w:ascii="Courier New" w:hAnsi="Courier New" w:cs="Courier New" w:hint="default"/>
+      </w:rPr>
+    </w:lvl>
+    <w:lvl w:ilvl="5" w:tplc="08090005" w:tentative="1">
+      <w:start w:val="1"/>
+      <w:numFmt w:val="bullet"/>
+      <w:lvlText w:val=""/>
+      <w:lvlJc w:val="left"/>
+      <w:pPr>
+        <w:ind w:left="4320" w:hanging="360"/>
+      </w:pPr>
+      <w:rPr>
+        <w:rFonts w:ascii="Wingdings" w:hAnsi="Wingdings" w:hint="default"/>
+      </w:rPr>
+    </w:lvl>
+    <w:lvl w:ilvl="6" w:tplc="08090001" w:tentative="1">
+      <w:start w:val="1"/>
+      <w:numFmt w:val="bullet"/>
+      <w:lvlText w:val=""/>
+      <w:lvlJc w:val="left"/>
+      <w:pPr>
+        <w:ind w:left="5040" w:hanging="360"/>
+      </w:pPr>
+      <w:rPr>
+        <w:rFonts w:ascii="Symbol" w:hAnsi="Symbol" w:hint="default"/>
+      </w:rPr>
+    </w:lvl>
+    <w:lvl w:ilvl="7" w:tplc="08090003" w:tentative="1">
+      <w:start w:val="1"/>
+      <w:numFmt w:val="bullet"/>
+      <w:lvlText w:val="o"/>
+      <w:lvlJc w:val="left"/>
+      <w:pPr>
+        <w:ind w:left="5760" w:hanging="360"/>
+      </w:pPr>
+      <w:rPr>
+        <w:rFonts w:ascii="Courier New" w:hAnsi="Courier New" w:cs="Courier New" w:hint="default"/>
+      </w:rPr>
+    </w:lvl>
+    <w:lvl w:ilvl="8" w:tplc="08090005" w:tentative="1">
+      <w:start w:val="1"/>
+      <w:numFmt w:val="bullet"/>
+      <w:lvlText w:val=""/>
+      <w:lvlJc w:val="left"/>
+      <w:pPr>
+        <w:ind w:left="6480" w:hanging="360"/>
+      </w:pPr>
+      <w:rPr>
+        <w:rFonts w:ascii="Wingdings" w:hAnsi="Wingdings" w:hint="default"/>
+      </w:rPr>
+    </w:lvl>
+  </w:abstractNum>
+  <w:abstractNum w:abstractNumId="1" w15:restartNumberingAfterBreak="0">
+    <w:nsid w:val="50A91BC2"/>
+    <w:multiLevelType w:val="hybridMultilevel"/>
+    <w:tmpl w:val="86F01752"/>
+    <w:lvl w:ilvl="0" w:tplc="0C8A7A48">
+      <w:numFmt w:val="bullet"/>
+      <w:lvlText w:val="-"/>
+      <w:lvlJc w:val="left"/>
+      <w:pPr>
+        <w:ind w:left="720" w:hanging="360"/>
+      </w:pPr>
+      <w:rPr>
+        <w:rFonts w:ascii="Courier New" w:eastAsiaTheme="minorHAnsi" w:hAnsi="Courier New" w:cs="Courier New" w:hint="default"/>
+      </w:rPr>
+    </w:lvl>
+    <w:lvl w:ilvl="1" w:tplc="08090003" w:tentative="1">
+      <w:start w:val="1"/>
+      <w:numFmt w:val="bullet"/>
+      <w:lvlText w:val="o"/>
+      <w:lvlJc w:val="left"/>
+      <w:pPr>
+        <w:ind w:left="1440" w:hanging="360"/>
+      </w:pPr>
+      <w:rPr>
+        <w:rFonts w:ascii="Courier New" w:hAnsi="Courier New" w:cs="Courier New" w:hint="default"/>
+      </w:rPr>
+    </w:lvl>
+    <w:lvl w:ilvl="2" w:tplc="08090005" w:tentative="1">
+      <w:start w:val="1"/>
+      <w:numFmt w:val="bullet"/>
+      <w:lvlText w:val=""/>
+      <w:lvlJc w:val="left"/>
+      <w:pPr>
+        <w:ind w:left="2160" w:hanging="360"/>
+      </w:pPr>
+      <w:rPr>
+        <w:rFonts w:ascii="Wingdings" w:hAnsi="Wingdings" w:hint="default"/>
+      </w:rPr>
+    </w:lvl>
+    <w:lvl w:ilvl="3" w:tplc="08090001" w:tentative="1">
+      <w:start w:val="1"/>
+      <w:numFmt w:val="bullet"/>
+      <w:lvlText w:val=""/>
+      <w:lvlJc w:val="left"/>
+      <w:pPr>
+        <w:ind w:left="2880" w:hanging="360"/>
+      </w:pPr>
+      <w:rPr>
+        <w:rFonts w:ascii="Symbol" w:hAnsi="Symbol" w:hint="default"/>
+      </w:rPr>
+    </w:lvl>
+    <w:lvl w:ilvl="4" w:tplc="08090003" w:tentative="1">
+      <w:start w:val="1"/>
+      <w:numFmt w:val="bullet"/>
+      <w:lvlText w:val="o"/>
+      <w:lvlJc w:val="left"/>
+      <w:pPr>
+        <w:ind w:left="3600" w:hanging="360"/>
+      </w:pPr>
+      <w:rPr>
+        <w:rFonts w:ascii="Courier New" w:hAnsi="Courier New" w:cs="Courier New" w:hint="default"/>
+      </w:rPr>
+    </w:lvl>
+    <w:lvl w:ilvl="5" w:tplc="08090005" w:tentative="1">
+      <w:start w:val="1"/>
+      <w:numFmt w:val="bullet"/>
+      <w:lvlText w:val=""/>
+      <w:lvlJc w:val="left"/>
+      <w:pPr>
+        <w:ind w:left="4320" w:hanging="360"/>
+      </w:pPr>
+      <w:rPr>
+        <w:rFonts w:ascii="Wingdings" w:hAnsi="Wingdings" w:hint="default"/>
+      </w:rPr>
+    </w:lvl>
+    <w:lvl w:ilvl="6" w:tplc="08090001" w:tentative="1">
+      <w:start w:val="1"/>
+      <w:numFmt w:val="bullet"/>
+      <w:lvlText w:val=""/>
+      <w:lvlJc w:val="left"/>
+      <w:pPr>
+        <w:ind w:left="5040" w:hanging="360"/>
+      </w:pPr>
+      <w:rPr>
+        <w:rFonts w:ascii="Symbol" w:hAnsi="Symbol" w:hint="default"/>
+      </w:rPr>
+    </w:lvl>
+    <w:lvl w:ilvl="7" w:tplc="08090003" w:tentative="1">
+      <w:start w:val="1"/>
+      <w:numFmt w:val="bullet"/>
+      <w:lvlText w:val="o"/>
+      <w:lvlJc w:val="left"/>
+      <w:pPr>
+        <w:ind w:left="5760" w:hanging="360"/>
+      </w:pPr>
+      <w:rPr>
+        <w:rFonts w:ascii="Courier New" w:hAnsi="Courier New" w:cs="Courier New" w:hint="default"/>
+      </w:rPr>
+    </w:lvl>
+    <w:lvl w:ilvl="8" w:tplc="08090005" w:tentative="1">
+      <w:start w:val="1"/>
+      <w:numFmt w:val="bullet"/>
+      <w:lvlText w:val=""/>
+      <w:lvlJc w:val="left"/>
+      <w:pPr>
+        <w:ind w:left="6480" w:hanging="360"/>
+      </w:pPr>
+      <w:rPr>
+        <w:rFonts w:ascii="Wingdings" w:hAnsi="Wingdings" w:hint="default"/>
+      </w:rPr>
+    </w:lvl>
+  </w:abstractNum>
+  <w:num w:numId="1" w16cid:durableId="1849561257">
+    <w:abstractNumId w:val="0"/>
+  </w:num>
+  <w:num w:numId="2" w16cid:durableId="1100219858">
+    <w:abstractNumId w:val="1"/>
+  </w:num>
+</w:numbering>
 </file>
 
 <file path=word/styles.xml><?xml version="1.0" encoding="utf-8"?>

</xml_diff>

<commit_message>
25-02-25, Wie wil die baan bijgewerkt
</commit_message>
<xml_diff>
--- a/BlogsWord/Wiewildiebaan?.docx
+++ b/BlogsWord/Wiewildiebaan?.docx
@@ -82,17 +82,7 @@
           <w:sz w:val="22"/>
           <w:szCs w:val="22"/>
         </w:rPr>
-        <w:t>Het langetermijnsucces van het hoger onderwijs als publiek goed hangt niet alleen af van de institutionele leiders — en hun besturen, hun docenten, medewerkers, bestuurders en alumni — maar ook van de bredere gemeenschappen die hen steunen en geloven in de transformerende kracht van hun onderwijsopdracht.</w:t>
-      </w:r>
-      <w:r>
-        <w:rPr>
-          <w:rFonts w:ascii="Courier New" w:hAnsi="Courier New" w:cs="Courier New"/>
-          <w:i/>
-          <w:iCs/>
-          <w:sz w:val="22"/>
-          <w:szCs w:val="22"/>
-        </w:rPr>
-        <w:t>”</w:t>
+        <w:t>Het langetermijnsucces van het hoger onderwijs als publiek goed hangt niet alleen af van de institutionele leiders — en hun besturen, hun docenten, medewerkers, bestuurders en alumni — maar ook van de bredere gemeenschappen die hen steunen en geloven in de transformerende kracht van hun onderwijsopdracht.”</w:t>
       </w:r>
     </w:p>
     <w:p>
@@ -239,15 +229,47 @@
           <w:sz w:val="22"/>
           <w:szCs w:val="22"/>
         </w:rPr>
-        <w:t xml:space="preserve">, </w:t>
-      </w:r>
-      <w:r>
-        <w:rPr>
-          <w:rFonts w:ascii="Courier New" w:hAnsi="Courier New" w:cs="Courier New"/>
-          <w:sz w:val="22"/>
-          <w:szCs w:val="22"/>
-        </w:rPr>
-        <w:t xml:space="preserve">in Amerika ook nog de dreiging van het wapenbezit op de instellingen en </w:t>
+        <w:t>. I</w:t>
+      </w:r>
+      <w:r>
+        <w:rPr>
+          <w:rFonts w:ascii="Courier New" w:hAnsi="Courier New" w:cs="Courier New"/>
+          <w:sz w:val="22"/>
+          <w:szCs w:val="22"/>
+        </w:rPr>
+        <w:t xml:space="preserve">n Amerika </w:t>
+      </w:r>
+      <w:r>
+        <w:rPr>
+          <w:rFonts w:ascii="Courier New" w:hAnsi="Courier New" w:cs="Courier New"/>
+          <w:sz w:val="22"/>
+          <w:szCs w:val="22"/>
+        </w:rPr>
+        <w:t xml:space="preserve">is er </w:t>
+      </w:r>
+      <w:r>
+        <w:rPr>
+          <w:rFonts w:ascii="Courier New" w:hAnsi="Courier New" w:cs="Courier New"/>
+          <w:sz w:val="22"/>
+          <w:szCs w:val="22"/>
+        </w:rPr>
+        <w:t>ook nog de dreiging van het wapenbezit op de instellingen</w:t>
+      </w:r>
+      <w:r>
+        <w:rPr>
+          <w:rFonts w:ascii="Courier New" w:hAnsi="Courier New" w:cs="Courier New"/>
+          <w:sz w:val="22"/>
+          <w:szCs w:val="22"/>
+        </w:rPr>
+        <w:t>. En</w:t>
+      </w:r>
+      <w:r>
+        <w:rPr>
+          <w:rFonts w:ascii="Courier New" w:hAnsi="Courier New" w:cs="Courier New"/>
+          <w:sz w:val="22"/>
+          <w:szCs w:val="22"/>
+        </w:rPr>
+        <w:t xml:space="preserve"> </w:t>
       </w:r>
       <w:r>
         <w:rPr>
@@ -263,7 +285,31 @@
           <w:sz w:val="22"/>
           <w:szCs w:val="22"/>
         </w:rPr>
-        <w:t xml:space="preserve">überhaupt de vraag wat het hoger onderwijs oplevert en wat er in de deze samenleving van het hoger onderwijs </w:t>
+        <w:t xml:space="preserve">is er </w:t>
+      </w:r>
+      <w:r>
+        <w:rPr>
+          <w:rFonts w:ascii="Courier New" w:hAnsi="Courier New" w:cs="Courier New"/>
+          <w:sz w:val="22"/>
+          <w:szCs w:val="22"/>
+        </w:rPr>
+        <w:t>überhaupt de vraag wat het hoger onderwijs oplevert en wat er in de</w:t>
+      </w:r>
+      <w:r>
+        <w:rPr>
+          <w:rFonts w:ascii="Courier New" w:hAnsi="Courier New" w:cs="Courier New"/>
+          <w:sz w:val="22"/>
+          <w:szCs w:val="22"/>
+        </w:rPr>
+        <w:t xml:space="preserve"> tegenwoordige</w:t>
+      </w:r>
+      <w:r>
+        <w:rPr>
+          <w:rFonts w:ascii="Courier New" w:hAnsi="Courier New" w:cs="Courier New"/>
+          <w:sz w:val="22"/>
+          <w:szCs w:val="22"/>
+        </w:rPr>
+        <w:t xml:space="preserve"> samenleving van het hoger onderwijs </w:t>
       </w:r>
       <w:r>
         <w:rPr>
@@ -279,7 +325,55 @@
           <w:sz w:val="22"/>
           <w:szCs w:val="22"/>
         </w:rPr>
-        <w:t xml:space="preserve"> verwacht. Personen die de universiteiten en colleges leiden (of dat nou de presidenten zijn, de decanen, de voorzitters en de afdelingshoofden) hebben het zwaar tegenwoordig en dat roept nogal eens de vraag op wie deze baan nog </w:t>
+        <w:t xml:space="preserve"> verwacht. Personen die de universiteiten en colleges leiden</w:t>
+      </w:r>
+      <w:r>
+        <w:rPr>
+          <w:rFonts w:ascii="Courier New" w:hAnsi="Courier New" w:cs="Courier New"/>
+          <w:sz w:val="22"/>
+          <w:szCs w:val="22"/>
+        </w:rPr>
+        <w:t xml:space="preserve"> (</w:t>
+      </w:r>
+      <w:r>
+        <w:rPr>
+          <w:rFonts w:ascii="Courier New" w:hAnsi="Courier New" w:cs="Courier New"/>
+          <w:sz w:val="22"/>
+          <w:szCs w:val="22"/>
+        </w:rPr>
+        <w:t xml:space="preserve">of dat nou presidenten zijn, decanen, voorzitters </w:t>
+      </w:r>
+      <w:r>
+        <w:rPr>
+          <w:rFonts w:ascii="Courier New" w:hAnsi="Courier New" w:cs="Courier New"/>
+          <w:sz w:val="22"/>
+          <w:szCs w:val="22"/>
+        </w:rPr>
+        <w:t>of</w:t>
+      </w:r>
+      <w:r>
+        <w:rPr>
+          <w:rFonts w:ascii="Courier New" w:hAnsi="Courier New" w:cs="Courier New"/>
+          <w:sz w:val="22"/>
+          <w:szCs w:val="22"/>
+        </w:rPr>
+        <w:t xml:space="preserve"> afdelingshoofden </w:t>
+      </w:r>
+      <w:r>
+        <w:rPr>
+          <w:rFonts w:ascii="Courier New" w:hAnsi="Courier New" w:cs="Courier New"/>
+          <w:sz w:val="22"/>
+          <w:szCs w:val="22"/>
+        </w:rPr>
+        <w:t xml:space="preserve">zijn) </w:t>
+      </w:r>
+      <w:r>
+        <w:rPr>
+          <w:rFonts w:ascii="Courier New" w:hAnsi="Courier New" w:cs="Courier New"/>
+          <w:sz w:val="22"/>
+          <w:szCs w:val="22"/>
+        </w:rPr>
+        <w:t xml:space="preserve">hebben het zwaar tegenwoordig en dat roept nogal eens de vraag op wie deze baan nog </w:t>
       </w:r>
       <w:r>
         <w:rPr>
@@ -296,6 +390,22 @@
           <w:szCs w:val="22"/>
         </w:rPr>
         <w:t>hebben.</w:t>
+      </w:r>
+      <w:r>
+        <w:rPr>
+          <w:rFonts w:ascii="Courier New" w:hAnsi="Courier New" w:cs="Courier New"/>
+          <w:sz w:val="22"/>
+          <w:szCs w:val="22"/>
+        </w:rPr>
+        <w:t xml:space="preserve"> Ook Beverly Daniel Tatum krijgt als oud-president van enkele Amerikaanse Universiteiten vaak gesteld.</w:t>
+      </w:r>
+      <w:r>
+        <w:rPr>
+          <w:rFonts w:ascii="Courier New" w:hAnsi="Courier New" w:cs="Courier New"/>
+          <w:sz w:val="22"/>
+          <w:szCs w:val="22"/>
+        </w:rPr>
+        <w:t xml:space="preserve"> </w:t>
       </w:r>
     </w:p>
     <w:p>
@@ -316,52 +426,16 @@
           <w:szCs w:val="22"/>
           <w:lang w:val="nl-NL"/>
         </w:rPr>
-        <w:t>Beverly Daniel Tatum</w:t>
-      </w:r>
-      <w:r>
-        <w:rPr>
-          <w:rFonts w:ascii="Courier New" w:hAnsi="Courier New" w:cs="Courier New"/>
-          <w:sz w:val="22"/>
-          <w:szCs w:val="22"/>
-          <w:lang w:val="nl-NL"/>
-        </w:rPr>
-        <w:t xml:space="preserve"> doceerde psychologie </w:t>
-      </w:r>
-      <w:r>
-        <w:rPr>
-          <w:rFonts w:ascii="Courier New" w:hAnsi="Courier New" w:cs="Courier New"/>
-          <w:sz w:val="22"/>
-          <w:szCs w:val="22"/>
-          <w:lang w:val="nl-NL"/>
-        </w:rPr>
-        <w:t xml:space="preserve">en </w:t>
-      </w:r>
-      <w:r>
-        <w:rPr>
-          <w:rFonts w:ascii="Courier New" w:hAnsi="Courier New" w:cs="Courier New"/>
-          <w:sz w:val="22"/>
-          <w:szCs w:val="22"/>
-          <w:lang w:val="nl-NL"/>
-        </w:rPr>
-        <w:t xml:space="preserve">is </w:t>
-      </w:r>
-      <w:r>
-        <w:rPr>
-          <w:rFonts w:ascii="Courier New" w:hAnsi="Courier New" w:cs="Courier New"/>
-          <w:sz w:val="22"/>
-          <w:szCs w:val="22"/>
-          <w:lang w:val="nl-NL"/>
-        </w:rPr>
-        <w:t xml:space="preserve">gespecialiseerd in de thematiek van diversiteit, ras en identiteit. </w:t>
-      </w:r>
-      <w:r>
-        <w:rPr>
-          <w:rFonts w:ascii="Courier New" w:hAnsi="Courier New" w:cs="Courier New"/>
-          <w:sz w:val="22"/>
-          <w:szCs w:val="22"/>
-          <w:lang w:val="en-US"/>
-        </w:rPr>
-        <w:t xml:space="preserve">Zij </w:t>
+        <w:t xml:space="preserve">Beverly Daniel Tantum </w:t>
+      </w:r>
+      <w:r>
+        <w:rPr>
+          <w:rFonts w:ascii="Courier New" w:hAnsi="Courier New" w:cs="Courier New"/>
+          <w:sz w:val="22"/>
+          <w:szCs w:val="22"/>
+          <w:lang w:val="nl-NL"/>
+        </w:rPr>
+        <w:t xml:space="preserve">werkte dertien jaar (1989-2002) op Mount </w:t>
       </w:r>
       <w:proofErr w:type="spellStart"/>
       <w:r>
@@ -369,9 +443,9 @@
           <w:rFonts w:ascii="Courier New" w:hAnsi="Courier New" w:cs="Courier New"/>
           <w:sz w:val="22"/>
           <w:szCs w:val="22"/>
-          <w:lang w:val="en-US"/>
-        </w:rPr>
-        <w:t>schreef</w:t>
+          <w:lang w:val="nl-NL"/>
+        </w:rPr>
+        <w:t>Holyoke</w:t>
       </w:r>
       <w:proofErr w:type="spellEnd"/>
       <w:r>
@@ -379,9 +453,90 @@
           <w:rFonts w:ascii="Courier New" w:hAnsi="Courier New" w:cs="Courier New"/>
           <w:sz w:val="22"/>
           <w:szCs w:val="22"/>
-          <w:lang w:val="en-US"/>
-        </w:rPr>
-        <w:t xml:space="preserve"> het </w:t>
+          <w:lang w:val="nl-NL"/>
+        </w:rPr>
+        <w:t>-</w:t>
+      </w:r>
+      <w:r>
+        <w:rPr>
+          <w:rFonts w:ascii="Courier New" w:hAnsi="Courier New" w:cs="Courier New"/>
+          <w:sz w:val="22"/>
+          <w:szCs w:val="22"/>
+          <w:lang w:val="nl-NL"/>
+        </w:rPr>
+        <w:t>vrouwen</w:t>
+      </w:r>
+      <w:r>
+        <w:rPr>
+          <w:rFonts w:ascii="Courier New" w:hAnsi="Courier New" w:cs="Courier New"/>
+          <w:sz w:val="22"/>
+          <w:szCs w:val="22"/>
+          <w:lang w:val="nl-NL"/>
+        </w:rPr>
+        <w:t>college</w:t>
+      </w:r>
+      <w:r>
+        <w:rPr>
+          <w:rFonts w:ascii="Courier New" w:hAnsi="Courier New" w:cs="Courier New"/>
+          <w:sz w:val="22"/>
+          <w:szCs w:val="22"/>
+          <w:lang w:val="nl-NL"/>
+        </w:rPr>
+        <w:t xml:space="preserve"> in Massachusetts</w:t>
+      </w:r>
+      <w:r>
+        <w:rPr>
+          <w:rFonts w:ascii="Courier New" w:hAnsi="Courier New" w:cs="Courier New"/>
+          <w:sz w:val="22"/>
+          <w:szCs w:val="22"/>
+          <w:lang w:val="nl-NL"/>
+        </w:rPr>
+        <w:t xml:space="preserve">, eerst als </w:t>
+      </w:r>
+      <w:r>
+        <w:rPr>
+          <w:rFonts w:ascii="Courier New" w:hAnsi="Courier New" w:cs="Courier New"/>
+          <w:sz w:val="22"/>
+          <w:szCs w:val="22"/>
+          <w:lang w:val="nl-NL"/>
+        </w:rPr>
+        <w:t xml:space="preserve">hoogleraar psychologie, vervolgens als </w:t>
+      </w:r>
+      <w:r>
+        <w:rPr>
+          <w:rFonts w:ascii="Courier New" w:hAnsi="Courier New" w:cs="Courier New"/>
+          <w:sz w:val="22"/>
+          <w:szCs w:val="22"/>
+          <w:lang w:val="nl-NL"/>
+        </w:rPr>
+        <w:t>decaan</w:t>
+      </w:r>
+      <w:r>
+        <w:rPr>
+          <w:rFonts w:ascii="Courier New" w:hAnsi="Courier New" w:cs="Courier New"/>
+          <w:sz w:val="22"/>
+          <w:szCs w:val="22"/>
+          <w:lang w:val="nl-NL"/>
+        </w:rPr>
+        <w:t xml:space="preserve"> en president </w:t>
+      </w:r>
+      <w:r>
+        <w:rPr>
+          <w:rFonts w:ascii="Courier New" w:hAnsi="Courier New" w:cs="Courier New"/>
+          <w:sz w:val="22"/>
+          <w:szCs w:val="22"/>
+          <w:lang w:val="nl-NL"/>
+        </w:rPr>
+        <w:t xml:space="preserve">(en later nog een keer een jaar als interim-president) </w:t>
+      </w:r>
+      <w:r>
+        <w:rPr>
+          <w:rFonts w:ascii="Courier New" w:hAnsi="Courier New" w:cs="Courier New"/>
+          <w:sz w:val="22"/>
+          <w:szCs w:val="22"/>
+          <w:lang w:val="nl-NL"/>
+        </w:rPr>
+        <w:t xml:space="preserve">om daarna president van het </w:t>
       </w:r>
       <w:proofErr w:type="spellStart"/>
       <w:r>
@@ -389,9 +544,9 @@
           <w:rFonts w:ascii="Courier New" w:hAnsi="Courier New" w:cs="Courier New"/>
           <w:sz w:val="22"/>
           <w:szCs w:val="22"/>
-          <w:lang w:val="en-US"/>
-        </w:rPr>
-        <w:t>bekende</w:t>
+          <w:lang w:val="nl-NL"/>
+        </w:rPr>
+        <w:t>Spelman</w:t>
       </w:r>
       <w:proofErr w:type="spellEnd"/>
       <w:r>
@@ -399,30 +554,184 @@
           <w:rFonts w:ascii="Courier New" w:hAnsi="Courier New" w:cs="Courier New"/>
           <w:sz w:val="22"/>
           <w:szCs w:val="22"/>
-          <w:lang w:val="en-US"/>
+          <w:lang w:val="nl-NL"/>
+        </w:rPr>
+        <w:t xml:space="preserve"> College </w:t>
+      </w:r>
+      <w:r>
+        <w:rPr>
+          <w:rFonts w:ascii="Courier New" w:hAnsi="Courier New" w:cs="Courier New"/>
+          <w:sz w:val="22"/>
+          <w:szCs w:val="22"/>
+          <w:lang w:val="nl-NL"/>
+        </w:rPr>
+        <w:t xml:space="preserve">in Atlanta </w:t>
+      </w:r>
+      <w:r>
+        <w:rPr>
+          <w:rFonts w:ascii="Courier New" w:hAnsi="Courier New" w:cs="Courier New"/>
+          <w:sz w:val="22"/>
+          <w:szCs w:val="22"/>
+          <w:lang w:val="nl-NL"/>
+        </w:rPr>
+        <w:t>te worden</w:t>
+      </w:r>
+      <w:r>
+        <w:rPr>
+          <w:rFonts w:ascii="Courier New" w:hAnsi="Courier New" w:cs="Courier New"/>
+          <w:sz w:val="22"/>
+          <w:szCs w:val="22"/>
+          <w:lang w:val="nl-NL"/>
+        </w:rPr>
+        <w:t>, ook een vrouwencollege</w:t>
+      </w:r>
+      <w:r>
+        <w:rPr>
+          <w:rFonts w:ascii="Courier New" w:hAnsi="Courier New" w:cs="Courier New"/>
+          <w:sz w:val="22"/>
+          <w:szCs w:val="22"/>
+          <w:lang w:val="nl-NL"/>
+        </w:rPr>
+        <w:t>.</w:t>
+      </w:r>
+      <w:r>
+        <w:rPr>
+          <w:rFonts w:ascii="Courier New" w:hAnsi="Courier New" w:cs="Courier New"/>
+          <w:sz w:val="22"/>
+          <w:szCs w:val="22"/>
+          <w:lang w:val="nl-NL"/>
+        </w:rPr>
+        <w:t xml:space="preserve"> In 2015 </w:t>
+      </w:r>
+      <w:r>
+        <w:rPr>
+          <w:rFonts w:ascii="Courier New" w:hAnsi="Courier New" w:cs="Courier New"/>
+          <w:sz w:val="22"/>
+          <w:szCs w:val="22"/>
+          <w:lang w:val="nl-NL"/>
+        </w:rPr>
+        <w:t>ging</w:t>
+      </w:r>
+      <w:r>
+        <w:rPr>
+          <w:rFonts w:ascii="Courier New" w:hAnsi="Courier New" w:cs="Courier New"/>
+          <w:sz w:val="22"/>
+          <w:szCs w:val="22"/>
+          <w:lang w:val="nl-NL"/>
+        </w:rPr>
+        <w:t xml:space="preserve"> ze met pensioen en </w:t>
+      </w:r>
+      <w:r>
+        <w:rPr>
+          <w:rFonts w:ascii="Courier New" w:hAnsi="Courier New" w:cs="Courier New"/>
+          <w:sz w:val="22"/>
+          <w:szCs w:val="22"/>
+          <w:lang w:val="nl-NL"/>
+        </w:rPr>
+        <w:t>nam z</w:t>
+      </w:r>
+      <w:r>
+        <w:rPr>
+          <w:rFonts w:ascii="Courier New" w:hAnsi="Courier New" w:cs="Courier New"/>
+          <w:sz w:val="22"/>
+          <w:szCs w:val="22"/>
+          <w:lang w:val="nl-NL"/>
+        </w:rPr>
+        <w:t xml:space="preserve">ich voor daar nog eens </w:t>
+      </w:r>
+      <w:proofErr w:type="spellStart"/>
+      <w:r>
+        <w:rPr>
+          <w:rFonts w:ascii="Courier New" w:hAnsi="Courier New" w:cs="Courier New"/>
+          <w:sz w:val="22"/>
+          <w:szCs w:val="22"/>
+          <w:lang w:val="nl-NL"/>
+        </w:rPr>
+        <w:t>eens</w:t>
+      </w:r>
+      <w:proofErr w:type="spellEnd"/>
+      <w:r>
+        <w:rPr>
+          <w:rFonts w:ascii="Courier New" w:hAnsi="Courier New" w:cs="Courier New"/>
+          <w:sz w:val="22"/>
+          <w:szCs w:val="22"/>
+          <w:lang w:val="nl-NL"/>
+        </w:rPr>
+        <w:t xml:space="preserve"> een boek over te schrijven. Het duurde </w:t>
+      </w:r>
+      <w:r>
+        <w:rPr>
+          <w:rFonts w:ascii="Courier New" w:hAnsi="Courier New" w:cs="Courier New"/>
+          <w:sz w:val="22"/>
+          <w:szCs w:val="22"/>
+          <w:lang w:val="nl-NL"/>
+        </w:rPr>
+        <w:t>even omdat ze na</w:t>
+      </w:r>
+      <w:r>
+        <w:rPr>
+          <w:rFonts w:ascii="Courier New" w:hAnsi="Courier New" w:cs="Courier New"/>
+          <w:sz w:val="22"/>
+          <w:szCs w:val="22"/>
+          <w:lang w:val="nl-NL"/>
+        </w:rPr>
+        <w:t xml:space="preserve"> de dood van </w:t>
+      </w:r>
+      <w:r>
+        <w:rPr>
+          <w:rFonts w:ascii="Courier New" w:hAnsi="Courier New" w:cs="Courier New"/>
+          <w:sz w:val="22"/>
+          <w:szCs w:val="22"/>
+          <w:lang w:val="nl-NL"/>
+        </w:rPr>
+        <w:t xml:space="preserve">George Floyd </w:t>
+      </w:r>
+      <w:r>
+        <w:rPr>
+          <w:rFonts w:ascii="Courier New" w:hAnsi="Courier New" w:cs="Courier New"/>
+          <w:sz w:val="22"/>
+          <w:szCs w:val="22"/>
+          <w:lang w:val="nl-NL"/>
+        </w:rPr>
+        <w:t>bij allerlei discussie betrokken raakt</w:t>
+      </w:r>
+      <w:r>
+        <w:rPr>
+          <w:rFonts w:ascii="Courier New" w:hAnsi="Courier New" w:cs="Courier New"/>
+          <w:sz w:val="22"/>
+          <w:szCs w:val="22"/>
+          <w:lang w:val="nl-NL"/>
+        </w:rPr>
+        <w:t>. Het boek dat ze in gedachten had was een soort memoires</w:t>
+      </w:r>
+      <w:r>
+        <w:rPr>
+          <w:rFonts w:ascii="Courier New" w:hAnsi="Courier New" w:cs="Courier New"/>
+          <w:sz w:val="22"/>
+          <w:szCs w:val="22"/>
+          <w:lang w:val="nl-NL"/>
         </w:rPr>
         <w:t xml:space="preserve"> </w:t>
       </w:r>
+      <w:r>
+        <w:rPr>
+          <w:rFonts w:ascii="Courier New" w:hAnsi="Courier New" w:cs="Courier New"/>
+          <w:sz w:val="22"/>
+          <w:szCs w:val="22"/>
+          <w:lang w:val="nl-NL"/>
+        </w:rPr>
+        <w:t>en verscheen uiteindelijk in 2025</w:t>
+      </w:r>
+      <w:r>
+        <w:rPr>
+          <w:rFonts w:ascii="Courier New" w:hAnsi="Courier New" w:cs="Courier New"/>
+          <w:sz w:val="22"/>
+          <w:szCs w:val="22"/>
+          <w:lang w:val="nl-NL"/>
+        </w:rPr>
+        <w:t xml:space="preserve"> onder de titel </w:t>
+      </w:r>
       <w:proofErr w:type="spellStart"/>
-      <w:r>
-        <w:rPr>
-          <w:rFonts w:ascii="Courier New" w:hAnsi="Courier New" w:cs="Courier New"/>
-          <w:sz w:val="22"/>
-          <w:szCs w:val="22"/>
-          <w:lang w:val="en-US"/>
-        </w:rPr>
-        <w:t>boek</w:t>
-      </w:r>
-      <w:proofErr w:type="spellEnd"/>
-      <w:r>
-        <w:rPr>
-          <w:rFonts w:ascii="Courier New" w:hAnsi="Courier New" w:cs="Courier New"/>
-          <w:sz w:val="22"/>
-          <w:szCs w:val="22"/>
-          <w:lang w:val="en-US"/>
-        </w:rPr>
-        <w:t xml:space="preserve"> </w:t>
-      </w:r>
       <w:r>
         <w:rPr>
           <w:rFonts w:ascii="Courier New" w:hAnsi="Courier New" w:cs="Courier New"/>
@@ -430,11 +739,11 @@
           <w:iCs/>
           <w:sz w:val="22"/>
           <w:szCs w:val="22"/>
-          <w:lang w:val="en-US"/>
-        </w:rPr>
-        <w:t xml:space="preserve">Why Are All the Black Kids Sitting Together in the </w:t>
-      </w:r>
-      <w:proofErr w:type="spellStart"/>
+          <w:lang w:val="nl-NL"/>
+        </w:rPr>
+        <w:t>Peril</w:t>
+      </w:r>
+      <w:proofErr w:type="spellEnd"/>
       <w:r>
         <w:rPr>
           <w:rFonts w:ascii="Courier New" w:hAnsi="Courier New" w:cs="Courier New"/>
@@ -442,11 +751,11 @@
           <w:iCs/>
           <w:sz w:val="22"/>
           <w:szCs w:val="22"/>
-          <w:lang w:val="en-US"/>
-        </w:rPr>
-        <w:t>Cafetaria</w:t>
-      </w:r>
-      <w:proofErr w:type="spellEnd"/>
+          <w:lang w:val="nl-NL"/>
+        </w:rPr>
+        <w:t xml:space="preserve"> </w:t>
+      </w:r>
+      <w:proofErr w:type="spellStart"/>
       <w:r>
         <w:rPr>
           <w:rFonts w:ascii="Courier New" w:hAnsi="Courier New" w:cs="Courier New"/>
@@ -454,11 +763,11 @@
           <w:iCs/>
           <w:sz w:val="22"/>
           <w:szCs w:val="22"/>
-          <w:lang w:val="en-US"/>
-        </w:rPr>
-        <w:t xml:space="preserve">? </w:t>
-      </w:r>
-      <w:proofErr w:type="spellStart"/>
+          <w:lang w:val="nl-NL"/>
+        </w:rPr>
+        <w:t>and</w:t>
+      </w:r>
+      <w:proofErr w:type="spellEnd"/>
       <w:r>
         <w:rPr>
           <w:rFonts w:ascii="Courier New" w:hAnsi="Courier New" w:cs="Courier New"/>
@@ -468,9 +777,9 @@
           <w:szCs w:val="22"/>
           <w:lang w:val="nl-NL"/>
         </w:rPr>
-        <w:t>And</w:t>
-      </w:r>
-      <w:proofErr w:type="spellEnd"/>
+        <w:t xml:space="preserve"> </w:t>
+      </w:r>
+      <w:proofErr w:type="spellStart"/>
       <w:r>
         <w:rPr>
           <w:rFonts w:ascii="Courier New" w:hAnsi="Courier New" w:cs="Courier New"/>
@@ -480,9 +789,9 @@
           <w:szCs w:val="22"/>
           <w:lang w:val="nl-NL"/>
         </w:rPr>
-        <w:t xml:space="preserve"> </w:t>
-      </w:r>
-      <w:proofErr w:type="spellStart"/>
+        <w:t>Promise</w:t>
+      </w:r>
+      <w:proofErr w:type="spellEnd"/>
       <w:r>
         <w:rPr>
           <w:rFonts w:ascii="Courier New" w:hAnsi="Courier New" w:cs="Courier New"/>
@@ -492,9 +801,9 @@
           <w:szCs w:val="22"/>
           <w:lang w:val="nl-NL"/>
         </w:rPr>
-        <w:t>Other</w:t>
-      </w:r>
-      <w:proofErr w:type="spellEnd"/>
+        <w:t xml:space="preserve">. College </w:t>
+      </w:r>
+      <w:proofErr w:type="spellStart"/>
       <w:r>
         <w:rPr>
           <w:rFonts w:ascii="Courier New" w:hAnsi="Courier New" w:cs="Courier New"/>
@@ -504,9 +813,9 @@
           <w:szCs w:val="22"/>
           <w:lang w:val="nl-NL"/>
         </w:rPr>
-        <w:t xml:space="preserve"> </w:t>
-      </w:r>
-      <w:proofErr w:type="spellStart"/>
+        <w:t>Leadership</w:t>
+      </w:r>
+      <w:proofErr w:type="spellEnd"/>
       <w:r>
         <w:rPr>
           <w:rFonts w:ascii="Courier New" w:hAnsi="Courier New" w:cs="Courier New"/>
@@ -516,505 +825,53 @@
           <w:szCs w:val="22"/>
           <w:lang w:val="nl-NL"/>
         </w:rPr>
-        <w:t>Conversations</w:t>
-      </w:r>
-      <w:proofErr w:type="spellEnd"/>
-      <w:r>
-        <w:rPr>
-          <w:rFonts w:ascii="Courier New" w:hAnsi="Courier New" w:cs="Courier New"/>
-          <w:i/>
-          <w:iCs/>
+        <w:t xml:space="preserve"> in Turbulent Times</w:t>
+      </w:r>
+      <w:r>
+        <w:rPr>
+          <w:rFonts w:ascii="Courier New" w:hAnsi="Courier New" w:cs="Courier New"/>
+          <w:sz w:val="22"/>
+          <w:szCs w:val="22"/>
+          <w:lang w:val="nl-NL"/>
+        </w:rPr>
+        <w:t xml:space="preserve">. Het is een </w:t>
+      </w:r>
+      <w:r>
+        <w:rPr>
+          <w:rFonts w:ascii="Courier New" w:hAnsi="Courier New" w:cs="Courier New"/>
+          <w:sz w:val="22"/>
+          <w:szCs w:val="22"/>
+          <w:lang w:val="nl-NL"/>
+        </w:rPr>
+        <w:t xml:space="preserve">mooi en heel leerzaam </w:t>
+      </w:r>
+      <w:r>
+        <w:rPr>
+          <w:rFonts w:ascii="Courier New" w:hAnsi="Courier New" w:cs="Courier New"/>
+          <w:sz w:val="22"/>
+          <w:szCs w:val="22"/>
+          <w:lang w:val="nl-NL"/>
+        </w:rPr>
+        <w:t>boek o</w:t>
+      </w:r>
+      <w:r>
+        <w:rPr>
+          <w:rFonts w:ascii="Courier New" w:hAnsi="Courier New" w:cs="Courier New"/>
+          <w:sz w:val="22"/>
+          <w:szCs w:val="22"/>
+          <w:lang w:val="nl-NL"/>
+        </w:rPr>
+        <w:t>mdat het zo’n goed beeld geeft van</w:t>
+      </w:r>
+      <w:r>
+        <w:rPr>
+          <w:rFonts w:ascii="Courier New" w:hAnsi="Courier New" w:cs="Courier New"/>
           <w:sz w:val="22"/>
           <w:szCs w:val="22"/>
           <w:lang w:val="nl-NL"/>
         </w:rPr>
         <w:t xml:space="preserve"> </w:t>
       </w:r>
-      <w:proofErr w:type="spellStart"/>
-      <w:r>
-        <w:rPr>
-          <w:rFonts w:ascii="Courier New" w:hAnsi="Courier New" w:cs="Courier New"/>
-          <w:i/>
-          <w:iCs/>
-          <w:sz w:val="22"/>
-          <w:szCs w:val="22"/>
-          <w:lang w:val="nl-NL"/>
-        </w:rPr>
-        <w:t>About</w:t>
-      </w:r>
-      <w:proofErr w:type="spellEnd"/>
-      <w:r>
-        <w:rPr>
-          <w:rFonts w:ascii="Courier New" w:hAnsi="Courier New" w:cs="Courier New"/>
-          <w:i/>
-          <w:iCs/>
-          <w:sz w:val="22"/>
-          <w:szCs w:val="22"/>
-          <w:lang w:val="nl-NL"/>
-        </w:rPr>
-        <w:t xml:space="preserve"> Race</w:t>
-      </w:r>
-      <w:r>
-        <w:rPr>
-          <w:rFonts w:ascii="Courier New" w:hAnsi="Courier New" w:cs="Courier New"/>
-          <w:sz w:val="22"/>
-          <w:szCs w:val="22"/>
-          <w:lang w:val="nl-NL"/>
-        </w:rPr>
-        <w:t xml:space="preserve">. </w:t>
-      </w:r>
-      <w:r>
-        <w:rPr>
-          <w:rFonts w:ascii="Courier New" w:hAnsi="Courier New" w:cs="Courier New"/>
-          <w:sz w:val="22"/>
-          <w:szCs w:val="22"/>
-          <w:lang w:val="nl-NL"/>
-        </w:rPr>
-        <w:t xml:space="preserve">Zij werkte dertien jaar (1989-2002) op Mount </w:t>
-      </w:r>
-      <w:proofErr w:type="spellStart"/>
-      <w:r>
-        <w:rPr>
-          <w:rFonts w:ascii="Courier New" w:hAnsi="Courier New" w:cs="Courier New"/>
-          <w:sz w:val="22"/>
-          <w:szCs w:val="22"/>
-          <w:lang w:val="nl-NL"/>
-        </w:rPr>
-        <w:t>Holyoke</w:t>
-      </w:r>
-      <w:proofErr w:type="spellEnd"/>
-      <w:r>
-        <w:rPr>
-          <w:rFonts w:ascii="Courier New" w:hAnsi="Courier New" w:cs="Courier New"/>
-          <w:sz w:val="22"/>
-          <w:szCs w:val="22"/>
-          <w:lang w:val="nl-NL"/>
-        </w:rPr>
-        <w:t>-</w:t>
-      </w:r>
-      <w:r>
-        <w:rPr>
-          <w:rFonts w:ascii="Courier New" w:hAnsi="Courier New" w:cs="Courier New"/>
-          <w:sz w:val="22"/>
-          <w:szCs w:val="22"/>
-          <w:lang w:val="nl-NL"/>
-        </w:rPr>
-        <w:t>vrouwen</w:t>
-      </w:r>
-      <w:r>
-        <w:rPr>
-          <w:rFonts w:ascii="Courier New" w:hAnsi="Courier New" w:cs="Courier New"/>
-          <w:sz w:val="22"/>
-          <w:szCs w:val="22"/>
-          <w:lang w:val="nl-NL"/>
-        </w:rPr>
-        <w:t>college</w:t>
-      </w:r>
-      <w:r>
-        <w:rPr>
-          <w:rFonts w:ascii="Courier New" w:hAnsi="Courier New" w:cs="Courier New"/>
-          <w:sz w:val="22"/>
-          <w:szCs w:val="22"/>
-          <w:lang w:val="nl-NL"/>
-        </w:rPr>
-        <w:t xml:space="preserve"> in Massachusetts</w:t>
-      </w:r>
-      <w:r>
-        <w:rPr>
-          <w:rFonts w:ascii="Courier New" w:hAnsi="Courier New" w:cs="Courier New"/>
-          <w:sz w:val="22"/>
-          <w:szCs w:val="22"/>
-          <w:lang w:val="nl-NL"/>
-        </w:rPr>
-        <w:t xml:space="preserve">, eerst als </w:t>
-      </w:r>
-      <w:r>
-        <w:rPr>
-          <w:rFonts w:ascii="Courier New" w:hAnsi="Courier New" w:cs="Courier New"/>
-          <w:sz w:val="22"/>
-          <w:szCs w:val="22"/>
-          <w:lang w:val="nl-NL"/>
-        </w:rPr>
-        <w:t xml:space="preserve">hoogleraar psychologie, vervolgens als </w:t>
-      </w:r>
-      <w:r>
-        <w:rPr>
-          <w:rFonts w:ascii="Courier New" w:hAnsi="Courier New" w:cs="Courier New"/>
-          <w:sz w:val="22"/>
-          <w:szCs w:val="22"/>
-          <w:lang w:val="nl-NL"/>
-        </w:rPr>
-        <w:t>decaan</w:t>
-      </w:r>
-      <w:r>
-        <w:rPr>
-          <w:rFonts w:ascii="Courier New" w:hAnsi="Courier New" w:cs="Courier New"/>
-          <w:sz w:val="22"/>
-          <w:szCs w:val="22"/>
-          <w:lang w:val="nl-NL"/>
-        </w:rPr>
-        <w:t xml:space="preserve"> en president </w:t>
-      </w:r>
-      <w:r>
-        <w:rPr>
-          <w:rFonts w:ascii="Courier New" w:hAnsi="Courier New" w:cs="Courier New"/>
-          <w:sz w:val="22"/>
-          <w:szCs w:val="22"/>
-          <w:lang w:val="nl-NL"/>
-        </w:rPr>
-        <w:t xml:space="preserve">(en later nog een keer een jaar als interim-president) </w:t>
-      </w:r>
-      <w:r>
-        <w:rPr>
-          <w:rFonts w:ascii="Courier New" w:hAnsi="Courier New" w:cs="Courier New"/>
-          <w:sz w:val="22"/>
-          <w:szCs w:val="22"/>
-          <w:lang w:val="nl-NL"/>
-        </w:rPr>
-        <w:t xml:space="preserve">om daarna president van het </w:t>
-      </w:r>
-      <w:proofErr w:type="spellStart"/>
-      <w:r>
-        <w:rPr>
-          <w:rFonts w:ascii="Courier New" w:hAnsi="Courier New" w:cs="Courier New"/>
-          <w:sz w:val="22"/>
-          <w:szCs w:val="22"/>
-          <w:lang w:val="nl-NL"/>
-        </w:rPr>
-        <w:t>Spelman</w:t>
-      </w:r>
-      <w:proofErr w:type="spellEnd"/>
-      <w:r>
-        <w:rPr>
-          <w:rFonts w:ascii="Courier New" w:hAnsi="Courier New" w:cs="Courier New"/>
-          <w:sz w:val="22"/>
-          <w:szCs w:val="22"/>
-          <w:lang w:val="nl-NL"/>
-        </w:rPr>
-        <w:t xml:space="preserve"> College </w:t>
-      </w:r>
-      <w:r>
-        <w:rPr>
-          <w:rFonts w:ascii="Courier New" w:hAnsi="Courier New" w:cs="Courier New"/>
-          <w:sz w:val="22"/>
-          <w:szCs w:val="22"/>
-          <w:lang w:val="nl-NL"/>
-        </w:rPr>
-        <w:t xml:space="preserve">in Atlanta </w:t>
-      </w:r>
-      <w:r>
-        <w:rPr>
-          <w:rFonts w:ascii="Courier New" w:hAnsi="Courier New" w:cs="Courier New"/>
-          <w:sz w:val="22"/>
-          <w:szCs w:val="22"/>
-          <w:lang w:val="nl-NL"/>
-        </w:rPr>
-        <w:t>te worden</w:t>
-      </w:r>
-      <w:r>
-        <w:rPr>
-          <w:rFonts w:ascii="Courier New" w:hAnsi="Courier New" w:cs="Courier New"/>
-          <w:sz w:val="22"/>
-          <w:szCs w:val="22"/>
-          <w:lang w:val="nl-NL"/>
-        </w:rPr>
-        <w:t>, ook een vrouwencollege</w:t>
-      </w:r>
-      <w:r>
-        <w:rPr>
-          <w:rFonts w:ascii="Courier New" w:hAnsi="Courier New" w:cs="Courier New"/>
-          <w:sz w:val="22"/>
-          <w:szCs w:val="22"/>
-          <w:lang w:val="nl-NL"/>
-        </w:rPr>
-        <w:t>.</w:t>
-      </w:r>
-      <w:r>
-        <w:rPr>
-          <w:rFonts w:ascii="Courier New" w:hAnsi="Courier New" w:cs="Courier New"/>
-          <w:sz w:val="22"/>
-          <w:szCs w:val="22"/>
-          <w:lang w:val="nl-NL"/>
-        </w:rPr>
-        <w:t xml:space="preserve"> In 2015 </w:t>
-      </w:r>
-      <w:r>
-        <w:rPr>
-          <w:rFonts w:ascii="Courier New" w:hAnsi="Courier New" w:cs="Courier New"/>
-          <w:sz w:val="22"/>
-          <w:szCs w:val="22"/>
-          <w:lang w:val="nl-NL"/>
-        </w:rPr>
-        <w:t>ging</w:t>
-      </w:r>
-      <w:r>
-        <w:rPr>
-          <w:rFonts w:ascii="Courier New" w:hAnsi="Courier New" w:cs="Courier New"/>
-          <w:sz w:val="22"/>
-          <w:szCs w:val="22"/>
-          <w:lang w:val="nl-NL"/>
-        </w:rPr>
-        <w:t xml:space="preserve"> ze met pensioen en </w:t>
-      </w:r>
-      <w:r>
-        <w:rPr>
-          <w:rFonts w:ascii="Courier New" w:hAnsi="Courier New" w:cs="Courier New"/>
-          <w:sz w:val="22"/>
-          <w:szCs w:val="22"/>
-          <w:lang w:val="nl-NL"/>
-        </w:rPr>
-        <w:t>nam zich toen voor</w:t>
-      </w:r>
-      <w:r>
-        <w:rPr>
-          <w:rFonts w:ascii="Courier New" w:hAnsi="Courier New" w:cs="Courier New"/>
-          <w:sz w:val="22"/>
-          <w:szCs w:val="22"/>
-          <w:lang w:val="nl-NL"/>
-        </w:rPr>
-        <w:t xml:space="preserve"> </w:t>
-      </w:r>
-      <w:r>
-        <w:rPr>
-          <w:rFonts w:ascii="Courier New" w:hAnsi="Courier New" w:cs="Courier New"/>
-          <w:sz w:val="22"/>
-          <w:szCs w:val="22"/>
-          <w:lang w:val="nl-NL"/>
-        </w:rPr>
-        <w:t xml:space="preserve">de komende jaren </w:t>
-      </w:r>
-      <w:r>
-        <w:rPr>
-          <w:rFonts w:ascii="Courier New" w:hAnsi="Courier New" w:cs="Courier New"/>
-          <w:sz w:val="22"/>
-          <w:szCs w:val="22"/>
-          <w:lang w:val="nl-NL"/>
-        </w:rPr>
-        <w:t>twee boeken te schrijven. Ze wilde na twintig jaar haar populaire ‘Cafetaria’-boek reviseren</w:t>
-      </w:r>
-      <w:r>
-        <w:rPr>
-          <w:rFonts w:ascii="Courier New" w:hAnsi="Courier New" w:cs="Courier New"/>
-          <w:sz w:val="22"/>
-          <w:szCs w:val="22"/>
-          <w:lang w:val="nl-NL"/>
-        </w:rPr>
-        <w:t xml:space="preserve">. Dat kwam in 2017 uit en </w:t>
-      </w:r>
-      <w:r>
-        <w:rPr>
-          <w:rFonts w:ascii="Courier New" w:hAnsi="Courier New" w:cs="Courier New"/>
-          <w:sz w:val="22"/>
-          <w:szCs w:val="22"/>
-          <w:lang w:val="nl-NL"/>
-        </w:rPr>
-        <w:t xml:space="preserve">de publicatie </w:t>
-      </w:r>
-      <w:r>
-        <w:rPr>
-          <w:rFonts w:ascii="Courier New" w:hAnsi="Courier New" w:cs="Courier New"/>
-          <w:sz w:val="22"/>
-          <w:szCs w:val="22"/>
-          <w:lang w:val="nl-NL"/>
-        </w:rPr>
-        <w:t xml:space="preserve">vroeg veel aandacht, zeker </w:t>
-      </w:r>
-      <w:r>
-        <w:rPr>
-          <w:rFonts w:ascii="Courier New" w:hAnsi="Courier New" w:cs="Courier New"/>
-          <w:sz w:val="22"/>
-          <w:szCs w:val="22"/>
-          <w:lang w:val="nl-NL"/>
-        </w:rPr>
-        <w:t xml:space="preserve">na de dood van </w:t>
-      </w:r>
-      <w:r>
-        <w:rPr>
-          <w:rFonts w:ascii="Courier New" w:hAnsi="Courier New" w:cs="Courier New"/>
-          <w:sz w:val="22"/>
-          <w:szCs w:val="22"/>
-          <w:lang w:val="nl-NL"/>
-        </w:rPr>
-        <w:t xml:space="preserve">George Floyd </w:t>
-      </w:r>
-      <w:r>
-        <w:rPr>
-          <w:rFonts w:ascii="Courier New" w:hAnsi="Courier New" w:cs="Courier New"/>
-          <w:sz w:val="22"/>
-          <w:szCs w:val="22"/>
-          <w:lang w:val="nl-NL"/>
-        </w:rPr>
-        <w:t>toen zij</w:t>
-      </w:r>
-      <w:r>
-        <w:rPr>
-          <w:rFonts w:ascii="Courier New" w:hAnsi="Courier New" w:cs="Courier New"/>
-          <w:sz w:val="22"/>
-          <w:szCs w:val="22"/>
-          <w:lang w:val="nl-NL"/>
-        </w:rPr>
-        <w:t xml:space="preserve"> voor haar boek overal moest opdraven. Het tweede boek dat ze in gedachten had was een soort memoires</w:t>
-      </w:r>
-      <w:r>
-        <w:rPr>
-          <w:rFonts w:ascii="Courier New" w:hAnsi="Courier New" w:cs="Courier New"/>
-          <w:sz w:val="22"/>
-          <w:szCs w:val="22"/>
-          <w:lang w:val="nl-NL"/>
-        </w:rPr>
-        <w:t xml:space="preserve"> </w:t>
-      </w:r>
-      <w:r>
-        <w:rPr>
-          <w:rFonts w:ascii="Courier New" w:hAnsi="Courier New" w:cs="Courier New"/>
-          <w:sz w:val="22"/>
-          <w:szCs w:val="22"/>
-          <w:lang w:val="nl-NL"/>
-        </w:rPr>
-        <w:t>en dat verscheen uiteindelijk in 2025</w:t>
-      </w:r>
-      <w:r>
-        <w:rPr>
-          <w:rFonts w:ascii="Courier New" w:hAnsi="Courier New" w:cs="Courier New"/>
-          <w:sz w:val="22"/>
-          <w:szCs w:val="22"/>
-          <w:lang w:val="nl-NL"/>
-        </w:rPr>
-        <w:t xml:space="preserve"> onder de titel </w:t>
-      </w:r>
-      <w:proofErr w:type="spellStart"/>
-      <w:r>
-        <w:rPr>
-          <w:rFonts w:ascii="Courier New" w:hAnsi="Courier New" w:cs="Courier New"/>
-          <w:i/>
-          <w:iCs/>
-          <w:sz w:val="22"/>
-          <w:szCs w:val="22"/>
-          <w:lang w:val="nl-NL"/>
-        </w:rPr>
-        <w:t>Peril</w:t>
-      </w:r>
-      <w:proofErr w:type="spellEnd"/>
-      <w:r>
-        <w:rPr>
-          <w:rFonts w:ascii="Courier New" w:hAnsi="Courier New" w:cs="Courier New"/>
-          <w:i/>
-          <w:iCs/>
-          <w:sz w:val="22"/>
-          <w:szCs w:val="22"/>
-          <w:lang w:val="nl-NL"/>
-        </w:rPr>
-        <w:t xml:space="preserve"> </w:t>
-      </w:r>
-      <w:proofErr w:type="spellStart"/>
-      <w:r>
-        <w:rPr>
-          <w:rFonts w:ascii="Courier New" w:hAnsi="Courier New" w:cs="Courier New"/>
-          <w:i/>
-          <w:iCs/>
-          <w:sz w:val="22"/>
-          <w:szCs w:val="22"/>
-          <w:lang w:val="nl-NL"/>
-        </w:rPr>
-        <w:t>and</w:t>
-      </w:r>
-      <w:proofErr w:type="spellEnd"/>
-      <w:r>
-        <w:rPr>
-          <w:rFonts w:ascii="Courier New" w:hAnsi="Courier New" w:cs="Courier New"/>
-          <w:i/>
-          <w:iCs/>
-          <w:sz w:val="22"/>
-          <w:szCs w:val="22"/>
-          <w:lang w:val="nl-NL"/>
-        </w:rPr>
-        <w:t xml:space="preserve"> </w:t>
-      </w:r>
-      <w:proofErr w:type="spellStart"/>
-      <w:r>
-        <w:rPr>
-          <w:rFonts w:ascii="Courier New" w:hAnsi="Courier New" w:cs="Courier New"/>
-          <w:i/>
-          <w:iCs/>
-          <w:sz w:val="22"/>
-          <w:szCs w:val="22"/>
-          <w:lang w:val="nl-NL"/>
-        </w:rPr>
-        <w:t>Promise</w:t>
-      </w:r>
-      <w:proofErr w:type="spellEnd"/>
-      <w:r>
-        <w:rPr>
-          <w:rFonts w:ascii="Courier New" w:hAnsi="Courier New" w:cs="Courier New"/>
-          <w:i/>
-          <w:iCs/>
-          <w:sz w:val="22"/>
-          <w:szCs w:val="22"/>
-          <w:lang w:val="nl-NL"/>
-        </w:rPr>
-        <w:t xml:space="preserve">. College </w:t>
-      </w:r>
-      <w:proofErr w:type="spellStart"/>
-      <w:r>
-        <w:rPr>
-          <w:rFonts w:ascii="Courier New" w:hAnsi="Courier New" w:cs="Courier New"/>
-          <w:i/>
-          <w:iCs/>
-          <w:sz w:val="22"/>
-          <w:szCs w:val="22"/>
-          <w:lang w:val="nl-NL"/>
-        </w:rPr>
-        <w:t>Leadership</w:t>
-      </w:r>
-      <w:proofErr w:type="spellEnd"/>
-      <w:r>
-        <w:rPr>
-          <w:rFonts w:ascii="Courier New" w:hAnsi="Courier New" w:cs="Courier New"/>
-          <w:i/>
-          <w:iCs/>
-          <w:sz w:val="22"/>
-          <w:szCs w:val="22"/>
-          <w:lang w:val="nl-NL"/>
-        </w:rPr>
-        <w:t xml:space="preserve"> in Turbulent Times</w:t>
-      </w:r>
-      <w:r>
-        <w:rPr>
-          <w:rFonts w:ascii="Courier New" w:hAnsi="Courier New" w:cs="Courier New"/>
-          <w:sz w:val="22"/>
-          <w:szCs w:val="22"/>
-          <w:lang w:val="nl-NL"/>
-        </w:rPr>
-        <w:t xml:space="preserve">. Het is een </w:t>
-      </w:r>
-      <w:r>
-        <w:rPr>
-          <w:rFonts w:ascii="Courier New" w:hAnsi="Courier New" w:cs="Courier New"/>
-          <w:sz w:val="22"/>
-          <w:szCs w:val="22"/>
-          <w:lang w:val="nl-NL"/>
-        </w:rPr>
-        <w:t xml:space="preserve">mooi en heel </w:t>
-      </w:r>
-      <w:r>
-        <w:rPr>
-          <w:rFonts w:ascii="Courier New" w:hAnsi="Courier New" w:cs="Courier New"/>
-          <w:sz w:val="22"/>
-          <w:szCs w:val="22"/>
-          <w:lang w:val="nl-NL"/>
-        </w:rPr>
-        <w:lastRenderedPageBreak/>
-        <w:t xml:space="preserve">leerzaam </w:t>
-      </w:r>
-      <w:r>
-        <w:rPr>
-          <w:rFonts w:ascii="Courier New" w:hAnsi="Courier New" w:cs="Courier New"/>
-          <w:sz w:val="22"/>
-          <w:szCs w:val="22"/>
-          <w:lang w:val="nl-NL"/>
-        </w:rPr>
-        <w:t xml:space="preserve">boek over </w:t>
-      </w:r>
       <w:r>
         <w:rPr>
           <w:rFonts w:ascii="Courier New" w:hAnsi="Courier New" w:cs="Courier New"/>
@@ -1087,15 +944,55 @@
           <w:sz w:val="22"/>
           <w:szCs w:val="22"/>
         </w:rPr>
-        <w:t xml:space="preserve">t er van jou </w:t>
-      </w:r>
-      <w:r>
-        <w:rPr>
-          <w:rFonts w:ascii="Courier New" w:hAnsi="Courier New" w:cs="Courier New"/>
-          <w:sz w:val="22"/>
-          <w:szCs w:val="22"/>
-        </w:rPr>
-        <w:t>als leider van die instellingen m</w:t>
+        <w:t>t er v</w:t>
+      </w:r>
+      <w:r>
+        <w:rPr>
+          <w:rFonts w:ascii="Courier New" w:hAnsi="Courier New" w:cs="Courier New"/>
+          <w:sz w:val="22"/>
+          <w:szCs w:val="22"/>
+        </w:rPr>
+        <w:t>an</w:t>
+      </w:r>
+      <w:r>
+        <w:rPr>
+          <w:rFonts w:ascii="Courier New" w:hAnsi="Courier New" w:cs="Courier New"/>
+          <w:sz w:val="22"/>
+          <w:szCs w:val="22"/>
+        </w:rPr>
+        <w:t xml:space="preserve"> leider</w:t>
+      </w:r>
+      <w:r>
+        <w:rPr>
+          <w:rFonts w:ascii="Courier New" w:hAnsi="Courier New" w:cs="Courier New"/>
+          <w:sz w:val="22"/>
+          <w:szCs w:val="22"/>
+        </w:rPr>
+        <w:t>s</w:t>
+      </w:r>
+      <w:r>
+        <w:rPr>
+          <w:rFonts w:ascii="Courier New" w:hAnsi="Courier New" w:cs="Courier New"/>
+          <w:sz w:val="22"/>
+          <w:szCs w:val="22"/>
+        </w:rPr>
+        <w:t xml:space="preserve"> van d</w:t>
+      </w:r>
+      <w:r>
+        <w:rPr>
+          <w:rFonts w:ascii="Courier New" w:hAnsi="Courier New" w:cs="Courier New"/>
+          <w:sz w:val="22"/>
+          <w:szCs w:val="22"/>
+        </w:rPr>
+        <w:t>eze</w:t>
+      </w:r>
+      <w:r>
+        <w:rPr>
+          <w:rFonts w:ascii="Courier New" w:hAnsi="Courier New" w:cs="Courier New"/>
+          <w:sz w:val="22"/>
+          <w:szCs w:val="22"/>
+        </w:rPr>
+        <w:t xml:space="preserve"> instellingen m</w:t>
       </w:r>
       <w:r>
         <w:rPr>
@@ -1117,6 +1014,7 @@
     <w:p>
       <w:pPr>
         <w:spacing w:line="360" w:lineRule="auto"/>
+        <w:ind w:firstLine="720"/>
         <w:rPr>
           <w:rFonts w:ascii="Courier New" w:hAnsi="Courier New" w:cs="Courier New"/>
           <w:sz w:val="22"/>
@@ -1128,6 +1026,7 @@
     <w:p>
       <w:pPr>
         <w:spacing w:line="360" w:lineRule="auto"/>
+        <w:ind w:firstLine="720"/>
         <w:rPr>
           <w:rFonts w:ascii="Courier New" w:hAnsi="Courier New" w:cs="Courier New"/>
           <w:sz w:val="22"/>
@@ -1173,7 +1072,25 @@
           <w:szCs w:val="22"/>
           <w:lang w:val="nl-NL"/>
         </w:rPr>
-        <w:t xml:space="preserve"> gedacht maar er zijn daar zo’n kleine 4000 instellingen van hoger onderwijs met meer dan 15 miljoen studenten. Het zijn vierjarige publieke instellingen (48%), </w:t>
+        <w:t xml:space="preserve"> gedacht maar er zijn daar zo’n kleine 4000 instellingen van hoger onderwijs met meer dan 15 miljoen studenten. </w:t>
+      </w:r>
+      <w:r>
+        <w:rPr>
+          <w:rFonts w:ascii="Courier New" w:hAnsi="Courier New" w:cs="Courier New"/>
+          <w:sz w:val="22"/>
+          <w:szCs w:val="22"/>
+          <w:lang w:val="nl-NL"/>
+        </w:rPr>
+        <w:t>Er</w:t>
+      </w:r>
+      <w:r>
+        <w:rPr>
+          <w:rFonts w:ascii="Courier New" w:hAnsi="Courier New" w:cs="Courier New"/>
+          <w:sz w:val="22"/>
+          <w:szCs w:val="22"/>
+          <w:lang w:val="nl-NL"/>
+        </w:rPr>
+        <w:t xml:space="preserve"> zijn vierjarige publieke instellingen (48%), </w:t>
       </w:r>
       <w:proofErr w:type="spellStart"/>
       <w:r>
@@ -1193,16 +1110,277 @@
           <w:szCs w:val="22"/>
           <w:lang w:val="nl-NL"/>
         </w:rPr>
-        <w:t xml:space="preserve"> publieke instellingen (29%), vierjarige private non-profit instellingen (17%) en nog een restant andersoortige instellingen. De raciale en etnische verdelingen over deze typen instellingen is heel groot. Het leiderschap van deze instellingen is veel minder </w:t>
-      </w:r>
-      <w:r>
-        <w:rPr>
-          <w:rFonts w:ascii="Courier New" w:hAnsi="Courier New" w:cs="Courier New"/>
-          <w:sz w:val="22"/>
-          <w:szCs w:val="22"/>
-          <w:lang w:val="nl-NL"/>
-        </w:rPr>
-        <w:t xml:space="preserve">divers. Het zijn vooral oudere witte mannen (gemiddeld 60 jaar) en 33% is vrouw. 25% is van kleur en 10% vrouw is van kleur. Tatum zelf groeide als enige zwarte student in haar klas op maar wel in een gezin met onderwijsambitie. </w:t>
+        <w:t xml:space="preserve"> publieke instellingen (29%), vierjarige private non-profit instellingen (17%) en nog een restant andersoortige instellingen. </w:t>
+      </w:r>
+      <w:r>
+        <w:rPr>
+          <w:rFonts w:ascii="Courier New" w:hAnsi="Courier New" w:cs="Courier New"/>
+          <w:sz w:val="22"/>
+          <w:szCs w:val="22"/>
+          <w:lang w:val="nl-NL"/>
+        </w:rPr>
+        <w:t>Deze typen instellingen verschillen</w:t>
+      </w:r>
+      <w:r>
+        <w:rPr>
+          <w:rFonts w:ascii="Courier New" w:hAnsi="Courier New" w:cs="Courier New"/>
+          <w:sz w:val="22"/>
+          <w:szCs w:val="22"/>
+          <w:lang w:val="nl-NL"/>
+        </w:rPr>
+        <w:t xml:space="preserve"> </w:t>
+      </w:r>
+      <w:r>
+        <w:rPr>
+          <w:rFonts w:ascii="Courier New" w:hAnsi="Courier New" w:cs="Courier New"/>
+          <w:sz w:val="22"/>
+          <w:szCs w:val="22"/>
+          <w:lang w:val="nl-NL"/>
+        </w:rPr>
+        <w:t xml:space="preserve">sterk in </w:t>
+      </w:r>
+      <w:r>
+        <w:rPr>
+          <w:rFonts w:ascii="Courier New" w:hAnsi="Courier New" w:cs="Courier New"/>
+          <w:sz w:val="22"/>
+          <w:szCs w:val="22"/>
+          <w:lang w:val="nl-NL"/>
+        </w:rPr>
+        <w:t xml:space="preserve">raciale en etnische verdelingen </w:t>
+      </w:r>
+      <w:r>
+        <w:rPr>
+          <w:rFonts w:ascii="Courier New" w:hAnsi="Courier New" w:cs="Courier New"/>
+          <w:sz w:val="22"/>
+          <w:szCs w:val="22"/>
+          <w:lang w:val="nl-NL"/>
+        </w:rPr>
+        <w:t>van studentengroepen</w:t>
+      </w:r>
+      <w:r>
+        <w:rPr>
+          <w:rFonts w:ascii="Courier New" w:hAnsi="Courier New" w:cs="Courier New"/>
+          <w:sz w:val="22"/>
+          <w:szCs w:val="22"/>
+          <w:lang w:val="nl-NL"/>
+        </w:rPr>
+        <w:t xml:space="preserve">. Het leiderschap van deze instellingen is veel minder </w:t>
+      </w:r>
+      <w:r>
+        <w:rPr>
+          <w:rFonts w:ascii="Courier New" w:hAnsi="Courier New" w:cs="Courier New"/>
+          <w:sz w:val="22"/>
+          <w:szCs w:val="22"/>
+          <w:lang w:val="nl-NL"/>
+        </w:rPr>
+        <w:t xml:space="preserve">divers. Het zijn vooral oudere witte mannen </w:t>
+      </w:r>
+      <w:r>
+        <w:rPr>
+          <w:rFonts w:ascii="Courier New" w:hAnsi="Courier New" w:cs="Courier New"/>
+          <w:sz w:val="22"/>
+          <w:szCs w:val="22"/>
+          <w:lang w:val="nl-NL"/>
+        </w:rPr>
+        <w:t xml:space="preserve">met een </w:t>
+      </w:r>
+      <w:r>
+        <w:rPr>
+          <w:rFonts w:ascii="Courier New" w:hAnsi="Courier New" w:cs="Courier New"/>
+          <w:sz w:val="22"/>
+          <w:szCs w:val="22"/>
+          <w:lang w:val="nl-NL"/>
+        </w:rPr>
+        <w:t>gemiddeld</w:t>
+      </w:r>
+      <w:r>
+        <w:rPr>
+          <w:rFonts w:ascii="Courier New" w:hAnsi="Courier New" w:cs="Courier New"/>
+          <w:sz w:val="22"/>
+          <w:szCs w:val="22"/>
+          <w:lang w:val="nl-NL"/>
+        </w:rPr>
+        <w:t>e leeftijd van</w:t>
+      </w:r>
+      <w:r>
+        <w:rPr>
+          <w:rFonts w:ascii="Courier New" w:hAnsi="Courier New" w:cs="Courier New"/>
+          <w:sz w:val="22"/>
+          <w:szCs w:val="22"/>
+          <w:lang w:val="nl-NL"/>
+        </w:rPr>
+        <w:t xml:space="preserve"> 60 jaar</w:t>
+      </w:r>
+      <w:r>
+        <w:rPr>
+          <w:rFonts w:ascii="Courier New" w:hAnsi="Courier New" w:cs="Courier New"/>
+          <w:sz w:val="22"/>
+          <w:szCs w:val="22"/>
+          <w:lang w:val="nl-NL"/>
+        </w:rPr>
+        <w:t xml:space="preserve">. </w:t>
+      </w:r>
+      <w:r>
+        <w:rPr>
+          <w:rFonts w:ascii="Courier New" w:hAnsi="Courier New" w:cs="Courier New"/>
+          <w:sz w:val="22"/>
+          <w:szCs w:val="22"/>
+          <w:lang w:val="nl-NL"/>
+        </w:rPr>
+        <w:t xml:space="preserve">33% </w:t>
+      </w:r>
+      <w:r>
+        <w:rPr>
+          <w:rFonts w:ascii="Courier New" w:hAnsi="Courier New" w:cs="Courier New"/>
+          <w:sz w:val="22"/>
+          <w:szCs w:val="22"/>
+          <w:lang w:val="nl-NL"/>
+        </w:rPr>
+        <w:t>I</w:t>
+      </w:r>
+      <w:r>
+        <w:rPr>
+          <w:rFonts w:ascii="Courier New" w:hAnsi="Courier New" w:cs="Courier New"/>
+          <w:sz w:val="22"/>
+          <w:szCs w:val="22"/>
+          <w:lang w:val="nl-NL"/>
+        </w:rPr>
+        <w:t xml:space="preserve">s vrouw. </w:t>
+      </w:r>
+      <w:r>
+        <w:rPr>
+          <w:rFonts w:ascii="Courier New" w:hAnsi="Courier New" w:cs="Courier New"/>
+          <w:sz w:val="22"/>
+          <w:szCs w:val="22"/>
+          <w:lang w:val="nl-NL"/>
+        </w:rPr>
+        <w:t>Van de grote groep mannelijke leiders</w:t>
+      </w:r>
+      <w:r>
+        <w:rPr>
+          <w:rFonts w:ascii="Courier New" w:hAnsi="Courier New" w:cs="Courier New"/>
+          <w:sz w:val="22"/>
+          <w:szCs w:val="22"/>
+          <w:lang w:val="nl-NL"/>
+        </w:rPr>
+        <w:t xml:space="preserve"> is </w:t>
+      </w:r>
+      <w:r>
+        <w:rPr>
+          <w:rFonts w:ascii="Courier New" w:hAnsi="Courier New" w:cs="Courier New"/>
+          <w:sz w:val="22"/>
+          <w:szCs w:val="22"/>
+          <w:lang w:val="nl-NL"/>
+        </w:rPr>
+        <w:t>25% van kleur</w:t>
+      </w:r>
+      <w:r>
+        <w:rPr>
+          <w:rFonts w:ascii="Courier New" w:hAnsi="Courier New" w:cs="Courier New"/>
+          <w:sz w:val="22"/>
+          <w:szCs w:val="22"/>
+          <w:lang w:val="nl-NL"/>
+        </w:rPr>
+        <w:t>. V</w:t>
+      </w:r>
+      <w:r>
+        <w:rPr>
+          <w:rFonts w:ascii="Courier New" w:hAnsi="Courier New" w:cs="Courier New"/>
+          <w:sz w:val="22"/>
+          <w:szCs w:val="22"/>
+          <w:lang w:val="nl-NL"/>
+        </w:rPr>
+        <w:t xml:space="preserve">an de </w:t>
+      </w:r>
+      <w:r>
+        <w:rPr>
+          <w:rFonts w:ascii="Courier New" w:hAnsi="Courier New" w:cs="Courier New"/>
+          <w:sz w:val="22"/>
+          <w:szCs w:val="22"/>
+          <w:lang w:val="nl-NL"/>
+        </w:rPr>
+        <w:t xml:space="preserve">kleinere groep </w:t>
+      </w:r>
+      <w:r>
+        <w:rPr>
+          <w:rFonts w:ascii="Courier New" w:hAnsi="Courier New" w:cs="Courier New"/>
+          <w:sz w:val="22"/>
+          <w:szCs w:val="22"/>
+          <w:lang w:val="nl-NL"/>
+        </w:rPr>
+        <w:t>vrouw</w:t>
+      </w:r>
+      <w:r>
+        <w:rPr>
+          <w:rFonts w:ascii="Courier New" w:hAnsi="Courier New" w:cs="Courier New"/>
+          <w:sz w:val="22"/>
+          <w:szCs w:val="22"/>
+          <w:lang w:val="nl-NL"/>
+        </w:rPr>
+        <w:t>e</w:t>
+      </w:r>
+      <w:r>
+        <w:rPr>
+          <w:rFonts w:ascii="Courier New" w:hAnsi="Courier New" w:cs="Courier New"/>
+          <w:sz w:val="22"/>
+          <w:szCs w:val="22"/>
+          <w:lang w:val="nl-NL"/>
+        </w:rPr>
+        <w:t>lijke leiders</w:t>
+      </w:r>
+      <w:r>
+        <w:rPr>
+          <w:rFonts w:ascii="Courier New" w:hAnsi="Courier New" w:cs="Courier New"/>
+          <w:sz w:val="22"/>
+          <w:szCs w:val="22"/>
+          <w:lang w:val="nl-NL"/>
+        </w:rPr>
+        <w:t xml:space="preserve"> is </w:t>
+      </w:r>
+      <w:r>
+        <w:rPr>
+          <w:rFonts w:ascii="Courier New" w:hAnsi="Courier New" w:cs="Courier New"/>
+          <w:sz w:val="22"/>
+          <w:szCs w:val="22"/>
+          <w:lang w:val="nl-NL"/>
+        </w:rPr>
+        <w:t xml:space="preserve">10% </w:t>
+      </w:r>
+      <w:r>
+        <w:rPr>
+          <w:rFonts w:ascii="Courier New" w:hAnsi="Courier New" w:cs="Courier New"/>
+          <w:sz w:val="22"/>
+          <w:szCs w:val="22"/>
+          <w:lang w:val="nl-NL"/>
+        </w:rPr>
+        <w:t>van kleur</w:t>
+      </w:r>
+      <w:r>
+        <w:rPr>
+          <w:rFonts w:ascii="Courier New" w:hAnsi="Courier New" w:cs="Courier New"/>
+          <w:sz w:val="22"/>
+          <w:szCs w:val="22"/>
+          <w:lang w:val="nl-NL"/>
+        </w:rPr>
+        <w:t xml:space="preserve"> en Tatum is er daar één van</w:t>
+      </w:r>
+      <w:r>
+        <w:rPr>
+          <w:rFonts w:ascii="Courier New" w:hAnsi="Courier New" w:cs="Courier New"/>
+          <w:sz w:val="22"/>
+          <w:szCs w:val="22"/>
+          <w:lang w:val="nl-NL"/>
+        </w:rPr>
+        <w:t xml:space="preserve">. </w:t>
+      </w:r>
+      <w:r>
+        <w:rPr>
+          <w:rFonts w:ascii="Courier New" w:hAnsi="Courier New" w:cs="Courier New"/>
+          <w:sz w:val="22"/>
+          <w:szCs w:val="22"/>
+          <w:lang w:val="nl-NL"/>
+        </w:rPr>
+        <w:t xml:space="preserve"> </w:t>
       </w:r>
     </w:p>
     <w:p>
@@ -1223,18 +1401,176 @@
           <w:szCs w:val="22"/>
           <w:lang w:val="nl-NL"/>
         </w:rPr>
-        <w:t xml:space="preserve">Als psychologe specialiseert zij zich in het thema ras en identiteit en werkt zich op tot hoogleraar. </w:t>
-      </w:r>
-      <w:r>
-        <w:rPr>
-          <w:rFonts w:ascii="Courier New" w:hAnsi="Courier New" w:cs="Courier New"/>
-          <w:sz w:val="22"/>
-          <w:szCs w:val="22"/>
-          <w:lang w:val="nl-NL"/>
-        </w:rPr>
-        <w:t xml:space="preserve">Wanneer Clinton het thema ras op de agenda zet en zij zelf net </w:t>
+        <w:t>Tatum g</w:t>
+      </w:r>
+      <w:r>
+        <w:rPr>
+          <w:rFonts w:ascii="Courier New" w:hAnsi="Courier New" w:cs="Courier New"/>
+          <w:sz w:val="22"/>
+          <w:szCs w:val="22"/>
+          <w:lang w:val="nl-NL"/>
+        </w:rPr>
+        <w:t>roei</w:t>
+      </w:r>
+      <w:r>
+        <w:rPr>
+          <w:rFonts w:ascii="Courier New" w:hAnsi="Courier New" w:cs="Courier New"/>
+          <w:sz w:val="22"/>
+          <w:szCs w:val="22"/>
+          <w:lang w:val="nl-NL"/>
+        </w:rPr>
+        <w:t>t</w:t>
+      </w:r>
+      <w:r>
+        <w:rPr>
+          <w:rFonts w:ascii="Courier New" w:hAnsi="Courier New" w:cs="Courier New"/>
+          <w:sz w:val="22"/>
+          <w:szCs w:val="22"/>
+          <w:lang w:val="nl-NL"/>
+        </w:rPr>
+        <w:t xml:space="preserve"> als enige zwarte student in haar klas op maar wel in een gezin met </w:t>
+      </w:r>
+      <w:r>
+        <w:rPr>
+          <w:rFonts w:ascii="Courier New" w:hAnsi="Courier New" w:cs="Courier New"/>
+          <w:sz w:val="22"/>
+          <w:szCs w:val="22"/>
+          <w:lang w:val="nl-NL"/>
+        </w:rPr>
+        <w:t xml:space="preserve">een sterkte </w:t>
+      </w:r>
+      <w:r>
+        <w:rPr>
+          <w:rFonts w:ascii="Courier New" w:hAnsi="Courier New" w:cs="Courier New"/>
+          <w:sz w:val="22"/>
+          <w:szCs w:val="22"/>
+          <w:lang w:val="nl-NL"/>
+        </w:rPr>
+        <w:t xml:space="preserve">onderwijsambitie. </w:t>
+      </w:r>
+      <w:r>
+        <w:rPr>
+          <w:rFonts w:ascii="Courier New" w:hAnsi="Courier New" w:cs="Courier New"/>
+          <w:sz w:val="22"/>
+          <w:szCs w:val="22"/>
+          <w:lang w:val="nl-NL"/>
+        </w:rPr>
+        <w:t xml:space="preserve">Zij wordt psychologe, </w:t>
+      </w:r>
+      <w:r>
+        <w:rPr>
+          <w:rFonts w:ascii="Courier New" w:hAnsi="Courier New" w:cs="Courier New"/>
+          <w:sz w:val="22"/>
+          <w:szCs w:val="22"/>
+          <w:lang w:val="nl-NL"/>
+        </w:rPr>
+        <w:t>specialiseert zij zich in het thema ras en identiteit en werkt zich op tot hoogleraar</w:t>
+      </w:r>
+      <w:r>
+        <w:rPr>
+          <w:rFonts w:ascii="Courier New" w:hAnsi="Courier New" w:cs="Courier New"/>
+          <w:sz w:val="22"/>
+          <w:szCs w:val="22"/>
+          <w:lang w:val="nl-NL"/>
+        </w:rPr>
+        <w:t xml:space="preserve"> op het Mount </w:t>
       </w:r>
       <w:proofErr w:type="spellStart"/>
+      <w:r>
+        <w:rPr>
+          <w:rFonts w:ascii="Courier New" w:hAnsi="Courier New" w:cs="Courier New"/>
+          <w:sz w:val="22"/>
+          <w:szCs w:val="22"/>
+          <w:lang w:val="nl-NL"/>
+        </w:rPr>
+        <w:t>Holyoke</w:t>
+      </w:r>
+      <w:proofErr w:type="spellEnd"/>
+      <w:r>
+        <w:rPr>
+          <w:rFonts w:ascii="Courier New" w:hAnsi="Courier New" w:cs="Courier New"/>
+          <w:sz w:val="22"/>
+          <w:szCs w:val="22"/>
+          <w:lang w:val="nl-NL"/>
+        </w:rPr>
+        <w:t xml:space="preserve"> instituut</w:t>
+      </w:r>
+      <w:r>
+        <w:rPr>
+          <w:rFonts w:ascii="Courier New" w:hAnsi="Courier New" w:cs="Courier New"/>
+          <w:sz w:val="22"/>
+          <w:szCs w:val="22"/>
+          <w:lang w:val="nl-NL"/>
+        </w:rPr>
+        <w:t xml:space="preserve">. </w:t>
+      </w:r>
+      <w:r>
+        <w:rPr>
+          <w:rFonts w:ascii="Courier New" w:hAnsi="Courier New" w:cs="Courier New"/>
+          <w:sz w:val="22"/>
+          <w:szCs w:val="22"/>
+          <w:lang w:val="en-US"/>
+        </w:rPr>
+        <w:t xml:space="preserve">Zij </w:t>
+      </w:r>
+      <w:proofErr w:type="spellStart"/>
+      <w:r>
+        <w:rPr>
+          <w:rFonts w:ascii="Courier New" w:hAnsi="Courier New" w:cs="Courier New"/>
+          <w:sz w:val="22"/>
+          <w:szCs w:val="22"/>
+          <w:lang w:val="en-US"/>
+        </w:rPr>
+        <w:t>sch</w:t>
+      </w:r>
+      <w:r>
+        <w:rPr>
+          <w:rFonts w:ascii="Courier New" w:hAnsi="Courier New" w:cs="Courier New"/>
+          <w:sz w:val="22"/>
+          <w:szCs w:val="22"/>
+          <w:lang w:val="en-US"/>
+        </w:rPr>
+        <w:t>rijft</w:t>
+      </w:r>
+      <w:proofErr w:type="spellEnd"/>
+      <w:r>
+        <w:rPr>
+          <w:rFonts w:ascii="Courier New" w:hAnsi="Courier New" w:cs="Courier New"/>
+          <w:sz w:val="22"/>
+          <w:szCs w:val="22"/>
+          <w:lang w:val="en-US"/>
+        </w:rPr>
+        <w:t xml:space="preserve"> het</w:t>
+      </w:r>
+      <w:r>
+        <w:rPr>
+          <w:rFonts w:ascii="Courier New" w:hAnsi="Courier New" w:cs="Courier New"/>
+          <w:sz w:val="22"/>
+          <w:szCs w:val="22"/>
+          <w:lang w:val="en-US"/>
+        </w:rPr>
+        <w:t xml:space="preserve"> </w:t>
+      </w:r>
+      <w:proofErr w:type="spellStart"/>
+      <w:r>
+        <w:rPr>
+          <w:rFonts w:ascii="Courier New" w:hAnsi="Courier New" w:cs="Courier New"/>
+          <w:sz w:val="22"/>
+          <w:szCs w:val="22"/>
+          <w:lang w:val="en-US"/>
+        </w:rPr>
+        <w:t>boek</w:t>
+      </w:r>
+      <w:proofErr w:type="spellEnd"/>
+      <w:r>
+        <w:rPr>
+          <w:rFonts w:ascii="Courier New" w:hAnsi="Courier New" w:cs="Courier New"/>
+          <w:sz w:val="22"/>
+          <w:szCs w:val="22"/>
+          <w:lang w:val="en-US"/>
+        </w:rPr>
+        <w:t xml:space="preserve"> </w:t>
+      </w:r>
       <w:r>
         <w:rPr>
           <w:rFonts w:ascii="Courier New" w:hAnsi="Courier New" w:cs="Courier New"/>
@@ -1242,11 +1578,11 @@
           <w:iCs/>
           <w:sz w:val="22"/>
           <w:szCs w:val="22"/>
-          <w:lang w:val="nl-NL"/>
-        </w:rPr>
-        <w:t>Why</w:t>
-      </w:r>
-      <w:proofErr w:type="spellEnd"/>
+          <w:lang w:val="en-US"/>
+        </w:rPr>
+        <w:t xml:space="preserve">Why Are All the Black Kids Sitting Together in the </w:t>
+      </w:r>
+      <w:proofErr w:type="spellStart"/>
       <w:r>
         <w:rPr>
           <w:rFonts w:ascii="Courier New" w:hAnsi="Courier New" w:cs="Courier New"/>
@@ -1254,11 +1590,11 @@
           <w:iCs/>
           <w:sz w:val="22"/>
           <w:szCs w:val="22"/>
-          <w:lang w:val="nl-NL"/>
-        </w:rPr>
-        <w:t xml:space="preserve"> Are </w:t>
-      </w:r>
-      <w:proofErr w:type="spellStart"/>
+          <w:lang w:val="en-US"/>
+        </w:rPr>
+        <w:t>Cafetaria</w:t>
+      </w:r>
+      <w:proofErr w:type="spellEnd"/>
       <w:r>
         <w:rPr>
           <w:rFonts w:ascii="Courier New" w:hAnsi="Courier New" w:cs="Courier New"/>
@@ -1266,11 +1602,11 @@
           <w:iCs/>
           <w:sz w:val="22"/>
           <w:szCs w:val="22"/>
-          <w:lang w:val="nl-NL"/>
-        </w:rPr>
-        <w:t>All</w:t>
-      </w:r>
-      <w:proofErr w:type="spellEnd"/>
+          <w:lang w:val="en-US"/>
+        </w:rPr>
+        <w:t xml:space="preserve">? </w:t>
+      </w:r>
+      <w:proofErr w:type="spellStart"/>
       <w:r>
         <w:rPr>
           <w:rFonts w:ascii="Courier New" w:hAnsi="Courier New" w:cs="Courier New"/>
@@ -1280,9 +1616,9 @@
           <w:szCs w:val="22"/>
           <w:lang w:val="nl-NL"/>
         </w:rPr>
-        <w:t xml:space="preserve"> </w:t>
-      </w:r>
-      <w:proofErr w:type="spellStart"/>
+        <w:t>And</w:t>
+      </w:r>
+      <w:proofErr w:type="spellEnd"/>
       <w:r>
         <w:rPr>
           <w:rFonts w:ascii="Courier New" w:hAnsi="Courier New" w:cs="Courier New"/>
@@ -1292,9 +1628,9 @@
           <w:szCs w:val="22"/>
           <w:lang w:val="nl-NL"/>
         </w:rPr>
-        <w:t>the</w:t>
-      </w:r>
-      <w:proofErr w:type="spellEnd"/>
+        <w:t xml:space="preserve"> </w:t>
+      </w:r>
+      <w:proofErr w:type="spellStart"/>
       <w:r>
         <w:rPr>
           <w:rFonts w:ascii="Courier New" w:hAnsi="Courier New" w:cs="Courier New"/>
@@ -1304,9 +1640,9 @@
           <w:szCs w:val="22"/>
           <w:lang w:val="nl-NL"/>
         </w:rPr>
-        <w:t xml:space="preserve"> Black </w:t>
-      </w:r>
-      <w:proofErr w:type="spellStart"/>
+        <w:t>Other</w:t>
+      </w:r>
+      <w:proofErr w:type="spellEnd"/>
       <w:r>
         <w:rPr>
           <w:rFonts w:ascii="Courier New" w:hAnsi="Courier New" w:cs="Courier New"/>
@@ -1316,9 +1652,9 @@
           <w:szCs w:val="22"/>
           <w:lang w:val="nl-NL"/>
         </w:rPr>
-        <w:t>Kids</w:t>
-      </w:r>
-      <w:proofErr w:type="spellEnd"/>
+        <w:t xml:space="preserve"> </w:t>
+      </w:r>
+      <w:proofErr w:type="spellStart"/>
       <w:r>
         <w:rPr>
           <w:rFonts w:ascii="Courier New" w:hAnsi="Courier New" w:cs="Courier New"/>
@@ -1328,9 +1664,9 @@
           <w:szCs w:val="22"/>
           <w:lang w:val="nl-NL"/>
         </w:rPr>
-        <w:t xml:space="preserve"> </w:t>
-      </w:r>
-      <w:proofErr w:type="spellStart"/>
+        <w:t>Conversations</w:t>
+      </w:r>
+      <w:proofErr w:type="spellEnd"/>
       <w:r>
         <w:rPr>
           <w:rFonts w:ascii="Courier New" w:hAnsi="Courier New" w:cs="Courier New"/>
@@ -1340,9 +1676,9 @@
           <w:szCs w:val="22"/>
           <w:lang w:val="nl-NL"/>
         </w:rPr>
-        <w:t>Sitting</w:t>
-      </w:r>
-      <w:proofErr w:type="spellEnd"/>
+        <w:t xml:space="preserve"> </w:t>
+      </w:r>
+      <w:proofErr w:type="spellStart"/>
       <w:r>
         <w:rPr>
           <w:rFonts w:ascii="Courier New" w:hAnsi="Courier New" w:cs="Courier New"/>
@@ -1352,9 +1688,9 @@
           <w:szCs w:val="22"/>
           <w:lang w:val="nl-NL"/>
         </w:rPr>
-        <w:t xml:space="preserve"> </w:t>
-      </w:r>
-      <w:proofErr w:type="spellStart"/>
+        <w:t>About</w:t>
+      </w:r>
+      <w:proofErr w:type="spellEnd"/>
       <w:r>
         <w:rPr>
           <w:rFonts w:ascii="Courier New" w:hAnsi="Courier New" w:cs="Courier New"/>
@@ -1364,9 +1700,235 @@
           <w:szCs w:val="22"/>
           <w:lang w:val="nl-NL"/>
         </w:rPr>
-        <w:t>Together</w:t>
+        <w:t xml:space="preserve"> Race</w:t>
+      </w:r>
+      <w:r>
+        <w:rPr>
+          <w:rFonts w:ascii="Courier New" w:hAnsi="Courier New" w:cs="Courier New"/>
+          <w:sz w:val="22"/>
+          <w:szCs w:val="22"/>
+          <w:lang w:val="nl-NL"/>
+        </w:rPr>
+        <w:t>. W</w:t>
+      </w:r>
+      <w:r>
+        <w:rPr>
+          <w:rFonts w:ascii="Courier New" w:hAnsi="Courier New" w:cs="Courier New"/>
+          <w:sz w:val="22"/>
+          <w:szCs w:val="22"/>
+          <w:lang w:val="nl-NL"/>
+        </w:rPr>
+        <w:t>anneer Clinton het thema ras op de agenda zet</w:t>
+      </w:r>
+      <w:r>
+        <w:rPr>
+          <w:rFonts w:ascii="Courier New" w:hAnsi="Courier New" w:cs="Courier New"/>
+          <w:sz w:val="22"/>
+          <w:szCs w:val="22"/>
+          <w:lang w:val="nl-NL"/>
+        </w:rPr>
+        <w:t xml:space="preserve">, </w:t>
+      </w:r>
+      <w:r>
+        <w:rPr>
+          <w:rFonts w:ascii="Courier New" w:hAnsi="Courier New" w:cs="Courier New"/>
+          <w:sz w:val="22"/>
+          <w:szCs w:val="22"/>
+          <w:lang w:val="nl-NL"/>
+        </w:rPr>
+        <w:t xml:space="preserve">komt zij zelf in de belangstelling te staan. </w:t>
+      </w:r>
+      <w:r>
+        <w:rPr>
+          <w:rFonts w:ascii="Courier New" w:hAnsi="Courier New" w:cs="Courier New"/>
+          <w:sz w:val="22"/>
+          <w:szCs w:val="22"/>
+          <w:lang w:val="nl-NL"/>
+        </w:rPr>
+        <w:t>In d</w:t>
+      </w:r>
+      <w:r>
+        <w:rPr>
+          <w:rFonts w:ascii="Courier New" w:hAnsi="Courier New" w:cs="Courier New"/>
+          <w:sz w:val="22"/>
+          <w:szCs w:val="22"/>
+          <w:lang w:val="nl-NL"/>
+        </w:rPr>
+        <w:t xml:space="preserve">eze periode </w:t>
+      </w:r>
+      <w:r>
+        <w:rPr>
+          <w:rFonts w:ascii="Courier New" w:hAnsi="Courier New" w:cs="Courier New"/>
+          <w:sz w:val="22"/>
+          <w:szCs w:val="22"/>
+          <w:lang w:val="nl-NL"/>
+        </w:rPr>
+        <w:t xml:space="preserve">vraagt zij </w:t>
+      </w:r>
+      <w:r>
+        <w:rPr>
+          <w:rFonts w:ascii="Courier New" w:hAnsi="Courier New" w:cs="Courier New"/>
+          <w:sz w:val="22"/>
+          <w:szCs w:val="22"/>
+          <w:lang w:val="nl-NL"/>
+        </w:rPr>
+        <w:t xml:space="preserve">zich af of zij </w:t>
+      </w:r>
+      <w:r>
+        <w:rPr>
+          <w:rFonts w:ascii="Courier New" w:hAnsi="Courier New" w:cs="Courier New"/>
+          <w:sz w:val="22"/>
+          <w:szCs w:val="22"/>
+          <w:lang w:val="nl-NL"/>
+        </w:rPr>
+        <w:t xml:space="preserve">meer </w:t>
+      </w:r>
+      <w:r>
+        <w:rPr>
+          <w:rFonts w:ascii="Courier New" w:hAnsi="Courier New" w:cs="Courier New"/>
+          <w:sz w:val="22"/>
+          <w:szCs w:val="22"/>
+          <w:lang w:val="nl-NL"/>
+        </w:rPr>
+        <w:t xml:space="preserve">concreet </w:t>
+      </w:r>
+      <w:r>
+        <w:rPr>
+          <w:rFonts w:ascii="Courier New" w:hAnsi="Courier New" w:cs="Courier New"/>
+          <w:sz w:val="22"/>
+          <w:szCs w:val="22"/>
+          <w:lang w:val="nl-NL"/>
+        </w:rPr>
+        <w:t xml:space="preserve">kan bijdragen aan het creëren van leeromgevingen </w:t>
+      </w:r>
+      <w:r>
+        <w:rPr>
+          <w:rFonts w:ascii="Courier New" w:hAnsi="Courier New" w:cs="Courier New"/>
+          <w:sz w:val="22"/>
+          <w:szCs w:val="22"/>
+          <w:lang w:val="nl-NL"/>
+        </w:rPr>
+        <w:t>waarin</w:t>
+      </w:r>
+      <w:r>
+        <w:rPr>
+          <w:rFonts w:ascii="Courier New" w:hAnsi="Courier New" w:cs="Courier New"/>
+          <w:sz w:val="22"/>
+          <w:szCs w:val="22"/>
+          <w:lang w:val="nl-NL"/>
+        </w:rPr>
+        <w:t xml:space="preserve"> beter met segregatie en verschillen </w:t>
+      </w:r>
+      <w:r>
+        <w:rPr>
+          <w:rFonts w:ascii="Courier New" w:hAnsi="Courier New" w:cs="Courier New"/>
+          <w:sz w:val="22"/>
+          <w:szCs w:val="22"/>
+          <w:lang w:val="nl-NL"/>
+        </w:rPr>
+        <w:t>tussen groepen wordt</w:t>
+      </w:r>
+      <w:r>
+        <w:rPr>
+          <w:rFonts w:ascii="Courier New" w:hAnsi="Courier New" w:cs="Courier New"/>
+          <w:sz w:val="22"/>
+          <w:szCs w:val="22"/>
+          <w:lang w:val="nl-NL"/>
+        </w:rPr>
+        <w:t xml:space="preserve"> om</w:t>
+      </w:r>
+      <w:r>
+        <w:rPr>
+          <w:rFonts w:ascii="Courier New" w:hAnsi="Courier New" w:cs="Courier New"/>
+          <w:sz w:val="22"/>
+          <w:szCs w:val="22"/>
+          <w:lang w:val="nl-NL"/>
+        </w:rPr>
+        <w:t>ge</w:t>
+      </w:r>
+      <w:r>
+        <w:rPr>
+          <w:rFonts w:ascii="Courier New" w:hAnsi="Courier New" w:cs="Courier New"/>
+          <w:sz w:val="22"/>
+          <w:szCs w:val="22"/>
+          <w:lang w:val="nl-NL"/>
+        </w:rPr>
+        <w:t xml:space="preserve">gaan. </w:t>
+      </w:r>
+      <w:r>
+        <w:rPr>
+          <w:rFonts w:ascii="Courier New" w:hAnsi="Courier New" w:cs="Courier New"/>
+          <w:sz w:val="22"/>
+          <w:szCs w:val="22"/>
+          <w:lang w:val="nl-NL"/>
+        </w:rPr>
+        <w:t>Ze wordt decaan en</w:t>
+      </w:r>
+      <w:r>
+        <w:rPr>
+          <w:rFonts w:ascii="Courier New" w:hAnsi="Courier New" w:cs="Courier New"/>
+          <w:sz w:val="22"/>
+          <w:szCs w:val="22"/>
+          <w:lang w:val="nl-NL"/>
+        </w:rPr>
+        <w:t xml:space="preserve"> </w:t>
+      </w:r>
+      <w:r>
+        <w:rPr>
+          <w:rFonts w:ascii="Courier New" w:hAnsi="Courier New" w:cs="Courier New"/>
+          <w:sz w:val="22"/>
+          <w:szCs w:val="22"/>
+          <w:lang w:val="nl-NL"/>
+        </w:rPr>
+        <w:t>vanuit die positie organiseert ze</w:t>
+      </w:r>
+      <w:r>
+        <w:rPr>
+          <w:rFonts w:ascii="Courier New" w:hAnsi="Courier New" w:cs="Courier New"/>
+          <w:sz w:val="22"/>
+          <w:szCs w:val="22"/>
+          <w:lang w:val="nl-NL"/>
+        </w:rPr>
+        <w:t xml:space="preserve"> dialogen </w:t>
+      </w:r>
+      <w:r>
+        <w:rPr>
+          <w:rFonts w:ascii="Courier New" w:hAnsi="Courier New" w:cs="Courier New"/>
+          <w:sz w:val="22"/>
+          <w:szCs w:val="22"/>
+          <w:lang w:val="nl-NL"/>
+        </w:rPr>
+        <w:t xml:space="preserve">tussen groepen </w:t>
+      </w:r>
+      <w:r>
+        <w:rPr>
+          <w:rFonts w:ascii="Courier New" w:hAnsi="Courier New" w:cs="Courier New"/>
+          <w:sz w:val="22"/>
+          <w:szCs w:val="22"/>
+          <w:lang w:val="nl-NL"/>
+        </w:rPr>
+        <w:t xml:space="preserve">op haar eigen Mount </w:t>
+      </w:r>
+      <w:proofErr w:type="spellStart"/>
+      <w:r>
+        <w:rPr>
+          <w:rFonts w:ascii="Courier New" w:hAnsi="Courier New" w:cs="Courier New"/>
+          <w:sz w:val="22"/>
+          <w:szCs w:val="22"/>
+          <w:lang w:val="nl-NL"/>
+        </w:rPr>
+        <w:t>Holyoke</w:t>
       </w:r>
       <w:proofErr w:type="spellEnd"/>
+      <w:r>
+        <w:rPr>
+          <w:rFonts w:ascii="Courier New" w:hAnsi="Courier New" w:cs="Courier New"/>
+          <w:sz w:val="22"/>
+          <w:szCs w:val="22"/>
+          <w:lang w:val="nl-NL"/>
+        </w:rPr>
+        <w:t xml:space="preserve"> instituut. Zij stelt een gemeenschappelijke visie voor die ze als het ABC definieert: </w:t>
+      </w:r>
       <w:r>
         <w:rPr>
           <w:rFonts w:ascii="Courier New" w:hAnsi="Courier New" w:cs="Courier New"/>
@@ -1376,9 +1938,17 @@
           <w:szCs w:val="22"/>
           <w:lang w:val="nl-NL"/>
         </w:rPr>
-        <w:t xml:space="preserve"> in </w:t>
-      </w:r>
-      <w:proofErr w:type="spellStart"/>
+        <w:t>aanmoedigen</w:t>
+      </w:r>
+      <w:r>
+        <w:rPr>
+          <w:rFonts w:ascii="Courier New" w:hAnsi="Courier New" w:cs="Courier New"/>
+          <w:sz w:val="22"/>
+          <w:szCs w:val="22"/>
+          <w:lang w:val="nl-NL"/>
+        </w:rPr>
+        <w:t xml:space="preserve"> van identiteitsvorming van alle studenten en dan met name van de gemarginaliseerde groepen, </w:t>
+      </w:r>
       <w:r>
         <w:rPr>
           <w:rFonts w:ascii="Courier New" w:hAnsi="Courier New" w:cs="Courier New"/>
@@ -1388,9 +1958,26 @@
           <w:szCs w:val="22"/>
           <w:lang w:val="nl-NL"/>
         </w:rPr>
-        <w:t>the</w:t>
-      </w:r>
-      <w:proofErr w:type="spellEnd"/>
+        <w:t>bouwen</w:t>
+      </w:r>
+      <w:r>
+        <w:rPr>
+          <w:rFonts w:ascii="Courier New" w:hAnsi="Courier New" w:cs="Courier New"/>
+          <w:sz w:val="22"/>
+          <w:szCs w:val="22"/>
+          <w:lang w:val="nl-NL"/>
+        </w:rPr>
+        <w:t xml:space="preserve"> van een gemeenschap waar iedereen zich thuis voelt en </w:t>
+      </w:r>
+      <w:r>
+        <w:rPr>
+          <w:rFonts w:ascii="Courier New" w:hAnsi="Courier New" w:cs="Courier New"/>
+          <w:sz w:val="22"/>
+          <w:szCs w:val="22"/>
+          <w:lang w:val="nl-NL"/>
+        </w:rPr>
+        <w:t xml:space="preserve">het </w:t>
+      </w:r>
       <w:r>
         <w:rPr>
           <w:rFonts w:ascii="Courier New" w:hAnsi="Courier New" w:cs="Courier New"/>
@@ -1400,301 +1987,953 @@
           <w:szCs w:val="22"/>
           <w:lang w:val="nl-NL"/>
         </w:rPr>
-        <w:t xml:space="preserve"> Cafetaria? </w:t>
-      </w:r>
-      <w:proofErr w:type="spellStart"/>
-      <w:r>
-        <w:rPr>
-          <w:rFonts w:ascii="Courier New" w:hAnsi="Courier New" w:cs="Courier New"/>
-          <w:i/>
-          <w:iCs/>
-          <w:sz w:val="22"/>
-          <w:szCs w:val="22"/>
-          <w:lang w:val="nl-NL"/>
-        </w:rPr>
-        <w:t>And</w:t>
-      </w:r>
-      <w:proofErr w:type="spellEnd"/>
-      <w:r>
-        <w:rPr>
-          <w:rFonts w:ascii="Courier New" w:hAnsi="Courier New" w:cs="Courier New"/>
-          <w:i/>
-          <w:iCs/>
-          <w:sz w:val="22"/>
-          <w:szCs w:val="22"/>
-          <w:lang w:val="nl-NL"/>
-        </w:rPr>
-        <w:t xml:space="preserve"> </w:t>
-      </w:r>
-      <w:proofErr w:type="spellStart"/>
-      <w:r>
-        <w:rPr>
-          <w:rFonts w:ascii="Courier New" w:hAnsi="Courier New" w:cs="Courier New"/>
-          <w:i/>
-          <w:iCs/>
-          <w:sz w:val="22"/>
-          <w:szCs w:val="22"/>
-          <w:lang w:val="nl-NL"/>
-        </w:rPr>
-        <w:t>Other</w:t>
-      </w:r>
-      <w:proofErr w:type="spellEnd"/>
-      <w:r>
-        <w:rPr>
-          <w:rFonts w:ascii="Courier New" w:hAnsi="Courier New" w:cs="Courier New"/>
-          <w:i/>
-          <w:iCs/>
-          <w:sz w:val="22"/>
-          <w:szCs w:val="22"/>
-          <w:lang w:val="nl-NL"/>
-        </w:rPr>
-        <w:t xml:space="preserve"> </w:t>
-      </w:r>
-      <w:proofErr w:type="spellStart"/>
-      <w:r>
-        <w:rPr>
-          <w:rFonts w:ascii="Courier New" w:hAnsi="Courier New" w:cs="Courier New"/>
-          <w:i/>
-          <w:iCs/>
-          <w:sz w:val="22"/>
-          <w:szCs w:val="22"/>
-          <w:lang w:val="nl-NL"/>
-        </w:rPr>
-        <w:t>Conversations</w:t>
-      </w:r>
-      <w:proofErr w:type="spellEnd"/>
-      <w:r>
-        <w:rPr>
-          <w:rFonts w:ascii="Courier New" w:hAnsi="Courier New" w:cs="Courier New"/>
-          <w:i/>
-          <w:iCs/>
-          <w:sz w:val="22"/>
-          <w:szCs w:val="22"/>
-          <w:lang w:val="nl-NL"/>
-        </w:rPr>
-        <w:t xml:space="preserve"> </w:t>
-      </w:r>
-      <w:proofErr w:type="spellStart"/>
-      <w:r>
-        <w:rPr>
-          <w:rFonts w:ascii="Courier New" w:hAnsi="Courier New" w:cs="Courier New"/>
-          <w:i/>
-          <w:iCs/>
-          <w:sz w:val="22"/>
-          <w:szCs w:val="22"/>
-          <w:lang w:val="nl-NL"/>
-        </w:rPr>
-        <w:t>About</w:t>
-      </w:r>
-      <w:proofErr w:type="spellEnd"/>
-      <w:r>
-        <w:rPr>
-          <w:rFonts w:ascii="Courier New" w:hAnsi="Courier New" w:cs="Courier New"/>
-          <w:i/>
-          <w:iCs/>
-          <w:sz w:val="22"/>
-          <w:szCs w:val="22"/>
-          <w:lang w:val="nl-NL"/>
-        </w:rPr>
-        <w:t xml:space="preserve"> Race</w:t>
-      </w:r>
-      <w:r>
-        <w:rPr>
-          <w:rFonts w:ascii="Courier New" w:hAnsi="Courier New" w:cs="Courier New"/>
-          <w:sz w:val="22"/>
-          <w:szCs w:val="22"/>
-          <w:lang w:val="nl-NL"/>
-        </w:rPr>
-        <w:t xml:space="preserve"> had geschreven, komt zij zelf in de belangstelling te staan. Ze gaat zich afvragen of zij kan bijdragen aan het creëren van leeromgevingen die beter met segregatie en verschillen kunnen omgaan. Ze raakt </w:t>
-      </w:r>
-      <w:proofErr w:type="spellStart"/>
-      <w:r>
-        <w:rPr>
-          <w:rFonts w:ascii="Courier New" w:hAnsi="Courier New" w:cs="Courier New"/>
-          <w:sz w:val="22"/>
-          <w:szCs w:val="22"/>
-          <w:lang w:val="nl-NL"/>
-        </w:rPr>
-        <w:t>geïneresseerd</w:t>
-      </w:r>
-      <w:proofErr w:type="spellEnd"/>
-      <w:r>
-        <w:rPr>
-          <w:rFonts w:ascii="Courier New" w:hAnsi="Courier New" w:cs="Courier New"/>
-          <w:sz w:val="22"/>
-          <w:szCs w:val="22"/>
-          <w:lang w:val="nl-NL"/>
-        </w:rPr>
-        <w:t xml:space="preserve"> in dialogen tussen </w:t>
-      </w:r>
-      <w:proofErr w:type="spellStart"/>
-      <w:r>
-        <w:rPr>
-          <w:rFonts w:ascii="Courier New" w:hAnsi="Courier New" w:cs="Courier New"/>
-          <w:sz w:val="22"/>
-          <w:szCs w:val="22"/>
-          <w:lang w:val="nl-NL"/>
-        </w:rPr>
-        <w:t>verchillende</w:t>
-      </w:r>
-      <w:proofErr w:type="spellEnd"/>
-      <w:r>
-        <w:rPr>
-          <w:rFonts w:ascii="Courier New" w:hAnsi="Courier New" w:cs="Courier New"/>
-          <w:sz w:val="22"/>
-          <w:szCs w:val="22"/>
-          <w:lang w:val="nl-NL"/>
-        </w:rPr>
-        <w:t xml:space="preserve"> groepen en maakt daar werk van als decaan op haar eigen Mount </w:t>
-      </w:r>
-      <w:proofErr w:type="spellStart"/>
-      <w:r>
-        <w:rPr>
-          <w:rFonts w:ascii="Courier New" w:hAnsi="Courier New" w:cs="Courier New"/>
-          <w:sz w:val="22"/>
-          <w:szCs w:val="22"/>
-          <w:lang w:val="nl-NL"/>
-        </w:rPr>
-        <w:t>Holyoke</w:t>
-      </w:r>
-      <w:proofErr w:type="spellEnd"/>
-      <w:r>
-        <w:rPr>
-          <w:rFonts w:ascii="Courier New" w:hAnsi="Courier New" w:cs="Courier New"/>
-          <w:sz w:val="22"/>
-          <w:szCs w:val="22"/>
-          <w:lang w:val="nl-NL"/>
-        </w:rPr>
-        <w:t xml:space="preserve"> instituut. Zij stelt een gemeenschappelijke visie voor die ze als het ABC definieert: aanmoedigen van identiteitsvorming van alle studenten en dan met name van de gemarginaliseerde groepen, bouwen van een gemeenschap waar iedereen zich thuis voelt en </w:t>
-      </w:r>
-      <w:r>
-        <w:rPr>
-          <w:rFonts w:ascii="Courier New" w:hAnsi="Courier New" w:cs="Courier New"/>
-          <w:sz w:val="22"/>
-          <w:szCs w:val="22"/>
-          <w:lang w:val="nl-NL"/>
-        </w:rPr>
-        <w:t xml:space="preserve">het cultiveren van de leiderschapscapaciteiten van de studenten waarmee zij zich voorbereiden op wat er in hun tijd van verwacht wordt. En haar ABC lijkt natuurlijk erg op DEI (Diversiteit, </w:t>
-      </w:r>
-      <w:proofErr w:type="spellStart"/>
-      <w:r>
-        <w:rPr>
-          <w:rFonts w:ascii="Courier New" w:hAnsi="Courier New" w:cs="Courier New"/>
-          <w:sz w:val="22"/>
-          <w:szCs w:val="22"/>
-          <w:lang w:val="nl-NL"/>
-        </w:rPr>
-        <w:t>Egaliteit</w:t>
-      </w:r>
-      <w:proofErr w:type="spellEnd"/>
-      <w:r>
-        <w:rPr>
-          <w:rFonts w:ascii="Courier New" w:hAnsi="Courier New" w:cs="Courier New"/>
-          <w:sz w:val="22"/>
-          <w:szCs w:val="22"/>
-          <w:lang w:val="nl-NL"/>
-        </w:rPr>
-        <w:t xml:space="preserve"> en </w:t>
-      </w:r>
-      <w:proofErr w:type="spellStart"/>
-      <w:r>
-        <w:rPr>
-          <w:rFonts w:ascii="Courier New" w:hAnsi="Courier New" w:cs="Courier New"/>
-          <w:sz w:val="22"/>
-          <w:szCs w:val="22"/>
-          <w:lang w:val="nl-NL"/>
-        </w:rPr>
-        <w:t>Inclusiviteit</w:t>
-      </w:r>
-      <w:proofErr w:type="spellEnd"/>
-      <w:r>
-        <w:rPr>
-          <w:rFonts w:ascii="Courier New" w:hAnsi="Courier New" w:cs="Courier New"/>
-          <w:sz w:val="22"/>
-          <w:szCs w:val="22"/>
-          <w:lang w:val="nl-NL"/>
-        </w:rPr>
-        <w:t xml:space="preserve">) waar tegenwoordig van hogerhand zoveel weerstand. Waar </w:t>
-      </w:r>
-      <w:proofErr w:type="spellStart"/>
-      <w:r>
-        <w:rPr>
-          <w:rFonts w:ascii="Courier New" w:hAnsi="Courier New" w:cs="Courier New"/>
-          <w:sz w:val="22"/>
-          <w:szCs w:val="22"/>
-          <w:lang w:val="nl-NL"/>
-        </w:rPr>
-        <w:t>Trump</w:t>
-      </w:r>
-      <w:proofErr w:type="spellEnd"/>
-      <w:r>
-        <w:rPr>
-          <w:rFonts w:ascii="Courier New" w:hAnsi="Courier New" w:cs="Courier New"/>
-          <w:sz w:val="22"/>
-          <w:szCs w:val="22"/>
-          <w:lang w:val="nl-NL"/>
-        </w:rPr>
-        <w:t xml:space="preserve"> en de zijnen dit onder de noemer van </w:t>
-      </w:r>
-      <w:proofErr w:type="spellStart"/>
-      <w:r>
-        <w:rPr>
-          <w:rFonts w:ascii="Courier New" w:hAnsi="Courier New" w:cs="Courier New"/>
-          <w:sz w:val="22"/>
-          <w:szCs w:val="22"/>
-          <w:lang w:val="nl-NL"/>
-        </w:rPr>
-        <w:t>woke</w:t>
-      </w:r>
-      <w:proofErr w:type="spellEnd"/>
-      <w:r>
-        <w:rPr>
-          <w:rFonts w:ascii="Courier New" w:hAnsi="Courier New" w:cs="Courier New"/>
-          <w:sz w:val="22"/>
-          <w:szCs w:val="22"/>
-          <w:lang w:val="nl-NL"/>
-        </w:rPr>
-        <w:t xml:space="preserve"> plaatsen waar het hoger onderwijs van gevrijwaard moet worden, benadrukt Tatum juist de onderwijskundige en pedagogische waarde van een aanpak die </w:t>
-      </w:r>
-      <w:r>
-        <w:rPr>
-          <w:rFonts w:ascii="Courier New" w:hAnsi="Courier New" w:cs="Courier New"/>
-          <w:sz w:val="22"/>
-          <w:szCs w:val="22"/>
-          <w:lang w:val="nl-NL"/>
-        </w:rPr>
-        <w:lastRenderedPageBreak/>
-        <w:t xml:space="preserve">studenten het gevoel geven erbij te horen. Want het gaat er volgens Tatum om dat studenten in een omgeving komen waarin iedereen kan floreren en optimaal kan presteren. Want wat kun je erop tegen hebben als studenten een omgeving vinden waar ze het beste uit zichzelf kunnen halen? Zij laat zien wat die </w:t>
-      </w:r>
-      <w:proofErr w:type="spellStart"/>
-      <w:r>
-        <w:rPr>
-          <w:rFonts w:ascii="Courier New" w:hAnsi="Courier New" w:cs="Courier New"/>
-          <w:sz w:val="22"/>
-          <w:szCs w:val="22"/>
-          <w:lang w:val="nl-NL"/>
-        </w:rPr>
-        <w:t>woke</w:t>
-      </w:r>
-      <w:proofErr w:type="spellEnd"/>
-      <w:r>
-        <w:rPr>
-          <w:rFonts w:ascii="Courier New" w:hAnsi="Courier New" w:cs="Courier New"/>
-          <w:sz w:val="22"/>
-          <w:szCs w:val="22"/>
-          <w:lang w:val="nl-NL"/>
-        </w:rPr>
-        <w:t>-oorlog op het New College van Florida betekent.</w:t>
+        <w:t>cultiveren</w:t>
+      </w:r>
+      <w:r>
+        <w:rPr>
+          <w:rFonts w:ascii="Courier New" w:hAnsi="Courier New" w:cs="Courier New"/>
+          <w:sz w:val="22"/>
+          <w:szCs w:val="22"/>
+          <w:lang w:val="nl-NL"/>
+        </w:rPr>
+        <w:t xml:space="preserve"> van de leiderschapscapaciteiten van de studenten </w:t>
+      </w:r>
+      <w:r>
+        <w:rPr>
+          <w:rFonts w:ascii="Courier New" w:hAnsi="Courier New" w:cs="Courier New"/>
+          <w:sz w:val="22"/>
+          <w:szCs w:val="22"/>
+          <w:lang w:val="nl-NL"/>
+        </w:rPr>
+        <w:t>die bij deze tijd passen</w:t>
+      </w:r>
+      <w:r>
+        <w:rPr>
+          <w:rFonts w:ascii="Courier New" w:hAnsi="Courier New" w:cs="Courier New"/>
+          <w:sz w:val="22"/>
+          <w:szCs w:val="22"/>
+          <w:lang w:val="nl-NL"/>
+        </w:rPr>
+        <w:t xml:space="preserve">. </w:t>
       </w:r>
     </w:p>
     <w:p>
       <w:pPr>
         <w:spacing w:line="360" w:lineRule="auto"/>
-        <w:rPr>
-          <w:rFonts w:ascii="Courier New" w:hAnsi="Courier New" w:cs="Courier New"/>
-          <w:sz w:val="22"/>
-          <w:szCs w:val="22"/>
-          <w:lang w:val="nl-NL"/>
+        <w:ind w:firstLine="720"/>
+        <w:rPr>
+          <w:rFonts w:ascii="Courier New" w:hAnsi="Courier New" w:cs="Courier New"/>
+          <w:sz w:val="22"/>
+          <w:szCs w:val="22"/>
+          <w:lang w:val="nl-NL"/>
+        </w:rPr>
+      </w:pPr>
+      <w:r>
+        <w:rPr>
+          <w:rFonts w:ascii="Courier New" w:hAnsi="Courier New" w:cs="Courier New"/>
+          <w:sz w:val="22"/>
+          <w:szCs w:val="22"/>
+          <w:lang w:val="nl-NL"/>
+        </w:rPr>
+        <w:t>H</w:t>
+      </w:r>
+      <w:r>
+        <w:rPr>
+          <w:rFonts w:ascii="Courier New" w:hAnsi="Courier New" w:cs="Courier New"/>
+          <w:sz w:val="22"/>
+          <w:szCs w:val="22"/>
+          <w:lang w:val="nl-NL"/>
+        </w:rPr>
+        <w:t xml:space="preserve">aar ABC lijkt natuurlijk erg op DEI (Diversiteit, </w:t>
+      </w:r>
+      <w:proofErr w:type="spellStart"/>
+      <w:r>
+        <w:rPr>
+          <w:rFonts w:ascii="Courier New" w:hAnsi="Courier New" w:cs="Courier New"/>
+          <w:sz w:val="22"/>
+          <w:szCs w:val="22"/>
+          <w:lang w:val="nl-NL"/>
+        </w:rPr>
+        <w:t>Egaliteit</w:t>
+      </w:r>
+      <w:proofErr w:type="spellEnd"/>
+      <w:r>
+        <w:rPr>
+          <w:rFonts w:ascii="Courier New" w:hAnsi="Courier New" w:cs="Courier New"/>
+          <w:sz w:val="22"/>
+          <w:szCs w:val="22"/>
+          <w:lang w:val="nl-NL"/>
+        </w:rPr>
+        <w:t xml:space="preserve"> en </w:t>
+      </w:r>
+      <w:proofErr w:type="spellStart"/>
+      <w:r>
+        <w:rPr>
+          <w:rFonts w:ascii="Courier New" w:hAnsi="Courier New" w:cs="Courier New"/>
+          <w:sz w:val="22"/>
+          <w:szCs w:val="22"/>
+          <w:lang w:val="nl-NL"/>
+        </w:rPr>
+        <w:t>Inclusiviteit</w:t>
+      </w:r>
+      <w:proofErr w:type="spellEnd"/>
+      <w:r>
+        <w:rPr>
+          <w:rFonts w:ascii="Courier New" w:hAnsi="Courier New" w:cs="Courier New"/>
+          <w:sz w:val="22"/>
+          <w:szCs w:val="22"/>
+          <w:lang w:val="nl-NL"/>
+        </w:rPr>
+        <w:t>) waar tegenwoordig van hogerhand zoveel weerstand</w:t>
+      </w:r>
+      <w:r>
+        <w:rPr>
+          <w:rFonts w:ascii="Courier New" w:hAnsi="Courier New" w:cs="Courier New"/>
+          <w:sz w:val="22"/>
+          <w:szCs w:val="22"/>
+          <w:lang w:val="nl-NL"/>
+        </w:rPr>
+        <w:t xml:space="preserve"> tegen is</w:t>
+      </w:r>
+      <w:r>
+        <w:rPr>
+          <w:rFonts w:ascii="Courier New" w:hAnsi="Courier New" w:cs="Courier New"/>
+          <w:sz w:val="22"/>
+          <w:szCs w:val="22"/>
+          <w:lang w:val="nl-NL"/>
+        </w:rPr>
+        <w:t xml:space="preserve">. Waar </w:t>
+      </w:r>
+      <w:proofErr w:type="spellStart"/>
+      <w:r>
+        <w:rPr>
+          <w:rFonts w:ascii="Courier New" w:hAnsi="Courier New" w:cs="Courier New"/>
+          <w:sz w:val="22"/>
+          <w:szCs w:val="22"/>
+          <w:lang w:val="nl-NL"/>
+        </w:rPr>
+        <w:t>Trump</w:t>
+      </w:r>
+      <w:proofErr w:type="spellEnd"/>
+      <w:r>
+        <w:rPr>
+          <w:rFonts w:ascii="Courier New" w:hAnsi="Courier New" w:cs="Courier New"/>
+          <w:sz w:val="22"/>
+          <w:szCs w:val="22"/>
+          <w:lang w:val="nl-NL"/>
+        </w:rPr>
+        <w:t xml:space="preserve"> en de zijnen dit </w:t>
+      </w:r>
+      <w:r>
+        <w:rPr>
+          <w:rFonts w:ascii="Courier New" w:hAnsi="Courier New" w:cs="Courier New"/>
+          <w:sz w:val="22"/>
+          <w:szCs w:val="22"/>
+          <w:lang w:val="nl-NL"/>
+        </w:rPr>
+        <w:t xml:space="preserve">alles </w:t>
+      </w:r>
+      <w:r>
+        <w:rPr>
+          <w:rFonts w:ascii="Courier New" w:hAnsi="Courier New" w:cs="Courier New"/>
+          <w:sz w:val="22"/>
+          <w:szCs w:val="22"/>
+          <w:lang w:val="nl-NL"/>
+        </w:rPr>
+        <w:t xml:space="preserve">onder de noemer van </w:t>
+      </w:r>
+      <w:proofErr w:type="spellStart"/>
+      <w:r>
+        <w:rPr>
+          <w:rFonts w:ascii="Courier New" w:hAnsi="Courier New" w:cs="Courier New"/>
+          <w:sz w:val="22"/>
+          <w:szCs w:val="22"/>
+          <w:lang w:val="nl-NL"/>
+        </w:rPr>
+        <w:t>woke</w:t>
+      </w:r>
+      <w:proofErr w:type="spellEnd"/>
+      <w:r>
+        <w:rPr>
+          <w:rFonts w:ascii="Courier New" w:hAnsi="Courier New" w:cs="Courier New"/>
+          <w:sz w:val="22"/>
+          <w:szCs w:val="22"/>
+          <w:lang w:val="nl-NL"/>
+        </w:rPr>
+        <w:t xml:space="preserve"> plaatsen </w:t>
+      </w:r>
+      <w:r>
+        <w:rPr>
+          <w:rFonts w:ascii="Courier New" w:hAnsi="Courier New" w:cs="Courier New"/>
+          <w:sz w:val="22"/>
+          <w:szCs w:val="22"/>
+          <w:lang w:val="nl-NL"/>
+        </w:rPr>
+        <w:t>en er alles aan doen om het hoger onderwijs ervan te vrijwaren</w:t>
+      </w:r>
+      <w:r>
+        <w:rPr>
+          <w:rFonts w:ascii="Courier New" w:hAnsi="Courier New" w:cs="Courier New"/>
+          <w:sz w:val="22"/>
+          <w:szCs w:val="22"/>
+          <w:lang w:val="nl-NL"/>
+        </w:rPr>
+        <w:t xml:space="preserve">, benadrukt Tatum juist de onderwijskundige en pedagogische </w:t>
+      </w:r>
+      <w:r>
+        <w:rPr>
+          <w:rFonts w:ascii="Courier New" w:hAnsi="Courier New" w:cs="Courier New"/>
+          <w:sz w:val="22"/>
+          <w:szCs w:val="22"/>
+          <w:lang w:val="nl-NL"/>
+        </w:rPr>
+        <w:lastRenderedPageBreak/>
+        <w:t>waarde van een aanpak die studenten het gevoel ge</w:t>
+      </w:r>
+      <w:r>
+        <w:rPr>
+          <w:rFonts w:ascii="Courier New" w:hAnsi="Courier New" w:cs="Courier New"/>
+          <w:sz w:val="22"/>
+          <w:szCs w:val="22"/>
+          <w:lang w:val="nl-NL"/>
+        </w:rPr>
+        <w:t>eft</w:t>
+      </w:r>
+      <w:r>
+        <w:rPr>
+          <w:rFonts w:ascii="Courier New" w:hAnsi="Courier New" w:cs="Courier New"/>
+          <w:sz w:val="22"/>
+          <w:szCs w:val="22"/>
+          <w:lang w:val="nl-NL"/>
+        </w:rPr>
+        <w:t xml:space="preserve"> erbij te horen. W</w:t>
+      </w:r>
+      <w:r>
+        <w:rPr>
+          <w:rFonts w:ascii="Courier New" w:hAnsi="Courier New" w:cs="Courier New"/>
+          <w:sz w:val="22"/>
+          <w:szCs w:val="22"/>
+          <w:lang w:val="nl-NL"/>
+        </w:rPr>
+        <w:t>ant w</w:t>
+      </w:r>
+      <w:r>
+        <w:rPr>
+          <w:rFonts w:ascii="Courier New" w:hAnsi="Courier New" w:cs="Courier New"/>
+          <w:sz w:val="22"/>
+          <w:szCs w:val="22"/>
+          <w:lang w:val="nl-NL"/>
+        </w:rPr>
+        <w:t>at kun je erop tegen hebben</w:t>
+      </w:r>
+      <w:r>
+        <w:rPr>
+          <w:rFonts w:ascii="Courier New" w:hAnsi="Courier New" w:cs="Courier New"/>
+          <w:sz w:val="22"/>
+          <w:szCs w:val="22"/>
+          <w:lang w:val="nl-NL"/>
+        </w:rPr>
+        <w:t>, vraagt Tatum zich af,</w:t>
+      </w:r>
+      <w:r>
+        <w:rPr>
+          <w:rFonts w:ascii="Courier New" w:hAnsi="Courier New" w:cs="Courier New"/>
+          <w:sz w:val="22"/>
+          <w:szCs w:val="22"/>
+          <w:lang w:val="nl-NL"/>
+        </w:rPr>
+        <w:t xml:space="preserve"> als studenten een omgeving vinden waar ze het beste uit zichzelf kunnen halen? </w:t>
+      </w:r>
+      <w:r>
+        <w:rPr>
+          <w:rFonts w:ascii="Courier New" w:hAnsi="Courier New" w:cs="Courier New"/>
+          <w:sz w:val="22"/>
+          <w:szCs w:val="22"/>
+          <w:lang w:val="nl-NL"/>
+        </w:rPr>
+        <w:t>Volgens Tatum gaat</w:t>
+      </w:r>
+      <w:r>
+        <w:rPr>
+          <w:rFonts w:ascii="Courier New" w:hAnsi="Courier New" w:cs="Courier New"/>
+          <w:sz w:val="22"/>
+          <w:szCs w:val="22"/>
+          <w:lang w:val="nl-NL"/>
+        </w:rPr>
+        <w:t xml:space="preserve"> het om de relaties tussen groepen, hoe studenten worden voorbereid op een diverse wereld en </w:t>
+      </w:r>
+      <w:r>
+        <w:rPr>
+          <w:rFonts w:ascii="Courier New" w:hAnsi="Courier New" w:cs="Courier New"/>
+          <w:sz w:val="22"/>
+          <w:szCs w:val="22"/>
+          <w:lang w:val="nl-NL"/>
+        </w:rPr>
+        <w:t xml:space="preserve">ze </w:t>
+      </w:r>
+      <w:r>
+        <w:rPr>
+          <w:rFonts w:ascii="Courier New" w:hAnsi="Courier New" w:cs="Courier New"/>
+          <w:sz w:val="22"/>
+          <w:szCs w:val="22"/>
+          <w:lang w:val="nl-NL"/>
+        </w:rPr>
+        <w:t xml:space="preserve">keuzes </w:t>
+      </w:r>
+      <w:r>
+        <w:rPr>
+          <w:rFonts w:ascii="Courier New" w:hAnsi="Courier New" w:cs="Courier New"/>
+          <w:sz w:val="22"/>
+          <w:szCs w:val="22"/>
+          <w:lang w:val="nl-NL"/>
+        </w:rPr>
+        <w:t xml:space="preserve">leren </w:t>
+      </w:r>
+      <w:r>
+        <w:rPr>
+          <w:rFonts w:ascii="Courier New" w:hAnsi="Courier New" w:cs="Courier New"/>
+          <w:sz w:val="22"/>
+          <w:szCs w:val="22"/>
+          <w:lang w:val="nl-NL"/>
+        </w:rPr>
+        <w:t xml:space="preserve">maken waarbij ze ook rekening houden met de ander. </w:t>
+      </w:r>
+      <w:r>
+        <w:rPr>
+          <w:rFonts w:ascii="Courier New" w:hAnsi="Courier New" w:cs="Courier New"/>
+          <w:sz w:val="22"/>
+          <w:szCs w:val="22"/>
+          <w:lang w:val="nl-NL"/>
+        </w:rPr>
+        <w:t xml:space="preserve">Zij laat </w:t>
+      </w:r>
+      <w:r>
+        <w:rPr>
+          <w:rFonts w:ascii="Courier New" w:hAnsi="Courier New" w:cs="Courier New"/>
+          <w:sz w:val="22"/>
+          <w:szCs w:val="22"/>
+          <w:lang w:val="nl-NL"/>
+        </w:rPr>
+        <w:t xml:space="preserve">haar boek </w:t>
+      </w:r>
+      <w:r>
+        <w:rPr>
+          <w:rFonts w:ascii="Courier New" w:hAnsi="Courier New" w:cs="Courier New"/>
+          <w:sz w:val="22"/>
+          <w:szCs w:val="22"/>
+          <w:lang w:val="nl-NL"/>
+        </w:rPr>
+        <w:t xml:space="preserve">heel duidelijk het verschil zien tussen haar </w:t>
+      </w:r>
+      <w:r>
+        <w:rPr>
+          <w:rFonts w:ascii="Courier New" w:hAnsi="Courier New" w:cs="Courier New"/>
+          <w:sz w:val="22"/>
+          <w:szCs w:val="22"/>
+          <w:lang w:val="nl-NL"/>
+        </w:rPr>
+        <w:t xml:space="preserve">dialogische aanpak en </w:t>
+      </w:r>
+      <w:r>
+        <w:rPr>
+          <w:rFonts w:ascii="Courier New" w:hAnsi="Courier New" w:cs="Courier New"/>
+          <w:sz w:val="22"/>
+          <w:szCs w:val="22"/>
+          <w:lang w:val="nl-NL"/>
+        </w:rPr>
+        <w:t>die van de</w:t>
+      </w:r>
+      <w:r>
+        <w:rPr>
+          <w:rFonts w:ascii="Courier New" w:hAnsi="Courier New" w:cs="Courier New"/>
+          <w:sz w:val="22"/>
+          <w:szCs w:val="22"/>
+          <w:lang w:val="nl-NL"/>
+        </w:rPr>
+        <w:t xml:space="preserve"> ‘war on </w:t>
+      </w:r>
+      <w:proofErr w:type="spellStart"/>
+      <w:r>
+        <w:rPr>
+          <w:rFonts w:ascii="Courier New" w:hAnsi="Courier New" w:cs="Courier New"/>
+          <w:sz w:val="22"/>
+          <w:szCs w:val="22"/>
+          <w:lang w:val="nl-NL"/>
+        </w:rPr>
+        <w:t>woke</w:t>
+      </w:r>
+      <w:proofErr w:type="spellEnd"/>
+      <w:r>
+        <w:rPr>
+          <w:rFonts w:ascii="Courier New" w:hAnsi="Courier New" w:cs="Courier New"/>
+          <w:sz w:val="22"/>
+          <w:szCs w:val="22"/>
+          <w:lang w:val="nl-NL"/>
+        </w:rPr>
+        <w:t xml:space="preserve">’. Boeken verbieden, cursussen schrappen en alles eruit halen dat te maken heeft met de ‘kritische ras theorie’ is niet de oplossing voor de problemen waar we tegenwoordig mee te maken hebben. </w:t>
+      </w:r>
+      <w:r>
+        <w:rPr>
+          <w:rFonts w:ascii="Courier New" w:hAnsi="Courier New" w:cs="Courier New"/>
+          <w:sz w:val="22"/>
+          <w:szCs w:val="22"/>
+          <w:lang w:val="nl-NL"/>
+        </w:rPr>
+        <w:t>Tatum</w:t>
+      </w:r>
+      <w:r>
+        <w:rPr>
+          <w:rFonts w:ascii="Courier New" w:hAnsi="Courier New" w:cs="Courier New"/>
+          <w:sz w:val="22"/>
+          <w:szCs w:val="22"/>
+          <w:lang w:val="nl-NL"/>
+        </w:rPr>
+        <w:t xml:space="preserve"> verwacht meer van begrip en respect. </w:t>
+      </w:r>
+    </w:p>
+    <w:p>
+      <w:pPr>
+        <w:spacing w:line="360" w:lineRule="auto"/>
+        <w:ind w:firstLine="720"/>
+        <w:rPr>
+          <w:rFonts w:ascii="Courier New" w:hAnsi="Courier New" w:cs="Courier New"/>
+          <w:sz w:val="22"/>
+          <w:szCs w:val="22"/>
+          <w:lang w:val="nl-NL"/>
+        </w:rPr>
+      </w:pPr>
+      <w:r>
+        <w:rPr>
+          <w:rFonts w:ascii="Courier New" w:hAnsi="Courier New" w:cs="Courier New"/>
+          <w:sz w:val="22"/>
+          <w:szCs w:val="22"/>
+          <w:lang w:val="nl-NL"/>
+        </w:rPr>
+        <w:t xml:space="preserve">De spanning tussen een inclusieve leeromgeving voor iedereen en </w:t>
+      </w:r>
+      <w:r>
+        <w:rPr>
+          <w:rFonts w:ascii="Courier New" w:hAnsi="Courier New" w:cs="Courier New"/>
+          <w:sz w:val="22"/>
+          <w:szCs w:val="22"/>
+          <w:lang w:val="nl-NL"/>
+        </w:rPr>
+        <w:t>de vrijheid van meningsuiting w</w:t>
+      </w:r>
+      <w:r>
+        <w:rPr>
+          <w:rFonts w:ascii="Courier New" w:hAnsi="Courier New" w:cs="Courier New"/>
+          <w:sz w:val="22"/>
+          <w:szCs w:val="22"/>
+          <w:lang w:val="nl-NL"/>
+        </w:rPr>
+        <w:t>o</w:t>
+      </w:r>
+      <w:r>
+        <w:rPr>
+          <w:rFonts w:ascii="Courier New" w:hAnsi="Courier New" w:cs="Courier New"/>
+          <w:sz w:val="22"/>
+          <w:szCs w:val="22"/>
+          <w:lang w:val="nl-NL"/>
+        </w:rPr>
+        <w:t>rd</w:t>
+      </w:r>
+      <w:r>
+        <w:rPr>
+          <w:rFonts w:ascii="Courier New" w:hAnsi="Courier New" w:cs="Courier New"/>
+          <w:sz w:val="22"/>
+          <w:szCs w:val="22"/>
+          <w:lang w:val="nl-NL"/>
+        </w:rPr>
+        <w:t>t</w:t>
+      </w:r>
+      <w:r>
+        <w:rPr>
+          <w:rFonts w:ascii="Courier New" w:hAnsi="Courier New" w:cs="Courier New"/>
+          <w:sz w:val="22"/>
+          <w:szCs w:val="22"/>
+          <w:lang w:val="nl-NL"/>
+        </w:rPr>
+        <w:t xml:space="preserve"> duidelijk met het 7 Oktober geweld in Israël en het geweld in Gaza dat erop volgde. Het veroorzaakt veel spanningen op de universiteiten en hogescholen en vr</w:t>
+      </w:r>
+      <w:r>
+        <w:rPr>
+          <w:rFonts w:ascii="Courier New" w:hAnsi="Courier New" w:cs="Courier New"/>
+          <w:sz w:val="22"/>
+          <w:szCs w:val="22"/>
+          <w:lang w:val="nl-NL"/>
+        </w:rPr>
+        <w:t>aagt</w:t>
+      </w:r>
+      <w:r>
+        <w:rPr>
+          <w:rFonts w:ascii="Courier New" w:hAnsi="Courier New" w:cs="Courier New"/>
+          <w:sz w:val="22"/>
+          <w:szCs w:val="22"/>
+          <w:lang w:val="nl-NL"/>
+        </w:rPr>
+        <w:t xml:space="preserve"> veel van het leiderschap, zeker </w:t>
+      </w:r>
+      <w:r>
+        <w:rPr>
+          <w:rFonts w:ascii="Courier New" w:hAnsi="Courier New" w:cs="Courier New"/>
+          <w:sz w:val="22"/>
+          <w:szCs w:val="22"/>
+          <w:lang w:val="nl-NL"/>
+        </w:rPr>
+        <w:t xml:space="preserve">wanneer </w:t>
+      </w:r>
+      <w:r>
+        <w:rPr>
+          <w:rFonts w:ascii="Courier New" w:hAnsi="Courier New" w:cs="Courier New"/>
+          <w:sz w:val="22"/>
+          <w:szCs w:val="22"/>
+          <w:lang w:val="nl-NL"/>
+        </w:rPr>
+        <w:t>de politiek zich er heel actief mee bezig g</w:t>
+      </w:r>
+      <w:r>
+        <w:rPr>
+          <w:rFonts w:ascii="Courier New" w:hAnsi="Courier New" w:cs="Courier New"/>
+          <w:sz w:val="22"/>
+          <w:szCs w:val="22"/>
+          <w:lang w:val="nl-NL"/>
+        </w:rPr>
+        <w:t>aat</w:t>
+      </w:r>
+      <w:r>
+        <w:rPr>
+          <w:rFonts w:ascii="Courier New" w:hAnsi="Courier New" w:cs="Courier New"/>
+          <w:sz w:val="22"/>
+          <w:szCs w:val="22"/>
+          <w:lang w:val="nl-NL"/>
+        </w:rPr>
+        <w:t xml:space="preserve"> houden en disciplinaire maatregelen eist. </w:t>
+      </w:r>
+      <w:r>
+        <w:rPr>
+          <w:rFonts w:ascii="Courier New" w:hAnsi="Courier New" w:cs="Courier New"/>
+          <w:sz w:val="22"/>
+          <w:szCs w:val="22"/>
+          <w:lang w:val="nl-NL"/>
+        </w:rPr>
+        <w:t>Voor</w:t>
+      </w:r>
+      <w:r>
+        <w:rPr>
+          <w:rFonts w:ascii="Courier New" w:hAnsi="Courier New" w:cs="Courier New"/>
+          <w:sz w:val="22"/>
+          <w:szCs w:val="22"/>
+          <w:lang w:val="nl-NL"/>
+        </w:rPr>
+        <w:t xml:space="preserve"> Tatum is het duidelijk dat de universiteit de plaats is waar mensen met verschillende achtergronden en levenservaringen samenkomen en van elkaar leren in betekenisvolle interactie. Leiderschap moet deze waarden verdedigen. </w:t>
+      </w:r>
+    </w:p>
+    <w:p>
+      <w:pPr>
+        <w:spacing w:line="360" w:lineRule="auto"/>
+        <w:rPr>
+          <w:rFonts w:ascii="Courier New" w:hAnsi="Courier New" w:cs="Courier New"/>
+          <w:sz w:val="22"/>
+          <w:szCs w:val="22"/>
+        </w:rPr>
+      </w:pPr>
+      <w:r>
+        <w:rPr>
+          <w:rFonts w:ascii="Courier New" w:hAnsi="Courier New" w:cs="Courier New"/>
+          <w:sz w:val="22"/>
+          <w:szCs w:val="22"/>
+        </w:rPr>
+        <w:t xml:space="preserve">Uitgebreid gaat ze in op een voorbeeld </w:t>
+      </w:r>
+      <w:r>
+        <w:rPr>
+          <w:rFonts w:ascii="Courier New" w:hAnsi="Courier New" w:cs="Courier New"/>
+          <w:sz w:val="22"/>
+          <w:szCs w:val="22"/>
+        </w:rPr>
+        <w:t xml:space="preserve">op </w:t>
+      </w:r>
+      <w:r>
+        <w:rPr>
+          <w:rFonts w:ascii="Courier New" w:hAnsi="Courier New" w:cs="Courier New"/>
+          <w:sz w:val="22"/>
+          <w:szCs w:val="22"/>
+        </w:rPr>
+        <w:t xml:space="preserve">het </w:t>
+      </w:r>
+      <w:r>
+        <w:rPr>
+          <w:rFonts w:ascii="Courier New" w:hAnsi="Courier New" w:cs="Courier New"/>
+          <w:sz w:val="22"/>
+          <w:szCs w:val="22"/>
+        </w:rPr>
+        <w:t>Spelman</w:t>
+      </w:r>
+      <w:r>
+        <w:rPr>
+          <w:rFonts w:ascii="Courier New" w:hAnsi="Courier New" w:cs="Courier New"/>
+          <w:sz w:val="22"/>
+          <w:szCs w:val="22"/>
+        </w:rPr>
+        <w:t xml:space="preserve"> instituut</w:t>
+      </w:r>
+      <w:r>
+        <w:rPr>
+          <w:rFonts w:ascii="Courier New" w:hAnsi="Courier New" w:cs="Courier New"/>
+          <w:sz w:val="22"/>
+          <w:szCs w:val="22"/>
+        </w:rPr>
+        <w:t xml:space="preserve"> </w:t>
+      </w:r>
+      <w:r>
+        <w:rPr>
+          <w:rFonts w:ascii="Courier New" w:hAnsi="Courier New" w:cs="Courier New"/>
+          <w:sz w:val="22"/>
+          <w:szCs w:val="22"/>
+        </w:rPr>
+        <w:t>aan het einde van de</w:t>
+      </w:r>
+      <w:r>
+        <w:rPr>
+          <w:rFonts w:ascii="Courier New" w:hAnsi="Courier New" w:cs="Courier New"/>
+          <w:sz w:val="22"/>
+          <w:szCs w:val="22"/>
+        </w:rPr>
+        <w:t xml:space="preserve"> Covid-19-pandemie. </w:t>
+      </w:r>
+      <w:r>
+        <w:rPr>
+          <w:rFonts w:ascii="Courier New" w:hAnsi="Courier New" w:cs="Courier New"/>
+          <w:sz w:val="22"/>
+          <w:szCs w:val="22"/>
+        </w:rPr>
+        <w:t xml:space="preserve">Het voorbeeld maakt heel duidelijk hoe Tatum operereerde en </w:t>
+      </w:r>
+      <w:r>
+        <w:rPr>
+          <w:rFonts w:ascii="Courier New" w:hAnsi="Courier New" w:cs="Courier New"/>
+          <w:sz w:val="22"/>
+          <w:szCs w:val="22"/>
+        </w:rPr>
+        <w:t xml:space="preserve">laat zien wat volgens haar een succesvolle aanpak is. </w:t>
+      </w:r>
+      <w:r>
+        <w:rPr>
+          <w:rFonts w:ascii="Courier New" w:hAnsi="Courier New" w:cs="Courier New"/>
+          <w:sz w:val="22"/>
+          <w:szCs w:val="22"/>
+        </w:rPr>
+        <w:t xml:space="preserve">Toen de mondkapjesplicht werd versoepeld, bezette een groep studenten vijfentwintig dagen lang de gangen van het bestuursgebouw. </w:t>
+      </w:r>
+      <w:r>
+        <w:rPr>
+          <w:rFonts w:ascii="Courier New" w:hAnsi="Courier New" w:cs="Courier New"/>
+          <w:sz w:val="22"/>
+          <w:szCs w:val="22"/>
+        </w:rPr>
+        <w:t>Zij waren het niet eens met de versoepeling van de maatregelen. Zij ziet de bezetting niet als</w:t>
+      </w:r>
+      <w:r>
+        <w:rPr>
+          <w:rFonts w:ascii="Courier New" w:hAnsi="Courier New" w:cs="Courier New"/>
+          <w:sz w:val="22"/>
+          <w:szCs w:val="22"/>
+        </w:rPr>
+        <w:t xml:space="preserve"> een ordeverstoring die </w:t>
+      </w:r>
+      <w:r>
+        <w:rPr>
+          <w:rFonts w:ascii="Courier New" w:hAnsi="Courier New" w:cs="Courier New"/>
+          <w:sz w:val="22"/>
+          <w:szCs w:val="22"/>
+        </w:rPr>
+        <w:t xml:space="preserve">direkt </w:t>
+      </w:r>
+      <w:r>
+        <w:rPr>
+          <w:rFonts w:ascii="Courier New" w:hAnsi="Courier New" w:cs="Courier New"/>
+          <w:sz w:val="22"/>
+          <w:szCs w:val="22"/>
+        </w:rPr>
+        <w:t>onderdrukt moet worden</w:t>
+      </w:r>
+      <w:r>
+        <w:rPr>
+          <w:rFonts w:ascii="Courier New" w:hAnsi="Courier New" w:cs="Courier New"/>
+          <w:sz w:val="22"/>
+          <w:szCs w:val="22"/>
+        </w:rPr>
+        <w:t>. Zij kiest voor</w:t>
+      </w:r>
+      <w:r>
+        <w:rPr>
+          <w:rFonts w:ascii="Courier New" w:hAnsi="Courier New" w:cs="Courier New"/>
+          <w:sz w:val="22"/>
+          <w:szCs w:val="22"/>
+        </w:rPr>
+        <w:t xml:space="preserve"> een andere aanpak. Zij v</w:t>
+      </w:r>
+      <w:r>
+        <w:rPr>
+          <w:rFonts w:ascii="Courier New" w:hAnsi="Courier New" w:cs="Courier New"/>
+          <w:sz w:val="22"/>
+          <w:szCs w:val="22"/>
+        </w:rPr>
+        <w:t xml:space="preserve">doet zelf een stap vooruit en </w:t>
+      </w:r>
+      <w:r>
+        <w:rPr>
+          <w:rFonts w:ascii="Courier New" w:hAnsi="Courier New" w:cs="Courier New"/>
+          <w:sz w:val="22"/>
+          <w:szCs w:val="22"/>
+        </w:rPr>
+        <w:t>erplaatst haar eigen werkzaamheden uit het gebouw</w:t>
+      </w:r>
+      <w:r>
+        <w:rPr>
+          <w:rFonts w:ascii="Courier New" w:hAnsi="Courier New" w:cs="Courier New"/>
+          <w:sz w:val="22"/>
+          <w:szCs w:val="22"/>
+        </w:rPr>
+        <w:t xml:space="preserve">. Zij </w:t>
+      </w:r>
+      <w:r>
+        <w:rPr>
+          <w:rFonts w:ascii="Courier New" w:hAnsi="Courier New" w:cs="Courier New"/>
+          <w:sz w:val="22"/>
+          <w:szCs w:val="22"/>
+        </w:rPr>
+        <w:t>werkt vanuit huis en h</w:t>
+      </w:r>
+      <w:r>
+        <w:rPr>
+          <w:rFonts w:ascii="Courier New" w:hAnsi="Courier New" w:cs="Courier New"/>
+          <w:sz w:val="22"/>
+          <w:szCs w:val="22"/>
+        </w:rPr>
+        <w:t>oudt de</w:t>
+      </w:r>
+      <w:r>
+        <w:rPr>
+          <w:rFonts w:ascii="Courier New" w:hAnsi="Courier New" w:cs="Courier New"/>
+          <w:sz w:val="22"/>
+          <w:szCs w:val="22"/>
+        </w:rPr>
+        <w:t xml:space="preserve"> vergaderingen in het studentencentrum </w:t>
+      </w:r>
+      <w:r>
+        <w:rPr>
+          <w:rFonts w:ascii="Courier New" w:hAnsi="Courier New" w:cs="Courier New"/>
+          <w:sz w:val="22"/>
+          <w:szCs w:val="22"/>
+        </w:rPr>
+        <w:t>o</w:t>
+      </w:r>
+      <w:r>
+        <w:rPr>
+          <w:rFonts w:ascii="Courier New" w:hAnsi="Courier New" w:cs="Courier New"/>
+          <w:sz w:val="22"/>
+          <w:szCs w:val="22"/>
+        </w:rPr>
+        <w:t xml:space="preserve">m </w:t>
+      </w:r>
+      <w:r>
+        <w:rPr>
+          <w:rFonts w:ascii="Courier New" w:hAnsi="Courier New" w:cs="Courier New"/>
+          <w:sz w:val="22"/>
+          <w:szCs w:val="22"/>
+        </w:rPr>
+        <w:t xml:space="preserve">zo </w:t>
+      </w:r>
+      <w:r>
+        <w:rPr>
+          <w:rFonts w:ascii="Courier New" w:hAnsi="Courier New" w:cs="Courier New"/>
+          <w:sz w:val="22"/>
+          <w:szCs w:val="22"/>
+        </w:rPr>
+        <w:t xml:space="preserve">confrontatie te vermijden. </w:t>
+      </w:r>
+      <w:r>
+        <w:rPr>
+          <w:rFonts w:ascii="Courier New" w:hAnsi="Courier New" w:cs="Courier New"/>
+          <w:sz w:val="22"/>
+          <w:szCs w:val="22"/>
+        </w:rPr>
+        <w:t>Deze aanpak zorgt voor</w:t>
+      </w:r>
+      <w:r>
+        <w:rPr>
+          <w:rFonts w:ascii="Courier New" w:hAnsi="Courier New" w:cs="Courier New"/>
+          <w:sz w:val="22"/>
+          <w:szCs w:val="22"/>
+        </w:rPr>
+        <w:t xml:space="preserve"> de-escalatie</w:t>
+      </w:r>
+      <w:r>
+        <w:rPr>
+          <w:rFonts w:ascii="Courier New" w:hAnsi="Courier New" w:cs="Courier New"/>
+          <w:sz w:val="22"/>
+          <w:szCs w:val="22"/>
+        </w:rPr>
+        <w:t xml:space="preserve"> en zorgt ervoor dat het gesprek gevoerd kan blijven worden.</w:t>
+      </w:r>
+      <w:r>
+        <w:rPr>
+          <w:rFonts w:ascii="Courier New" w:hAnsi="Courier New" w:cs="Courier New"/>
+          <w:sz w:val="22"/>
+          <w:szCs w:val="22"/>
+        </w:rPr>
+        <w:t xml:space="preserve"> </w:t>
+      </w:r>
+      <w:r>
+        <w:rPr>
+          <w:rFonts w:ascii="Courier New" w:hAnsi="Courier New" w:cs="Courier New"/>
+          <w:sz w:val="22"/>
+          <w:szCs w:val="22"/>
+        </w:rPr>
+        <w:t xml:space="preserve">Dit zorgt ervoor dat </w:t>
+      </w:r>
+      <w:r>
+        <w:rPr>
+          <w:rFonts w:ascii="Courier New" w:hAnsi="Courier New" w:cs="Courier New"/>
+          <w:sz w:val="22"/>
+          <w:szCs w:val="22"/>
+        </w:rPr>
+        <w:t xml:space="preserve"> </w:t>
+      </w:r>
+      <w:r>
+        <w:rPr>
+          <w:rFonts w:ascii="Courier New" w:hAnsi="Courier New" w:cs="Courier New"/>
+          <w:sz w:val="22"/>
+          <w:szCs w:val="22"/>
+        </w:rPr>
+        <w:t xml:space="preserve">het </w:t>
+      </w:r>
+      <w:r>
+        <w:rPr>
+          <w:rFonts w:ascii="Courier New" w:hAnsi="Courier New" w:cs="Courier New"/>
+          <w:sz w:val="22"/>
+          <w:szCs w:val="22"/>
+        </w:rPr>
+        <w:t xml:space="preserve">institutionele gezag </w:t>
+      </w:r>
+      <w:r>
+        <w:rPr>
+          <w:rFonts w:ascii="Courier New" w:hAnsi="Courier New" w:cs="Courier New"/>
+          <w:sz w:val="22"/>
+          <w:szCs w:val="22"/>
+        </w:rPr>
+        <w:t>overeind blijft net zoals</w:t>
+      </w:r>
+      <w:r>
+        <w:rPr>
+          <w:rFonts w:ascii="Courier New" w:hAnsi="Courier New" w:cs="Courier New"/>
+          <w:sz w:val="22"/>
+          <w:szCs w:val="22"/>
+        </w:rPr>
+        <w:t xml:space="preserve"> het vertrouwen van </w:t>
+      </w:r>
+      <w:r>
+        <w:rPr>
+          <w:rFonts w:ascii="Courier New" w:hAnsi="Courier New" w:cs="Courier New"/>
+          <w:sz w:val="22"/>
+          <w:szCs w:val="22"/>
+        </w:rPr>
+        <w:t xml:space="preserve">de </w:t>
+      </w:r>
+      <w:r>
+        <w:rPr>
+          <w:rFonts w:ascii="Courier New" w:hAnsi="Courier New" w:cs="Courier New"/>
+          <w:sz w:val="22"/>
+          <w:szCs w:val="22"/>
+        </w:rPr>
+        <w:t>studenten</w:t>
+      </w:r>
+      <w:r>
+        <w:rPr>
+          <w:rFonts w:ascii="Courier New" w:hAnsi="Courier New" w:cs="Courier New"/>
+          <w:sz w:val="22"/>
+          <w:szCs w:val="22"/>
+        </w:rPr>
+        <w:t xml:space="preserve"> zelf</w:t>
+      </w:r>
+      <w:r>
+        <w:rPr>
+          <w:rFonts w:ascii="Courier New" w:hAnsi="Courier New" w:cs="Courier New"/>
+          <w:sz w:val="22"/>
+          <w:szCs w:val="22"/>
+        </w:rPr>
+        <w:t xml:space="preserve">. </w:t>
+      </w:r>
+      <w:r>
+        <w:rPr>
+          <w:rFonts w:ascii="Courier New" w:hAnsi="Courier New" w:cs="Courier New"/>
+          <w:sz w:val="22"/>
+          <w:szCs w:val="22"/>
+        </w:rPr>
+        <w:t>Zij contrasteert haar aanpak</w:t>
+      </w:r>
+      <w:r>
+        <w:rPr>
+          <w:rFonts w:ascii="Courier New" w:hAnsi="Courier New" w:cs="Courier New"/>
+          <w:sz w:val="22"/>
+          <w:szCs w:val="22"/>
+        </w:rPr>
+        <w:t xml:space="preserve"> met de gewelddadige verwijdering van demonstranten aan andere universiteiten.</w:t>
+      </w:r>
+      <w:r>
+        <w:rPr>
+          <w:rFonts w:ascii="Courier New" w:hAnsi="Courier New" w:cs="Courier New"/>
+          <w:sz w:val="22"/>
+          <w:szCs w:val="22"/>
+        </w:rPr>
+        <w:t xml:space="preserve"> Lesson </w:t>
+      </w:r>
+      <w:r>
+        <w:rPr>
+          <w:rFonts w:ascii="Courier New" w:hAnsi="Courier New" w:cs="Courier New"/>
+          <w:sz w:val="22"/>
+          <w:szCs w:val="22"/>
+        </w:rPr>
+        <w:lastRenderedPageBreak/>
+        <w:t xml:space="preserve">learned: </w:t>
+      </w:r>
+      <w:r>
+        <w:rPr>
+          <w:rFonts w:ascii="Courier New" w:hAnsi="Courier New" w:cs="Courier New"/>
+          <w:sz w:val="22"/>
+          <w:szCs w:val="22"/>
+        </w:rPr>
+        <w:t>neem nooit een beslissing die als totale verrassing komt; bel niet onmiddellijk de politie; luister naar zoveel mogelijk stemmen voordat je handelt. Dit zijn geen gemeenplaatsen, maar principes die zijn gesmeed in daadwerkelijke institutionele crises.</w:t>
+      </w:r>
+    </w:p>
+    <w:p>
+      <w:pPr>
+        <w:spacing w:line="360" w:lineRule="auto"/>
+        <w:ind w:firstLine="720"/>
+        <w:rPr>
+          <w:rFonts w:ascii="Courier New" w:hAnsi="Courier New" w:cs="Courier New"/>
+          <w:sz w:val="22"/>
+          <w:szCs w:val="22"/>
+        </w:rPr>
+      </w:pPr>
+      <w:r>
+        <w:rPr>
+          <w:rFonts w:ascii="Courier New" w:hAnsi="Courier New" w:cs="Courier New"/>
+          <w:sz w:val="22"/>
+          <w:szCs w:val="22"/>
+        </w:rPr>
+        <w:t>Het boek vervolgt met een reeks casestudy’s, grotendeels ontleend aan Tatums eigen presidentschap bij Spelman. Deze voorbeelden behandelen een indrukwekkend scala aan institutionele uitdagingen: het omgaan met campusprotesten, het navigeren door controverses rond vrije meningsuiting, het hanteren van financiële beperkingen en de delicate kunst van gedeeld bestuur met faculteit, personeel, studenten en toezichthouders die het niet altijd met elkaar eens zijn. Elk voorbeeld is concreet genoeg om leerzaam te zijn en openhartig genoeg om de zelfverheerlijking te vermijden die leiderschapsmemoires vaak kenmerkt.</w:t>
+      </w:r>
+    </w:p>
+    <w:p>
+      <w:pPr>
+        <w:spacing w:line="360" w:lineRule="auto"/>
+        <w:rPr>
+          <w:rFonts w:ascii="Courier New" w:hAnsi="Courier New" w:cs="Courier New"/>
+          <w:sz w:val="22"/>
+          <w:szCs w:val="22"/>
         </w:rPr>
       </w:pPr>
     </w:p>
@@ -1708,69 +2947,6 @@
           <w:lang w:val="nl-NL"/>
         </w:rPr>
       </w:pPr>
-      <w:r>
-        <w:rPr>
-          <w:rFonts w:ascii="Courier New" w:hAnsi="Courier New" w:cs="Courier New"/>
-          <w:sz w:val="22"/>
-          <w:szCs w:val="22"/>
-          <w:lang w:val="nl-NL"/>
-        </w:rPr>
-        <w:t>W</w:t>
-      </w:r>
-      <w:r>
-        <w:rPr>
-          <w:rFonts w:ascii="Courier New" w:hAnsi="Courier New" w:cs="Courier New"/>
-          <w:sz w:val="22"/>
-          <w:szCs w:val="22"/>
-          <w:lang w:val="nl-NL"/>
-        </w:rPr>
-        <w:t xml:space="preserve">at mag er van jou als </w:t>
-      </w:r>
-      <w:r>
-        <w:rPr>
-          <w:rFonts w:ascii="Courier New" w:hAnsi="Courier New" w:cs="Courier New"/>
-          <w:sz w:val="22"/>
-          <w:szCs w:val="22"/>
-          <w:lang w:val="nl-NL"/>
-        </w:rPr>
-        <w:t xml:space="preserve">president, </w:t>
-      </w:r>
-      <w:r>
-        <w:rPr>
-          <w:rFonts w:ascii="Courier New" w:hAnsi="Courier New" w:cs="Courier New"/>
-          <w:sz w:val="22"/>
-          <w:szCs w:val="22"/>
-          <w:lang w:val="nl-NL"/>
-        </w:rPr>
-        <w:t>decaan</w:t>
-      </w:r>
-      <w:r>
-        <w:rPr>
-          <w:rFonts w:ascii="Courier New" w:hAnsi="Courier New" w:cs="Courier New"/>
-          <w:sz w:val="22"/>
-          <w:szCs w:val="22"/>
-          <w:lang w:val="nl-NL"/>
-        </w:rPr>
-        <w:t xml:space="preserve"> of bestuursvoorzitter </w:t>
-      </w:r>
-      <w:r>
-        <w:rPr>
-          <w:rFonts w:ascii="Courier New" w:hAnsi="Courier New" w:cs="Courier New"/>
-          <w:sz w:val="22"/>
-          <w:szCs w:val="22"/>
-          <w:lang w:val="nl-NL"/>
-        </w:rPr>
-        <w:t>zoal worden verwacht</w:t>
-      </w:r>
-      <w:r>
-        <w:rPr>
-          <w:rFonts w:ascii="Courier New" w:hAnsi="Courier New" w:cs="Courier New"/>
-          <w:sz w:val="22"/>
-          <w:szCs w:val="22"/>
-          <w:lang w:val="nl-NL"/>
-        </w:rPr>
-        <w:t>.</w:t>
-      </w:r>
     </w:p>
     <w:p>
       <w:pPr>
@@ -1779,18 +2955,66 @@
           <w:rFonts w:ascii="Courier New" w:hAnsi="Courier New" w:cs="Courier New"/>
           <w:sz w:val="22"/>
           <w:szCs w:val="22"/>
-          <w:lang w:val="nl-NL"/>
         </w:rPr>
       </w:pPr>
+      <w:r>
+        <w:rPr>
+          <w:rFonts w:ascii="Courier New" w:hAnsi="Courier New" w:cs="Courier New"/>
+          <w:sz w:val="22"/>
+          <w:szCs w:val="22"/>
+          <w:lang w:val="nl-NL"/>
+        </w:rPr>
+        <w:t>H</w:t>
+      </w:r>
+      <w:r>
+        <w:rPr>
+          <w:rFonts w:ascii="Courier New" w:hAnsi="Courier New" w:cs="Courier New"/>
+          <w:sz w:val="22"/>
+          <w:szCs w:val="22"/>
+        </w:rPr>
+        <w:t>et boek is geschreven vanuit het perspectief van specifieke instellingen</w:t>
+      </w:r>
+      <w:r>
+        <w:rPr>
+          <w:rFonts w:ascii="Courier New" w:hAnsi="Courier New" w:cs="Courier New"/>
+          <w:sz w:val="22"/>
+          <w:szCs w:val="22"/>
+        </w:rPr>
+        <w:t xml:space="preserve">, </w:t>
+      </w:r>
+      <w:r>
+        <w:rPr>
+          <w:rFonts w:ascii="Courier New" w:hAnsi="Courier New" w:cs="Courier New"/>
+          <w:sz w:val="22"/>
+          <w:szCs w:val="22"/>
+        </w:rPr>
+        <w:t xml:space="preserve">een zwarte vrouwenuniversiteit en liberal arts-instelling. </w:t>
+      </w:r>
+      <w:r>
+        <w:rPr>
+          <w:rFonts w:ascii="Courier New" w:hAnsi="Courier New" w:cs="Courier New"/>
+          <w:sz w:val="22"/>
+          <w:szCs w:val="22"/>
+        </w:rPr>
+        <w:t>Maar de lessen zijn overdraagbaar naar andere instellingen.</w:t>
+      </w:r>
+      <w:r>
+        <w:rPr>
+          <w:rFonts w:ascii="Courier New" w:hAnsi="Courier New" w:cs="Courier New"/>
+          <w:sz w:val="22"/>
+          <w:szCs w:val="22"/>
+        </w:rPr>
+        <w:t xml:space="preserve"> </w:t>
+      </w:r>
     </w:p>
     <w:p>
       <w:pPr>
         <w:spacing w:line="360" w:lineRule="auto"/>
-        <w:rPr>
-          <w:rFonts w:ascii="Courier New" w:hAnsi="Courier New" w:cs="Courier New"/>
-          <w:sz w:val="22"/>
-          <w:szCs w:val="22"/>
-          <w:lang w:val="nl-NL"/>
+        <w:ind w:firstLine="720"/>
+        <w:rPr>
+          <w:rFonts w:ascii="Courier New" w:hAnsi="Courier New" w:cs="Courier New"/>
+          <w:sz w:val="22"/>
+          <w:szCs w:val="22"/>
         </w:rPr>
       </w:pPr>
       <w:r>
@@ -1895,7 +3119,15 @@
           <w:sz w:val="22"/>
           <w:szCs w:val="22"/>
         </w:rPr>
-        <w:t>nieuw leiderschap te ontwikkelen en te vormen. Voor haar zijn het</w:t>
+        <w:t xml:space="preserve">nieuw leiderschap te ontwikkelen en te vormen. </w:t>
+      </w:r>
+      <w:r>
+        <w:rPr>
+          <w:rFonts w:ascii="Courier New" w:hAnsi="Courier New" w:cs="Courier New"/>
+          <w:sz w:val="22"/>
+          <w:szCs w:val="22"/>
+        </w:rPr>
+        <w:t>Tatum ziet universiteiten en hogescholen als</w:t>
       </w:r>
       <w:r>
         <w:rPr>
@@ -1911,23 +3143,95 @@
           <w:sz w:val="22"/>
           <w:szCs w:val="22"/>
         </w:rPr>
-        <w:t>willen ze nieuwe generaties inspireren</w:t>
-      </w:r>
-      <w:r>
-        <w:rPr>
-          <w:rFonts w:ascii="Courier New" w:hAnsi="Courier New" w:cs="Courier New"/>
-          <w:sz w:val="22"/>
-          <w:szCs w:val="22"/>
-        </w:rPr>
-        <w:t>. Hogescholen en universiteiten zi</w:t>
-      </w:r>
-      <w:r>
-        <w:rPr>
-          <w:rFonts w:ascii="Courier New" w:hAnsi="Courier New" w:cs="Courier New"/>
-          <w:sz w:val="22"/>
-          <w:szCs w:val="22"/>
-        </w:rPr>
-        <w:t>et zij als</w:t>
+        <w:t xml:space="preserve">willen </w:t>
+      </w:r>
+      <w:r>
+        <w:rPr>
+          <w:rFonts w:ascii="Courier New" w:hAnsi="Courier New" w:cs="Courier New"/>
+          <w:sz w:val="22"/>
+          <w:szCs w:val="22"/>
+        </w:rPr>
+        <w:t xml:space="preserve">dat </w:t>
+      </w:r>
+      <w:r>
+        <w:rPr>
+          <w:rFonts w:ascii="Courier New" w:hAnsi="Courier New" w:cs="Courier New"/>
+          <w:sz w:val="22"/>
+          <w:szCs w:val="22"/>
+        </w:rPr>
+        <w:t xml:space="preserve">ze </w:t>
+      </w:r>
+      <w:r>
+        <w:rPr>
+          <w:rFonts w:ascii="Courier New" w:hAnsi="Courier New" w:cs="Courier New"/>
+          <w:sz w:val="22"/>
+          <w:szCs w:val="22"/>
+        </w:rPr>
+        <w:t xml:space="preserve">erin slagen om </w:t>
+      </w:r>
+      <w:r>
+        <w:rPr>
+          <w:rFonts w:ascii="Courier New" w:hAnsi="Courier New" w:cs="Courier New"/>
+          <w:sz w:val="22"/>
+          <w:szCs w:val="22"/>
+        </w:rPr>
+        <w:t xml:space="preserve">nieuwe generaties </w:t>
+      </w:r>
+      <w:r>
+        <w:rPr>
+          <w:rFonts w:ascii="Courier New" w:hAnsi="Courier New" w:cs="Courier New"/>
+          <w:sz w:val="22"/>
+          <w:szCs w:val="22"/>
+        </w:rPr>
+        <w:t xml:space="preserve">te </w:t>
+      </w:r>
+      <w:r>
+        <w:rPr>
+          <w:rFonts w:ascii="Courier New" w:hAnsi="Courier New" w:cs="Courier New"/>
+          <w:sz w:val="22"/>
+          <w:szCs w:val="22"/>
+        </w:rPr>
+        <w:t>inspireren</w:t>
+      </w:r>
+      <w:r>
+        <w:rPr>
+          <w:rFonts w:ascii="Courier New" w:hAnsi="Courier New" w:cs="Courier New"/>
+          <w:sz w:val="22"/>
+          <w:szCs w:val="22"/>
+        </w:rPr>
+        <w:t xml:space="preserve">. </w:t>
+      </w:r>
+      <w:r>
+        <w:rPr>
+          <w:rFonts w:ascii="Courier New" w:hAnsi="Courier New" w:cs="Courier New"/>
+          <w:sz w:val="22"/>
+          <w:szCs w:val="22"/>
+        </w:rPr>
+        <w:t xml:space="preserve">Zij ziet </w:t>
+      </w:r>
+      <w:r>
+        <w:rPr>
+          <w:rFonts w:ascii="Courier New" w:hAnsi="Courier New" w:cs="Courier New"/>
+          <w:sz w:val="22"/>
+          <w:szCs w:val="22"/>
+        </w:rPr>
+        <w:t xml:space="preserve">universiteiten </w:t>
+      </w:r>
+      <w:r>
+        <w:rPr>
+          <w:rFonts w:ascii="Courier New" w:hAnsi="Courier New" w:cs="Courier New"/>
+          <w:sz w:val="22"/>
+          <w:szCs w:val="22"/>
+        </w:rPr>
+        <w:t>en hogescholen</w:t>
+      </w:r>
+      <w:r>
+        <w:rPr>
+          <w:rFonts w:ascii="Courier New" w:hAnsi="Courier New" w:cs="Courier New"/>
+          <w:sz w:val="22"/>
+          <w:szCs w:val="22"/>
+        </w:rPr>
+        <w:t xml:space="preserve"> als</w:t>
       </w:r>
       <w:r>
         <w:rPr>
@@ -1951,21 +3255,61 @@
           <w:sz w:val="22"/>
           <w:szCs w:val="22"/>
         </w:rPr>
-        <w:t>aantrekken. Het zijn plaatsen waar leiders de impact kunnen zien van het werk dat zij elke dag doen, waar effectief leiderschap transformerend kan zijn. Ondanks de uitdagingen is een campus een prachtige plek om te zijn. Het was inspirerend om weer op de campus terug te zijn in een leidinggevende rol.</w:t>
-      </w:r>
-      <w:r>
-        <w:rPr>
-          <w:rFonts w:ascii="Courier New" w:hAnsi="Courier New" w:cs="Courier New"/>
-          <w:sz w:val="22"/>
-          <w:szCs w:val="22"/>
-          <w:lang w:val="nl-NL"/>
-        </w:rPr>
-        <w:t>Het einde van het voorkeursbeleid</w:t>
+        <w:t xml:space="preserve">aantrekken. </w:t>
+      </w:r>
+      <w:r>
+        <w:rPr>
+          <w:rFonts w:ascii="Courier New" w:hAnsi="Courier New" w:cs="Courier New"/>
+          <w:sz w:val="22"/>
+          <w:szCs w:val="22"/>
+        </w:rPr>
+        <w:t>Als plekken</w:t>
+      </w:r>
+      <w:r>
+        <w:rPr>
+          <w:rFonts w:ascii="Courier New" w:hAnsi="Courier New" w:cs="Courier New"/>
+          <w:sz w:val="22"/>
+          <w:szCs w:val="22"/>
+        </w:rPr>
+        <w:t xml:space="preserve"> waar leiders de impact kunnen zien van het werk dat zij elke dag doen, waar effectief leiderschap transformerend kan zijn. Ondanks </w:t>
+      </w:r>
+      <w:r>
+        <w:rPr>
+          <w:rFonts w:ascii="Courier New" w:hAnsi="Courier New" w:cs="Courier New"/>
+          <w:sz w:val="22"/>
+          <w:szCs w:val="22"/>
+        </w:rPr>
+        <w:t xml:space="preserve">al </w:t>
+      </w:r>
+      <w:r>
+        <w:rPr>
+          <w:rFonts w:ascii="Courier New" w:hAnsi="Courier New" w:cs="Courier New"/>
+          <w:sz w:val="22"/>
+          <w:szCs w:val="22"/>
+        </w:rPr>
+        <w:t xml:space="preserve">de uitdagingen </w:t>
+      </w:r>
+      <w:r>
+        <w:rPr>
+          <w:rFonts w:ascii="Courier New" w:hAnsi="Courier New" w:cs="Courier New"/>
+          <w:sz w:val="22"/>
+          <w:szCs w:val="22"/>
+        </w:rPr>
+        <w:t xml:space="preserve">waarmee ze worden geconfronteerd </w:t>
+      </w:r>
+      <w:r>
+        <w:rPr>
+          <w:rFonts w:ascii="Courier New" w:hAnsi="Courier New" w:cs="Courier New"/>
+          <w:sz w:val="22"/>
+          <w:szCs w:val="22"/>
+        </w:rPr>
+        <w:t xml:space="preserve">is een campus een prachtige plek om te zijn. </w:t>
       </w:r>
     </w:p>
     <w:p>
       <w:pPr>
         <w:spacing w:line="360" w:lineRule="auto"/>
+        <w:ind w:firstLine="720"/>
         <w:rPr>
           <w:rFonts w:ascii="Courier New" w:hAnsi="Courier New" w:cs="Courier New"/>
           <w:sz w:val="22"/>
@@ -1976,12 +3320,160 @@
       <w:r>
         <w:rPr>
           <w:rFonts w:ascii="Courier New" w:hAnsi="Courier New" w:cs="Courier New"/>
-          <w:sz w:val="22"/>
-          <w:szCs w:val="22"/>
-          <w:lang w:val="nl-NL"/>
-        </w:rPr>
-        <w:t>Destructie en plezier</w:t>
-      </w:r>
+          <w:i/>
+          <w:iCs/>
+          <w:sz w:val="22"/>
+          <w:szCs w:val="22"/>
+        </w:rPr>
+        <w:t>Peril and Promise</w:t>
+      </w:r>
+      <w:r>
+        <w:rPr>
+          <w:rFonts w:ascii="Courier New" w:hAnsi="Courier New" w:cs="Courier New"/>
+          <w:sz w:val="22"/>
+          <w:szCs w:val="22"/>
+        </w:rPr>
+        <w:t xml:space="preserve"> is </w:t>
+      </w:r>
+      <w:r>
+        <w:rPr>
+          <w:rFonts w:ascii="Courier New" w:hAnsi="Courier New" w:cs="Courier New"/>
+          <w:sz w:val="22"/>
+          <w:szCs w:val="22"/>
+        </w:rPr>
+        <w:t xml:space="preserve">een belangrijk en waardevol boek. </w:t>
+      </w:r>
+      <w:r>
+        <w:rPr>
+          <w:rFonts w:ascii="Courier New" w:hAnsi="Courier New" w:cs="Courier New"/>
+          <w:sz w:val="22"/>
+          <w:szCs w:val="22"/>
+        </w:rPr>
+        <w:t>N</w:t>
+      </w:r>
+      <w:r>
+        <w:rPr>
+          <w:rFonts w:ascii="Courier New" w:hAnsi="Courier New" w:cs="Courier New"/>
+          <w:sz w:val="22"/>
+          <w:szCs w:val="22"/>
+        </w:rPr>
+        <w:t xml:space="preserve">iet </w:t>
+      </w:r>
+      <w:r>
+        <w:rPr>
+          <w:rFonts w:ascii="Courier New" w:hAnsi="Courier New" w:cs="Courier New"/>
+          <w:sz w:val="22"/>
+          <w:szCs w:val="22"/>
+        </w:rPr>
+        <w:t xml:space="preserve">zozeer vanwege </w:t>
+      </w:r>
+      <w:r>
+        <w:rPr>
+          <w:rFonts w:ascii="Courier New" w:hAnsi="Courier New" w:cs="Courier New"/>
+          <w:sz w:val="22"/>
+          <w:szCs w:val="22"/>
+        </w:rPr>
+        <w:t xml:space="preserve">de originaliteit van de ideeën, maar </w:t>
+      </w:r>
+      <w:r>
+        <w:rPr>
+          <w:rFonts w:ascii="Courier New" w:hAnsi="Courier New" w:cs="Courier New"/>
+          <w:sz w:val="22"/>
+          <w:szCs w:val="22"/>
+        </w:rPr>
+        <w:t>is juist de ervaring en het dialogisch perspectief dat het boek interessant maakt</w:t>
+      </w:r>
+      <w:r>
+        <w:rPr>
+          <w:rFonts w:ascii="Courier New" w:hAnsi="Courier New" w:cs="Courier New"/>
+          <w:sz w:val="22"/>
+          <w:szCs w:val="22"/>
+        </w:rPr>
+        <w:t>. Het b</w:t>
+      </w:r>
+      <w:r>
+        <w:rPr>
+          <w:rFonts w:ascii="Courier New" w:hAnsi="Courier New" w:cs="Courier New"/>
+          <w:sz w:val="22"/>
+          <w:szCs w:val="22"/>
+        </w:rPr>
+        <w:t xml:space="preserve">oek is interessant voor iedereen die werkt of de </w:t>
+      </w:r>
+      <w:r>
+        <w:rPr>
+          <w:rFonts w:ascii="Courier New" w:hAnsi="Courier New" w:cs="Courier New"/>
+          <w:sz w:val="22"/>
+          <w:szCs w:val="22"/>
+        </w:rPr>
+        <w:t xml:space="preserve">ambitie heeft </w:t>
+      </w:r>
+      <w:r>
+        <w:rPr>
+          <w:rFonts w:ascii="Courier New" w:hAnsi="Courier New" w:cs="Courier New"/>
+          <w:sz w:val="22"/>
+          <w:szCs w:val="22"/>
+        </w:rPr>
+        <w:t xml:space="preserve">om </w:t>
+      </w:r>
+      <w:r>
+        <w:rPr>
+          <w:rFonts w:ascii="Courier New" w:hAnsi="Courier New" w:cs="Courier New"/>
+          <w:sz w:val="22"/>
+          <w:szCs w:val="22"/>
+        </w:rPr>
+        <w:t>binnen het hoger onderwijsbestuur</w:t>
+      </w:r>
+      <w:r>
+        <w:rPr>
+          <w:rFonts w:ascii="Courier New" w:hAnsi="Courier New" w:cs="Courier New"/>
+          <w:sz w:val="22"/>
+          <w:szCs w:val="22"/>
+        </w:rPr>
+        <w:t xml:space="preserve"> te gaan werken</w:t>
+      </w:r>
+      <w:r>
+        <w:rPr>
+          <w:rFonts w:ascii="Courier New" w:hAnsi="Courier New" w:cs="Courier New"/>
+          <w:sz w:val="22"/>
+          <w:szCs w:val="22"/>
+        </w:rPr>
+        <w:t xml:space="preserve">. Maar ook anderen — ouders, alumni, burgers — die zich zorgen maken over de </w:t>
+      </w:r>
+      <w:r>
+        <w:rPr>
+          <w:rFonts w:ascii="Courier New" w:hAnsi="Courier New" w:cs="Courier New"/>
+          <w:sz w:val="22"/>
+          <w:szCs w:val="22"/>
+        </w:rPr>
+        <w:lastRenderedPageBreak/>
+        <w:t>toekomst van universiteiten, vinden hier een wijze en humane gids. In een tijd waarin het verleidelijk is het hoger onderwijs af te schrijven als hopeloos gebroken of het kritiekloos te verdedigen, biedt Tatum iets zeldzaams: een nuchtere analyse van echte problemen én een geloofwaardig betoog voor blijvende belofte.</w:t>
+      </w:r>
+      <w:r>
+        <w:rPr>
+          <w:rFonts w:ascii="Courier New" w:hAnsi="Courier New" w:cs="Courier New"/>
+          <w:sz w:val="22"/>
+          <w:szCs w:val="22"/>
+        </w:rPr>
+        <w:t xml:space="preserve"> Een goed tegengeluid in deze tijd.</w:t>
+      </w:r>
+      <w:r>
+        <w:rPr>
+          <w:rFonts w:ascii="Courier New" w:hAnsi="Courier New" w:cs="Courier New"/>
+          <w:sz w:val="22"/>
+          <w:szCs w:val="22"/>
+        </w:rPr>
+        <w:t xml:space="preserve"> </w:t>
+      </w:r>
+    </w:p>
+    <w:p>
+      <w:pPr>
+        <w:spacing w:line="360" w:lineRule="auto"/>
+        <w:rPr>
+          <w:rFonts w:ascii="Courier New" w:hAnsi="Courier New" w:cs="Courier New"/>
+          <w:sz w:val="22"/>
+          <w:szCs w:val="22"/>
+        </w:rPr>
+      </w:pPr>
     </w:p>
     <w:p>
       <w:pPr>
@@ -2876,6 +4368,7 @@
   <w:style w:type="character" w:default="1" w:styleId="DefaultParagraphFont">
     <w:name w:val="Default Paragraph Font"/>
     <w:uiPriority w:val="1"/>
+    <w:semiHidden/>
     <w:unhideWhenUsed/>
   </w:style>
   <w:style w:type="table" w:default="1" w:styleId="TableNormal">

</xml_diff>

<commit_message>
26-02-26, Blog Tatum bijgewerkt
</commit_message>
<xml_diff>
--- a/BlogsWord/Wiewildiebaan?.docx
+++ b/BlogsWord/Wiewildiebaan?.docx
@@ -82,7 +82,7 @@
           <w:sz w:val="22"/>
           <w:szCs w:val="22"/>
         </w:rPr>
-        <w:t>Het langetermijnsucces van het hoger onderwijs als publiek goed hangt niet alleen af van de institutionele leiders — en hun besturen, hun docenten, medewerkers, bestuurders en alumni — maar ook van de bredere gemeenschappen die hen steunen en geloven in de transformerende kracht van hun onderwijsopdracht.”</w:t>
+        <w:t>Goede leiders zijn juist in een tijd als deze nodig.</w:t>
       </w:r>
     </w:p>
     <w:p>
@@ -150,7 +150,6 @@
           <w:rFonts w:ascii="Courier New" w:hAnsi="Courier New" w:cs="Courier New"/>
           <w:sz w:val="22"/>
           <w:szCs w:val="22"/>
-          <w:lang w:val="nl-NL"/>
         </w:rPr>
       </w:pPr>
       <w:r>
@@ -373,7 +372,23 @@
           <w:sz w:val="22"/>
           <w:szCs w:val="22"/>
         </w:rPr>
-        <w:t xml:space="preserve">hebben het zwaar tegenwoordig en dat roept nogal eens de vraag op wie deze baan nog </w:t>
+        <w:t>hebben het zwaar tegenwoordig</w:t>
+      </w:r>
+      <w:r>
+        <w:rPr>
+          <w:rFonts w:ascii="Courier New" w:hAnsi="Courier New" w:cs="Courier New"/>
+          <w:sz w:val="22"/>
+          <w:szCs w:val="22"/>
+        </w:rPr>
+        <w:t>. D</w:t>
+      </w:r>
+      <w:r>
+        <w:rPr>
+          <w:rFonts w:ascii="Courier New" w:hAnsi="Courier New" w:cs="Courier New"/>
+          <w:sz w:val="22"/>
+          <w:szCs w:val="22"/>
+        </w:rPr>
+        <w:t xml:space="preserve">at roept nogal eens de vraag op wie deze baan nog </w:t>
       </w:r>
       <w:r>
         <w:rPr>
@@ -390,14 +405,6 @@
           <w:szCs w:val="22"/>
         </w:rPr>
         <w:t>hebben.</w:t>
-      </w:r>
-      <w:r>
-        <w:rPr>
-          <w:rFonts w:ascii="Courier New" w:hAnsi="Courier New" w:cs="Courier New"/>
-          <w:sz w:val="22"/>
-          <w:szCs w:val="22"/>
-        </w:rPr>
-        <w:t xml:space="preserve"> Ook Beverly Daniel Tatum krijgt als oud-president van enkele Amerikaanse Universiteiten vaak gesteld.</w:t>
       </w:r>
       <w:r>
         <w:rPr>
@@ -424,6 +431,39 @@
           <w:rFonts w:ascii="Courier New" w:hAnsi="Courier New" w:cs="Courier New"/>
           <w:sz w:val="22"/>
           <w:szCs w:val="22"/>
+        </w:rPr>
+        <w:t>Ook Beverly Daniel Tatum krijgt als oud-president van enkele Amerikaanse Universiteiten vaak gesteld.</w:t>
+      </w:r>
+      <w:r>
+        <w:rPr>
+          <w:rFonts w:ascii="Courier New" w:hAnsi="Courier New" w:cs="Courier New"/>
+          <w:sz w:val="22"/>
+          <w:szCs w:val="22"/>
+        </w:rPr>
+        <w:t xml:space="preserve"> </w:t>
+      </w:r>
+      <w:r>
+        <w:rPr>
+          <w:rFonts w:ascii="Courier New" w:hAnsi="Courier New" w:cs="Courier New"/>
+          <w:sz w:val="22"/>
+          <w:szCs w:val="22"/>
+        </w:rPr>
+        <w:t>Het daagde haar in ieder geval uit daar een antwoord op te geven.</w:t>
+      </w:r>
+      <w:r>
+        <w:rPr>
+          <w:rFonts w:ascii="Courier New" w:hAnsi="Courier New" w:cs="Courier New"/>
+          <w:sz w:val="22"/>
+          <w:szCs w:val="22"/>
+          <w:lang w:val="nl-NL"/>
+        </w:rPr>
+        <w:t xml:space="preserve"> </w:t>
+      </w:r>
+      <w:r>
+        <w:rPr>
+          <w:rFonts w:ascii="Courier New" w:hAnsi="Courier New" w:cs="Courier New"/>
+          <w:sz w:val="22"/>
+          <w:szCs w:val="22"/>
           <w:lang w:val="nl-NL"/>
         </w:rPr>
         <w:t xml:space="preserve">Beverly Daniel Tantum </w:t>
@@ -637,27 +677,25 @@
           <w:szCs w:val="22"/>
           <w:lang w:val="nl-NL"/>
         </w:rPr>
-        <w:t xml:space="preserve">ich voor daar nog eens </w:t>
-      </w:r>
-      <w:proofErr w:type="spellStart"/>
-      <w:r>
-        <w:rPr>
-          <w:rFonts w:ascii="Courier New" w:hAnsi="Courier New" w:cs="Courier New"/>
-          <w:sz w:val="22"/>
-          <w:szCs w:val="22"/>
-          <w:lang w:val="nl-NL"/>
-        </w:rPr>
-        <w:t>eens</w:t>
-      </w:r>
-      <w:proofErr w:type="spellEnd"/>
-      <w:r>
-        <w:rPr>
-          <w:rFonts w:ascii="Courier New" w:hAnsi="Courier New" w:cs="Courier New"/>
-          <w:sz w:val="22"/>
-          <w:szCs w:val="22"/>
-          <w:lang w:val="nl-NL"/>
-        </w:rPr>
-        <w:t xml:space="preserve"> een boek over te schrijven. Het duurde </w:t>
+        <w:t xml:space="preserve">ich voor </w:t>
+      </w:r>
+      <w:r>
+        <w:rPr>
+          <w:rFonts w:ascii="Courier New" w:hAnsi="Courier New" w:cs="Courier New"/>
+          <w:sz w:val="22"/>
+          <w:szCs w:val="22"/>
+          <w:lang w:val="nl-NL"/>
+        </w:rPr>
+        <w:t>over haar werk nog eens</w:t>
+      </w:r>
+      <w:r>
+        <w:rPr>
+          <w:rFonts w:ascii="Courier New" w:hAnsi="Courier New" w:cs="Courier New"/>
+          <w:sz w:val="22"/>
+          <w:szCs w:val="22"/>
+          <w:lang w:val="nl-NL"/>
+        </w:rPr>
+        <w:t xml:space="preserve"> een boek te schrijven. Het duurde </w:t>
       </w:r>
       <w:r>
         <w:rPr>
@@ -702,7 +740,25 @@
           <w:szCs w:val="22"/>
           <w:lang w:val="nl-NL"/>
         </w:rPr>
-        <w:t>. Het boek dat ze in gedachten had was een soort memoires</w:t>
+        <w:t xml:space="preserve">. Het boek </w:t>
+      </w:r>
+      <w:r>
+        <w:rPr>
+          <w:rFonts w:ascii="Courier New" w:hAnsi="Courier New" w:cs="Courier New"/>
+          <w:sz w:val="22"/>
+          <w:szCs w:val="22"/>
+          <w:lang w:val="nl-NL"/>
+        </w:rPr>
+        <w:t xml:space="preserve">over educatief leiderschap </w:t>
+      </w:r>
+      <w:r>
+        <w:rPr>
+          <w:rFonts w:ascii="Courier New" w:hAnsi="Courier New" w:cs="Courier New"/>
+          <w:sz w:val="22"/>
+          <w:szCs w:val="22"/>
+          <w:lang w:val="nl-NL"/>
+        </w:rPr>
+        <w:t>dat ze in gedachten had was een soort memoires</w:t>
       </w:r>
       <w:r>
         <w:rPr>
@@ -843,7 +899,25 @@
           <w:szCs w:val="22"/>
           <w:lang w:val="nl-NL"/>
         </w:rPr>
-        <w:t xml:space="preserve">mooi en heel leerzaam </w:t>
+        <w:t xml:space="preserve">mooi en </w:t>
+      </w:r>
+      <w:r>
+        <w:rPr>
+          <w:rFonts w:ascii="Courier New" w:hAnsi="Courier New" w:cs="Courier New"/>
+          <w:sz w:val="22"/>
+          <w:szCs w:val="22"/>
+          <w:lang w:val="nl-NL"/>
+        </w:rPr>
+        <w:t>inspirerend</w:t>
+      </w:r>
+      <w:r>
+        <w:rPr>
+          <w:rFonts w:ascii="Courier New" w:hAnsi="Courier New" w:cs="Courier New"/>
+          <w:sz w:val="22"/>
+          <w:szCs w:val="22"/>
+          <w:lang w:val="nl-NL"/>
+        </w:rPr>
+        <w:t xml:space="preserve"> </w:t>
       </w:r>
       <w:r>
         <w:rPr>
@@ -1008,7 +1082,23 @@
           <w:sz w:val="22"/>
           <w:szCs w:val="22"/>
         </w:rPr>
-        <w:t xml:space="preserve">. </w:t>
+        <w:t>.</w:t>
+      </w:r>
+      <w:r>
+        <w:rPr>
+          <w:rFonts w:ascii="Courier New" w:hAnsi="Courier New" w:cs="Courier New"/>
+          <w:sz w:val="22"/>
+          <w:szCs w:val="22"/>
+        </w:rPr>
+        <w:t xml:space="preserve"> Een rustig baken in turbulente tijden.</w:t>
+      </w:r>
+      <w:r>
+        <w:rPr>
+          <w:rFonts w:ascii="Courier New" w:hAnsi="Courier New" w:cs="Courier New"/>
+          <w:sz w:val="22"/>
+          <w:szCs w:val="22"/>
+        </w:rPr>
+        <w:t xml:space="preserve"> </w:t>
       </w:r>
     </w:p>
     <w:p>
@@ -1052,7 +1142,43 @@
           <w:szCs w:val="22"/>
           <w:lang w:val="nl-NL"/>
         </w:rPr>
-        <w:t xml:space="preserve">Als we aan het hoger onderwijs van Amerika denken wordt er al snel aan Harvard, Stanford, MIT, Princeton, Chicago of </w:t>
+        <w:t>Als we aan het hoger onderwijs van Amerika denken</w:t>
+      </w:r>
+      <w:r>
+        <w:rPr>
+          <w:rFonts w:ascii="Courier New" w:hAnsi="Courier New" w:cs="Courier New"/>
+          <w:sz w:val="22"/>
+          <w:szCs w:val="22"/>
+          <w:lang w:val="nl-NL"/>
+        </w:rPr>
+        <w:t>,</w:t>
+      </w:r>
+      <w:r>
+        <w:rPr>
+          <w:rFonts w:ascii="Courier New" w:hAnsi="Courier New" w:cs="Courier New"/>
+          <w:sz w:val="22"/>
+          <w:szCs w:val="22"/>
+          <w:lang w:val="nl-NL"/>
+        </w:rPr>
+        <w:t xml:space="preserve"> wordt er al snel aan </w:t>
+      </w:r>
+      <w:r>
+        <w:rPr>
+          <w:rFonts w:ascii="Courier New" w:hAnsi="Courier New" w:cs="Courier New"/>
+          <w:sz w:val="22"/>
+          <w:szCs w:val="22"/>
+          <w:lang w:val="nl-NL"/>
+        </w:rPr>
+        <w:t xml:space="preserve">universiteiten als </w:t>
+      </w:r>
+      <w:r>
+        <w:rPr>
+          <w:rFonts w:ascii="Courier New" w:hAnsi="Courier New" w:cs="Courier New"/>
+          <w:sz w:val="22"/>
+          <w:szCs w:val="22"/>
+          <w:lang w:val="nl-NL"/>
+        </w:rPr>
+        <w:t xml:space="preserve">Harvard, Stanford, MIT, Princeton, Chicago of </w:t>
       </w:r>
       <w:proofErr w:type="spellStart"/>
       <w:r>
@@ -1072,45 +1198,133 @@
           <w:szCs w:val="22"/>
           <w:lang w:val="nl-NL"/>
         </w:rPr>
-        <w:t xml:space="preserve"> gedacht maar er zijn daar zo’n kleine 4000 instellingen van hoger onderwijs met meer dan 15 miljoen studenten. </w:t>
-      </w:r>
-      <w:r>
-        <w:rPr>
-          <w:rFonts w:ascii="Courier New" w:hAnsi="Courier New" w:cs="Courier New"/>
-          <w:sz w:val="22"/>
-          <w:szCs w:val="22"/>
-          <w:lang w:val="nl-NL"/>
-        </w:rPr>
-        <w:t>Er</w:t>
-      </w:r>
-      <w:r>
-        <w:rPr>
-          <w:rFonts w:ascii="Courier New" w:hAnsi="Courier New" w:cs="Courier New"/>
-          <w:sz w:val="22"/>
-          <w:szCs w:val="22"/>
-          <w:lang w:val="nl-NL"/>
-        </w:rPr>
-        <w:t xml:space="preserve"> zijn vierjarige publieke instellingen (48%), </w:t>
-      </w:r>
-      <w:proofErr w:type="spellStart"/>
-      <w:r>
-        <w:rPr>
-          <w:rFonts w:ascii="Courier New" w:hAnsi="Courier New" w:cs="Courier New"/>
-          <w:sz w:val="22"/>
-          <w:szCs w:val="22"/>
-          <w:lang w:val="nl-NL"/>
-        </w:rPr>
-        <w:t>twee-jarige</w:t>
-      </w:r>
-      <w:proofErr w:type="spellEnd"/>
-      <w:r>
-        <w:rPr>
-          <w:rFonts w:ascii="Courier New" w:hAnsi="Courier New" w:cs="Courier New"/>
-          <w:sz w:val="22"/>
-          <w:szCs w:val="22"/>
-          <w:lang w:val="nl-NL"/>
-        </w:rPr>
-        <w:t xml:space="preserve"> publieke instellingen (29%), vierjarige private non-profit instellingen (17%) en nog een restant andersoortige instellingen. </w:t>
+        <w:t xml:space="preserve"> gedacht</w:t>
+      </w:r>
+      <w:r>
+        <w:rPr>
+          <w:rFonts w:ascii="Courier New" w:hAnsi="Courier New" w:cs="Courier New"/>
+          <w:sz w:val="22"/>
+          <w:szCs w:val="22"/>
+          <w:lang w:val="nl-NL"/>
+        </w:rPr>
+        <w:t>,</w:t>
+      </w:r>
+      <w:r>
+        <w:rPr>
+          <w:rFonts w:ascii="Courier New" w:hAnsi="Courier New" w:cs="Courier New"/>
+          <w:sz w:val="22"/>
+          <w:szCs w:val="22"/>
+          <w:lang w:val="nl-NL"/>
+        </w:rPr>
+        <w:t xml:space="preserve"> maar er zijn daar </w:t>
+      </w:r>
+      <w:r>
+        <w:rPr>
+          <w:rFonts w:ascii="Courier New" w:hAnsi="Courier New" w:cs="Courier New"/>
+          <w:sz w:val="22"/>
+          <w:szCs w:val="22"/>
+          <w:lang w:val="nl-NL"/>
+        </w:rPr>
+        <w:t xml:space="preserve">nog </w:t>
+      </w:r>
+      <w:r>
+        <w:rPr>
+          <w:rFonts w:ascii="Courier New" w:hAnsi="Courier New" w:cs="Courier New"/>
+          <w:sz w:val="22"/>
+          <w:szCs w:val="22"/>
+          <w:lang w:val="nl-NL"/>
+        </w:rPr>
+        <w:t xml:space="preserve">zo’n kleine 4000 </w:t>
+      </w:r>
+      <w:r>
+        <w:rPr>
+          <w:rFonts w:ascii="Courier New" w:hAnsi="Courier New" w:cs="Courier New"/>
+          <w:sz w:val="22"/>
+          <w:szCs w:val="22"/>
+          <w:lang w:val="nl-NL"/>
+        </w:rPr>
+        <w:t xml:space="preserve">andere </w:t>
+      </w:r>
+      <w:r>
+        <w:rPr>
+          <w:rFonts w:ascii="Courier New" w:hAnsi="Courier New" w:cs="Courier New"/>
+          <w:sz w:val="22"/>
+          <w:szCs w:val="22"/>
+          <w:lang w:val="nl-NL"/>
+        </w:rPr>
+        <w:t xml:space="preserve">instellingen van hoger onderwijs met meer dan 15 miljoen studenten. </w:t>
+      </w:r>
+      <w:r>
+        <w:rPr>
+          <w:rFonts w:ascii="Courier New" w:hAnsi="Courier New" w:cs="Courier New"/>
+          <w:sz w:val="22"/>
+          <w:szCs w:val="22"/>
+          <w:lang w:val="nl-NL"/>
+        </w:rPr>
+        <w:t>Het hoger onderwijs is een heel divers landschap</w:t>
+      </w:r>
+      <w:r>
+        <w:rPr>
+          <w:rFonts w:ascii="Courier New" w:hAnsi="Courier New" w:cs="Courier New"/>
+          <w:sz w:val="22"/>
+          <w:szCs w:val="22"/>
+          <w:lang w:val="nl-NL"/>
+        </w:rPr>
+        <w:t xml:space="preserve"> </w:t>
+      </w:r>
+      <w:r>
+        <w:rPr>
+          <w:rFonts w:ascii="Courier New" w:hAnsi="Courier New" w:cs="Courier New"/>
+          <w:sz w:val="22"/>
+          <w:szCs w:val="22"/>
+          <w:lang w:val="nl-NL"/>
+        </w:rPr>
+        <w:t>met</w:t>
+      </w:r>
+      <w:r>
+        <w:rPr>
+          <w:rFonts w:ascii="Courier New" w:hAnsi="Courier New" w:cs="Courier New"/>
+          <w:sz w:val="22"/>
+          <w:szCs w:val="22"/>
+          <w:lang w:val="nl-NL"/>
+        </w:rPr>
+        <w:t xml:space="preserve"> vierjarige publieke instellingen (48%), </w:t>
+      </w:r>
+      <w:r>
+        <w:rPr>
+          <w:rFonts w:ascii="Courier New" w:hAnsi="Courier New" w:cs="Courier New"/>
+          <w:sz w:val="22"/>
+          <w:szCs w:val="22"/>
+          <w:lang w:val="nl-NL"/>
+        </w:rPr>
+        <w:t>tweejarige</w:t>
+      </w:r>
+      <w:r>
+        <w:rPr>
+          <w:rFonts w:ascii="Courier New" w:hAnsi="Courier New" w:cs="Courier New"/>
+          <w:sz w:val="22"/>
+          <w:szCs w:val="22"/>
+          <w:lang w:val="nl-NL"/>
+        </w:rPr>
+        <w:t xml:space="preserve"> publieke instellingen (29%), vierjarige private non-profit instellingen (17%) en nog een restant</w:t>
+      </w:r>
+      <w:r>
+        <w:rPr>
+          <w:rFonts w:ascii="Courier New" w:hAnsi="Courier New" w:cs="Courier New"/>
+          <w:sz w:val="22"/>
+          <w:szCs w:val="22"/>
+          <w:lang w:val="nl-NL"/>
+        </w:rPr>
+        <w:t>je</w:t>
+      </w:r>
+      <w:r>
+        <w:rPr>
+          <w:rFonts w:ascii="Courier New" w:hAnsi="Courier New" w:cs="Courier New"/>
+          <w:sz w:val="22"/>
+          <w:szCs w:val="22"/>
+          <w:lang w:val="nl-NL"/>
+        </w:rPr>
+        <w:t xml:space="preserve"> andersoortige instellingen. </w:t>
       </w:r>
       <w:r>
         <w:rPr>
@@ -1155,16 +1369,52 @@
           <w:szCs w:val="22"/>
           <w:lang w:val="nl-NL"/>
         </w:rPr>
-        <w:t>van studentengroepen</w:t>
-      </w:r>
-      <w:r>
-        <w:rPr>
-          <w:rFonts w:ascii="Courier New" w:hAnsi="Courier New" w:cs="Courier New"/>
-          <w:sz w:val="22"/>
-          <w:szCs w:val="22"/>
-          <w:lang w:val="nl-NL"/>
-        </w:rPr>
-        <w:t xml:space="preserve">. Het leiderschap van deze instellingen is veel minder </w:t>
+        <w:t xml:space="preserve">van </w:t>
+      </w:r>
+      <w:r>
+        <w:rPr>
+          <w:rFonts w:ascii="Courier New" w:hAnsi="Courier New" w:cs="Courier New"/>
+          <w:sz w:val="22"/>
+          <w:szCs w:val="22"/>
+          <w:lang w:val="nl-NL"/>
+        </w:rPr>
+        <w:t xml:space="preserve">hun </w:t>
+      </w:r>
+      <w:r>
+        <w:rPr>
+          <w:rFonts w:ascii="Courier New" w:hAnsi="Courier New" w:cs="Courier New"/>
+          <w:sz w:val="22"/>
+          <w:szCs w:val="22"/>
+          <w:lang w:val="nl-NL"/>
+        </w:rPr>
+        <w:t>studentengroepen</w:t>
+      </w:r>
+      <w:r>
+        <w:rPr>
+          <w:rFonts w:ascii="Courier New" w:hAnsi="Courier New" w:cs="Courier New"/>
+          <w:sz w:val="22"/>
+          <w:szCs w:val="22"/>
+          <w:lang w:val="nl-NL"/>
+        </w:rPr>
+        <w:t xml:space="preserve">. Het leiderschap van deze instellingen is </w:t>
+      </w:r>
+      <w:r>
+        <w:rPr>
+          <w:rFonts w:ascii="Courier New" w:hAnsi="Courier New" w:cs="Courier New"/>
+          <w:sz w:val="22"/>
+          <w:szCs w:val="22"/>
+          <w:lang w:val="nl-NL"/>
+        </w:rPr>
+        <w:t xml:space="preserve">daarentegen </w:t>
+      </w:r>
+      <w:r>
+        <w:rPr>
+          <w:rFonts w:ascii="Courier New" w:hAnsi="Courier New" w:cs="Courier New"/>
+          <w:sz w:val="22"/>
+          <w:szCs w:val="22"/>
+          <w:lang w:val="nl-NL"/>
+        </w:rPr>
+        <w:t xml:space="preserve">veel minder </w:t>
       </w:r>
       <w:r>
         <w:rPr>
@@ -1218,7 +1468,16 @@
           <w:szCs w:val="22"/>
           <w:lang w:val="nl-NL"/>
         </w:rPr>
-        <w:t xml:space="preserve">. </w:t>
+        <w:t xml:space="preserve"> die er leiding aan geven en</w:t>
+      </w:r>
+      <w:r>
+        <w:rPr>
+          <w:rFonts w:ascii="Courier New" w:hAnsi="Courier New" w:cs="Courier New"/>
+          <w:sz w:val="22"/>
+          <w:szCs w:val="22"/>
+          <w:lang w:val="nl-NL"/>
+        </w:rPr>
+        <w:t xml:space="preserve"> </w:t>
       </w:r>
       <w:r>
         <w:rPr>
@@ -1236,7 +1495,7 @@
           <w:szCs w:val="22"/>
           <w:lang w:val="nl-NL"/>
         </w:rPr>
-        <w:t>I</w:t>
+        <w:t>van die leiders s</w:t>
       </w:r>
       <w:r>
         <w:rPr>
@@ -1362,7 +1621,25 @@
           <w:szCs w:val="22"/>
           <w:lang w:val="nl-NL"/>
         </w:rPr>
-        <w:t xml:space="preserve"> en Tatum is er daar één van</w:t>
+        <w:t xml:space="preserve">, waar </w:t>
+      </w:r>
+      <w:r>
+        <w:rPr>
+          <w:rFonts w:ascii="Courier New" w:hAnsi="Courier New" w:cs="Courier New"/>
+          <w:sz w:val="22"/>
+          <w:szCs w:val="22"/>
+          <w:lang w:val="nl-NL"/>
+        </w:rPr>
+        <w:t xml:space="preserve">Tatum er </w:t>
+      </w:r>
+      <w:r>
+        <w:rPr>
+          <w:rFonts w:ascii="Courier New" w:hAnsi="Courier New" w:cs="Courier New"/>
+          <w:sz w:val="22"/>
+          <w:szCs w:val="22"/>
+          <w:lang w:val="nl-NL"/>
+        </w:rPr>
+        <w:t>één van is</w:t>
       </w:r>
       <w:r>
         <w:rPr>
@@ -1428,7 +1705,61 @@
           <w:szCs w:val="22"/>
           <w:lang w:val="nl-NL"/>
         </w:rPr>
-        <w:t xml:space="preserve"> als enige zwarte student in haar klas op maar wel in een gezin met </w:t>
+        <w:t xml:space="preserve"> </w:t>
+      </w:r>
+      <w:r>
+        <w:rPr>
+          <w:rFonts w:ascii="Courier New" w:hAnsi="Courier New" w:cs="Courier New"/>
+          <w:sz w:val="22"/>
+          <w:szCs w:val="22"/>
+          <w:lang w:val="nl-NL"/>
+        </w:rPr>
+        <w:t xml:space="preserve">op </w:t>
+      </w:r>
+      <w:r>
+        <w:rPr>
+          <w:rFonts w:ascii="Courier New" w:hAnsi="Courier New" w:cs="Courier New"/>
+          <w:sz w:val="22"/>
+          <w:szCs w:val="22"/>
+          <w:lang w:val="nl-NL"/>
+        </w:rPr>
+        <w:t xml:space="preserve">als enige zwarte student in haar klas maar </w:t>
+      </w:r>
+      <w:r>
+        <w:rPr>
+          <w:rFonts w:ascii="Courier New" w:hAnsi="Courier New" w:cs="Courier New"/>
+          <w:sz w:val="22"/>
+          <w:szCs w:val="22"/>
+          <w:lang w:val="nl-NL"/>
+        </w:rPr>
+        <w:t xml:space="preserve">komt </w:t>
+      </w:r>
+      <w:r>
+        <w:rPr>
+          <w:rFonts w:ascii="Courier New" w:hAnsi="Courier New" w:cs="Courier New"/>
+          <w:sz w:val="22"/>
+          <w:szCs w:val="22"/>
+          <w:lang w:val="nl-NL"/>
+        </w:rPr>
+        <w:t xml:space="preserve">wel </w:t>
+      </w:r>
+      <w:r>
+        <w:rPr>
+          <w:rFonts w:ascii="Courier New" w:hAnsi="Courier New" w:cs="Courier New"/>
+          <w:sz w:val="22"/>
+          <w:szCs w:val="22"/>
+          <w:lang w:val="nl-NL"/>
+        </w:rPr>
+        <w:t>uit</w:t>
+      </w:r>
+      <w:r>
+        <w:rPr>
+          <w:rFonts w:ascii="Courier New" w:hAnsi="Courier New" w:cs="Courier New"/>
+          <w:sz w:val="22"/>
+          <w:szCs w:val="22"/>
+          <w:lang w:val="nl-NL"/>
+        </w:rPr>
+        <w:t xml:space="preserve"> een gezin met </w:t>
       </w:r>
       <w:r>
         <w:rPr>
@@ -1540,7 +1871,7 @@
           <w:szCs w:val="22"/>
           <w:lang w:val="en-US"/>
         </w:rPr>
-        <w:t xml:space="preserve"> het</w:t>
+        <w:t xml:space="preserve"> </w:t>
       </w:r>
       <w:r>
         <w:rPr>
@@ -1549,7 +1880,74 @@
           <w:szCs w:val="22"/>
           <w:lang w:val="en-US"/>
         </w:rPr>
+        <w:t xml:space="preserve">over </w:t>
+      </w:r>
+      <w:proofErr w:type="spellStart"/>
+      <w:r>
+        <w:rPr>
+          <w:rFonts w:ascii="Courier New" w:hAnsi="Courier New" w:cs="Courier New"/>
+          <w:sz w:val="22"/>
+          <w:szCs w:val="22"/>
+          <w:lang w:val="en-US"/>
+        </w:rPr>
+        <w:t>dat</w:t>
+      </w:r>
+      <w:proofErr w:type="spellEnd"/>
+      <w:r>
+        <w:rPr>
+          <w:rFonts w:ascii="Courier New" w:hAnsi="Courier New" w:cs="Courier New"/>
+          <w:sz w:val="22"/>
+          <w:szCs w:val="22"/>
+          <w:lang w:val="en-US"/>
+        </w:rPr>
         <w:t xml:space="preserve"> </w:t>
+      </w:r>
+      <w:proofErr w:type="spellStart"/>
+      <w:r>
+        <w:rPr>
+          <w:rFonts w:ascii="Courier New" w:hAnsi="Courier New" w:cs="Courier New"/>
+          <w:sz w:val="22"/>
+          <w:szCs w:val="22"/>
+          <w:lang w:val="en-US"/>
+        </w:rPr>
+        <w:t>onderwerp</w:t>
+      </w:r>
+      <w:proofErr w:type="spellEnd"/>
+      <w:r>
+        <w:rPr>
+          <w:rFonts w:ascii="Courier New" w:hAnsi="Courier New" w:cs="Courier New"/>
+          <w:sz w:val="22"/>
+          <w:szCs w:val="22"/>
+          <w:lang w:val="en-US"/>
+        </w:rPr>
+        <w:t xml:space="preserve"> </w:t>
+      </w:r>
+      <w:r>
+        <w:rPr>
+          <w:rFonts w:ascii="Courier New" w:hAnsi="Courier New" w:cs="Courier New"/>
+          <w:sz w:val="22"/>
+          <w:szCs w:val="22"/>
+          <w:lang w:val="en-US"/>
+        </w:rPr>
+        <w:t>het</w:t>
+      </w:r>
+      <w:r>
+        <w:rPr>
+          <w:rFonts w:ascii="Courier New" w:hAnsi="Courier New" w:cs="Courier New"/>
+          <w:sz w:val="22"/>
+          <w:szCs w:val="22"/>
+          <w:lang w:val="en-US"/>
+        </w:rPr>
+        <w:t xml:space="preserve"> </w:t>
+      </w:r>
+      <w:r>
+        <w:rPr>
+          <w:rFonts w:ascii="Courier New" w:hAnsi="Courier New" w:cs="Courier New"/>
+          <w:sz w:val="22"/>
+          <w:szCs w:val="22"/>
+          <w:lang w:val="en-US"/>
+        </w:rPr>
+        <w:t xml:space="preserve">Populaire </w:t>
       </w:r>
       <w:proofErr w:type="spellStart"/>
       <w:r>
@@ -1718,34 +2116,88 @@
           <w:szCs w:val="22"/>
           <w:lang w:val="nl-NL"/>
         </w:rPr>
-        <w:t>anneer Clinton het thema ras op de agenda zet</w:t>
-      </w:r>
-      <w:r>
-        <w:rPr>
-          <w:rFonts w:ascii="Courier New" w:hAnsi="Courier New" w:cs="Courier New"/>
-          <w:sz w:val="22"/>
-          <w:szCs w:val="22"/>
-          <w:lang w:val="nl-NL"/>
-        </w:rPr>
-        <w:t xml:space="preserve">, </w:t>
-      </w:r>
-      <w:r>
-        <w:rPr>
-          <w:rFonts w:ascii="Courier New" w:hAnsi="Courier New" w:cs="Courier New"/>
-          <w:sz w:val="22"/>
-          <w:szCs w:val="22"/>
-          <w:lang w:val="nl-NL"/>
-        </w:rPr>
-        <w:t xml:space="preserve">komt zij zelf in de belangstelling te staan. </w:t>
-      </w:r>
-      <w:r>
-        <w:rPr>
-          <w:rFonts w:ascii="Courier New" w:hAnsi="Courier New" w:cs="Courier New"/>
-          <w:sz w:val="22"/>
-          <w:szCs w:val="22"/>
-          <w:lang w:val="nl-NL"/>
-        </w:rPr>
-        <w:t>In d</w:t>
+        <w:t xml:space="preserve">anneer Clinton </w:t>
+      </w:r>
+      <w:r>
+        <w:rPr>
+          <w:rFonts w:ascii="Courier New" w:hAnsi="Courier New" w:cs="Courier New"/>
+          <w:sz w:val="22"/>
+          <w:szCs w:val="22"/>
+          <w:lang w:val="nl-NL"/>
+        </w:rPr>
+        <w:t xml:space="preserve">president wordt in 1993 wordt </w:t>
+      </w:r>
+      <w:r>
+        <w:rPr>
+          <w:rFonts w:ascii="Courier New" w:hAnsi="Courier New" w:cs="Courier New"/>
+          <w:sz w:val="22"/>
+          <w:szCs w:val="22"/>
+          <w:lang w:val="nl-NL"/>
+        </w:rPr>
+        <w:t>het thema ras op de agenda zet</w:t>
+      </w:r>
+      <w:r>
+        <w:rPr>
+          <w:rFonts w:ascii="Courier New" w:hAnsi="Courier New" w:cs="Courier New"/>
+          <w:sz w:val="22"/>
+          <w:szCs w:val="22"/>
+          <w:lang w:val="nl-NL"/>
+        </w:rPr>
+        <w:t xml:space="preserve"> en</w:t>
+      </w:r>
+      <w:r>
+        <w:rPr>
+          <w:rFonts w:ascii="Courier New" w:hAnsi="Courier New" w:cs="Courier New"/>
+          <w:sz w:val="22"/>
+          <w:szCs w:val="22"/>
+          <w:lang w:val="nl-NL"/>
+        </w:rPr>
+        <w:t xml:space="preserve"> </w:t>
+      </w:r>
+      <w:r>
+        <w:rPr>
+          <w:rFonts w:ascii="Courier New" w:hAnsi="Courier New" w:cs="Courier New"/>
+          <w:sz w:val="22"/>
+          <w:szCs w:val="22"/>
+          <w:lang w:val="nl-NL"/>
+        </w:rPr>
+        <w:t xml:space="preserve">komt zij zelf </w:t>
+      </w:r>
+      <w:r>
+        <w:rPr>
+          <w:rFonts w:ascii="Courier New" w:hAnsi="Courier New" w:cs="Courier New"/>
+          <w:sz w:val="22"/>
+          <w:szCs w:val="22"/>
+          <w:lang w:val="nl-NL"/>
+        </w:rPr>
+        <w:t xml:space="preserve">met haar boek volop </w:t>
+      </w:r>
+      <w:r>
+        <w:rPr>
+          <w:rFonts w:ascii="Courier New" w:hAnsi="Courier New" w:cs="Courier New"/>
+          <w:sz w:val="22"/>
+          <w:szCs w:val="22"/>
+          <w:lang w:val="nl-NL"/>
+        </w:rPr>
+        <w:t xml:space="preserve">in de belangstelling te staan. </w:t>
+      </w:r>
+      <w:r>
+        <w:rPr>
+          <w:rFonts w:ascii="Courier New" w:hAnsi="Courier New" w:cs="Courier New"/>
+          <w:sz w:val="22"/>
+          <w:szCs w:val="22"/>
+          <w:lang w:val="nl-NL"/>
+        </w:rPr>
+        <w:t>Het is i</w:t>
+      </w:r>
+      <w:r>
+        <w:rPr>
+          <w:rFonts w:ascii="Courier New" w:hAnsi="Courier New" w:cs="Courier New"/>
+          <w:sz w:val="22"/>
+          <w:szCs w:val="22"/>
+          <w:lang w:val="nl-NL"/>
+        </w:rPr>
+        <w:t>n d</w:t>
       </w:r>
       <w:r>
         <w:rPr>
@@ -1763,79 +2215,79 @@
           <w:szCs w:val="22"/>
           <w:lang w:val="nl-NL"/>
         </w:rPr>
-        <w:t xml:space="preserve">vraagt zij </w:t>
-      </w:r>
-      <w:r>
-        <w:rPr>
-          <w:rFonts w:ascii="Courier New" w:hAnsi="Courier New" w:cs="Courier New"/>
-          <w:sz w:val="22"/>
-          <w:szCs w:val="22"/>
-          <w:lang w:val="nl-NL"/>
-        </w:rPr>
-        <w:t xml:space="preserve">zich af of zij </w:t>
-      </w:r>
-      <w:r>
-        <w:rPr>
-          <w:rFonts w:ascii="Courier New" w:hAnsi="Courier New" w:cs="Courier New"/>
-          <w:sz w:val="22"/>
-          <w:szCs w:val="22"/>
-          <w:lang w:val="nl-NL"/>
-        </w:rPr>
-        <w:t xml:space="preserve">meer </w:t>
-      </w:r>
-      <w:r>
-        <w:rPr>
-          <w:rFonts w:ascii="Courier New" w:hAnsi="Courier New" w:cs="Courier New"/>
-          <w:sz w:val="22"/>
-          <w:szCs w:val="22"/>
-          <w:lang w:val="nl-NL"/>
-        </w:rPr>
-        <w:t xml:space="preserve">concreet </w:t>
-      </w:r>
-      <w:r>
-        <w:rPr>
-          <w:rFonts w:ascii="Courier New" w:hAnsi="Courier New" w:cs="Courier New"/>
-          <w:sz w:val="22"/>
-          <w:szCs w:val="22"/>
-          <w:lang w:val="nl-NL"/>
-        </w:rPr>
-        <w:t xml:space="preserve">kan bijdragen aan het creëren van leeromgevingen </w:t>
-      </w:r>
-      <w:r>
-        <w:rPr>
-          <w:rFonts w:ascii="Courier New" w:hAnsi="Courier New" w:cs="Courier New"/>
-          <w:sz w:val="22"/>
-          <w:szCs w:val="22"/>
-          <w:lang w:val="nl-NL"/>
-        </w:rPr>
-        <w:t>waarin</w:t>
-      </w:r>
-      <w:r>
-        <w:rPr>
-          <w:rFonts w:ascii="Courier New" w:hAnsi="Courier New" w:cs="Courier New"/>
-          <w:sz w:val="22"/>
-          <w:szCs w:val="22"/>
-          <w:lang w:val="nl-NL"/>
-        </w:rPr>
-        <w:t xml:space="preserve"> beter met segregatie en verschillen </w:t>
-      </w:r>
-      <w:r>
-        <w:rPr>
-          <w:rFonts w:ascii="Courier New" w:hAnsi="Courier New" w:cs="Courier New"/>
-          <w:sz w:val="22"/>
-          <w:szCs w:val="22"/>
-          <w:lang w:val="nl-NL"/>
-        </w:rPr>
-        <w:t>tussen groepen wordt</w:t>
-      </w:r>
-      <w:r>
-        <w:rPr>
-          <w:rFonts w:ascii="Courier New" w:hAnsi="Courier New" w:cs="Courier New"/>
-          <w:sz w:val="22"/>
-          <w:szCs w:val="22"/>
-          <w:lang w:val="nl-NL"/>
-        </w:rPr>
-        <w:t xml:space="preserve"> om</w:t>
+        <w:t xml:space="preserve">dat </w:t>
+      </w:r>
+      <w:r>
+        <w:rPr>
+          <w:rFonts w:ascii="Courier New" w:hAnsi="Courier New" w:cs="Courier New"/>
+          <w:sz w:val="22"/>
+          <w:szCs w:val="22"/>
+          <w:lang w:val="nl-NL"/>
+        </w:rPr>
+        <w:t xml:space="preserve">zij </w:t>
+      </w:r>
+      <w:r>
+        <w:rPr>
+          <w:rFonts w:ascii="Courier New" w:hAnsi="Courier New" w:cs="Courier New"/>
+          <w:sz w:val="22"/>
+          <w:szCs w:val="22"/>
+          <w:lang w:val="nl-NL"/>
+        </w:rPr>
+        <w:t>zich af</w:t>
+      </w:r>
+      <w:r>
+        <w:rPr>
+          <w:rFonts w:ascii="Courier New" w:hAnsi="Courier New" w:cs="Courier New"/>
+          <w:sz w:val="22"/>
+          <w:szCs w:val="22"/>
+          <w:lang w:val="nl-NL"/>
+        </w:rPr>
+        <w:t>vraagt</w:t>
+      </w:r>
+      <w:r>
+        <w:rPr>
+          <w:rFonts w:ascii="Courier New" w:hAnsi="Courier New" w:cs="Courier New"/>
+          <w:sz w:val="22"/>
+          <w:szCs w:val="22"/>
+          <w:lang w:val="nl-NL"/>
+        </w:rPr>
+        <w:t xml:space="preserve"> of zij </w:t>
+      </w:r>
+      <w:r>
+        <w:rPr>
+          <w:rFonts w:ascii="Courier New" w:hAnsi="Courier New" w:cs="Courier New"/>
+          <w:sz w:val="22"/>
+          <w:szCs w:val="22"/>
+          <w:lang w:val="nl-NL"/>
+        </w:rPr>
+        <w:t xml:space="preserve">niet meer kan doen tegen </w:t>
+      </w:r>
+      <w:r>
+        <w:rPr>
+          <w:rFonts w:ascii="Courier New" w:hAnsi="Courier New" w:cs="Courier New"/>
+          <w:sz w:val="22"/>
+          <w:szCs w:val="22"/>
+          <w:lang w:val="nl-NL"/>
+        </w:rPr>
+        <w:t xml:space="preserve">segregatie en </w:t>
+      </w:r>
+      <w:r>
+        <w:rPr>
+          <w:rFonts w:ascii="Courier New" w:hAnsi="Courier New" w:cs="Courier New"/>
+          <w:sz w:val="22"/>
+          <w:szCs w:val="22"/>
+          <w:lang w:val="nl-NL"/>
+        </w:rPr>
+        <w:t xml:space="preserve">met de manier waarop in het onderwijs wordt </w:t>
+      </w:r>
+      <w:r>
+        <w:rPr>
+          <w:rFonts w:ascii="Courier New" w:hAnsi="Courier New" w:cs="Courier New"/>
+          <w:sz w:val="22"/>
+          <w:szCs w:val="22"/>
+          <w:lang w:val="nl-NL"/>
+        </w:rPr>
+        <w:t>om</w:t>
       </w:r>
       <w:r>
         <w:rPr>
@@ -1853,7 +2305,25 @@
           <w:szCs w:val="22"/>
           <w:lang w:val="nl-NL"/>
         </w:rPr>
-        <w:t xml:space="preserve">gaan. </w:t>
+        <w:t>gaan</w:t>
+      </w:r>
+      <w:r>
+        <w:rPr>
+          <w:rFonts w:ascii="Courier New" w:hAnsi="Courier New" w:cs="Courier New"/>
+          <w:sz w:val="22"/>
+          <w:szCs w:val="22"/>
+          <w:lang w:val="nl-NL"/>
+        </w:rPr>
+        <w:t xml:space="preserve"> met verschillen</w:t>
+      </w:r>
+      <w:r>
+        <w:rPr>
+          <w:rFonts w:ascii="Courier New" w:hAnsi="Courier New" w:cs="Courier New"/>
+          <w:sz w:val="22"/>
+          <w:szCs w:val="22"/>
+          <w:lang w:val="nl-NL"/>
+        </w:rPr>
+        <w:t xml:space="preserve">. </w:t>
       </w:r>
       <w:r>
         <w:rPr>
@@ -1927,7 +2397,43 @@
           <w:szCs w:val="22"/>
           <w:lang w:val="nl-NL"/>
         </w:rPr>
-        <w:t xml:space="preserve"> instituut. Zij stelt een gemeenschappelijke visie voor die ze als het ABC definieert: </w:t>
+        <w:t xml:space="preserve"> instituut. Zij stelt een gemeenschappelijke visie voor die ze </w:t>
+      </w:r>
+      <w:r>
+        <w:rPr>
+          <w:rFonts w:ascii="Courier New" w:hAnsi="Courier New" w:cs="Courier New"/>
+          <w:sz w:val="22"/>
+          <w:szCs w:val="22"/>
+          <w:lang w:val="nl-NL"/>
+        </w:rPr>
+        <w:t>in dit boek als het</w:t>
+      </w:r>
+      <w:r>
+        <w:rPr>
+          <w:rFonts w:ascii="Courier New" w:hAnsi="Courier New" w:cs="Courier New"/>
+          <w:sz w:val="22"/>
+          <w:szCs w:val="22"/>
+          <w:lang w:val="nl-NL"/>
+        </w:rPr>
+        <w:t xml:space="preserve"> ABC definieert</w:t>
+      </w:r>
+      <w:r>
+        <w:rPr>
+          <w:rFonts w:ascii="Courier New" w:hAnsi="Courier New" w:cs="Courier New"/>
+          <w:sz w:val="22"/>
+          <w:szCs w:val="22"/>
+          <w:lang w:val="nl-NL"/>
+        </w:rPr>
+        <w:t xml:space="preserve"> om leeromgevingen sterker te maken</w:t>
+      </w:r>
+      <w:r>
+        <w:rPr>
+          <w:rFonts w:ascii="Courier New" w:hAnsi="Courier New" w:cs="Courier New"/>
+          <w:sz w:val="22"/>
+          <w:szCs w:val="22"/>
+          <w:lang w:val="nl-NL"/>
+        </w:rPr>
+        <w:t xml:space="preserve">: </w:t>
       </w:r>
       <w:r>
         <w:rPr>
@@ -2093,7 +2599,17 @@
           <w:szCs w:val="22"/>
           <w:lang w:val="nl-NL"/>
         </w:rPr>
-        <w:t xml:space="preserve"> tegen is</w:t>
+        <w:t xml:space="preserve"> </w:t>
+      </w:r>
+      <w:r>
+        <w:rPr>
+          <w:rFonts w:ascii="Courier New" w:hAnsi="Courier New" w:cs="Courier New"/>
+          <w:sz w:val="22"/>
+          <w:szCs w:val="22"/>
+          <w:lang w:val="nl-NL"/>
+        </w:rPr>
+        <w:lastRenderedPageBreak/>
+        <w:t>tegen is</w:t>
       </w:r>
       <w:r>
         <w:rPr>
@@ -2178,17 +2694,7 @@
           <w:szCs w:val="22"/>
           <w:lang w:val="nl-NL"/>
         </w:rPr>
-        <w:t xml:space="preserve">, benadrukt Tatum juist de onderwijskundige en pedagogische </w:t>
-      </w:r>
-      <w:r>
-        <w:rPr>
-          <w:rFonts w:ascii="Courier New" w:hAnsi="Courier New" w:cs="Courier New"/>
-          <w:sz w:val="22"/>
-          <w:szCs w:val="22"/>
-          <w:lang w:val="nl-NL"/>
-        </w:rPr>
-        <w:lastRenderedPageBreak/>
-        <w:t>waarde van een aanpak die studenten het gevoel ge</w:t>
+        <w:t>, benadrukt Tatum juist de onderwijskundige en pedagogische waarde van een aanpak die studenten het gevoel ge</w:t>
       </w:r>
       <w:r>
         <w:rPr>
@@ -2233,7 +2739,25 @@
           <w:szCs w:val="22"/>
           <w:lang w:val="nl-NL"/>
         </w:rPr>
-        <w:t>, vraagt Tatum zich af,</w:t>
+        <w:t xml:space="preserve">, vraagt Tatum zich </w:t>
+      </w:r>
+      <w:r>
+        <w:rPr>
+          <w:rFonts w:ascii="Courier New" w:hAnsi="Courier New" w:cs="Courier New"/>
+          <w:sz w:val="22"/>
+          <w:szCs w:val="22"/>
+          <w:lang w:val="nl-NL"/>
+        </w:rPr>
+        <w:t xml:space="preserve">terecht hardop </w:t>
+      </w:r>
+      <w:r>
+        <w:rPr>
+          <w:rFonts w:ascii="Courier New" w:hAnsi="Courier New" w:cs="Courier New"/>
+          <w:sz w:val="22"/>
+          <w:szCs w:val="22"/>
+          <w:lang w:val="nl-NL"/>
+        </w:rPr>
+        <w:t>af,</w:t>
       </w:r>
       <w:r>
         <w:rPr>
@@ -2370,7 +2894,45 @@
           <w:szCs w:val="22"/>
           <w:lang w:val="nl-NL"/>
         </w:rPr>
-        <w:t xml:space="preserve">’. Boeken verbieden, cursussen schrappen en alles eruit halen dat te maken heeft met de ‘kritische ras theorie’ is niet de oplossing voor de problemen waar we tegenwoordig mee te maken hebben. </w:t>
+        <w:t>’</w:t>
+      </w:r>
+      <w:r>
+        <w:rPr>
+          <w:rFonts w:ascii="Courier New" w:hAnsi="Courier New" w:cs="Courier New"/>
+          <w:sz w:val="22"/>
+          <w:szCs w:val="22"/>
+          <w:lang w:val="nl-NL"/>
+        </w:rPr>
+        <w:t xml:space="preserve"> om de spanning tussen </w:t>
+      </w:r>
+      <w:proofErr w:type="spellStart"/>
+      <w:r>
+        <w:rPr>
+          <w:rFonts w:ascii="Courier New" w:hAnsi="Courier New" w:cs="Courier New"/>
+          <w:sz w:val="22"/>
+          <w:szCs w:val="22"/>
+          <w:lang w:val="nl-NL"/>
+        </w:rPr>
+        <w:t>inclusiviteit</w:t>
+      </w:r>
+      <w:proofErr w:type="spellEnd"/>
+      <w:r>
+        <w:rPr>
+          <w:rFonts w:ascii="Courier New" w:hAnsi="Courier New" w:cs="Courier New"/>
+          <w:sz w:val="22"/>
+          <w:szCs w:val="22"/>
+          <w:lang w:val="nl-NL"/>
+        </w:rPr>
+        <w:t xml:space="preserve"> en vrijheid van meningsuiting op te lossen</w:t>
+      </w:r>
+      <w:r>
+        <w:rPr>
+          <w:rFonts w:ascii="Courier New" w:hAnsi="Courier New" w:cs="Courier New"/>
+          <w:sz w:val="22"/>
+          <w:szCs w:val="22"/>
+          <w:lang w:val="nl-NL"/>
+        </w:rPr>
+        <w:t xml:space="preserve">. Boeken verbieden, cursussen schrappen en alles eruit halen dat te maken heeft met de ‘kritische ras theorie’ is niet de oplossing voor de problemen waar we tegenwoordig mee te maken hebben. </w:t>
       </w:r>
       <w:r>
         <w:rPr>
@@ -2388,7 +2950,25 @@
           <w:szCs w:val="22"/>
           <w:lang w:val="nl-NL"/>
         </w:rPr>
-        <w:t xml:space="preserve"> verwacht meer van begrip en respect. </w:t>
+        <w:t xml:space="preserve"> verwacht meer van begrip en respect</w:t>
+      </w:r>
+      <w:r>
+        <w:rPr>
+          <w:rFonts w:ascii="Courier New" w:hAnsi="Courier New" w:cs="Courier New"/>
+          <w:sz w:val="22"/>
+          <w:szCs w:val="22"/>
+          <w:lang w:val="nl-NL"/>
+        </w:rPr>
+        <w:t>, zo simpel is het</w:t>
+      </w:r>
+      <w:r>
+        <w:rPr>
+          <w:rFonts w:ascii="Courier New" w:hAnsi="Courier New" w:cs="Courier New"/>
+          <w:sz w:val="22"/>
+          <w:szCs w:val="22"/>
+          <w:lang w:val="nl-NL"/>
+        </w:rPr>
+        <w:t xml:space="preserve">. </w:t>
       </w:r>
     </w:p>
     <w:p>
@@ -2454,7 +3034,43 @@
           <w:szCs w:val="22"/>
           <w:lang w:val="nl-NL"/>
         </w:rPr>
-        <w:t xml:space="preserve"> duidelijk met het 7 Oktober geweld in Israël en het geweld in Gaza dat erop volgde. Het veroorzaakt veel spanningen op de universiteiten en hogescholen en vr</w:t>
+        <w:t xml:space="preserve"> duidelijk met het 7 Oktober geweld in Israël en het geweld in Gaza dat erop volg</w:t>
+      </w:r>
+      <w:r>
+        <w:rPr>
+          <w:rFonts w:ascii="Courier New" w:hAnsi="Courier New" w:cs="Courier New"/>
+          <w:sz w:val="22"/>
+          <w:szCs w:val="22"/>
+          <w:lang w:val="nl-NL"/>
+        </w:rPr>
+        <w:t>t</w:t>
+      </w:r>
+      <w:r>
+        <w:rPr>
+          <w:rFonts w:ascii="Courier New" w:hAnsi="Courier New" w:cs="Courier New"/>
+          <w:sz w:val="22"/>
+          <w:szCs w:val="22"/>
+          <w:lang w:val="nl-NL"/>
+        </w:rPr>
+        <w:t xml:space="preserve">. Het veroorzaakt veel </w:t>
+      </w:r>
+      <w:r>
+        <w:rPr>
+          <w:rFonts w:ascii="Courier New" w:hAnsi="Courier New" w:cs="Courier New"/>
+          <w:sz w:val="22"/>
+          <w:szCs w:val="22"/>
+          <w:lang w:val="nl-NL"/>
+        </w:rPr>
+        <w:t>onrust</w:t>
+      </w:r>
+      <w:r>
+        <w:rPr>
+          <w:rFonts w:ascii="Courier New" w:hAnsi="Courier New" w:cs="Courier New"/>
+          <w:sz w:val="22"/>
+          <w:szCs w:val="22"/>
+          <w:lang w:val="nl-NL"/>
+        </w:rPr>
+        <w:t xml:space="preserve"> op de universiteiten en hogescholen en vr</w:t>
       </w:r>
       <w:r>
         <w:rPr>
@@ -2508,7 +3124,25 @@
           <w:szCs w:val="22"/>
           <w:lang w:val="nl-NL"/>
         </w:rPr>
-        <w:t xml:space="preserve"> houden en disciplinaire maatregelen eist. </w:t>
+        <w:t xml:space="preserve"> houden en disciplinaire maatregelen eist</w:t>
+      </w:r>
+      <w:r>
+        <w:rPr>
+          <w:rFonts w:ascii="Courier New" w:hAnsi="Courier New" w:cs="Courier New"/>
+          <w:sz w:val="22"/>
+          <w:szCs w:val="22"/>
+          <w:lang w:val="nl-NL"/>
+        </w:rPr>
+        <w:t xml:space="preserve"> van de leiders</w:t>
+      </w:r>
+      <w:r>
+        <w:rPr>
+          <w:rFonts w:ascii="Courier New" w:hAnsi="Courier New" w:cs="Courier New"/>
+          <w:sz w:val="22"/>
+          <w:szCs w:val="22"/>
+          <w:lang w:val="nl-NL"/>
+        </w:rPr>
+        <w:t xml:space="preserve">. </w:t>
       </w:r>
       <w:r>
         <w:rPr>
@@ -2526,386 +3160,43 @@
           <w:szCs w:val="22"/>
           <w:lang w:val="nl-NL"/>
         </w:rPr>
-        <w:t xml:space="preserve"> Tatum is het duidelijk dat de universiteit de plaats is waar mensen met verschillende achtergronden en levenservaringen samenkomen en van elkaar leren in betekenisvolle interactie. Leiderschap moet deze waarden verdedigen. </w:t>
-      </w:r>
-    </w:p>
-    <w:p>
-      <w:pPr>
-        <w:spacing w:line="360" w:lineRule="auto"/>
-        <w:rPr>
-          <w:rFonts w:ascii="Courier New" w:hAnsi="Courier New" w:cs="Courier New"/>
-          <w:sz w:val="22"/>
-          <w:szCs w:val="22"/>
-        </w:rPr>
-      </w:pPr>
-      <w:r>
-        <w:rPr>
-          <w:rFonts w:ascii="Courier New" w:hAnsi="Courier New" w:cs="Courier New"/>
-          <w:sz w:val="22"/>
-          <w:szCs w:val="22"/>
-        </w:rPr>
-        <w:t xml:space="preserve">Uitgebreid gaat ze in op een voorbeeld </w:t>
-      </w:r>
-      <w:r>
-        <w:rPr>
-          <w:rFonts w:ascii="Courier New" w:hAnsi="Courier New" w:cs="Courier New"/>
-          <w:sz w:val="22"/>
-          <w:szCs w:val="22"/>
-        </w:rPr>
-        <w:t xml:space="preserve">op </w:t>
-      </w:r>
-      <w:r>
-        <w:rPr>
-          <w:rFonts w:ascii="Courier New" w:hAnsi="Courier New" w:cs="Courier New"/>
-          <w:sz w:val="22"/>
-          <w:szCs w:val="22"/>
-        </w:rPr>
-        <w:t xml:space="preserve">het </w:t>
-      </w:r>
-      <w:r>
-        <w:rPr>
-          <w:rFonts w:ascii="Courier New" w:hAnsi="Courier New" w:cs="Courier New"/>
-          <w:sz w:val="22"/>
-          <w:szCs w:val="22"/>
-        </w:rPr>
-        <w:t>Spelman</w:t>
-      </w:r>
-      <w:r>
-        <w:rPr>
-          <w:rFonts w:ascii="Courier New" w:hAnsi="Courier New" w:cs="Courier New"/>
-          <w:sz w:val="22"/>
-          <w:szCs w:val="22"/>
-        </w:rPr>
-        <w:t xml:space="preserve"> instituut</w:t>
-      </w:r>
-      <w:r>
-        <w:rPr>
-          <w:rFonts w:ascii="Courier New" w:hAnsi="Courier New" w:cs="Courier New"/>
-          <w:sz w:val="22"/>
-          <w:szCs w:val="22"/>
-        </w:rPr>
-        <w:t xml:space="preserve"> </w:t>
-      </w:r>
-      <w:r>
-        <w:rPr>
-          <w:rFonts w:ascii="Courier New" w:hAnsi="Courier New" w:cs="Courier New"/>
-          <w:sz w:val="22"/>
-          <w:szCs w:val="22"/>
-        </w:rPr>
-        <w:t>aan het einde van de</w:t>
-      </w:r>
-      <w:r>
-        <w:rPr>
-          <w:rFonts w:ascii="Courier New" w:hAnsi="Courier New" w:cs="Courier New"/>
-          <w:sz w:val="22"/>
-          <w:szCs w:val="22"/>
-        </w:rPr>
-        <w:t xml:space="preserve"> Covid-19-pandemie. </w:t>
-      </w:r>
-      <w:r>
-        <w:rPr>
-          <w:rFonts w:ascii="Courier New" w:hAnsi="Courier New" w:cs="Courier New"/>
-          <w:sz w:val="22"/>
-          <w:szCs w:val="22"/>
-        </w:rPr>
-        <w:t xml:space="preserve">Het voorbeeld maakt heel duidelijk hoe Tatum operereerde en </w:t>
-      </w:r>
-      <w:r>
-        <w:rPr>
-          <w:rFonts w:ascii="Courier New" w:hAnsi="Courier New" w:cs="Courier New"/>
-          <w:sz w:val="22"/>
-          <w:szCs w:val="22"/>
-        </w:rPr>
-        <w:t xml:space="preserve">laat zien wat volgens haar een succesvolle aanpak is. </w:t>
-      </w:r>
-      <w:r>
-        <w:rPr>
-          <w:rFonts w:ascii="Courier New" w:hAnsi="Courier New" w:cs="Courier New"/>
-          <w:sz w:val="22"/>
-          <w:szCs w:val="22"/>
-        </w:rPr>
-        <w:t xml:space="preserve">Toen de mondkapjesplicht werd versoepeld, bezette een groep studenten vijfentwintig dagen lang de gangen van het bestuursgebouw. </w:t>
-      </w:r>
-      <w:r>
-        <w:rPr>
-          <w:rFonts w:ascii="Courier New" w:hAnsi="Courier New" w:cs="Courier New"/>
-          <w:sz w:val="22"/>
-          <w:szCs w:val="22"/>
-        </w:rPr>
-        <w:t>Zij waren het niet eens met de versoepeling van de maatregelen. Zij ziet de bezetting niet als</w:t>
-      </w:r>
-      <w:r>
-        <w:rPr>
-          <w:rFonts w:ascii="Courier New" w:hAnsi="Courier New" w:cs="Courier New"/>
-          <w:sz w:val="22"/>
-          <w:szCs w:val="22"/>
-        </w:rPr>
-        <w:t xml:space="preserve"> een ordeverstoring die </w:t>
-      </w:r>
-      <w:r>
-        <w:rPr>
-          <w:rFonts w:ascii="Courier New" w:hAnsi="Courier New" w:cs="Courier New"/>
-          <w:sz w:val="22"/>
-          <w:szCs w:val="22"/>
-        </w:rPr>
-        <w:t xml:space="preserve">direkt </w:t>
-      </w:r>
-      <w:r>
-        <w:rPr>
-          <w:rFonts w:ascii="Courier New" w:hAnsi="Courier New" w:cs="Courier New"/>
-          <w:sz w:val="22"/>
-          <w:szCs w:val="22"/>
-        </w:rPr>
-        <w:t>onderdrukt moet worden</w:t>
-      </w:r>
-      <w:r>
-        <w:rPr>
-          <w:rFonts w:ascii="Courier New" w:hAnsi="Courier New" w:cs="Courier New"/>
-          <w:sz w:val="22"/>
-          <w:szCs w:val="22"/>
-        </w:rPr>
-        <w:t>. Zij kiest voor</w:t>
-      </w:r>
-      <w:r>
-        <w:rPr>
-          <w:rFonts w:ascii="Courier New" w:hAnsi="Courier New" w:cs="Courier New"/>
-          <w:sz w:val="22"/>
-          <w:szCs w:val="22"/>
-        </w:rPr>
-        <w:t xml:space="preserve"> een andere aanpak. Zij v</w:t>
-      </w:r>
-      <w:r>
-        <w:rPr>
-          <w:rFonts w:ascii="Courier New" w:hAnsi="Courier New" w:cs="Courier New"/>
-          <w:sz w:val="22"/>
-          <w:szCs w:val="22"/>
-        </w:rPr>
-        <w:t xml:space="preserve">doet zelf een stap vooruit en </w:t>
-      </w:r>
-      <w:r>
-        <w:rPr>
-          <w:rFonts w:ascii="Courier New" w:hAnsi="Courier New" w:cs="Courier New"/>
-          <w:sz w:val="22"/>
-          <w:szCs w:val="22"/>
-        </w:rPr>
-        <w:t>erplaatst haar eigen werkzaamheden uit het gebouw</w:t>
-      </w:r>
-      <w:r>
-        <w:rPr>
-          <w:rFonts w:ascii="Courier New" w:hAnsi="Courier New" w:cs="Courier New"/>
-          <w:sz w:val="22"/>
-          <w:szCs w:val="22"/>
-        </w:rPr>
-        <w:t xml:space="preserve">. Zij </w:t>
-      </w:r>
-      <w:r>
-        <w:rPr>
-          <w:rFonts w:ascii="Courier New" w:hAnsi="Courier New" w:cs="Courier New"/>
-          <w:sz w:val="22"/>
-          <w:szCs w:val="22"/>
-        </w:rPr>
-        <w:t>werkt vanuit huis en h</w:t>
-      </w:r>
-      <w:r>
-        <w:rPr>
-          <w:rFonts w:ascii="Courier New" w:hAnsi="Courier New" w:cs="Courier New"/>
-          <w:sz w:val="22"/>
-          <w:szCs w:val="22"/>
-        </w:rPr>
-        <w:t>oudt de</w:t>
-      </w:r>
-      <w:r>
-        <w:rPr>
-          <w:rFonts w:ascii="Courier New" w:hAnsi="Courier New" w:cs="Courier New"/>
-          <w:sz w:val="22"/>
-          <w:szCs w:val="22"/>
-        </w:rPr>
-        <w:t xml:space="preserve"> vergaderingen in het studentencentrum </w:t>
-      </w:r>
-      <w:r>
-        <w:rPr>
-          <w:rFonts w:ascii="Courier New" w:hAnsi="Courier New" w:cs="Courier New"/>
-          <w:sz w:val="22"/>
-          <w:szCs w:val="22"/>
-        </w:rPr>
-        <w:t>o</w:t>
-      </w:r>
-      <w:r>
-        <w:rPr>
-          <w:rFonts w:ascii="Courier New" w:hAnsi="Courier New" w:cs="Courier New"/>
-          <w:sz w:val="22"/>
-          <w:szCs w:val="22"/>
-        </w:rPr>
-        <w:t xml:space="preserve">m </w:t>
-      </w:r>
-      <w:r>
-        <w:rPr>
-          <w:rFonts w:ascii="Courier New" w:hAnsi="Courier New" w:cs="Courier New"/>
-          <w:sz w:val="22"/>
-          <w:szCs w:val="22"/>
-        </w:rPr>
-        <w:t xml:space="preserve">zo </w:t>
-      </w:r>
-      <w:r>
-        <w:rPr>
-          <w:rFonts w:ascii="Courier New" w:hAnsi="Courier New" w:cs="Courier New"/>
-          <w:sz w:val="22"/>
-          <w:szCs w:val="22"/>
-        </w:rPr>
-        <w:t xml:space="preserve">confrontatie te vermijden. </w:t>
-      </w:r>
-      <w:r>
-        <w:rPr>
-          <w:rFonts w:ascii="Courier New" w:hAnsi="Courier New" w:cs="Courier New"/>
-          <w:sz w:val="22"/>
-          <w:szCs w:val="22"/>
-        </w:rPr>
-        <w:t>Deze aanpak zorgt voor</w:t>
-      </w:r>
-      <w:r>
-        <w:rPr>
-          <w:rFonts w:ascii="Courier New" w:hAnsi="Courier New" w:cs="Courier New"/>
-          <w:sz w:val="22"/>
-          <w:szCs w:val="22"/>
-        </w:rPr>
-        <w:t xml:space="preserve"> de-escalatie</w:t>
-      </w:r>
-      <w:r>
-        <w:rPr>
-          <w:rFonts w:ascii="Courier New" w:hAnsi="Courier New" w:cs="Courier New"/>
-          <w:sz w:val="22"/>
-          <w:szCs w:val="22"/>
-        </w:rPr>
-        <w:t xml:space="preserve"> en zorgt ervoor dat het gesprek gevoerd kan blijven worden.</w:t>
-      </w:r>
-      <w:r>
-        <w:rPr>
-          <w:rFonts w:ascii="Courier New" w:hAnsi="Courier New" w:cs="Courier New"/>
-          <w:sz w:val="22"/>
-          <w:szCs w:val="22"/>
-        </w:rPr>
-        <w:t xml:space="preserve"> </w:t>
-      </w:r>
-      <w:r>
-        <w:rPr>
-          <w:rFonts w:ascii="Courier New" w:hAnsi="Courier New" w:cs="Courier New"/>
-          <w:sz w:val="22"/>
-          <w:szCs w:val="22"/>
-        </w:rPr>
-        <w:t xml:space="preserve">Dit zorgt ervoor dat </w:t>
-      </w:r>
-      <w:r>
-        <w:rPr>
-          <w:rFonts w:ascii="Courier New" w:hAnsi="Courier New" w:cs="Courier New"/>
-          <w:sz w:val="22"/>
-          <w:szCs w:val="22"/>
-        </w:rPr>
-        <w:t xml:space="preserve"> </w:t>
-      </w:r>
-      <w:r>
-        <w:rPr>
-          <w:rFonts w:ascii="Courier New" w:hAnsi="Courier New" w:cs="Courier New"/>
-          <w:sz w:val="22"/>
-          <w:szCs w:val="22"/>
-        </w:rPr>
-        <w:t xml:space="preserve">het </w:t>
-      </w:r>
-      <w:r>
-        <w:rPr>
-          <w:rFonts w:ascii="Courier New" w:hAnsi="Courier New" w:cs="Courier New"/>
-          <w:sz w:val="22"/>
-          <w:szCs w:val="22"/>
-        </w:rPr>
-        <w:t xml:space="preserve">institutionele gezag </w:t>
-      </w:r>
-      <w:r>
-        <w:rPr>
-          <w:rFonts w:ascii="Courier New" w:hAnsi="Courier New" w:cs="Courier New"/>
-          <w:sz w:val="22"/>
-          <w:szCs w:val="22"/>
-        </w:rPr>
-        <w:t>overeind blijft net zoals</w:t>
-      </w:r>
-      <w:r>
-        <w:rPr>
-          <w:rFonts w:ascii="Courier New" w:hAnsi="Courier New" w:cs="Courier New"/>
-          <w:sz w:val="22"/>
-          <w:szCs w:val="22"/>
-        </w:rPr>
-        <w:t xml:space="preserve"> het vertrouwen van </w:t>
-      </w:r>
-      <w:r>
-        <w:rPr>
-          <w:rFonts w:ascii="Courier New" w:hAnsi="Courier New" w:cs="Courier New"/>
-          <w:sz w:val="22"/>
-          <w:szCs w:val="22"/>
-        </w:rPr>
-        <w:t xml:space="preserve">de </w:t>
-      </w:r>
-      <w:r>
-        <w:rPr>
-          <w:rFonts w:ascii="Courier New" w:hAnsi="Courier New" w:cs="Courier New"/>
-          <w:sz w:val="22"/>
-          <w:szCs w:val="22"/>
-        </w:rPr>
-        <w:t>studenten</w:t>
-      </w:r>
-      <w:r>
-        <w:rPr>
-          <w:rFonts w:ascii="Courier New" w:hAnsi="Courier New" w:cs="Courier New"/>
-          <w:sz w:val="22"/>
-          <w:szCs w:val="22"/>
-        </w:rPr>
-        <w:t xml:space="preserve"> zelf</w:t>
-      </w:r>
-      <w:r>
-        <w:rPr>
-          <w:rFonts w:ascii="Courier New" w:hAnsi="Courier New" w:cs="Courier New"/>
-          <w:sz w:val="22"/>
-          <w:szCs w:val="22"/>
-        </w:rPr>
-        <w:t xml:space="preserve">. </w:t>
-      </w:r>
-      <w:r>
-        <w:rPr>
-          <w:rFonts w:ascii="Courier New" w:hAnsi="Courier New" w:cs="Courier New"/>
-          <w:sz w:val="22"/>
-          <w:szCs w:val="22"/>
-        </w:rPr>
-        <w:t>Zij contrasteert haar aanpak</w:t>
-      </w:r>
-      <w:r>
-        <w:rPr>
-          <w:rFonts w:ascii="Courier New" w:hAnsi="Courier New" w:cs="Courier New"/>
-          <w:sz w:val="22"/>
-          <w:szCs w:val="22"/>
-        </w:rPr>
-        <w:t xml:space="preserve"> met de gewelddadige verwijdering van demonstranten aan andere universiteiten.</w:t>
-      </w:r>
-      <w:r>
-        <w:rPr>
-          <w:rFonts w:ascii="Courier New" w:hAnsi="Courier New" w:cs="Courier New"/>
-          <w:sz w:val="22"/>
-          <w:szCs w:val="22"/>
-        </w:rPr>
-        <w:t xml:space="preserve"> Lesson </w:t>
-      </w:r>
-      <w:r>
-        <w:rPr>
-          <w:rFonts w:ascii="Courier New" w:hAnsi="Courier New" w:cs="Courier New"/>
-          <w:sz w:val="22"/>
-          <w:szCs w:val="22"/>
-        </w:rPr>
-        <w:lastRenderedPageBreak/>
-        <w:t xml:space="preserve">learned: </w:t>
-      </w:r>
-      <w:r>
-        <w:rPr>
-          <w:rFonts w:ascii="Courier New" w:hAnsi="Courier New" w:cs="Courier New"/>
-          <w:sz w:val="22"/>
-          <w:szCs w:val="22"/>
-        </w:rPr>
-        <w:t>neem nooit een beslissing die als totale verrassing komt; bel niet onmiddellijk de politie; luister naar zoveel mogelijk stemmen voordat je handelt. Dit zijn geen gemeenplaatsen, maar principes die zijn gesmeed in daadwerkelijke institutionele crises.</w:t>
+        <w:t xml:space="preserve"> Tatum is het duidelijk dat de universiteit de plaats is waar mensen met verschillende achtergronden en levenservaringen samenkomen en van elkaar leren in betekenisvolle interactie. </w:t>
+      </w:r>
+      <w:r>
+        <w:rPr>
+          <w:rFonts w:ascii="Courier New" w:hAnsi="Courier New" w:cs="Courier New"/>
+          <w:sz w:val="22"/>
+          <w:szCs w:val="22"/>
+          <w:lang w:val="nl-NL"/>
+        </w:rPr>
+        <w:t xml:space="preserve">Het is de taak van een leider van hoger onderwijs om </w:t>
+      </w:r>
+      <w:r>
+        <w:rPr>
+          <w:rFonts w:ascii="Courier New" w:hAnsi="Courier New" w:cs="Courier New"/>
+          <w:sz w:val="22"/>
+          <w:szCs w:val="22"/>
+          <w:lang w:val="nl-NL"/>
+        </w:rPr>
+        <w:t xml:space="preserve">deze waarden </w:t>
+      </w:r>
+      <w:r>
+        <w:rPr>
+          <w:rFonts w:ascii="Courier New" w:hAnsi="Courier New" w:cs="Courier New"/>
+          <w:sz w:val="22"/>
+          <w:szCs w:val="22"/>
+          <w:lang w:val="nl-NL"/>
+        </w:rPr>
+        <w:t xml:space="preserve">te </w:t>
+      </w:r>
+      <w:r>
+        <w:rPr>
+          <w:rFonts w:ascii="Courier New" w:hAnsi="Courier New" w:cs="Courier New"/>
+          <w:sz w:val="22"/>
+          <w:szCs w:val="22"/>
+          <w:lang w:val="nl-NL"/>
+        </w:rPr>
+        <w:t xml:space="preserve">verdedigen. </w:t>
       </w:r>
     </w:p>
     <w:p>
@@ -2924,7 +3215,755 @@
           <w:sz w:val="22"/>
           <w:szCs w:val="22"/>
         </w:rPr>
-        <w:t>Het boek vervolgt met een reeks casestudy’s, grotendeels ontleend aan Tatums eigen presidentschap bij Spelman. Deze voorbeelden behandelen een indrukwekkend scala aan institutionele uitdagingen: het omgaan met campusprotesten, het navigeren door controverses rond vrije meningsuiting, het hanteren van financiële beperkingen en de delicate kunst van gedeeld bestuur met faculteit, personeel, studenten en toezichthouders die het niet altijd met elkaar eens zijn. Elk voorbeeld is concreet genoeg om leerzaam te zijn en openhartig genoeg om de zelfverheerlijking te vermijden die leiderschapsmemoires vaak kenmerkt.</w:t>
+        <w:t xml:space="preserve">Om een goed beeld te schetsen van haar manier van werken als </w:t>
+      </w:r>
+      <w:r>
+        <w:rPr>
+          <w:rFonts w:ascii="Courier New" w:hAnsi="Courier New" w:cs="Courier New"/>
+          <w:sz w:val="22"/>
+          <w:szCs w:val="22"/>
+        </w:rPr>
+        <w:t>president van een universiteit, gaat zij u</w:t>
+      </w:r>
+      <w:r>
+        <w:rPr>
+          <w:rFonts w:ascii="Courier New" w:hAnsi="Courier New" w:cs="Courier New"/>
+          <w:sz w:val="22"/>
+          <w:szCs w:val="22"/>
+        </w:rPr>
+        <w:t xml:space="preserve">itgebreid in op een voorbeeld </w:t>
+      </w:r>
+      <w:r>
+        <w:rPr>
+          <w:rFonts w:ascii="Courier New" w:hAnsi="Courier New" w:cs="Courier New"/>
+          <w:sz w:val="22"/>
+          <w:szCs w:val="22"/>
+        </w:rPr>
+        <w:t xml:space="preserve">op </w:t>
+      </w:r>
+      <w:r>
+        <w:rPr>
+          <w:rFonts w:ascii="Courier New" w:hAnsi="Courier New" w:cs="Courier New"/>
+          <w:sz w:val="22"/>
+          <w:szCs w:val="22"/>
+        </w:rPr>
+        <w:t xml:space="preserve">het </w:t>
+      </w:r>
+      <w:r>
+        <w:rPr>
+          <w:rFonts w:ascii="Courier New" w:hAnsi="Courier New" w:cs="Courier New"/>
+          <w:sz w:val="22"/>
+          <w:szCs w:val="22"/>
+        </w:rPr>
+        <w:t>Spelman</w:t>
+      </w:r>
+      <w:r>
+        <w:rPr>
+          <w:rFonts w:ascii="Courier New" w:hAnsi="Courier New" w:cs="Courier New"/>
+          <w:sz w:val="22"/>
+          <w:szCs w:val="22"/>
+        </w:rPr>
+        <w:t xml:space="preserve"> instituut</w:t>
+      </w:r>
+      <w:r>
+        <w:rPr>
+          <w:rFonts w:ascii="Courier New" w:hAnsi="Courier New" w:cs="Courier New"/>
+          <w:sz w:val="22"/>
+          <w:szCs w:val="22"/>
+        </w:rPr>
+        <w:t xml:space="preserve"> </w:t>
+      </w:r>
+      <w:r>
+        <w:rPr>
+          <w:rFonts w:ascii="Courier New" w:hAnsi="Courier New" w:cs="Courier New"/>
+          <w:sz w:val="22"/>
+          <w:szCs w:val="22"/>
+        </w:rPr>
+        <w:t>aan het einde van de</w:t>
+      </w:r>
+      <w:r>
+        <w:rPr>
+          <w:rFonts w:ascii="Courier New" w:hAnsi="Courier New" w:cs="Courier New"/>
+          <w:sz w:val="22"/>
+          <w:szCs w:val="22"/>
+        </w:rPr>
+        <w:t xml:space="preserve"> Covid-19-pandemie. </w:t>
+      </w:r>
+      <w:r>
+        <w:rPr>
+          <w:rFonts w:ascii="Courier New" w:hAnsi="Courier New" w:cs="Courier New"/>
+          <w:sz w:val="22"/>
+          <w:szCs w:val="22"/>
+        </w:rPr>
+        <w:t xml:space="preserve">Het voorbeeld maakt </w:t>
+      </w:r>
+      <w:r>
+        <w:rPr>
+          <w:rFonts w:ascii="Courier New" w:hAnsi="Courier New" w:cs="Courier New"/>
+          <w:sz w:val="22"/>
+          <w:szCs w:val="22"/>
+        </w:rPr>
+        <w:t>duidelijk</w:t>
+      </w:r>
+      <w:r>
+        <w:rPr>
+          <w:rFonts w:ascii="Courier New" w:hAnsi="Courier New" w:cs="Courier New"/>
+          <w:sz w:val="22"/>
+          <w:szCs w:val="22"/>
+        </w:rPr>
+        <w:t xml:space="preserve"> hoe Tatum operereer</w:t>
+      </w:r>
+      <w:r>
+        <w:rPr>
+          <w:rFonts w:ascii="Courier New" w:hAnsi="Courier New" w:cs="Courier New"/>
+          <w:sz w:val="22"/>
+          <w:szCs w:val="22"/>
+        </w:rPr>
+        <w:t>t</w:t>
+      </w:r>
+      <w:r>
+        <w:rPr>
+          <w:rFonts w:ascii="Courier New" w:hAnsi="Courier New" w:cs="Courier New"/>
+          <w:sz w:val="22"/>
+          <w:szCs w:val="22"/>
+        </w:rPr>
+        <w:t xml:space="preserve"> en </w:t>
+      </w:r>
+      <w:r>
+        <w:rPr>
+          <w:rFonts w:ascii="Courier New" w:hAnsi="Courier New" w:cs="Courier New"/>
+          <w:sz w:val="22"/>
+          <w:szCs w:val="22"/>
+        </w:rPr>
+        <w:t xml:space="preserve">laat zien wat volgens haar een succesvolle aanpak is. </w:t>
+      </w:r>
+      <w:r>
+        <w:rPr>
+          <w:rFonts w:ascii="Courier New" w:hAnsi="Courier New" w:cs="Courier New"/>
+          <w:sz w:val="22"/>
+          <w:szCs w:val="22"/>
+        </w:rPr>
+        <w:t>Wanneer</w:t>
+      </w:r>
+      <w:r>
+        <w:rPr>
+          <w:rFonts w:ascii="Courier New" w:hAnsi="Courier New" w:cs="Courier New"/>
+          <w:sz w:val="22"/>
+          <w:szCs w:val="22"/>
+        </w:rPr>
+        <w:t xml:space="preserve"> de mondkapjesplicht w</w:t>
+      </w:r>
+      <w:r>
+        <w:rPr>
+          <w:rFonts w:ascii="Courier New" w:hAnsi="Courier New" w:cs="Courier New"/>
+          <w:sz w:val="22"/>
+          <w:szCs w:val="22"/>
+        </w:rPr>
+        <w:t>ordt</w:t>
+      </w:r>
+      <w:r>
+        <w:rPr>
+          <w:rFonts w:ascii="Courier New" w:hAnsi="Courier New" w:cs="Courier New"/>
+          <w:sz w:val="22"/>
+          <w:szCs w:val="22"/>
+        </w:rPr>
+        <w:t xml:space="preserve"> versoepeld, bezet een groep studenten vijfentwintig dagen lang de gangen van het bestuursgebouw. </w:t>
+      </w:r>
+      <w:r>
+        <w:rPr>
+          <w:rFonts w:ascii="Courier New" w:hAnsi="Courier New" w:cs="Courier New"/>
+          <w:sz w:val="22"/>
+          <w:szCs w:val="22"/>
+        </w:rPr>
+        <w:t xml:space="preserve">Zij </w:t>
+      </w:r>
+      <w:r>
+        <w:rPr>
+          <w:rFonts w:ascii="Courier New" w:hAnsi="Courier New" w:cs="Courier New"/>
+          <w:sz w:val="22"/>
+          <w:szCs w:val="22"/>
+        </w:rPr>
+        <w:t>zijn</w:t>
+      </w:r>
+      <w:r>
+        <w:rPr>
+          <w:rFonts w:ascii="Courier New" w:hAnsi="Courier New" w:cs="Courier New"/>
+          <w:sz w:val="22"/>
+          <w:szCs w:val="22"/>
+        </w:rPr>
+        <w:t xml:space="preserve"> het niet eens met de versoepeling van de maatregelen. </w:t>
+      </w:r>
+      <w:r>
+        <w:rPr>
+          <w:rFonts w:ascii="Courier New" w:hAnsi="Courier New" w:cs="Courier New"/>
+          <w:sz w:val="22"/>
+          <w:szCs w:val="22"/>
+        </w:rPr>
+        <w:t xml:space="preserve">Tatum </w:t>
+      </w:r>
+      <w:r>
+        <w:rPr>
+          <w:rFonts w:ascii="Courier New" w:hAnsi="Courier New" w:cs="Courier New"/>
+          <w:sz w:val="22"/>
+          <w:szCs w:val="22"/>
+        </w:rPr>
+        <w:t>ziet de bezetting niet als</w:t>
+      </w:r>
+      <w:r>
+        <w:rPr>
+          <w:rFonts w:ascii="Courier New" w:hAnsi="Courier New" w:cs="Courier New"/>
+          <w:sz w:val="22"/>
+          <w:szCs w:val="22"/>
+        </w:rPr>
+        <w:t xml:space="preserve"> een ordeverstoring die </w:t>
+      </w:r>
+      <w:r>
+        <w:rPr>
+          <w:rFonts w:ascii="Courier New" w:hAnsi="Courier New" w:cs="Courier New"/>
+          <w:sz w:val="22"/>
+          <w:szCs w:val="22"/>
+        </w:rPr>
+        <w:t xml:space="preserve">direkt </w:t>
+      </w:r>
+      <w:r>
+        <w:rPr>
+          <w:rFonts w:ascii="Courier New" w:hAnsi="Courier New" w:cs="Courier New"/>
+          <w:sz w:val="22"/>
+          <w:szCs w:val="22"/>
+        </w:rPr>
+        <w:t>onderdrukt moet worden</w:t>
+      </w:r>
+      <w:r>
+        <w:rPr>
+          <w:rFonts w:ascii="Courier New" w:hAnsi="Courier New" w:cs="Courier New"/>
+          <w:sz w:val="22"/>
+          <w:szCs w:val="22"/>
+        </w:rPr>
+        <w:t>. Zij kiest voor</w:t>
+      </w:r>
+      <w:r>
+        <w:rPr>
+          <w:rFonts w:ascii="Courier New" w:hAnsi="Courier New" w:cs="Courier New"/>
+          <w:sz w:val="22"/>
+          <w:szCs w:val="22"/>
+        </w:rPr>
+        <w:t xml:space="preserve"> een andere aanpak. Zij </w:t>
+      </w:r>
+      <w:r>
+        <w:rPr>
+          <w:rFonts w:ascii="Courier New" w:hAnsi="Courier New" w:cs="Courier New"/>
+          <w:sz w:val="22"/>
+          <w:szCs w:val="22"/>
+        </w:rPr>
+        <w:t xml:space="preserve">doet zelf een stap </w:t>
+      </w:r>
+      <w:r>
+        <w:rPr>
+          <w:rFonts w:ascii="Courier New" w:hAnsi="Courier New" w:cs="Courier New"/>
+          <w:sz w:val="22"/>
+          <w:szCs w:val="22"/>
+        </w:rPr>
+        <w:lastRenderedPageBreak/>
+        <w:t xml:space="preserve">vooruit en </w:t>
+      </w:r>
+      <w:r>
+        <w:rPr>
+          <w:rFonts w:ascii="Courier New" w:hAnsi="Courier New" w:cs="Courier New"/>
+          <w:sz w:val="22"/>
+          <w:szCs w:val="22"/>
+        </w:rPr>
+        <w:t>v</w:t>
+      </w:r>
+      <w:r>
+        <w:rPr>
+          <w:rFonts w:ascii="Courier New" w:hAnsi="Courier New" w:cs="Courier New"/>
+          <w:sz w:val="22"/>
+          <w:szCs w:val="22"/>
+        </w:rPr>
+        <w:t>erplaatst haar eigen werkzaamheden uit het gebouw</w:t>
+      </w:r>
+      <w:r>
+        <w:rPr>
+          <w:rFonts w:ascii="Courier New" w:hAnsi="Courier New" w:cs="Courier New"/>
+          <w:sz w:val="22"/>
+          <w:szCs w:val="22"/>
+        </w:rPr>
+        <w:t xml:space="preserve">. </w:t>
+      </w:r>
+      <w:r>
+        <w:rPr>
+          <w:rFonts w:ascii="Courier New" w:hAnsi="Courier New" w:cs="Courier New"/>
+          <w:sz w:val="22"/>
+          <w:szCs w:val="22"/>
+        </w:rPr>
+        <w:t>Zij probeert</w:t>
+      </w:r>
+      <w:r>
+        <w:rPr>
+          <w:rFonts w:ascii="Courier New" w:hAnsi="Courier New" w:cs="Courier New"/>
+          <w:sz w:val="22"/>
+          <w:szCs w:val="22"/>
+        </w:rPr>
+        <w:t xml:space="preserve"> </w:t>
+      </w:r>
+      <w:r>
+        <w:rPr>
+          <w:rFonts w:ascii="Courier New" w:hAnsi="Courier New" w:cs="Courier New"/>
+          <w:sz w:val="22"/>
+          <w:szCs w:val="22"/>
+        </w:rPr>
+        <w:t xml:space="preserve">een harde </w:t>
+      </w:r>
+      <w:r>
+        <w:rPr>
+          <w:rFonts w:ascii="Courier New" w:hAnsi="Courier New" w:cs="Courier New"/>
+          <w:sz w:val="22"/>
+          <w:szCs w:val="22"/>
+        </w:rPr>
+        <w:t xml:space="preserve">confrontatie </w:t>
+      </w:r>
+      <w:r>
+        <w:rPr>
+          <w:rFonts w:ascii="Courier New" w:hAnsi="Courier New" w:cs="Courier New"/>
+          <w:sz w:val="22"/>
+          <w:szCs w:val="22"/>
+        </w:rPr>
+        <w:t xml:space="preserve">met deze studenten </w:t>
+      </w:r>
+      <w:r>
+        <w:rPr>
+          <w:rFonts w:ascii="Courier New" w:hAnsi="Courier New" w:cs="Courier New"/>
+          <w:sz w:val="22"/>
+          <w:szCs w:val="22"/>
+        </w:rPr>
+        <w:t xml:space="preserve">te vermijden. </w:t>
+      </w:r>
+      <w:r>
+        <w:rPr>
+          <w:rFonts w:ascii="Courier New" w:hAnsi="Courier New" w:cs="Courier New"/>
+          <w:sz w:val="22"/>
+          <w:szCs w:val="22"/>
+        </w:rPr>
+        <w:t>Deze aanpak zorgt voor</w:t>
+      </w:r>
+      <w:r>
+        <w:rPr>
+          <w:rFonts w:ascii="Courier New" w:hAnsi="Courier New" w:cs="Courier New"/>
+          <w:sz w:val="22"/>
+          <w:szCs w:val="22"/>
+        </w:rPr>
+        <w:t xml:space="preserve"> de-escalatie</w:t>
+      </w:r>
+      <w:r>
+        <w:rPr>
+          <w:rFonts w:ascii="Courier New" w:hAnsi="Courier New" w:cs="Courier New"/>
+          <w:sz w:val="22"/>
+          <w:szCs w:val="22"/>
+        </w:rPr>
+        <w:t xml:space="preserve"> en </w:t>
+      </w:r>
+      <w:r>
+        <w:rPr>
+          <w:rFonts w:ascii="Courier New" w:hAnsi="Courier New" w:cs="Courier New"/>
+          <w:sz w:val="22"/>
+          <w:szCs w:val="22"/>
+        </w:rPr>
+        <w:t xml:space="preserve">ook </w:t>
+      </w:r>
+      <w:r>
+        <w:rPr>
+          <w:rFonts w:ascii="Courier New" w:hAnsi="Courier New" w:cs="Courier New"/>
+          <w:sz w:val="22"/>
+          <w:szCs w:val="22"/>
+        </w:rPr>
+        <w:t>dat het gesprek gevoerd kan blijven worden.</w:t>
+      </w:r>
+      <w:r>
+        <w:rPr>
+          <w:rFonts w:ascii="Courier New" w:hAnsi="Courier New" w:cs="Courier New"/>
+          <w:sz w:val="22"/>
+          <w:szCs w:val="22"/>
+        </w:rPr>
+        <w:t xml:space="preserve"> </w:t>
+      </w:r>
+      <w:r>
+        <w:rPr>
+          <w:rFonts w:ascii="Courier New" w:hAnsi="Courier New" w:cs="Courier New"/>
+          <w:sz w:val="22"/>
+          <w:szCs w:val="22"/>
+        </w:rPr>
+        <w:t xml:space="preserve">Zo blijft </w:t>
+      </w:r>
+      <w:r>
+        <w:rPr>
+          <w:rFonts w:ascii="Courier New" w:hAnsi="Courier New" w:cs="Courier New"/>
+          <w:sz w:val="22"/>
+          <w:szCs w:val="22"/>
+        </w:rPr>
+        <w:t xml:space="preserve">het </w:t>
+      </w:r>
+      <w:r>
+        <w:rPr>
+          <w:rFonts w:ascii="Courier New" w:hAnsi="Courier New" w:cs="Courier New"/>
+          <w:sz w:val="22"/>
+          <w:szCs w:val="22"/>
+        </w:rPr>
+        <w:t xml:space="preserve">institutionele gezag </w:t>
+      </w:r>
+      <w:r>
+        <w:rPr>
+          <w:rFonts w:ascii="Courier New" w:hAnsi="Courier New" w:cs="Courier New"/>
+          <w:sz w:val="22"/>
+          <w:szCs w:val="22"/>
+        </w:rPr>
+        <w:t>overeind net</w:t>
+      </w:r>
+      <w:r>
+        <w:rPr>
+          <w:rFonts w:ascii="Courier New" w:hAnsi="Courier New" w:cs="Courier New"/>
+          <w:sz w:val="22"/>
+          <w:szCs w:val="22"/>
+        </w:rPr>
+        <w:t xml:space="preserve"> zp goed als</w:t>
+      </w:r>
+      <w:r>
+        <w:rPr>
+          <w:rFonts w:ascii="Courier New" w:hAnsi="Courier New" w:cs="Courier New"/>
+          <w:sz w:val="22"/>
+          <w:szCs w:val="22"/>
+        </w:rPr>
+        <w:t xml:space="preserve"> het vertrouwen van </w:t>
+      </w:r>
+      <w:r>
+        <w:rPr>
+          <w:rFonts w:ascii="Courier New" w:hAnsi="Courier New" w:cs="Courier New"/>
+          <w:sz w:val="22"/>
+          <w:szCs w:val="22"/>
+        </w:rPr>
+        <w:t xml:space="preserve">de </w:t>
+      </w:r>
+      <w:r>
+        <w:rPr>
+          <w:rFonts w:ascii="Courier New" w:hAnsi="Courier New" w:cs="Courier New"/>
+          <w:sz w:val="22"/>
+          <w:szCs w:val="22"/>
+        </w:rPr>
+        <w:t>studenten</w:t>
+      </w:r>
+      <w:r>
+        <w:rPr>
+          <w:rFonts w:ascii="Courier New" w:hAnsi="Courier New" w:cs="Courier New"/>
+          <w:sz w:val="22"/>
+          <w:szCs w:val="22"/>
+        </w:rPr>
+        <w:t xml:space="preserve"> zelf</w:t>
+      </w:r>
+      <w:r>
+        <w:rPr>
+          <w:rFonts w:ascii="Courier New" w:hAnsi="Courier New" w:cs="Courier New"/>
+          <w:sz w:val="22"/>
+          <w:szCs w:val="22"/>
+        </w:rPr>
+        <w:t xml:space="preserve">. </w:t>
+      </w:r>
+      <w:r>
+        <w:rPr>
+          <w:rFonts w:ascii="Courier New" w:hAnsi="Courier New" w:cs="Courier New"/>
+          <w:sz w:val="22"/>
+          <w:szCs w:val="22"/>
+        </w:rPr>
+        <w:t>Zij contrasteert haar aanpak</w:t>
+      </w:r>
+      <w:r>
+        <w:rPr>
+          <w:rFonts w:ascii="Courier New" w:hAnsi="Courier New" w:cs="Courier New"/>
+          <w:sz w:val="22"/>
+          <w:szCs w:val="22"/>
+        </w:rPr>
+        <w:t xml:space="preserve"> met de gewelddadige verwijdering van demonstranten aan andere universiteiten.</w:t>
+      </w:r>
+      <w:r>
+        <w:rPr>
+          <w:rFonts w:ascii="Courier New" w:hAnsi="Courier New" w:cs="Courier New"/>
+          <w:sz w:val="22"/>
+          <w:szCs w:val="22"/>
+        </w:rPr>
+        <w:t xml:space="preserve"> </w:t>
+      </w:r>
+      <w:r>
+        <w:rPr>
+          <w:rFonts w:ascii="Courier New" w:hAnsi="Courier New" w:cs="Courier New"/>
+          <w:sz w:val="22"/>
+          <w:szCs w:val="22"/>
+        </w:rPr>
+        <w:t>Wat zij ons meegeeft is:</w:t>
+      </w:r>
+      <w:r>
+        <w:rPr>
+          <w:rFonts w:ascii="Courier New" w:hAnsi="Courier New" w:cs="Courier New"/>
+          <w:sz w:val="22"/>
+          <w:szCs w:val="22"/>
+        </w:rPr>
+        <w:t xml:space="preserve"> </w:t>
+      </w:r>
+      <w:r>
+        <w:rPr>
+          <w:rFonts w:ascii="Courier New" w:hAnsi="Courier New" w:cs="Courier New"/>
+          <w:sz w:val="22"/>
+          <w:szCs w:val="22"/>
+        </w:rPr>
+        <w:t>neem nooit een beslissing die als totale verrassing komt</w:t>
+      </w:r>
+      <w:r>
+        <w:rPr>
+          <w:rFonts w:ascii="Courier New" w:hAnsi="Courier New" w:cs="Courier New"/>
+          <w:sz w:val="22"/>
+          <w:szCs w:val="22"/>
+        </w:rPr>
+        <w:t xml:space="preserve">, </w:t>
+      </w:r>
+      <w:r>
+        <w:rPr>
+          <w:rFonts w:ascii="Courier New" w:hAnsi="Courier New" w:cs="Courier New"/>
+          <w:sz w:val="22"/>
+          <w:szCs w:val="22"/>
+        </w:rPr>
+        <w:t>bel niet onmiddellijk de politie</w:t>
+      </w:r>
+      <w:r>
+        <w:rPr>
+          <w:rFonts w:ascii="Courier New" w:hAnsi="Courier New" w:cs="Courier New"/>
+          <w:sz w:val="22"/>
+          <w:szCs w:val="22"/>
+        </w:rPr>
+        <w:t>,</w:t>
+      </w:r>
+      <w:r>
+        <w:rPr>
+          <w:rFonts w:ascii="Courier New" w:hAnsi="Courier New" w:cs="Courier New"/>
+          <w:sz w:val="22"/>
+          <w:szCs w:val="22"/>
+        </w:rPr>
+        <w:t xml:space="preserve"> luister naar zoveel mogelijk stemmen voordat je handelt. </w:t>
+      </w:r>
+    </w:p>
+    <w:p>
+      <w:pPr>
+        <w:spacing w:line="360" w:lineRule="auto"/>
+        <w:ind w:firstLine="720"/>
+        <w:rPr>
+          <w:rFonts w:ascii="Courier New" w:hAnsi="Courier New" w:cs="Courier New"/>
+          <w:sz w:val="22"/>
+          <w:szCs w:val="22"/>
+        </w:rPr>
+      </w:pPr>
+      <w:r>
+        <w:rPr>
+          <w:rFonts w:ascii="Courier New" w:hAnsi="Courier New" w:cs="Courier New"/>
+          <w:sz w:val="22"/>
+          <w:szCs w:val="22"/>
+        </w:rPr>
+        <w:t xml:space="preserve">Het boek </w:t>
+      </w:r>
+      <w:r>
+        <w:rPr>
+          <w:rFonts w:ascii="Courier New" w:hAnsi="Courier New" w:cs="Courier New"/>
+          <w:sz w:val="22"/>
+          <w:szCs w:val="22"/>
+        </w:rPr>
+        <w:t>laat ook zien hoe leiders van deze instituten met dagelijkse problemen hebben om</w:t>
+      </w:r>
+      <w:r>
+        <w:rPr>
+          <w:rFonts w:ascii="Courier New" w:hAnsi="Courier New" w:cs="Courier New"/>
+          <w:sz w:val="22"/>
+          <w:szCs w:val="22"/>
+        </w:rPr>
+        <w:t xml:space="preserve"> het omgaan me</w:t>
+      </w:r>
+      <w:r>
+        <w:rPr>
+          <w:rFonts w:ascii="Courier New" w:hAnsi="Courier New" w:cs="Courier New"/>
+          <w:sz w:val="22"/>
+          <w:szCs w:val="22"/>
+        </w:rPr>
+        <w:t>t veiligheid en gezondheid van studenten hebben om te gaan (hoe ze met de moord van een student omgaat en met de mentale problematiek van studenten)</w:t>
+      </w:r>
+      <w:r>
+        <w:rPr>
+          <w:rFonts w:ascii="Courier New" w:hAnsi="Courier New" w:cs="Courier New"/>
+          <w:sz w:val="22"/>
+          <w:szCs w:val="22"/>
+        </w:rPr>
+        <w:t>, met studentenaantal (en het demografische probleem van dreigende instroomdaling, hoe universiteiten op verschillende manieren met nieuwe ontwikkelingen omgaan,</w:t>
+      </w:r>
+      <w:r>
+        <w:rPr>
+          <w:rFonts w:ascii="Courier New" w:hAnsi="Courier New" w:cs="Courier New"/>
+          <w:sz w:val="22"/>
+          <w:szCs w:val="22"/>
+        </w:rPr>
+        <w:t xml:space="preserve"> </w:t>
+      </w:r>
+      <w:r>
+        <w:rPr>
+          <w:rFonts w:ascii="Courier New" w:hAnsi="Courier New" w:cs="Courier New"/>
+          <w:sz w:val="22"/>
+          <w:szCs w:val="22"/>
+        </w:rPr>
+        <w:t>hoe elke leider om heeft te gaan</w:t>
+      </w:r>
+      <w:r>
+        <w:rPr>
+          <w:rFonts w:ascii="Courier New" w:hAnsi="Courier New" w:cs="Courier New"/>
+          <w:sz w:val="22"/>
+          <w:szCs w:val="22"/>
+        </w:rPr>
+        <w:t xml:space="preserve"> </w:t>
+      </w:r>
+      <w:r>
+        <w:rPr>
+          <w:rFonts w:ascii="Courier New" w:hAnsi="Courier New" w:cs="Courier New"/>
+          <w:sz w:val="22"/>
+          <w:szCs w:val="22"/>
+        </w:rPr>
+        <w:t>met de</w:t>
+      </w:r>
+      <w:r>
+        <w:rPr>
+          <w:rFonts w:ascii="Courier New" w:hAnsi="Courier New" w:cs="Courier New"/>
+          <w:sz w:val="22"/>
+          <w:szCs w:val="22"/>
+        </w:rPr>
+        <w:t xml:space="preserve"> financiële beperkingen </w:t>
+      </w:r>
+      <w:r>
+        <w:rPr>
+          <w:rFonts w:ascii="Courier New" w:hAnsi="Courier New" w:cs="Courier New"/>
+          <w:sz w:val="22"/>
+          <w:szCs w:val="22"/>
+        </w:rPr>
+        <w:t xml:space="preserve">(wat lang niet iedereen goed begrijpt) </w:t>
+      </w:r>
+      <w:r>
+        <w:rPr>
+          <w:rFonts w:ascii="Courier New" w:hAnsi="Courier New" w:cs="Courier New"/>
+          <w:sz w:val="22"/>
+          <w:szCs w:val="22"/>
+        </w:rPr>
+        <w:t xml:space="preserve">en </w:t>
+      </w:r>
+      <w:r>
+        <w:rPr>
+          <w:rFonts w:ascii="Courier New" w:hAnsi="Courier New" w:cs="Courier New"/>
+          <w:sz w:val="22"/>
+          <w:szCs w:val="22"/>
+        </w:rPr>
+        <w:t>het belang en de wijze waarop</w:t>
+      </w:r>
+      <w:r>
+        <w:rPr>
+          <w:rFonts w:ascii="Courier New" w:hAnsi="Courier New" w:cs="Courier New"/>
+          <w:sz w:val="22"/>
+          <w:szCs w:val="22"/>
+        </w:rPr>
+        <w:t xml:space="preserve"> </w:t>
+      </w:r>
+      <w:r>
+        <w:rPr>
+          <w:rFonts w:ascii="Courier New" w:hAnsi="Courier New" w:cs="Courier New"/>
+          <w:sz w:val="22"/>
+          <w:szCs w:val="22"/>
+        </w:rPr>
+        <w:t xml:space="preserve">om te gaan met </w:t>
+      </w:r>
+      <w:r>
+        <w:rPr>
+          <w:rFonts w:ascii="Courier New" w:hAnsi="Courier New" w:cs="Courier New"/>
+          <w:sz w:val="22"/>
+          <w:szCs w:val="22"/>
+        </w:rPr>
+        <w:t>gedeeld bestuur me</w:t>
+      </w:r>
+      <w:r>
+        <w:rPr>
+          <w:rFonts w:ascii="Courier New" w:hAnsi="Courier New" w:cs="Courier New"/>
+          <w:sz w:val="22"/>
+          <w:szCs w:val="22"/>
+        </w:rPr>
+        <w:t>t</w:t>
+      </w:r>
+      <w:r>
+        <w:rPr>
+          <w:rFonts w:ascii="Courier New" w:hAnsi="Courier New" w:cs="Courier New"/>
+          <w:sz w:val="22"/>
+          <w:szCs w:val="22"/>
+        </w:rPr>
+        <w:t xml:space="preserve"> faculteit, personeel, studenten en toezichthouders </w:t>
+      </w:r>
+      <w:r>
+        <w:rPr>
+          <w:rFonts w:ascii="Courier New" w:hAnsi="Courier New" w:cs="Courier New"/>
+          <w:sz w:val="22"/>
+          <w:szCs w:val="22"/>
+        </w:rPr>
+        <w:t>(</w:t>
+      </w:r>
+      <w:r>
+        <w:rPr>
+          <w:rFonts w:ascii="Courier New" w:hAnsi="Courier New" w:cs="Courier New"/>
+          <w:sz w:val="22"/>
+          <w:szCs w:val="22"/>
+        </w:rPr>
+        <w:t>die het niet altijd met elkaar eens zijn</w:t>
+      </w:r>
+      <w:r>
+        <w:rPr>
+          <w:rFonts w:ascii="Courier New" w:hAnsi="Courier New" w:cs="Courier New"/>
+          <w:sz w:val="22"/>
+          <w:szCs w:val="22"/>
+        </w:rPr>
+        <w:t xml:space="preserve"> en daarin kun je als leider het verschil maken)</w:t>
+      </w:r>
+      <w:r>
+        <w:rPr>
+          <w:rFonts w:ascii="Courier New" w:hAnsi="Courier New" w:cs="Courier New"/>
+          <w:sz w:val="22"/>
+          <w:szCs w:val="22"/>
+        </w:rPr>
+        <w:t>.</w:t>
+      </w:r>
+      <w:r>
+        <w:rPr>
+          <w:rFonts w:ascii="Courier New" w:hAnsi="Courier New" w:cs="Courier New"/>
+          <w:sz w:val="22"/>
+          <w:szCs w:val="22"/>
+        </w:rPr>
+        <w:t xml:space="preserve"> Tatum maakt modern educatief leiderschap heel</w:t>
+      </w:r>
+      <w:r>
+        <w:rPr>
+          <w:rFonts w:ascii="Courier New" w:hAnsi="Courier New" w:cs="Courier New"/>
+          <w:sz w:val="22"/>
+          <w:szCs w:val="22"/>
+        </w:rPr>
+        <w:t xml:space="preserve"> concreet</w:t>
+      </w:r>
+      <w:r>
+        <w:rPr>
+          <w:rFonts w:ascii="Courier New" w:hAnsi="Courier New" w:cs="Courier New"/>
+          <w:sz w:val="22"/>
+          <w:szCs w:val="22"/>
+        </w:rPr>
+        <w:t xml:space="preserve"> en inzichtelijk</w:t>
+      </w:r>
+      <w:r>
+        <w:rPr>
+          <w:rFonts w:ascii="Courier New" w:hAnsi="Courier New" w:cs="Courier New"/>
+          <w:sz w:val="22"/>
+          <w:szCs w:val="22"/>
+        </w:rPr>
+        <w:t>.</w:t>
       </w:r>
     </w:p>
     <w:p>
@@ -2972,31 +4011,103 @@
           <w:sz w:val="22"/>
           <w:szCs w:val="22"/>
         </w:rPr>
-        <w:t>et boek is geschreven vanuit het perspectief van specifieke instellingen</w:t>
-      </w:r>
-      <w:r>
-        <w:rPr>
-          <w:rFonts w:ascii="Courier New" w:hAnsi="Courier New" w:cs="Courier New"/>
-          <w:sz w:val="22"/>
-          <w:szCs w:val="22"/>
-        </w:rPr>
-        <w:t xml:space="preserve">, </w:t>
-      </w:r>
-      <w:r>
-        <w:rPr>
-          <w:rFonts w:ascii="Courier New" w:hAnsi="Courier New" w:cs="Courier New"/>
-          <w:sz w:val="22"/>
-          <w:szCs w:val="22"/>
-        </w:rPr>
-        <w:t xml:space="preserve">een zwarte vrouwenuniversiteit en liberal arts-instelling. </w:t>
-      </w:r>
-      <w:r>
-        <w:rPr>
-          <w:rFonts w:ascii="Courier New" w:hAnsi="Courier New" w:cs="Courier New"/>
-          <w:sz w:val="22"/>
-          <w:szCs w:val="22"/>
-        </w:rPr>
-        <w:t>Maar de lessen zijn overdraagbaar naar andere instellingen.</w:t>
+        <w:t xml:space="preserve">et boek is geschreven vanuit het perspectief van </w:t>
+      </w:r>
+      <w:r>
+        <w:rPr>
+          <w:rFonts w:ascii="Courier New" w:hAnsi="Courier New" w:cs="Courier New"/>
+          <w:sz w:val="22"/>
+          <w:szCs w:val="22"/>
+        </w:rPr>
+        <w:t xml:space="preserve">een </w:t>
+      </w:r>
+      <w:r>
+        <w:rPr>
+          <w:rFonts w:ascii="Courier New" w:hAnsi="Courier New" w:cs="Courier New"/>
+          <w:sz w:val="22"/>
+          <w:szCs w:val="22"/>
+        </w:rPr>
+        <w:t xml:space="preserve">leider van twee </w:t>
+      </w:r>
+      <w:r>
+        <w:rPr>
+          <w:rFonts w:ascii="Courier New" w:hAnsi="Courier New" w:cs="Courier New"/>
+          <w:sz w:val="22"/>
+          <w:szCs w:val="22"/>
+        </w:rPr>
+        <w:t>specifieke instellingen</w:t>
+      </w:r>
+      <w:r>
+        <w:rPr>
+          <w:rFonts w:ascii="Courier New" w:hAnsi="Courier New" w:cs="Courier New"/>
+          <w:sz w:val="22"/>
+          <w:szCs w:val="22"/>
+        </w:rPr>
+        <w:t>,</w:t>
+      </w:r>
+      <w:r>
+        <w:rPr>
+          <w:rFonts w:ascii="Courier New" w:hAnsi="Courier New" w:cs="Courier New"/>
+          <w:sz w:val="22"/>
+          <w:szCs w:val="22"/>
+        </w:rPr>
+        <w:t xml:space="preserve"> zwarte vrouwenuniversiteit</w:t>
+      </w:r>
+      <w:r>
+        <w:rPr>
+          <w:rFonts w:ascii="Courier New" w:hAnsi="Courier New" w:cs="Courier New"/>
+          <w:sz w:val="22"/>
+          <w:szCs w:val="22"/>
+        </w:rPr>
+        <w:t>en, gericht op brede academische vorming en met kleinschalig onderwijs</w:t>
+      </w:r>
+      <w:r>
+        <w:rPr>
+          <w:rFonts w:ascii="Courier New" w:hAnsi="Courier New" w:cs="Courier New"/>
+          <w:sz w:val="22"/>
+          <w:szCs w:val="22"/>
+        </w:rPr>
+        <w:t xml:space="preserve">. </w:t>
+      </w:r>
+      <w:r>
+        <w:rPr>
+          <w:rFonts w:ascii="Courier New" w:hAnsi="Courier New" w:cs="Courier New"/>
+          <w:sz w:val="22"/>
+          <w:szCs w:val="22"/>
+        </w:rPr>
+        <w:t xml:space="preserve">Maar </w:t>
+      </w:r>
+      <w:r>
+        <w:rPr>
+          <w:rFonts w:ascii="Courier New" w:hAnsi="Courier New" w:cs="Courier New"/>
+          <w:sz w:val="22"/>
+          <w:szCs w:val="22"/>
+        </w:rPr>
+        <w:t>haar ervaringen maakt ze</w:t>
+      </w:r>
+      <w:r>
+        <w:rPr>
+          <w:rFonts w:ascii="Courier New" w:hAnsi="Courier New" w:cs="Courier New"/>
+          <w:sz w:val="22"/>
+          <w:szCs w:val="22"/>
+        </w:rPr>
+        <w:t xml:space="preserve"> overdraagbaar naar andere instellingen</w:t>
+      </w:r>
+      <w:r>
+        <w:rPr>
+          <w:rFonts w:ascii="Courier New" w:hAnsi="Courier New" w:cs="Courier New"/>
+          <w:sz w:val="22"/>
+          <w:szCs w:val="22"/>
+        </w:rPr>
+        <w:t xml:space="preserve"> van hoger onderwijs in Amerika</w:t>
+      </w:r>
+      <w:r>
+        <w:rPr>
+          <w:rFonts w:ascii="Courier New" w:hAnsi="Courier New" w:cs="Courier New"/>
+          <w:sz w:val="22"/>
+          <w:szCs w:val="22"/>
+        </w:rPr>
+        <w:t>.</w:t>
       </w:r>
       <w:r>
         <w:rPr>
@@ -3005,6 +4116,431 @@
           <w:szCs w:val="22"/>
         </w:rPr>
         <w:t xml:space="preserve"> </w:t>
+      </w:r>
+      <w:r>
+        <w:rPr>
+          <w:rFonts w:ascii="Courier New" w:hAnsi="Courier New" w:cs="Courier New"/>
+          <w:sz w:val="22"/>
+          <w:szCs w:val="22"/>
+        </w:rPr>
+        <w:t>Deze i</w:t>
+      </w:r>
+      <w:r>
+        <w:rPr>
+          <w:rFonts w:ascii="Courier New" w:hAnsi="Courier New" w:cs="Courier New"/>
+          <w:sz w:val="22"/>
+          <w:szCs w:val="22"/>
+        </w:rPr>
+        <w:t xml:space="preserve">nstellingen </w:t>
+      </w:r>
+      <w:r>
+        <w:rPr>
+          <w:rFonts w:ascii="Courier New" w:hAnsi="Courier New" w:cs="Courier New"/>
+          <w:sz w:val="22"/>
+          <w:szCs w:val="22"/>
+        </w:rPr>
+        <w:t>hebben</w:t>
+      </w:r>
+      <w:r>
+        <w:rPr>
+          <w:rFonts w:ascii="Courier New" w:hAnsi="Courier New" w:cs="Courier New"/>
+          <w:sz w:val="22"/>
+          <w:szCs w:val="22"/>
+        </w:rPr>
+        <w:t xml:space="preserve"> </w:t>
+      </w:r>
+      <w:r>
+        <w:rPr>
+          <w:rFonts w:ascii="Courier New" w:hAnsi="Courier New" w:cs="Courier New"/>
+          <w:sz w:val="22"/>
+          <w:szCs w:val="22"/>
+        </w:rPr>
+        <w:t xml:space="preserve">volgens haar </w:t>
+      </w:r>
+      <w:r>
+        <w:rPr>
+          <w:rFonts w:ascii="Courier New" w:hAnsi="Courier New" w:cs="Courier New"/>
+          <w:sz w:val="22"/>
+          <w:szCs w:val="22"/>
+        </w:rPr>
+        <w:t xml:space="preserve">allemaal </w:t>
+      </w:r>
+      <w:r>
+        <w:rPr>
+          <w:rFonts w:ascii="Courier New" w:hAnsi="Courier New" w:cs="Courier New"/>
+          <w:sz w:val="22"/>
+          <w:szCs w:val="22"/>
+        </w:rPr>
+        <w:t xml:space="preserve">de taak om </w:t>
+      </w:r>
+      <w:r>
+        <w:rPr>
+          <w:rFonts w:ascii="Courier New" w:hAnsi="Courier New" w:cs="Courier New"/>
+          <w:sz w:val="22"/>
+          <w:szCs w:val="22"/>
+        </w:rPr>
+        <w:t>ons aan</w:t>
+      </w:r>
+      <w:r>
+        <w:rPr>
+          <w:rFonts w:ascii="Courier New" w:hAnsi="Courier New" w:cs="Courier New"/>
+          <w:sz w:val="22"/>
+          <w:szCs w:val="22"/>
+        </w:rPr>
+        <w:t xml:space="preserve"> te </w:t>
+      </w:r>
+      <w:r>
+        <w:rPr>
+          <w:rFonts w:ascii="Courier New" w:hAnsi="Courier New" w:cs="Courier New"/>
+          <w:sz w:val="22"/>
+          <w:szCs w:val="22"/>
+        </w:rPr>
+        <w:t xml:space="preserve">moedigen kritisch na te denken over </w:t>
+      </w:r>
+      <w:r>
+        <w:rPr>
+          <w:rFonts w:ascii="Courier New" w:hAnsi="Courier New" w:cs="Courier New"/>
+          <w:sz w:val="22"/>
+          <w:szCs w:val="22"/>
+        </w:rPr>
+        <w:t xml:space="preserve">de </w:t>
+      </w:r>
+      <w:r>
+        <w:rPr>
+          <w:rFonts w:ascii="Courier New" w:hAnsi="Courier New" w:cs="Courier New"/>
+          <w:sz w:val="22"/>
+          <w:szCs w:val="22"/>
+        </w:rPr>
+        <w:t xml:space="preserve">belangrijke kwesties </w:t>
+      </w:r>
+      <w:r>
+        <w:rPr>
+          <w:rFonts w:ascii="Courier New" w:hAnsi="Courier New" w:cs="Courier New"/>
+          <w:sz w:val="22"/>
+          <w:szCs w:val="22"/>
+        </w:rPr>
+        <w:t xml:space="preserve">die er </w:t>
+      </w:r>
+      <w:r>
+        <w:rPr>
+          <w:rFonts w:ascii="Courier New" w:hAnsi="Courier New" w:cs="Courier New"/>
+          <w:sz w:val="22"/>
+          <w:szCs w:val="22"/>
+        </w:rPr>
+        <w:t xml:space="preserve">in de samenleving </w:t>
+      </w:r>
+      <w:r>
+        <w:rPr>
+          <w:rFonts w:ascii="Courier New" w:hAnsi="Courier New" w:cs="Courier New"/>
+          <w:sz w:val="22"/>
+          <w:szCs w:val="22"/>
+        </w:rPr>
+        <w:t xml:space="preserve">spelen </w:t>
+      </w:r>
+      <w:r>
+        <w:rPr>
+          <w:rFonts w:ascii="Courier New" w:hAnsi="Courier New" w:cs="Courier New"/>
+          <w:sz w:val="22"/>
+          <w:szCs w:val="22"/>
+        </w:rPr>
+        <w:t xml:space="preserve">en </w:t>
+      </w:r>
+      <w:r>
+        <w:rPr>
+          <w:rFonts w:ascii="Courier New" w:hAnsi="Courier New" w:cs="Courier New"/>
+          <w:sz w:val="22"/>
+          <w:szCs w:val="22"/>
+        </w:rPr>
+        <w:t>ook de taak hebben om</w:t>
+      </w:r>
+      <w:r>
+        <w:rPr>
+          <w:rFonts w:ascii="Courier New" w:hAnsi="Courier New" w:cs="Courier New"/>
+          <w:sz w:val="22"/>
+          <w:szCs w:val="22"/>
+        </w:rPr>
+        <w:t xml:space="preserve"> </w:t>
+      </w:r>
+      <w:r>
+        <w:rPr>
+          <w:rFonts w:ascii="Courier New" w:hAnsi="Courier New" w:cs="Courier New"/>
+          <w:sz w:val="22"/>
+          <w:szCs w:val="22"/>
+        </w:rPr>
+        <w:t xml:space="preserve">nieuw leiderschap te ontwikkelen en te vormen. </w:t>
+      </w:r>
+      <w:r>
+        <w:rPr>
+          <w:rFonts w:ascii="Courier New" w:hAnsi="Courier New" w:cs="Courier New"/>
+          <w:sz w:val="22"/>
+          <w:szCs w:val="22"/>
+        </w:rPr>
+        <w:t>Tatum ziet universiteiten en hogescholen als</w:t>
+      </w:r>
+      <w:r>
+        <w:rPr>
+          <w:rFonts w:ascii="Courier New" w:hAnsi="Courier New" w:cs="Courier New"/>
+          <w:sz w:val="22"/>
+          <w:szCs w:val="22"/>
+        </w:rPr>
+        <w:t xml:space="preserve"> bakens van hoop en </w:t>
+      </w:r>
+      <w:r>
+        <w:rPr>
+          <w:rFonts w:ascii="Courier New" w:hAnsi="Courier New" w:cs="Courier New"/>
+          <w:sz w:val="22"/>
+          <w:szCs w:val="22"/>
+        </w:rPr>
+        <w:t>al haar inspanningen zijn er op gericht</w:t>
+      </w:r>
+      <w:r>
+        <w:rPr>
+          <w:rFonts w:ascii="Courier New" w:hAnsi="Courier New" w:cs="Courier New"/>
+          <w:sz w:val="22"/>
+          <w:szCs w:val="22"/>
+        </w:rPr>
+        <w:t xml:space="preserve"> </w:t>
+      </w:r>
+      <w:r>
+        <w:rPr>
+          <w:rFonts w:ascii="Courier New" w:hAnsi="Courier New" w:cs="Courier New"/>
+          <w:sz w:val="22"/>
+          <w:szCs w:val="22"/>
+        </w:rPr>
+        <w:t xml:space="preserve">om </w:t>
+      </w:r>
+      <w:r>
+        <w:rPr>
+          <w:rFonts w:ascii="Courier New" w:hAnsi="Courier New" w:cs="Courier New"/>
+          <w:sz w:val="22"/>
+          <w:szCs w:val="22"/>
+        </w:rPr>
+        <w:t xml:space="preserve">nieuwe generaties </w:t>
+      </w:r>
+      <w:r>
+        <w:rPr>
+          <w:rFonts w:ascii="Courier New" w:hAnsi="Courier New" w:cs="Courier New"/>
+          <w:sz w:val="22"/>
+          <w:szCs w:val="22"/>
+        </w:rPr>
+        <w:t xml:space="preserve">te </w:t>
+      </w:r>
+      <w:r>
+        <w:rPr>
+          <w:rFonts w:ascii="Courier New" w:hAnsi="Courier New" w:cs="Courier New"/>
+          <w:sz w:val="22"/>
+          <w:szCs w:val="22"/>
+        </w:rPr>
+        <w:t>inspireren</w:t>
+      </w:r>
+      <w:r>
+        <w:rPr>
+          <w:rFonts w:ascii="Courier New" w:hAnsi="Courier New" w:cs="Courier New"/>
+          <w:sz w:val="22"/>
+          <w:szCs w:val="22"/>
+        </w:rPr>
+        <w:t xml:space="preserve"> en ervoor te zorgen dat zij in de toekomst slagen</w:t>
+      </w:r>
+      <w:r>
+        <w:rPr>
+          <w:rFonts w:ascii="Courier New" w:hAnsi="Courier New" w:cs="Courier New"/>
+          <w:sz w:val="22"/>
+          <w:szCs w:val="22"/>
+        </w:rPr>
+        <w:t xml:space="preserve">. </w:t>
+      </w:r>
+      <w:r>
+        <w:rPr>
+          <w:rFonts w:ascii="Courier New" w:hAnsi="Courier New" w:cs="Courier New"/>
+          <w:sz w:val="22"/>
+          <w:szCs w:val="22"/>
+        </w:rPr>
+        <w:t xml:space="preserve">Tatum </w:t>
+      </w:r>
+      <w:r>
+        <w:rPr>
+          <w:rFonts w:ascii="Courier New" w:hAnsi="Courier New" w:cs="Courier New"/>
+          <w:sz w:val="22"/>
+          <w:szCs w:val="22"/>
+        </w:rPr>
+        <w:t xml:space="preserve">ziet </w:t>
+      </w:r>
+      <w:r>
+        <w:rPr>
+          <w:rFonts w:ascii="Courier New" w:hAnsi="Courier New" w:cs="Courier New"/>
+          <w:sz w:val="22"/>
+          <w:szCs w:val="22"/>
+        </w:rPr>
+        <w:t xml:space="preserve">universiteiten </w:t>
+      </w:r>
+      <w:r>
+        <w:rPr>
+          <w:rFonts w:ascii="Courier New" w:hAnsi="Courier New" w:cs="Courier New"/>
+          <w:sz w:val="22"/>
+          <w:szCs w:val="22"/>
+        </w:rPr>
+        <w:t>en hogescholen</w:t>
+      </w:r>
+      <w:r>
+        <w:rPr>
+          <w:rFonts w:ascii="Courier New" w:hAnsi="Courier New" w:cs="Courier New"/>
+          <w:sz w:val="22"/>
+          <w:szCs w:val="22"/>
+        </w:rPr>
+        <w:t xml:space="preserve"> als</w:t>
+      </w:r>
+      <w:r>
+        <w:rPr>
+          <w:rFonts w:ascii="Courier New" w:hAnsi="Courier New" w:cs="Courier New"/>
+          <w:sz w:val="22"/>
+          <w:szCs w:val="22"/>
+        </w:rPr>
+        <w:t xml:space="preserve"> gemeenschappen van probleemoplossers, die creatieve denkers </w:t>
+      </w:r>
+      <w:r>
+        <w:rPr>
+          <w:rFonts w:ascii="Courier New" w:hAnsi="Courier New" w:cs="Courier New"/>
+          <w:sz w:val="22"/>
+          <w:szCs w:val="22"/>
+        </w:rPr>
+        <w:t xml:space="preserve">voor de toekomst wil </w:t>
+      </w:r>
+      <w:r>
+        <w:rPr>
+          <w:rFonts w:ascii="Courier New" w:hAnsi="Courier New" w:cs="Courier New"/>
+          <w:sz w:val="22"/>
+          <w:szCs w:val="22"/>
+        </w:rPr>
+        <w:lastRenderedPageBreak/>
+        <w:t xml:space="preserve">aantrekken. </w:t>
+      </w:r>
+      <w:r>
+        <w:rPr>
+          <w:rFonts w:ascii="Courier New" w:hAnsi="Courier New" w:cs="Courier New"/>
+          <w:sz w:val="22"/>
+          <w:szCs w:val="22"/>
+        </w:rPr>
+        <w:t>Zij wil dat de l</w:t>
+      </w:r>
+      <w:r>
+        <w:rPr>
+          <w:rFonts w:ascii="Courier New" w:hAnsi="Courier New" w:cs="Courier New"/>
+          <w:sz w:val="22"/>
+          <w:szCs w:val="22"/>
+        </w:rPr>
+        <w:t xml:space="preserve">eiders impact kunnen zien van </w:t>
+      </w:r>
+      <w:r>
+        <w:rPr>
+          <w:rFonts w:ascii="Courier New" w:hAnsi="Courier New" w:cs="Courier New"/>
+          <w:sz w:val="22"/>
+          <w:szCs w:val="22"/>
+        </w:rPr>
+        <w:t xml:space="preserve">al </w:t>
+      </w:r>
+      <w:r>
+        <w:rPr>
+          <w:rFonts w:ascii="Courier New" w:hAnsi="Courier New" w:cs="Courier New"/>
+          <w:sz w:val="22"/>
+          <w:szCs w:val="22"/>
+        </w:rPr>
+        <w:t xml:space="preserve">het werk dat zij </w:t>
+      </w:r>
+      <w:r>
+        <w:rPr>
+          <w:rFonts w:ascii="Courier New" w:hAnsi="Courier New" w:cs="Courier New"/>
+          <w:sz w:val="22"/>
+          <w:szCs w:val="22"/>
+        </w:rPr>
+        <w:t xml:space="preserve">dagelijks </w:t>
+      </w:r>
+      <w:r>
+        <w:rPr>
+          <w:rFonts w:ascii="Courier New" w:hAnsi="Courier New" w:cs="Courier New"/>
+          <w:sz w:val="22"/>
+          <w:szCs w:val="22"/>
+        </w:rPr>
+        <w:t xml:space="preserve"> doen</w:t>
+      </w:r>
+      <w:r>
+        <w:rPr>
+          <w:rFonts w:ascii="Courier New" w:hAnsi="Courier New" w:cs="Courier New"/>
+          <w:sz w:val="22"/>
+          <w:szCs w:val="22"/>
+        </w:rPr>
+        <w:t>.</w:t>
+      </w:r>
+      <w:r>
+        <w:rPr>
+          <w:rFonts w:ascii="Courier New" w:hAnsi="Courier New" w:cs="Courier New"/>
+          <w:sz w:val="22"/>
+          <w:szCs w:val="22"/>
+        </w:rPr>
+        <w:t xml:space="preserve"> Ondanks </w:t>
+      </w:r>
+      <w:r>
+        <w:rPr>
+          <w:rFonts w:ascii="Courier New" w:hAnsi="Courier New" w:cs="Courier New"/>
+          <w:sz w:val="22"/>
+          <w:szCs w:val="22"/>
+        </w:rPr>
+        <w:t xml:space="preserve">al </w:t>
+      </w:r>
+      <w:r>
+        <w:rPr>
+          <w:rFonts w:ascii="Courier New" w:hAnsi="Courier New" w:cs="Courier New"/>
+          <w:sz w:val="22"/>
+          <w:szCs w:val="22"/>
+        </w:rPr>
+        <w:t xml:space="preserve">de uitdagingen </w:t>
+      </w:r>
+      <w:r>
+        <w:rPr>
+          <w:rFonts w:ascii="Courier New" w:hAnsi="Courier New" w:cs="Courier New"/>
+          <w:sz w:val="22"/>
+          <w:szCs w:val="22"/>
+        </w:rPr>
+        <w:t>waarmee ze worden geconfronteerd</w:t>
+      </w:r>
+      <w:r>
+        <w:rPr>
+          <w:rFonts w:ascii="Courier New" w:hAnsi="Courier New" w:cs="Courier New"/>
+          <w:sz w:val="22"/>
+          <w:szCs w:val="22"/>
+        </w:rPr>
+        <w:t>, de</w:t>
+      </w:r>
+      <w:r>
+        <w:rPr>
+          <w:rFonts w:ascii="Courier New" w:hAnsi="Courier New" w:cs="Courier New"/>
+          <w:sz w:val="22"/>
+          <w:szCs w:val="22"/>
+        </w:rPr>
+        <w:t xml:space="preserve"> campus een prachtige plek </w:t>
+      </w:r>
+      <w:r>
+        <w:rPr>
+          <w:rFonts w:ascii="Courier New" w:hAnsi="Courier New" w:cs="Courier New"/>
+          <w:sz w:val="22"/>
+          <w:szCs w:val="22"/>
+        </w:rPr>
+        <w:t xml:space="preserve">is </w:t>
+      </w:r>
+      <w:r>
+        <w:rPr>
+          <w:rFonts w:ascii="Courier New" w:hAnsi="Courier New" w:cs="Courier New"/>
+          <w:sz w:val="22"/>
+          <w:szCs w:val="22"/>
+        </w:rPr>
+        <w:t>om te zijn</w:t>
+      </w:r>
+      <w:r>
+        <w:rPr>
+          <w:rFonts w:ascii="Courier New" w:hAnsi="Courier New" w:cs="Courier New"/>
+          <w:sz w:val="22"/>
+          <w:szCs w:val="22"/>
+        </w:rPr>
+        <w:t xml:space="preserve"> en dat het wel degelijk een baan is die je wilt hebben, ook in deze turbulente tijd.</w:t>
       </w:r>
     </w:p>
     <w:p>
@@ -3023,300 +4559,112 @@
           <w:sz w:val="22"/>
           <w:szCs w:val="22"/>
         </w:rPr>
-        <w:t>I</w:t>
-      </w:r>
-      <w:r>
-        <w:rPr>
-          <w:rFonts w:ascii="Courier New" w:hAnsi="Courier New" w:cs="Courier New"/>
-          <w:sz w:val="22"/>
-          <w:szCs w:val="22"/>
-        </w:rPr>
-        <w:t xml:space="preserve">nstellingen die </w:t>
-      </w:r>
-      <w:r>
-        <w:rPr>
-          <w:rFonts w:ascii="Courier New" w:hAnsi="Courier New" w:cs="Courier New"/>
-          <w:sz w:val="22"/>
-          <w:szCs w:val="22"/>
-        </w:rPr>
-        <w:t xml:space="preserve">volgens haar de taak hebben om </w:t>
-      </w:r>
-      <w:r>
-        <w:rPr>
-          <w:rFonts w:ascii="Courier New" w:hAnsi="Courier New" w:cs="Courier New"/>
-          <w:sz w:val="22"/>
-          <w:szCs w:val="22"/>
-        </w:rPr>
-        <w:t>ons aan</w:t>
-      </w:r>
-      <w:r>
-        <w:rPr>
-          <w:rFonts w:ascii="Courier New" w:hAnsi="Courier New" w:cs="Courier New"/>
-          <w:sz w:val="22"/>
-          <w:szCs w:val="22"/>
-        </w:rPr>
-        <w:t xml:space="preserve"> te </w:t>
-      </w:r>
-      <w:r>
-        <w:rPr>
-          <w:rFonts w:ascii="Courier New" w:hAnsi="Courier New" w:cs="Courier New"/>
-          <w:sz w:val="22"/>
-          <w:szCs w:val="22"/>
-        </w:rPr>
-        <w:t xml:space="preserve">moedigen kritisch na te denken over </w:t>
-      </w:r>
-      <w:r>
-        <w:rPr>
-          <w:rFonts w:ascii="Courier New" w:hAnsi="Courier New" w:cs="Courier New"/>
-          <w:sz w:val="22"/>
-          <w:szCs w:val="22"/>
-        </w:rPr>
-        <w:t xml:space="preserve">de </w:t>
-      </w:r>
-      <w:r>
-        <w:rPr>
-          <w:rFonts w:ascii="Courier New" w:hAnsi="Courier New" w:cs="Courier New"/>
-          <w:sz w:val="22"/>
-          <w:szCs w:val="22"/>
-        </w:rPr>
-        <w:t xml:space="preserve">belangrijke maatschappelijke kwesties </w:t>
-      </w:r>
-      <w:r>
-        <w:rPr>
-          <w:rFonts w:ascii="Courier New" w:hAnsi="Courier New" w:cs="Courier New"/>
-          <w:sz w:val="22"/>
-          <w:szCs w:val="22"/>
-        </w:rPr>
-        <w:t xml:space="preserve">die er spelen </w:t>
-      </w:r>
-      <w:r>
-        <w:rPr>
-          <w:rFonts w:ascii="Courier New" w:hAnsi="Courier New" w:cs="Courier New"/>
-          <w:sz w:val="22"/>
-          <w:szCs w:val="22"/>
-        </w:rPr>
-        <w:t xml:space="preserve">en </w:t>
-      </w:r>
-      <w:r>
-        <w:rPr>
-          <w:rFonts w:ascii="Courier New" w:hAnsi="Courier New" w:cs="Courier New"/>
-          <w:sz w:val="22"/>
-          <w:szCs w:val="22"/>
-        </w:rPr>
-        <w:t>ook de taak hebben om</w:t>
-      </w:r>
-      <w:r>
-        <w:rPr>
-          <w:rFonts w:ascii="Courier New" w:hAnsi="Courier New" w:cs="Courier New"/>
-          <w:sz w:val="22"/>
-          <w:szCs w:val="22"/>
-        </w:rPr>
-        <w:t xml:space="preserve"> </w:t>
-      </w:r>
-      <w:r>
-        <w:rPr>
-          <w:rFonts w:ascii="Courier New" w:hAnsi="Courier New" w:cs="Courier New"/>
-          <w:sz w:val="22"/>
-          <w:szCs w:val="22"/>
-        </w:rPr>
-        <w:t xml:space="preserve">nieuw leiderschap te ontwikkelen en te vormen. </w:t>
-      </w:r>
-      <w:r>
-        <w:rPr>
-          <w:rFonts w:ascii="Courier New" w:hAnsi="Courier New" w:cs="Courier New"/>
-          <w:sz w:val="22"/>
-          <w:szCs w:val="22"/>
-        </w:rPr>
-        <w:t>Tatum ziet universiteiten en hogescholen als</w:t>
-      </w:r>
-      <w:r>
-        <w:rPr>
-          <w:rFonts w:ascii="Courier New" w:hAnsi="Courier New" w:cs="Courier New"/>
-          <w:sz w:val="22"/>
-          <w:szCs w:val="22"/>
-        </w:rPr>
-        <w:t xml:space="preserve"> bakens van hoop en </w:t>
-      </w:r>
-      <w:r>
-        <w:rPr>
-          <w:rFonts w:ascii="Courier New" w:hAnsi="Courier New" w:cs="Courier New"/>
-          <w:sz w:val="22"/>
-          <w:szCs w:val="22"/>
-        </w:rPr>
-        <w:t xml:space="preserve">willen </w:t>
-      </w:r>
-      <w:r>
-        <w:rPr>
-          <w:rFonts w:ascii="Courier New" w:hAnsi="Courier New" w:cs="Courier New"/>
-          <w:sz w:val="22"/>
-          <w:szCs w:val="22"/>
-        </w:rPr>
-        <w:t xml:space="preserve">dat </w:t>
-      </w:r>
-      <w:r>
-        <w:rPr>
-          <w:rFonts w:ascii="Courier New" w:hAnsi="Courier New" w:cs="Courier New"/>
-          <w:sz w:val="22"/>
-          <w:szCs w:val="22"/>
-        </w:rPr>
-        <w:t xml:space="preserve">ze </w:t>
-      </w:r>
-      <w:r>
-        <w:rPr>
-          <w:rFonts w:ascii="Courier New" w:hAnsi="Courier New" w:cs="Courier New"/>
-          <w:sz w:val="22"/>
-          <w:szCs w:val="22"/>
-        </w:rPr>
-        <w:t xml:space="preserve">erin slagen om </w:t>
-      </w:r>
-      <w:r>
-        <w:rPr>
-          <w:rFonts w:ascii="Courier New" w:hAnsi="Courier New" w:cs="Courier New"/>
-          <w:sz w:val="22"/>
-          <w:szCs w:val="22"/>
-        </w:rPr>
-        <w:t xml:space="preserve">nieuwe generaties </w:t>
-      </w:r>
-      <w:r>
-        <w:rPr>
-          <w:rFonts w:ascii="Courier New" w:hAnsi="Courier New" w:cs="Courier New"/>
-          <w:sz w:val="22"/>
-          <w:szCs w:val="22"/>
-        </w:rPr>
-        <w:t xml:space="preserve">te </w:t>
-      </w:r>
-      <w:r>
-        <w:rPr>
-          <w:rFonts w:ascii="Courier New" w:hAnsi="Courier New" w:cs="Courier New"/>
-          <w:sz w:val="22"/>
-          <w:szCs w:val="22"/>
-        </w:rPr>
-        <w:t>inspireren</w:t>
-      </w:r>
-      <w:r>
-        <w:rPr>
-          <w:rFonts w:ascii="Courier New" w:hAnsi="Courier New" w:cs="Courier New"/>
-          <w:sz w:val="22"/>
-          <w:szCs w:val="22"/>
-        </w:rPr>
-        <w:t xml:space="preserve">. </w:t>
-      </w:r>
-      <w:r>
-        <w:rPr>
-          <w:rFonts w:ascii="Courier New" w:hAnsi="Courier New" w:cs="Courier New"/>
-          <w:sz w:val="22"/>
-          <w:szCs w:val="22"/>
-        </w:rPr>
-        <w:t xml:space="preserve">Zij ziet </w:t>
-      </w:r>
-      <w:r>
-        <w:rPr>
-          <w:rFonts w:ascii="Courier New" w:hAnsi="Courier New" w:cs="Courier New"/>
-          <w:sz w:val="22"/>
-          <w:szCs w:val="22"/>
-        </w:rPr>
-        <w:t xml:space="preserve">universiteiten </w:t>
-      </w:r>
-      <w:r>
-        <w:rPr>
-          <w:rFonts w:ascii="Courier New" w:hAnsi="Courier New" w:cs="Courier New"/>
-          <w:sz w:val="22"/>
-          <w:szCs w:val="22"/>
-        </w:rPr>
-        <w:t>en hogescholen</w:t>
-      </w:r>
-      <w:r>
-        <w:rPr>
-          <w:rFonts w:ascii="Courier New" w:hAnsi="Courier New" w:cs="Courier New"/>
-          <w:sz w:val="22"/>
-          <w:szCs w:val="22"/>
-        </w:rPr>
-        <w:t xml:space="preserve"> als</w:t>
-      </w:r>
-      <w:r>
-        <w:rPr>
-          <w:rFonts w:ascii="Courier New" w:hAnsi="Courier New" w:cs="Courier New"/>
-          <w:sz w:val="22"/>
-          <w:szCs w:val="22"/>
-        </w:rPr>
-        <w:t xml:space="preserve"> gemeenschappen van probleemoplossers, die creatieve denkers </w:t>
-      </w:r>
-      <w:r>
-        <w:rPr>
-          <w:rFonts w:ascii="Courier New" w:hAnsi="Courier New" w:cs="Courier New"/>
-          <w:sz w:val="22"/>
-          <w:szCs w:val="22"/>
-        </w:rPr>
-        <w:t xml:space="preserve">voor de toekomst wil </w:t>
-      </w:r>
-      <w:r>
-        <w:rPr>
-          <w:rFonts w:ascii="Courier New" w:hAnsi="Courier New" w:cs="Courier New"/>
-          <w:sz w:val="22"/>
-          <w:szCs w:val="22"/>
-        </w:rPr>
-        <w:t xml:space="preserve">aantrekken. </w:t>
-      </w:r>
-      <w:r>
-        <w:rPr>
-          <w:rFonts w:ascii="Courier New" w:hAnsi="Courier New" w:cs="Courier New"/>
-          <w:sz w:val="22"/>
-          <w:szCs w:val="22"/>
-        </w:rPr>
-        <w:t>Als plekken</w:t>
-      </w:r>
-      <w:r>
-        <w:rPr>
-          <w:rFonts w:ascii="Courier New" w:hAnsi="Courier New" w:cs="Courier New"/>
-          <w:sz w:val="22"/>
-          <w:szCs w:val="22"/>
-        </w:rPr>
-        <w:t xml:space="preserve"> waar leiders de impact kunnen zien van het werk dat zij elke dag doen, waar effectief leiderschap transformerend kan zijn. Ondanks </w:t>
-      </w:r>
-      <w:r>
-        <w:rPr>
-          <w:rFonts w:ascii="Courier New" w:hAnsi="Courier New" w:cs="Courier New"/>
-          <w:sz w:val="22"/>
-          <w:szCs w:val="22"/>
-        </w:rPr>
-        <w:t xml:space="preserve">al </w:t>
-      </w:r>
-      <w:r>
-        <w:rPr>
-          <w:rFonts w:ascii="Courier New" w:hAnsi="Courier New" w:cs="Courier New"/>
-          <w:sz w:val="22"/>
-          <w:szCs w:val="22"/>
-        </w:rPr>
-        <w:t xml:space="preserve">de uitdagingen </w:t>
-      </w:r>
-      <w:r>
-        <w:rPr>
-          <w:rFonts w:ascii="Courier New" w:hAnsi="Courier New" w:cs="Courier New"/>
-          <w:sz w:val="22"/>
-          <w:szCs w:val="22"/>
-        </w:rPr>
-        <w:t xml:space="preserve">waarmee ze worden geconfronteerd </w:t>
-      </w:r>
-      <w:r>
-        <w:rPr>
-          <w:rFonts w:ascii="Courier New" w:hAnsi="Courier New" w:cs="Courier New"/>
-          <w:sz w:val="22"/>
-          <w:szCs w:val="22"/>
-        </w:rPr>
-        <w:t xml:space="preserve">is een campus een prachtige plek om te zijn. </w:t>
-      </w:r>
-    </w:p>
-    <w:p>
-      <w:pPr>
-        <w:spacing w:line="360" w:lineRule="auto"/>
-        <w:ind w:firstLine="720"/>
-        <w:rPr>
-          <w:rFonts w:ascii="Courier New" w:hAnsi="Courier New" w:cs="Courier New"/>
-          <w:sz w:val="22"/>
-          <w:szCs w:val="22"/>
-          <w:lang w:val="nl-NL"/>
-        </w:rPr>
-      </w:pPr>
+        <w:t>Prec</w:t>
+      </w:r>
+      <w:r>
+        <w:rPr>
+          <w:rFonts w:ascii="Courier New" w:hAnsi="Courier New" w:cs="Courier New"/>
+          <w:sz w:val="22"/>
+          <w:szCs w:val="22"/>
+        </w:rPr>
+        <w:t xml:space="preserve">ies een jaar geleden stuurde de Traump administratie die beruchte ‘Dear Colleague’ en anti-Dei brief uit waarin </w:t>
+      </w:r>
+      <w:r>
+        <w:rPr>
+          <w:rFonts w:ascii="Courier New" w:hAnsi="Courier New" w:cs="Courier New"/>
+          <w:sz w:val="22"/>
+          <w:szCs w:val="22"/>
+        </w:rPr>
+        <w:t>onderwijsinstellingen op</w:t>
+      </w:r>
+      <w:r>
+        <w:rPr>
+          <w:rFonts w:ascii="Courier New" w:hAnsi="Courier New" w:cs="Courier New"/>
+          <w:sz w:val="22"/>
+          <w:szCs w:val="22"/>
+        </w:rPr>
+        <w:t>gereopen</w:t>
+      </w:r>
+      <w:r>
+        <w:rPr>
+          <w:rFonts w:ascii="Courier New" w:hAnsi="Courier New" w:cs="Courier New"/>
+          <w:sz w:val="22"/>
+          <w:szCs w:val="22"/>
+        </w:rPr>
+        <w:t xml:space="preserve"> om alle vormen van op ras gerichte programma’s, voorzieningen en financiële steun af te schaffen</w:t>
+      </w:r>
+      <w:r>
+        <w:rPr>
+          <w:rFonts w:ascii="Courier New" w:hAnsi="Courier New" w:cs="Courier New"/>
+          <w:sz w:val="22"/>
+          <w:szCs w:val="22"/>
+        </w:rPr>
+        <w:t xml:space="preserve"> en </w:t>
+      </w:r>
+      <w:r>
+        <w:rPr>
+          <w:rFonts w:ascii="Courier New" w:hAnsi="Courier New" w:cs="Courier New"/>
+          <w:sz w:val="22"/>
+          <w:szCs w:val="22"/>
+        </w:rPr>
+        <w:t xml:space="preserve">die </w:t>
+      </w:r>
+      <w:r>
+        <w:rPr>
+          <w:rFonts w:ascii="Courier New" w:hAnsi="Courier New" w:cs="Courier New"/>
+          <w:sz w:val="22"/>
+          <w:szCs w:val="22"/>
+        </w:rPr>
+        <w:t xml:space="preserve">vanaf dat moment </w:t>
+      </w:r>
+      <w:r>
+        <w:rPr>
+          <w:rFonts w:ascii="Courier New" w:hAnsi="Courier New" w:cs="Courier New"/>
+          <w:sz w:val="22"/>
+          <w:szCs w:val="22"/>
+        </w:rPr>
+        <w:t xml:space="preserve">als illegaal werden bestempeld. Instellingen kregen veertien dagen </w:t>
+      </w:r>
+      <w:r>
+        <w:rPr>
+          <w:rFonts w:ascii="Courier New" w:hAnsi="Courier New" w:cs="Courier New"/>
+          <w:sz w:val="22"/>
+          <w:szCs w:val="22"/>
+        </w:rPr>
+        <w:t xml:space="preserve">de tijd </w:t>
+      </w:r>
+      <w:r>
+        <w:rPr>
+          <w:rFonts w:ascii="Courier New" w:hAnsi="Courier New" w:cs="Courier New"/>
+          <w:sz w:val="22"/>
+          <w:szCs w:val="22"/>
+        </w:rPr>
+        <w:t>om te reageren</w:t>
+      </w:r>
+      <w:r>
+        <w:rPr>
+          <w:rFonts w:ascii="Courier New" w:hAnsi="Courier New" w:cs="Courier New"/>
+          <w:sz w:val="22"/>
+          <w:szCs w:val="22"/>
+        </w:rPr>
+        <w:t xml:space="preserve"> en er werd gedreigd met stopzetten van financiële hulp</w:t>
+      </w:r>
+      <w:r>
+        <w:rPr>
+          <w:rFonts w:ascii="Courier New" w:hAnsi="Courier New" w:cs="Courier New"/>
+          <w:sz w:val="22"/>
+          <w:szCs w:val="22"/>
+        </w:rPr>
+        <w:t>.</w:t>
+      </w:r>
+      <w:r>
+        <w:rPr>
+          <w:rFonts w:ascii="Courier New" w:hAnsi="Courier New" w:cs="Courier New"/>
+          <w:sz w:val="22"/>
+          <w:szCs w:val="22"/>
+        </w:rPr>
+        <w:t xml:space="preserve"> Tatums doen en denken zal daar zeker onder vallen. </w:t>
+      </w:r>
       <w:r>
         <w:rPr>
           <w:rFonts w:ascii="Courier New" w:hAnsi="Courier New" w:cs="Courier New"/>
@@ -3341,6 +4689,14 @@
           <w:sz w:val="22"/>
           <w:szCs w:val="22"/>
         </w:rPr>
+        <w:t xml:space="preserve">juist nu </w:t>
+      </w:r>
+      <w:r>
+        <w:rPr>
+          <w:rFonts w:ascii="Courier New" w:hAnsi="Courier New" w:cs="Courier New"/>
+          <w:sz w:val="22"/>
+          <w:szCs w:val="22"/>
+        </w:rPr>
         <w:t xml:space="preserve">een belangrijk en waardevol boek. </w:t>
       </w:r>
       <w:r>
@@ -3357,47 +4713,103 @@
           <w:sz w:val="22"/>
           <w:szCs w:val="22"/>
         </w:rPr>
-        <w:t xml:space="preserve">iet </w:t>
-      </w:r>
-      <w:r>
-        <w:rPr>
-          <w:rFonts w:ascii="Courier New" w:hAnsi="Courier New" w:cs="Courier New"/>
-          <w:sz w:val="22"/>
-          <w:szCs w:val="22"/>
-        </w:rPr>
-        <w:t xml:space="preserve">zozeer vanwege </w:t>
-      </w:r>
-      <w:r>
-        <w:rPr>
-          <w:rFonts w:ascii="Courier New" w:hAnsi="Courier New" w:cs="Courier New"/>
-          <w:sz w:val="22"/>
-          <w:szCs w:val="22"/>
-        </w:rPr>
-        <w:t xml:space="preserve">de originaliteit van de ideeën, maar </w:t>
-      </w:r>
-      <w:r>
-        <w:rPr>
-          <w:rFonts w:ascii="Courier New" w:hAnsi="Courier New" w:cs="Courier New"/>
-          <w:sz w:val="22"/>
-          <w:szCs w:val="22"/>
-        </w:rPr>
-        <w:t>is juist de ervaring en het dialogisch perspectief dat het boek interessant maakt</w:t>
-      </w:r>
-      <w:r>
-        <w:rPr>
-          <w:rFonts w:ascii="Courier New" w:hAnsi="Courier New" w:cs="Courier New"/>
-          <w:sz w:val="22"/>
-          <w:szCs w:val="22"/>
-        </w:rPr>
-        <w:t>. Het b</w:t>
-      </w:r>
-      <w:r>
-        <w:rPr>
-          <w:rFonts w:ascii="Courier New" w:hAnsi="Courier New" w:cs="Courier New"/>
-          <w:sz w:val="22"/>
-          <w:szCs w:val="22"/>
-        </w:rPr>
-        <w:t xml:space="preserve">oek is interessant voor iedereen die werkt of de </w:t>
+        <w:t>iet</w:t>
+      </w:r>
+      <w:r>
+        <w:rPr>
+          <w:rFonts w:ascii="Courier New" w:hAnsi="Courier New" w:cs="Courier New"/>
+          <w:sz w:val="22"/>
+          <w:szCs w:val="22"/>
+        </w:rPr>
+        <w:t xml:space="preserve"> omdat het vol nieuwe </w:t>
+      </w:r>
+      <w:r>
+        <w:rPr>
+          <w:rFonts w:ascii="Courier New" w:hAnsi="Courier New" w:cs="Courier New"/>
+          <w:sz w:val="22"/>
+          <w:szCs w:val="22"/>
+        </w:rPr>
+        <w:t>ideeën</w:t>
+      </w:r>
+      <w:r>
+        <w:rPr>
+          <w:rFonts w:ascii="Courier New" w:hAnsi="Courier New" w:cs="Courier New"/>
+          <w:sz w:val="22"/>
+          <w:szCs w:val="22"/>
+        </w:rPr>
+        <w:t xml:space="preserve"> zit. Het is </w:t>
+      </w:r>
+      <w:r>
+        <w:rPr>
+          <w:rFonts w:ascii="Courier New" w:hAnsi="Courier New" w:cs="Courier New"/>
+          <w:sz w:val="22"/>
+          <w:szCs w:val="22"/>
+        </w:rPr>
+        <w:t xml:space="preserve">de ervaring en het dialogisch perspectief </w:t>
+      </w:r>
+      <w:r>
+        <w:rPr>
+          <w:rFonts w:ascii="Courier New" w:hAnsi="Courier New" w:cs="Courier New"/>
+          <w:sz w:val="22"/>
+          <w:szCs w:val="22"/>
+        </w:rPr>
+        <w:t xml:space="preserve">van Tatum </w:t>
+      </w:r>
+      <w:r>
+        <w:rPr>
+          <w:rFonts w:ascii="Courier New" w:hAnsi="Courier New" w:cs="Courier New"/>
+          <w:sz w:val="22"/>
+          <w:szCs w:val="22"/>
+        </w:rPr>
+        <w:t>dat het boek interessant maakt</w:t>
+      </w:r>
+      <w:r>
+        <w:rPr>
+          <w:rFonts w:ascii="Courier New" w:hAnsi="Courier New" w:cs="Courier New"/>
+          <w:sz w:val="22"/>
+          <w:szCs w:val="22"/>
+        </w:rPr>
+        <w:t>.</w:t>
+      </w:r>
+      <w:r>
+        <w:rPr>
+          <w:rFonts w:ascii="Courier New" w:hAnsi="Courier New" w:cs="Courier New"/>
+          <w:sz w:val="22"/>
+          <w:szCs w:val="22"/>
+        </w:rPr>
+        <w:t xml:space="preserve"> Iedere goede leider wil eraan bijdragen dat een organisatie floreert en uitblinkt en zij laat zien wat daar bij komt kijken. </w:t>
+      </w:r>
+      <w:r>
+        <w:rPr>
+          <w:rFonts w:ascii="Courier New" w:hAnsi="Courier New" w:cs="Courier New"/>
+          <w:sz w:val="22"/>
+          <w:szCs w:val="22"/>
+        </w:rPr>
+        <w:t>I</w:t>
+      </w:r>
+      <w:r>
+        <w:rPr>
+          <w:rFonts w:ascii="Courier New" w:hAnsi="Courier New" w:cs="Courier New"/>
+          <w:sz w:val="22"/>
+          <w:szCs w:val="22"/>
+        </w:rPr>
+        <w:t xml:space="preserve">nteressant voor iedereen die </w:t>
+      </w:r>
+      <w:r>
+        <w:rPr>
+          <w:rFonts w:ascii="Courier New" w:hAnsi="Courier New" w:cs="Courier New"/>
+          <w:sz w:val="22"/>
+          <w:szCs w:val="22"/>
+        </w:rPr>
+        <w:t>een verantwoordelijk baan in het onderwijs heeft</w:t>
+      </w:r>
+      <w:r>
+        <w:rPr>
+          <w:rFonts w:ascii="Courier New" w:hAnsi="Courier New" w:cs="Courier New"/>
+          <w:sz w:val="22"/>
+          <w:szCs w:val="22"/>
+        </w:rPr>
+        <w:t xml:space="preserve"> of de </w:t>
       </w:r>
       <w:r>
         <w:rPr>
@@ -3413,15 +4825,7 @@
           <w:sz w:val="22"/>
           <w:szCs w:val="22"/>
         </w:rPr>
-        <w:t xml:space="preserve">om </w:t>
-      </w:r>
-      <w:r>
-        <w:rPr>
-          <w:rFonts w:ascii="Courier New" w:hAnsi="Courier New" w:cs="Courier New"/>
-          <w:sz w:val="22"/>
-          <w:szCs w:val="22"/>
-        </w:rPr>
-        <w:t>binnen het hoger onderwijsbestuur</w:t>
+        <w:t>om er</w:t>
       </w:r>
       <w:r>
         <w:rPr>
@@ -3437,16 +4841,127 @@
           <w:sz w:val="22"/>
           <w:szCs w:val="22"/>
         </w:rPr>
-        <w:t xml:space="preserve">. Maar ook anderen — ouders, alumni, burgers — die zich zorgen maken over de </w:t>
-      </w:r>
-      <w:r>
-        <w:rPr>
-          <w:rFonts w:ascii="Courier New" w:hAnsi="Courier New" w:cs="Courier New"/>
-          <w:sz w:val="22"/>
-          <w:szCs w:val="22"/>
-        </w:rPr>
-        <w:lastRenderedPageBreak/>
-        <w:t>toekomst van universiteiten, vinden hier een wijze en humane gids. In een tijd waarin het verleidelijk is het hoger onderwijs af te schrijven als hopeloos gebroken of het kritiekloos te verdedigen, biedt Tatum iets zeldzaams: een nuchtere analyse van echte problemen én een geloofwaardig betoog voor blijvende belofte.</w:t>
+        <w:t>. Maar ook anderen</w:t>
+      </w:r>
+      <w:r>
+        <w:rPr>
+          <w:rFonts w:ascii="Courier New" w:hAnsi="Courier New" w:cs="Courier New"/>
+          <w:sz w:val="22"/>
+          <w:szCs w:val="22"/>
+        </w:rPr>
+        <w:t xml:space="preserve"> (</w:t>
+      </w:r>
+      <w:r>
+        <w:rPr>
+          <w:rFonts w:ascii="Courier New" w:hAnsi="Courier New" w:cs="Courier New"/>
+          <w:sz w:val="22"/>
+          <w:szCs w:val="22"/>
+        </w:rPr>
+        <w:t xml:space="preserve">ouders, </w:t>
+      </w:r>
+      <w:r>
+        <w:rPr>
+          <w:rFonts w:ascii="Courier New" w:hAnsi="Courier New" w:cs="Courier New"/>
+          <w:sz w:val="22"/>
+          <w:szCs w:val="22"/>
+        </w:rPr>
+        <w:t>bestuurders</w:t>
+      </w:r>
+      <w:r>
+        <w:rPr>
+          <w:rFonts w:ascii="Courier New" w:hAnsi="Courier New" w:cs="Courier New"/>
+          <w:sz w:val="22"/>
+          <w:szCs w:val="22"/>
+        </w:rPr>
+        <w:t xml:space="preserve">, </w:t>
+      </w:r>
+      <w:r>
+        <w:rPr>
+          <w:rFonts w:ascii="Courier New" w:hAnsi="Courier New" w:cs="Courier New"/>
+          <w:sz w:val="22"/>
+          <w:szCs w:val="22"/>
+        </w:rPr>
+        <w:t>politici</w:t>
+      </w:r>
+      <w:r>
+        <w:rPr>
+          <w:rFonts w:ascii="Courier New" w:hAnsi="Courier New" w:cs="Courier New"/>
+          <w:sz w:val="22"/>
+          <w:szCs w:val="22"/>
+        </w:rPr>
+        <w:t xml:space="preserve"> en </w:t>
+      </w:r>
+      <w:r>
+        <w:rPr>
+          <w:rFonts w:ascii="Courier New" w:hAnsi="Courier New" w:cs="Courier New"/>
+          <w:sz w:val="22"/>
+          <w:szCs w:val="22"/>
+        </w:rPr>
+        <w:t>burgers</w:t>
+      </w:r>
+      <w:r>
+        <w:rPr>
+          <w:rFonts w:ascii="Courier New" w:hAnsi="Courier New" w:cs="Courier New"/>
+          <w:sz w:val="22"/>
+          <w:szCs w:val="22"/>
+        </w:rPr>
+        <w:t>)</w:t>
+      </w:r>
+      <w:r>
+        <w:rPr>
+          <w:rFonts w:ascii="Courier New" w:hAnsi="Courier New" w:cs="Courier New"/>
+          <w:sz w:val="22"/>
+          <w:szCs w:val="22"/>
+        </w:rPr>
+        <w:t xml:space="preserve"> die zich zorgen maken over de toekomst van universiteiten, vinden hier een wijze</w:t>
+      </w:r>
+      <w:r>
+        <w:rPr>
+          <w:rFonts w:ascii="Courier New" w:hAnsi="Courier New" w:cs="Courier New"/>
+          <w:sz w:val="22"/>
+          <w:szCs w:val="22"/>
+        </w:rPr>
+        <w:t>, rustige</w:t>
+      </w:r>
+      <w:r>
+        <w:rPr>
+          <w:rFonts w:ascii="Courier New" w:hAnsi="Courier New" w:cs="Courier New"/>
+          <w:sz w:val="22"/>
+          <w:szCs w:val="22"/>
+        </w:rPr>
+        <w:t xml:space="preserve"> en humane gids. In een tijd waarin het verleidelijk is het hoger onderwijs af te schrijven als hopeloos gebroken of het kritiekloos te verdedigen, biedt Tatum een nuchtere analyse van </w:t>
+      </w:r>
+      <w:r>
+        <w:rPr>
+          <w:rFonts w:ascii="Courier New" w:hAnsi="Courier New" w:cs="Courier New"/>
+          <w:sz w:val="22"/>
+          <w:szCs w:val="22"/>
+        </w:rPr>
+        <w:t>de</w:t>
+      </w:r>
+      <w:r>
+        <w:rPr>
+          <w:rFonts w:ascii="Courier New" w:hAnsi="Courier New" w:cs="Courier New"/>
+          <w:sz w:val="22"/>
+          <w:szCs w:val="22"/>
+        </w:rPr>
+        <w:t xml:space="preserve"> problemen én </w:t>
+      </w:r>
+      <w:r>
+        <w:rPr>
+          <w:rFonts w:ascii="Courier New" w:hAnsi="Courier New" w:cs="Courier New"/>
+          <w:sz w:val="22"/>
+          <w:szCs w:val="22"/>
+        </w:rPr>
+        <w:t>wat je kunt doen en wat jouw verantwoordelijkheid is</w:t>
+      </w:r>
+      <w:r>
+        <w:rPr>
+          <w:rFonts w:ascii="Courier New" w:hAnsi="Courier New" w:cs="Courier New"/>
+          <w:sz w:val="22"/>
+          <w:szCs w:val="22"/>
+        </w:rPr>
+        <w:t>.</w:t>
       </w:r>
       <w:r>
         <w:rPr>
@@ -3505,6 +5020,7 @@
         </w:rPr>
         <w:t xml:space="preserve">Tatum, B.D. (2025). </w:t>
       </w:r>
+      <w:proofErr w:type="spellStart"/>
       <w:r>
         <w:rPr>
           <w:rFonts w:ascii="Courier New" w:hAnsi="Courier New" w:cs="Courier New"/>
@@ -3512,9 +5028,80 @@
           <w:iCs/>
           <w:sz w:val="22"/>
           <w:szCs w:val="22"/>
+          <w:lang w:val="nl-NL"/>
+        </w:rPr>
+        <w:t>Peril</w:t>
+      </w:r>
+      <w:proofErr w:type="spellEnd"/>
+      <w:r>
+        <w:rPr>
+          <w:rFonts w:ascii="Courier New" w:hAnsi="Courier New" w:cs="Courier New"/>
+          <w:i/>
+          <w:iCs/>
+          <w:sz w:val="22"/>
+          <w:szCs w:val="22"/>
+          <w:lang w:val="nl-NL"/>
+        </w:rPr>
+        <w:t xml:space="preserve"> </w:t>
+      </w:r>
+      <w:proofErr w:type="spellStart"/>
+      <w:r>
+        <w:rPr>
+          <w:rFonts w:ascii="Courier New" w:hAnsi="Courier New" w:cs="Courier New"/>
+          <w:i/>
+          <w:iCs/>
+          <w:sz w:val="22"/>
+          <w:szCs w:val="22"/>
+          <w:lang w:val="nl-NL"/>
+        </w:rPr>
+        <w:t>and</w:t>
+      </w:r>
+      <w:proofErr w:type="spellEnd"/>
+      <w:r>
+        <w:rPr>
+          <w:rFonts w:ascii="Courier New" w:hAnsi="Courier New" w:cs="Courier New"/>
+          <w:i/>
+          <w:iCs/>
+          <w:sz w:val="22"/>
+          <w:szCs w:val="22"/>
+          <w:lang w:val="nl-NL"/>
+        </w:rPr>
+        <w:t xml:space="preserve"> </w:t>
+      </w:r>
+      <w:proofErr w:type="spellStart"/>
+      <w:r>
+        <w:rPr>
+          <w:rFonts w:ascii="Courier New" w:hAnsi="Courier New" w:cs="Courier New"/>
+          <w:i/>
+          <w:iCs/>
+          <w:sz w:val="22"/>
+          <w:szCs w:val="22"/>
+          <w:lang w:val="nl-NL"/>
+        </w:rPr>
+        <w:t>Promise</w:t>
+      </w:r>
+      <w:proofErr w:type="spellEnd"/>
+      <w:r>
+        <w:rPr>
+          <w:rFonts w:ascii="Courier New" w:hAnsi="Courier New" w:cs="Courier New"/>
+          <w:i/>
+          <w:iCs/>
+          <w:sz w:val="22"/>
+          <w:szCs w:val="22"/>
+          <w:lang w:val="nl-NL"/>
+        </w:rPr>
+        <w:t xml:space="preserve">. </w:t>
+      </w:r>
+      <w:r>
+        <w:rPr>
+          <w:rFonts w:ascii="Courier New" w:hAnsi="Courier New" w:cs="Courier New"/>
+          <w:i/>
+          <w:iCs/>
+          <w:sz w:val="22"/>
+          <w:szCs w:val="22"/>
           <w:lang w:val="en-US"/>
         </w:rPr>
-        <w:t>Peril and Promise. College Leadership in Turbulent Times.</w:t>
+        <w:t>College Leadership in Turbulent Times.</w:t>
       </w:r>
       <w:r>
         <w:rPr>
@@ -4368,7 +5955,6 @@
   <w:style w:type="character" w:default="1" w:styleId="DefaultParagraphFont">
     <w:name w:val="Default Paragraph Font"/>
     <w:uiPriority w:val="1"/>
-    <w:semiHidden/>
     <w:unhideWhenUsed/>
   </w:style>
   <w:style w:type="table" w:default="1" w:styleId="TableNormal">

</xml_diff>